<commit_message>
Rebaseline Element C calibration using 120 Current documents
</commit_message>
<xml_diff>
--- a/Readme.docx
+++ b/Readme.docx
@@ -9,64 +9,53 @@
           <w:bCs/>
         </w:rPr>
       </w:pPr>
-      <w:proofErr w:type="spellStart"/>
       <w:r>
         <w:rPr>
           <w:b/>
           <w:bCs/>
         </w:rPr>
-        <w:t>GPTScorer</w:t>
-      </w:r>
-      <w:proofErr w:type="spellEnd"/>
+        <w:t>GPTScorer – Element C Scoring Application</w:t>
+      </w:r>
+    </w:p>
+    <w:p>
+      <w:r>
+        <w:t xml:space="preserve">This repository contains the </w:t>
+      </w:r>
+      <w:r>
+        <w:t>validated</w:t>
+      </w:r>
+      <w:r>
+        <w:t xml:space="preserve"> scoring application for MyDesign – Element C (Presentation and Justification of Solution Design Requirements).</w:t>
+      </w:r>
+    </w:p>
+    <w:p/>
+    <w:p>
+      <w:r>
+        <w:t>The system uses deterministic GPT-based evaluation combined with post-processing calibration to generate rubric-aligned sub-scores (C1–C6), a calibrated element score, and structured narrative feedback suitable for educator review.</w:t>
+      </w:r>
+    </w:p>
+    <w:p/>
+    <w:p>
+      <w:r>
+        <w:t>The application supports both:</w:t>
+      </w:r>
+    </w:p>
+    <w:p>
       <w:r>
         <w:rPr>
           <w:b/>
           <w:bCs/>
         </w:rPr>
-        <w:t xml:space="preserve"> – Element C Scoring Application</w:t>
-      </w:r>
-    </w:p>
-    <w:p>
-      <w:r>
-        <w:t xml:space="preserve">This repository contains the </w:t>
-      </w:r>
-      <w:r>
-        <w:t>validated</w:t>
-      </w:r>
-      <w:r>
-        <w:t xml:space="preserve"> scoring application for </w:t>
-      </w:r>
-      <w:proofErr w:type="spellStart"/>
-      <w:r>
-        <w:t>MyDesign</w:t>
-      </w:r>
-      <w:proofErr w:type="spellEnd"/>
-      <w:r>
-        <w:t xml:space="preserve"> – Element C (Presentation and Justification of Solution Design Requirements).</w:t>
-      </w:r>
-    </w:p>
-    <w:p/>
-    <w:p>
-      <w:r>
-        <w:t>The system uses deterministic GPT-based evaluation combined with post-processing calibration to generate rubric-aligned sub-scores (C1–C6), a calibrated element score, and structured narrative feedback suitable for educator review.</w:t>
-      </w:r>
-    </w:p>
-    <w:p/>
-    <w:p>
-      <w:r>
-        <w:t>The application supports both:</w:t>
-      </w:r>
-    </w:p>
-    <w:p>
-      <w:r>
-        <w:rPr>
-          <w:b/>
-          <w:bCs/>
-        </w:rPr>
         <w:t xml:space="preserve">Current </w:t>
       </w:r>
       <w:r>
-        <w:t>documents (2025–present)</w:t>
+        <w:t>documents (</w:t>
+      </w:r>
+      <w:r>
+        <w:t>10/2024</w:t>
+      </w:r>
+      <w:r>
+        <w:t>–present)</w:t>
       </w:r>
     </w:p>
     <w:p>
@@ -152,15 +141,7 @@
       </w:r>
       <w:r>
         <w:br/>
-        <w:t xml:space="preserve">Raw Element Score (mean of </w:t>
-      </w:r>
-      <w:proofErr w:type="spellStart"/>
-      <w:r>
-        <w:t>subscores</w:t>
-      </w:r>
-      <w:proofErr w:type="spellEnd"/>
-      <w:r>
-        <w:t>)</w:t>
+        <w:t>Raw Element Score (mean of subscores)</w:t>
       </w:r>
       <w:r>
         <w:br/>
@@ -443,6 +424,95 @@
     </w:p>
     <w:p>
       <w:pPr>
+        <w:numPr>
+          <w:ilvl w:val="0"/>
+          <w:numId w:val="4"/>
+        </w:numPr>
+      </w:pPr>
+      <w:r>
+        <w:t xml:space="preserve">Calibration </w:t>
+      </w:r>
+      <w:r>
+        <w:t xml:space="preserve">coefficients </w:t>
+      </w:r>
+      <w:r>
+        <w:t>derived from 120 expert-scored documents.</w:t>
+      </w:r>
+    </w:p>
+    <w:p>
+      <w:pPr>
+        <w:numPr>
+          <w:ilvl w:val="1"/>
+          <w:numId w:val="4"/>
+        </w:numPr>
+      </w:pPr>
+      <w:r>
+        <w:t>Transformation:</w:t>
+      </w:r>
+    </w:p>
+    <w:p>
+      <w:pPr>
+        <w:numPr>
+          <w:ilvl w:val="1"/>
+          <w:numId w:val="4"/>
+        </w:numPr>
+      </w:pPr>
+      <w:r>
+        <w:t>y = 1.289x − 1.267</w:t>
+      </w:r>
+    </w:p>
+    <w:p>
+      <w:pPr>
+        <w:numPr>
+          <w:ilvl w:val="1"/>
+          <w:numId w:val="4"/>
+        </w:numPr>
+      </w:pPr>
+      <w:r>
+        <w:t>Where:</w:t>
+      </w:r>
+    </w:p>
+    <w:p>
+      <w:pPr>
+        <w:numPr>
+          <w:ilvl w:val="2"/>
+          <w:numId w:val="4"/>
+        </w:numPr>
+      </w:pPr>
+      <w:r>
+        <w:t>x = raw GPT element score</w:t>
+      </w:r>
+    </w:p>
+    <w:p>
+      <w:pPr>
+        <w:numPr>
+          <w:ilvl w:val="2"/>
+          <w:numId w:val="4"/>
+        </w:numPr>
+      </w:pPr>
+      <w:r>
+        <w:t>y = calibrated score</w:t>
+      </w:r>
+    </w:p>
+    <w:p>
+      <w:pPr>
+        <w:numPr>
+          <w:ilvl w:val="0"/>
+          <w:numId w:val="4"/>
+        </w:numPr>
+      </w:pPr>
+      <w:r>
+        <w:t>This aligns GPT score distribution with expert scoring</w:t>
+      </w:r>
+      <w:r>
+        <w:t xml:space="preserve"> </w:t>
+      </w:r>
+      <w:r>
+        <w:t>while preserving document rank ordering.</w:t>
+      </w:r>
+    </w:p>
+    <w:p>
+      <w:pPr>
         <w:rPr>
           <w:b/>
           <w:bCs/>
@@ -502,6 +572,7 @@
         </w:numPr>
       </w:pPr>
       <w:r>
+        <w:lastRenderedPageBreak/>
         <w:t>Intercept-only correction (no slope scaling)</w:t>
       </w:r>
     </w:p>
@@ -579,14 +650,8 @@
     </w:p>
     <w:p>
       <w:r>
-        <w:lastRenderedPageBreak/>
-        <w:t>set OPENAI_API_KEY=</w:t>
-      </w:r>
-      <w:proofErr w:type="spellStart"/>
-      <w:r>
-        <w:t>your_key_here</w:t>
-      </w:r>
-      <w:proofErr w:type="spellEnd"/>
+        <w:t>set OPENAI_API_KEY=your_key_here</w:t>
+      </w:r>
     </w:p>
     <w:p>
       <w:r>
@@ -645,48 +710,11 @@
     </w:p>
     <w:p>
       <w:r>
-        <w:t xml:space="preserve">python -m </w:t>
-      </w:r>
-      <w:proofErr w:type="spellStart"/>
-      <w:proofErr w:type="gramStart"/>
-      <w:r>
-        <w:t>elements.element</w:t>
-      </w:r>
-      <w:proofErr w:type="gramEnd"/>
-      <w:r>
-        <w:t>_</w:t>
-      </w:r>
-      <w:proofErr w:type="gramStart"/>
-      <w:r>
-        <w:t>C.score</w:t>
-      </w:r>
-      <w:proofErr w:type="gramEnd"/>
-      <w:r>
-        <w:t>_with_API_C</w:t>
-      </w:r>
-      <w:proofErr w:type="spellEnd"/>
-      <w:r>
-        <w:t xml:space="preserve"> ^</w:t>
+        <w:t>python -m elements.element_C.score_with_API_C ^</w:t>
       </w:r>
       <w:r>
         <w:br/>
-        <w:t xml:space="preserve">  --folder elements/</w:t>
-      </w:r>
-      <w:proofErr w:type="spellStart"/>
-      <w:r>
-        <w:t>element_C</w:t>
-      </w:r>
-      <w:proofErr w:type="spellEnd"/>
-      <w:r>
-        <w:t>/</w:t>
-      </w:r>
-      <w:proofErr w:type="spellStart"/>
-      <w:r>
-        <w:t>current_api_scoring_documents</w:t>
-      </w:r>
-      <w:proofErr w:type="spellEnd"/>
-      <w:r>
-        <w:t xml:space="preserve"> ^</w:t>
+        <w:t xml:space="preserve">  --folder elements/element_C/current_api_scoring_documents ^</w:t>
       </w:r>
       <w:r>
         <w:br/>
@@ -696,15 +724,7 @@
         <w:t xml:space="preserve"> </w:t>
       </w:r>
       <w:r>
-        <w:t>elements/</w:t>
-      </w:r>
-      <w:proofErr w:type="spellStart"/>
-      <w:r>
-        <w:t>element_C</w:t>
-      </w:r>
-      <w:proofErr w:type="spellEnd"/>
-      <w:r>
-        <w:t>/</w:t>
+        <w:t>elements/element_C/</w:t>
       </w:r>
       <w:r>
         <w:t>scored_results</w:t>
@@ -804,15 +824,8 @@
         </w:numPr>
       </w:pPr>
       <w:r>
-        <w:t>C1-C</w:t>
-      </w:r>
-      <w:proofErr w:type="gramStart"/>
-      <w:r>
-        <w:t>6  Bulleted</w:t>
-      </w:r>
-      <w:proofErr w:type="gramEnd"/>
-      <w:r>
-        <w:t xml:space="preserve"> rationale</w:t>
+        <w:lastRenderedPageBreak/>
+        <w:t>C1-C6  Bulleted rationale</w:t>
       </w:r>
     </w:p>
     <w:p>
@@ -889,110 +902,260 @@
       </w:r>
     </w:p>
     <w:p>
-      <w:proofErr w:type="spellStart"/>
-      <w:r>
-        <w:t>uvicorn</w:t>
-      </w:r>
-      <w:proofErr w:type="spellEnd"/>
+      <w:r>
+        <w:t>uvicorn elements.element_C.scorer_app_C:app --reload</w:t>
+      </w:r>
+    </w:p>
+    <w:p/>
+    <w:p>
+      <w:r>
+        <w:t>Then open the local server in your browser</w:t>
+      </w:r>
+      <w:r>
+        <w:t xml:space="preserve">, </w:t>
+      </w:r>
+      <w:r>
+        <w:t>http://127.0.0.1:8000/</w:t>
+      </w:r>
+      <w:r>
+        <w:t>.</w:t>
+      </w:r>
+    </w:p>
+    <w:p>
+      <w:r>
+        <w:t>UI Features:</w:t>
+      </w:r>
+    </w:p>
+    <w:p>
+      <w:pPr>
+        <w:numPr>
+          <w:ilvl w:val="0"/>
+          <w:numId w:val="7"/>
+        </w:numPr>
+      </w:pPr>
+      <w:r>
+        <w:t>Upload documents</w:t>
+      </w:r>
+    </w:p>
+    <w:p>
+      <w:pPr>
+        <w:numPr>
+          <w:ilvl w:val="0"/>
+          <w:numId w:val="7"/>
+        </w:numPr>
+      </w:pPr>
+      <w:r>
+        <w:t>View calibrated C1–C6 scores</w:t>
+      </w:r>
+    </w:p>
+    <w:p>
+      <w:pPr>
+        <w:numPr>
+          <w:ilvl w:val="0"/>
+          <w:numId w:val="7"/>
+        </w:numPr>
+      </w:pPr>
+      <w:r>
+        <w:t>View narrative feedback</w:t>
+      </w:r>
+    </w:p>
+    <w:p>
+      <w:pPr>
+        <w:numPr>
+          <w:ilvl w:val="0"/>
+          <w:numId w:val="7"/>
+        </w:numPr>
+      </w:pPr>
+      <w:r>
+        <w:t>Download CSV results</w:t>
+      </w:r>
+    </w:p>
+    <w:p>
+      <w:r>
+        <w:t xml:space="preserve">The UI mode can be used to upload one or more documents for scoring through the API or alternatively, a csv input </w:t>
+      </w:r>
+      <w:r>
+        <w:t>file</w:t>
+      </w:r>
+      <w:r>
+        <w:t xml:space="preserve"> that includes previously scored data from the score_with_api_C.py app.   The csv input file includes:</w:t>
+      </w:r>
+    </w:p>
+    <w:p>
+      <w:pPr>
+        <w:pStyle w:val="ListParagraph"/>
+        <w:numPr>
+          <w:ilvl w:val="0"/>
+          <w:numId w:val="18"/>
+        </w:numPr>
+      </w:pPr>
+      <w:r>
+        <w:t xml:space="preserve">Metadata for each document row </w:t>
+      </w:r>
+    </w:p>
+    <w:p>
+      <w:pPr>
+        <w:pStyle w:val="ListParagraph"/>
+        <w:numPr>
+          <w:ilvl w:val="0"/>
+          <w:numId w:val="18"/>
+        </w:numPr>
+      </w:pPr>
+      <w:r>
+        <w:t>C1_expert – C_expert</w:t>
+      </w:r>
+      <w:r>
+        <w:t xml:space="preserve"> scores</w:t>
+      </w:r>
+    </w:p>
+    <w:p>
+      <w:pPr>
+        <w:pStyle w:val="ListParagraph"/>
+        <w:numPr>
+          <w:ilvl w:val="0"/>
+          <w:numId w:val="18"/>
+        </w:numPr>
+      </w:pPr>
+      <w:r>
+        <w:t>C1 – C6 scores output from score_with_api_C.py</w:t>
+      </w:r>
+    </w:p>
+    <w:p>
+      <w:pPr>
+        <w:pStyle w:val="ListParagraph"/>
+        <w:numPr>
+          <w:ilvl w:val="0"/>
+          <w:numId w:val="18"/>
+        </w:numPr>
+      </w:pPr>
+      <w:r>
+        <w:t>C1 – C6 flags</w:t>
+      </w:r>
       <w:r>
         <w:t xml:space="preserve"> </w:t>
       </w:r>
-      <w:proofErr w:type="spellStart"/>
-      <w:proofErr w:type="gramStart"/>
-      <w:r>
-        <w:t>elements.element</w:t>
-      </w:r>
-      <w:proofErr w:type="gramEnd"/>
-      <w:r>
-        <w:t>_</w:t>
-      </w:r>
-      <w:proofErr w:type="gramStart"/>
-      <w:r>
-        <w:t>C.scorer</w:t>
-      </w:r>
-      <w:proofErr w:type="gramEnd"/>
-      <w:r>
-        <w:t>_app_C:app</w:t>
-      </w:r>
-      <w:proofErr w:type="spellEnd"/>
-      <w:r>
-        <w:t xml:space="preserve"> --reload</w:t>
-      </w:r>
-    </w:p>
-    <w:p/>
-    <w:p>
+      <w:r>
+        <w:t>from score_with_api_C.py</w:t>
+      </w:r>
+    </w:p>
+    <w:p>
+      <w:pPr>
+        <w:pStyle w:val="ListParagraph"/>
+        <w:numPr>
+          <w:ilvl w:val="0"/>
+          <w:numId w:val="18"/>
+        </w:numPr>
+      </w:pPr>
+      <w:r>
+        <w:t>C1 – C6 bulleted rationale</w:t>
+      </w:r>
+      <w:r>
+        <w:t xml:space="preserve"> </w:t>
+      </w:r>
+      <w:r>
+        <w:t>from score_with_api_C.py</w:t>
+      </w:r>
+    </w:p>
+    <w:p>
+      <w:pPr>
+        <w:pStyle w:val="ListParagraph"/>
+        <w:numPr>
+          <w:ilvl w:val="0"/>
+          <w:numId w:val="18"/>
+        </w:numPr>
+      </w:pPr>
+      <w:r>
+        <w:t>Narrative ra</w:t>
+      </w:r>
+      <w:r>
+        <w:t>t</w:t>
+      </w:r>
+      <w:r>
+        <w:t>ionale</w:t>
+      </w:r>
+    </w:p>
+    <w:p>
+      <w:pPr>
+        <w:pStyle w:val="ListParagraph"/>
+        <w:numPr>
+          <w:ilvl w:val="0"/>
+          <w:numId w:val="18"/>
+        </w:numPr>
+      </w:pPr>
+      <w:r>
+        <w:t>Element_score_raw, the average of the api scores</w:t>
+      </w:r>
+    </w:p>
+    <w:p>
+      <w:r>
+        <w:t>Whether uploading a csv file or document files, the UI output is sub-element scores and narrative rationale.  A downloadable csv contains the following outputs:</w:t>
+      </w:r>
+    </w:p>
+    <w:p>
+      <w:pPr>
+        <w:pStyle w:val="ListParagraph"/>
+        <w:numPr>
+          <w:ilvl w:val="0"/>
+          <w:numId w:val="17"/>
+        </w:numPr>
+      </w:pPr>
+      <w:r>
+        <w:t>Filename</w:t>
+      </w:r>
+    </w:p>
+    <w:p>
+      <w:pPr>
+        <w:pStyle w:val="ListParagraph"/>
+        <w:numPr>
+          <w:ilvl w:val="0"/>
+          <w:numId w:val="17"/>
+        </w:numPr>
+      </w:pPr>
+      <w:r>
+        <w:t>C1 – C6 outputs from score_with_API_C.py (aka C1_api-C6_api)</w:t>
+      </w:r>
+    </w:p>
+    <w:p>
+      <w:pPr>
+        <w:pStyle w:val="ListParagraph"/>
+        <w:numPr>
+          <w:ilvl w:val="0"/>
+          <w:numId w:val="17"/>
+        </w:numPr>
+      </w:pPr>
+      <w:r>
+        <w:t>C1_final  – C6_final calibrated scores for output</w:t>
+      </w:r>
+    </w:p>
+    <w:p>
+      <w:pPr>
+        <w:pStyle w:val="ListParagraph"/>
+        <w:numPr>
+          <w:ilvl w:val="0"/>
+          <w:numId w:val="17"/>
+        </w:numPr>
+      </w:pPr>
+      <w:r>
+        <w:t>element_score_raw</w:t>
+      </w:r>
+      <w:r>
+        <w:tab/>
+      </w:r>
+    </w:p>
+    <w:p>
+      <w:pPr>
+        <w:pStyle w:val="ListParagraph"/>
+        <w:numPr>
+          <w:ilvl w:val="0"/>
+          <w:numId w:val="17"/>
+        </w:numPr>
+      </w:pPr>
       <w:r>
         <w:lastRenderedPageBreak/>
-        <w:t>Then open the local server in your browser</w:t>
-      </w:r>
-      <w:r>
-        <w:t xml:space="preserve">, </w:t>
-      </w:r>
-      <w:r>
-        <w:t>http://127.0.0.1:8000/</w:t>
-      </w:r>
-      <w:r>
-        <w:t>.</w:t>
-      </w:r>
-    </w:p>
-    <w:p>
-      <w:r>
-        <w:t>UI Features:</w:t>
-      </w:r>
-    </w:p>
-    <w:p>
-      <w:pPr>
-        <w:numPr>
-          <w:ilvl w:val="0"/>
-          <w:numId w:val="7"/>
-        </w:numPr>
-      </w:pPr>
-      <w:r>
-        <w:t>Upload documents</w:t>
-      </w:r>
-    </w:p>
-    <w:p>
-      <w:pPr>
-        <w:numPr>
-          <w:ilvl w:val="0"/>
-          <w:numId w:val="7"/>
-        </w:numPr>
-      </w:pPr>
-      <w:r>
-        <w:t>View calibrated C1–C6 scores</w:t>
-      </w:r>
-    </w:p>
-    <w:p>
-      <w:pPr>
-        <w:numPr>
-          <w:ilvl w:val="0"/>
-          <w:numId w:val="7"/>
-        </w:numPr>
-      </w:pPr>
-      <w:r>
-        <w:t>View narrative feedback</w:t>
-      </w:r>
-    </w:p>
-    <w:p>
-      <w:pPr>
-        <w:numPr>
-          <w:ilvl w:val="0"/>
-          <w:numId w:val="7"/>
-        </w:numPr>
-      </w:pPr>
-      <w:r>
-        <w:t>Download CSV results</w:t>
-      </w:r>
-    </w:p>
-    <w:p>
-      <w:r>
-        <w:t xml:space="preserve">The UI mode can be used to upload one or more documents for scoring through the API or alternatively, a csv input </w:t>
-      </w:r>
-      <w:r>
-        <w:t>file</w:t>
-      </w:r>
-      <w:r>
-        <w:t xml:space="preserve"> that includes previously scored data from the score_with_api_C.py app.   The csv input file includes:</w:t>
+        <w:t>element_score_calibrated</w:t>
+      </w:r>
+      <w:r>
+        <w:tab/>
       </w:r>
     </w:p>
     <w:p>
@@ -1000,220 +1163,12 @@
         <w:pStyle w:val="ListParagraph"/>
         <w:numPr>
           <w:ilvl w:val="0"/>
-          <w:numId w:val="18"/>
-        </w:numPr>
-      </w:pPr>
-      <w:r>
-        <w:t xml:space="preserve">Metadata for each document row </w:t>
-      </w:r>
-    </w:p>
-    <w:p>
-      <w:pPr>
-        <w:pStyle w:val="ListParagraph"/>
-        <w:numPr>
-          <w:ilvl w:val="0"/>
-          <w:numId w:val="18"/>
-        </w:numPr>
-      </w:pPr>
-      <w:r>
-        <w:t xml:space="preserve">C1_expert – </w:t>
-      </w:r>
-      <w:proofErr w:type="spellStart"/>
-      <w:r>
-        <w:t>C_expert</w:t>
-      </w:r>
-      <w:proofErr w:type="spellEnd"/>
-      <w:r>
-        <w:t xml:space="preserve"> scores</w:t>
-      </w:r>
-    </w:p>
-    <w:p>
-      <w:pPr>
-        <w:pStyle w:val="ListParagraph"/>
-        <w:numPr>
-          <w:ilvl w:val="0"/>
-          <w:numId w:val="18"/>
-        </w:numPr>
-      </w:pPr>
-      <w:r>
-        <w:t>C1 – C6 scores output from score_with_api_C.py</w:t>
-      </w:r>
-    </w:p>
-    <w:p>
-      <w:pPr>
-        <w:pStyle w:val="ListParagraph"/>
-        <w:numPr>
-          <w:ilvl w:val="0"/>
-          <w:numId w:val="18"/>
-        </w:numPr>
-      </w:pPr>
-      <w:r>
-        <w:t>C1 – C6 flags</w:t>
-      </w:r>
-      <w:r>
-        <w:t xml:space="preserve"> </w:t>
-      </w:r>
-      <w:r>
-        <w:t>from score_with_api_C.py</w:t>
-      </w:r>
-    </w:p>
-    <w:p>
-      <w:pPr>
-        <w:pStyle w:val="ListParagraph"/>
-        <w:numPr>
-          <w:ilvl w:val="0"/>
-          <w:numId w:val="18"/>
-        </w:numPr>
-      </w:pPr>
-      <w:r>
-        <w:t>C1 – C6 bulleted rationale</w:t>
-      </w:r>
-      <w:r>
-        <w:t xml:space="preserve"> </w:t>
-      </w:r>
-      <w:r>
-        <w:t>from score_with_api_C.py</w:t>
-      </w:r>
-    </w:p>
-    <w:p>
-      <w:pPr>
-        <w:pStyle w:val="ListParagraph"/>
-        <w:numPr>
-          <w:ilvl w:val="0"/>
-          <w:numId w:val="18"/>
-        </w:numPr>
-      </w:pPr>
-      <w:r>
-        <w:t>Narrative ra</w:t>
-      </w:r>
-      <w:r>
-        <w:t>t</w:t>
-      </w:r>
-      <w:r>
-        <w:t>ionale</w:t>
-      </w:r>
-    </w:p>
-    <w:p>
-      <w:pPr>
-        <w:pStyle w:val="ListParagraph"/>
-        <w:numPr>
-          <w:ilvl w:val="0"/>
-          <w:numId w:val="18"/>
-        </w:numPr>
-      </w:pPr>
-      <w:proofErr w:type="spellStart"/>
-      <w:r>
-        <w:t>Element_score_raw</w:t>
-      </w:r>
-      <w:proofErr w:type="spellEnd"/>
-      <w:r>
-        <w:t xml:space="preserve">, the average of the </w:t>
-      </w:r>
-      <w:proofErr w:type="spellStart"/>
-      <w:r>
-        <w:t>api</w:t>
-      </w:r>
-      <w:proofErr w:type="spellEnd"/>
-      <w:r>
-        <w:t xml:space="preserve"> scores</w:t>
-      </w:r>
-    </w:p>
-    <w:p>
-      <w:r>
-        <w:t>Whether uploading a csv file or document files, the UI output is sub-element scores and narrative rationale.  A downloadable csv contains the following outputs:</w:t>
-      </w:r>
-    </w:p>
-    <w:p>
-      <w:pPr>
-        <w:pStyle w:val="ListParagraph"/>
-        <w:numPr>
-          <w:ilvl w:val="0"/>
           <w:numId w:val="17"/>
         </w:numPr>
       </w:pPr>
       <w:r>
-        <w:t>Filename</w:t>
-      </w:r>
-    </w:p>
-    <w:p>
-      <w:pPr>
-        <w:pStyle w:val="ListParagraph"/>
-        <w:numPr>
-          <w:ilvl w:val="0"/>
-          <w:numId w:val="17"/>
-        </w:numPr>
-      </w:pPr>
-      <w:r>
-        <w:t>C1 – C6 outputs from score_with_API_C.py (aka C1_api-C6_api)</w:t>
-      </w:r>
-    </w:p>
-    <w:p>
-      <w:pPr>
-        <w:pStyle w:val="ListParagraph"/>
-        <w:numPr>
-          <w:ilvl w:val="0"/>
-          <w:numId w:val="17"/>
-        </w:numPr>
-      </w:pPr>
-      <w:r>
-        <w:t>C1_</w:t>
-      </w:r>
-      <w:proofErr w:type="gramStart"/>
-      <w:r>
-        <w:t>final  –</w:t>
-      </w:r>
-      <w:proofErr w:type="gramEnd"/>
-      <w:r>
-        <w:t xml:space="preserve"> C6_final calibrated scores for output</w:t>
-      </w:r>
-    </w:p>
-    <w:p>
-      <w:pPr>
-        <w:pStyle w:val="ListParagraph"/>
-        <w:numPr>
-          <w:ilvl w:val="0"/>
-          <w:numId w:val="17"/>
-        </w:numPr>
-      </w:pPr>
-      <w:proofErr w:type="spellStart"/>
-      <w:r>
-        <w:t>element_score_raw</w:t>
-      </w:r>
-      <w:proofErr w:type="spellEnd"/>
-      <w:r>
-        <w:tab/>
-      </w:r>
-    </w:p>
-    <w:p>
-      <w:pPr>
-        <w:pStyle w:val="ListParagraph"/>
-        <w:numPr>
-          <w:ilvl w:val="0"/>
-          <w:numId w:val="17"/>
-        </w:numPr>
-      </w:pPr>
-      <w:proofErr w:type="spellStart"/>
-      <w:r>
-        <w:t>element_score_calibrated</w:t>
-      </w:r>
-      <w:proofErr w:type="spellEnd"/>
-      <w:r>
-        <w:tab/>
-      </w:r>
-    </w:p>
-    <w:p>
-      <w:pPr>
-        <w:pStyle w:val="ListParagraph"/>
-        <w:numPr>
-          <w:ilvl w:val="0"/>
-          <w:numId w:val="17"/>
-        </w:numPr>
-      </w:pPr>
-      <w:proofErr w:type="spellStart"/>
-      <w:r>
         <w:t>calibration_delta</w:t>
       </w:r>
-      <w:proofErr w:type="spellEnd"/>
     </w:p>
     <w:p>
       <w:pPr>
@@ -1299,14 +1254,8 @@
         </w:numPr>
       </w:pPr>
       <w:r>
-        <w:lastRenderedPageBreak/>
-        <w:t xml:space="preserve">Drift slightly </w:t>
-      </w:r>
-      <w:proofErr w:type="gramStart"/>
-      <w:r>
-        <w:t>over time</w:t>
-      </w:r>
-      <w:proofErr w:type="gramEnd"/>
+        <w:t>Drift slightly over time</w:t>
+      </w:r>
     </w:p>
     <w:p>
       <w:pPr>
@@ -1457,13 +1406,8 @@
           <w:numId w:val="11"/>
         </w:numPr>
       </w:pPr>
-      <w:proofErr w:type="gramStart"/>
-      <w:r>
-        <w:t>Explains</w:t>
-      </w:r>
-      <w:proofErr w:type="gramEnd"/>
-      <w:r>
-        <w:t xml:space="preserve"> strengths and weaknesses</w:t>
+      <w:r>
+        <w:t>Explains strengths and weaknesses</w:t>
       </w:r>
     </w:p>
     <w:p>
@@ -1484,17 +1428,13 @@
           <w:numId w:val="11"/>
         </w:numPr>
       </w:pPr>
-      <w:proofErr w:type="gramStart"/>
-      <w:r>
-        <w:t>Uses</w:t>
-      </w:r>
-      <w:proofErr w:type="gramEnd"/>
-      <w:r>
-        <w:t xml:space="preserve"> educator-friendly language</w:t>
-      </w:r>
-    </w:p>
-    <w:p>
-      <w:r>
+      <w:r>
+        <w:t>Uses educator-friendly language</w:t>
+      </w:r>
+    </w:p>
+    <w:p>
+      <w:r>
+        <w:lastRenderedPageBreak/>
         <w:t>This is intended for teacher-facing use and instructional support.</w:t>
       </w:r>
     </w:p>
@@ -1559,13 +1499,8 @@
           <w:numId w:val="12"/>
         </w:numPr>
       </w:pPr>
-      <w:proofErr w:type="spellStart"/>
-      <w:r>
-        <w:t>Subscore</w:t>
-      </w:r>
-      <w:proofErr w:type="spellEnd"/>
-      <w:r>
-        <w:t xml:space="preserve"> drift analysis</w:t>
+      <w:r>
+        <w:t>Subscore drift analysis</w:t>
       </w:r>
     </w:p>
     <w:p>
@@ -1576,7 +1511,6 @@
         </w:numPr>
       </w:pPr>
       <w:r>
-        <w:lastRenderedPageBreak/>
         <w:t>Rank stability monitoring</w:t>
       </w:r>
     </w:p>
@@ -1670,15 +1604,7 @@
         <w:t>└──</w:t>
       </w:r>
       <w:r>
-        <w:t xml:space="preserve"> </w:t>
-      </w:r>
-      <w:proofErr w:type="spellStart"/>
-      <w:r>
-        <w:t>element_C</w:t>
-      </w:r>
-      <w:proofErr w:type="spellEnd"/>
-      <w:r>
-        <w:t>/</w:t>
+        <w:t xml:space="preserve"> element_C/</w:t>
       </w:r>
       <w:r>
         <w:br/>
@@ -1813,15 +1739,7 @@
         <w:t>──</w:t>
       </w:r>
       <w:r>
-        <w:t xml:space="preserve"> </w:t>
-      </w:r>
-      <w:proofErr w:type="spellStart"/>
-      <w:r>
-        <w:t>current_api_scoring_documents</w:t>
-      </w:r>
-      <w:proofErr w:type="spellEnd"/>
-      <w:r>
-        <w:t>/</w:t>
+        <w:t xml:space="preserve"> current_api_scoring_documents/</w:t>
       </w:r>
       <w:r>
         <w:br/>
@@ -1842,15 +1760,7 @@
         <w:t>└──</w:t>
       </w:r>
       <w:r>
-        <w:t xml:space="preserve"> </w:t>
-      </w:r>
-      <w:proofErr w:type="spellStart"/>
-      <w:r>
-        <w:t>legacy_api_scoring_documents</w:t>
-      </w:r>
-      <w:proofErr w:type="spellEnd"/>
-      <w:r>
-        <w:t>/</w:t>
+        <w:t xml:space="preserve"> legacy_api_scoring_documents/</w:t>
       </w:r>
       <w:r>
         <w:br/>
@@ -1895,15 +1805,7 @@
         <w:t>──</w:t>
       </w:r>
       <w:r>
-        <w:t xml:space="preserve"> </w:t>
-      </w:r>
-      <w:proofErr w:type="spellStart"/>
-      <w:r>
-        <w:t>simple_ui</w:t>
-      </w:r>
-      <w:proofErr w:type="spellEnd"/>
-      <w:r>
-        <w:t>/</w:t>
+        <w:t xml:space="preserve"> simple_ui/</w:t>
       </w:r>
       <w:r>
         <w:br/>
@@ -1946,6 +1848,7 @@
     </w:p>
     <w:p>
       <w:r>
+        <w:lastRenderedPageBreak/>
         <w:pict w14:anchorId="382B2E9B">
           <v:rect id="_x0000_i1034" style="width:0;height:1.5pt" o:hralign="center" o:hrstd="t" o:hr="t" fillcolor="#a0a0a0" stroked="f"/>
         </w:pict>
@@ -2001,15 +1904,7 @@
         </w:numPr>
       </w:pPr>
       <w:r>
-        <w:t xml:space="preserve">Bias controlled through </w:t>
-      </w:r>
-      <w:proofErr w:type="gramStart"/>
-      <w:r>
-        <w:t>intercept</w:t>
-      </w:r>
-      <w:proofErr w:type="gramEnd"/>
-      <w:r>
-        <w:t xml:space="preserve"> calibration</w:t>
+        <w:t>Bias controlled through intercept calibration</w:t>
       </w:r>
     </w:p>
     <w:p>
@@ -2025,7 +1920,6 @@
     </w:p>
     <w:p>
       <w:r>
-        <w:lastRenderedPageBreak/>
         <w:t>Note: Validation sample sizes are moderate; future re-baselining will use expanded Current document sets.</w:t>
       </w:r>
     </w:p>
@@ -2124,13 +2018,8 @@
           <w:numId w:val="15"/>
         </w:numPr>
       </w:pPr>
-      <w:proofErr w:type="spellStart"/>
-      <w:r>
-        <w:t>Rebaseline</w:t>
-      </w:r>
-      <w:proofErr w:type="spellEnd"/>
-      <w:r>
-        <w:t xml:space="preserve"> with expanded Current document corpus</w:t>
+      <w:r>
+        <w:t>Rebaseline with expanded Current document corpus</w:t>
       </w:r>
     </w:p>
     <w:p>
@@ -2195,15 +2084,7 @@
     </w:p>
     <w:p>
       <w:r>
-        <w:t xml:space="preserve">For questions regarding calibration methodology or validation metrics, contact the project </w:t>
-      </w:r>
-      <w:proofErr w:type="gramStart"/>
-      <w:r>
-        <w:t>lead</w:t>
-      </w:r>
-      <w:proofErr w:type="gramEnd"/>
-      <w:r>
-        <w:t>.</w:t>
+        <w:t>For questions regarding calibration methodology or validation metrics, contact the project lead.</w:t>
       </w:r>
     </w:p>
     <w:p/>
@@ -2537,7 +2418,7 @@
         <w:sz w:val="20"/>
       </w:rPr>
     </w:lvl>
-    <w:lvl w:ilvl="1" w:tentative="1">
+    <w:lvl w:ilvl="1">
       <w:start w:val="1"/>
       <w:numFmt w:val="bullet"/>
       <w:lvlText w:val="o"/>
@@ -2553,7 +2434,7 @@
         <w:sz w:val="20"/>
       </w:rPr>
     </w:lvl>
-    <w:lvl w:ilvl="2" w:tentative="1">
+    <w:lvl w:ilvl="2">
       <w:start w:val="1"/>
       <w:numFmt w:val="bullet"/>
       <w:lvlText w:val=""/>

</xml_diff>

<commit_message>
Add drift diagnostics, Golden20 validation, and cached scoring for Element C
</commit_message>
<xml_diff>
--- a/Readme.docx
+++ b/Readme.docx
@@ -9,12 +9,21 @@
           <w:bCs/>
         </w:rPr>
       </w:pPr>
+      <w:proofErr w:type="spellStart"/>
       <w:r>
         <w:rPr>
           <w:b/>
           <w:bCs/>
         </w:rPr>
-        <w:t>GPTScorer – Element C Scoring Application</w:t>
+        <w:t>GPTScorer</w:t>
+      </w:r>
+      <w:proofErr w:type="spellEnd"/>
+      <w:r>
+        <w:rPr>
+          <w:b/>
+          <w:bCs/>
+        </w:rPr>
+        <w:t xml:space="preserve"> – Element C Scoring Application</w:t>
       </w:r>
     </w:p>
     <w:p>
@@ -25,7 +34,15 @@
         <w:t>validated</w:t>
       </w:r>
       <w:r>
-        <w:t xml:space="preserve"> scoring application for MyDesign – Element C (Presentation and Justification of Solution Design Requirements).</w:t>
+        <w:t xml:space="preserve"> scoring application for </w:t>
+      </w:r>
+      <w:proofErr w:type="spellStart"/>
+      <w:r>
+        <w:t>MyDesign</w:t>
+      </w:r>
+      <w:proofErr w:type="spellEnd"/>
+      <w:r>
+        <w:t xml:space="preserve"> – Element C (Presentation and Justification of Solution Design Requirements).</w:t>
       </w:r>
     </w:p>
     <w:p/>
@@ -141,7 +158,15 @@
       </w:r>
       <w:r>
         <w:br/>
-        <w:t>Raw Element Score (mean of subscores)</w:t>
+        <w:t xml:space="preserve">Raw Element Score (mean of </w:t>
+      </w:r>
+      <w:proofErr w:type="spellStart"/>
+      <w:r>
+        <w:t>subscores</w:t>
+      </w:r>
+      <w:proofErr w:type="spellEnd"/>
+      <w:r>
+        <w:t>)</w:t>
       </w:r>
       <w:r>
         <w:br/>
@@ -430,13 +455,7 @@
         </w:numPr>
       </w:pPr>
       <w:r>
-        <w:t xml:space="preserve">Calibration </w:t>
-      </w:r>
-      <w:r>
-        <w:t xml:space="preserve">coefficients </w:t>
-      </w:r>
-      <w:r>
-        <w:t>derived from 120 expert-scored documents.</w:t>
+        <w:t>Calibration coefficients derived from 120 expert-scored documents.</w:t>
       </w:r>
     </w:p>
     <w:p>
@@ -502,13 +521,7 @@
         </w:numPr>
       </w:pPr>
       <w:r>
-        <w:t>This aligns GPT score distribution with expert scoring</w:t>
-      </w:r>
-      <w:r>
-        <w:t xml:space="preserve"> </w:t>
-      </w:r>
-      <w:r>
-        <w:t>while preserving document rank ordering.</w:t>
+        <w:t>This aligns GPT score distribution with expert scoring while preserving document rank ordering.</w:t>
       </w:r>
     </w:p>
     <w:p>
@@ -650,8 +663,13 @@
     </w:p>
     <w:p>
       <w:r>
-        <w:t>set OPENAI_API_KEY=your_key_here</w:t>
-      </w:r>
+        <w:t>set OPENAI_API_KEY=</w:t>
+      </w:r>
+      <w:proofErr w:type="spellStart"/>
+      <w:r>
+        <w:t>your_key_here</w:t>
+      </w:r>
+      <w:proofErr w:type="spellEnd"/>
     </w:p>
     <w:p>
       <w:r>
@@ -710,11 +728,35 @@
     </w:p>
     <w:p>
       <w:r>
-        <w:t>python -m elements.element_C.score_with_API_C ^</w:t>
+        <w:t xml:space="preserve">python -m </w:t>
+      </w:r>
+      <w:proofErr w:type="spellStart"/>
+      <w:r>
+        <w:t>elements.element_C.score_with_API_C</w:t>
+      </w:r>
+      <w:proofErr w:type="spellEnd"/>
+      <w:r>
+        <w:t xml:space="preserve"> ^</w:t>
       </w:r>
       <w:r>
         <w:br/>
-        <w:t xml:space="preserve">  --folder elements/element_C/current_api_scoring_documents ^</w:t>
+        <w:t xml:space="preserve">  --folder elements/</w:t>
+      </w:r>
+      <w:proofErr w:type="spellStart"/>
+      <w:r>
+        <w:t>element_C</w:t>
+      </w:r>
+      <w:proofErr w:type="spellEnd"/>
+      <w:r>
+        <w:t>/</w:t>
+      </w:r>
+      <w:proofErr w:type="spellStart"/>
+      <w:r>
+        <w:t>current_api_scoring_documents</w:t>
+      </w:r>
+      <w:proofErr w:type="spellEnd"/>
+      <w:r>
+        <w:t xml:space="preserve"> ^</w:t>
       </w:r>
       <w:r>
         <w:br/>
@@ -724,7 +766,15 @@
         <w:t xml:space="preserve"> </w:t>
       </w:r>
       <w:r>
-        <w:t>elements/element_C/</w:t>
+        <w:t>elements/</w:t>
+      </w:r>
+      <w:proofErr w:type="spellStart"/>
+      <w:r>
+        <w:t>element_C</w:t>
+      </w:r>
+      <w:proofErr w:type="spellEnd"/>
+      <w:r>
+        <w:t>/</w:t>
       </w:r>
       <w:r>
         <w:t>scored_results</w:t>
@@ -902,8 +952,21 @@
       </w:r>
     </w:p>
     <w:p>
-      <w:r>
-        <w:t>uvicorn elements.element_C.scorer_app_C:app --reload</w:t>
+      <w:proofErr w:type="spellStart"/>
+      <w:r>
+        <w:t>uvicorn</w:t>
+      </w:r>
+      <w:proofErr w:type="spellEnd"/>
+      <w:r>
+        <w:t xml:space="preserve"> </w:t>
+      </w:r>
+      <w:proofErr w:type="spellStart"/>
+      <w:r>
+        <w:t>elements.element_C.scorer_app_C:app</w:t>
+      </w:r>
+      <w:proofErr w:type="spellEnd"/>
+      <w:r>
+        <w:t xml:space="preserve"> --reload</w:t>
       </w:r>
     </w:p>
     <w:p/>
@@ -1002,8 +1065,13 @@
         </w:numPr>
       </w:pPr>
       <w:r>
-        <w:t>C1_expert – C_expert</w:t>
-      </w:r>
+        <w:t xml:space="preserve">C1_expert – </w:t>
+      </w:r>
+      <w:proofErr w:type="spellStart"/>
+      <w:r>
+        <w:t>C_expert</w:t>
+      </w:r>
+      <w:proofErr w:type="spellEnd"/>
       <w:r>
         <w:t xml:space="preserve"> scores</w:t>
       </w:r>
@@ -1082,8 +1150,21 @@
           <w:numId w:val="18"/>
         </w:numPr>
       </w:pPr>
-      <w:r>
-        <w:t>Element_score_raw, the average of the api scores</w:t>
+      <w:proofErr w:type="spellStart"/>
+      <w:r>
+        <w:t>Element_score_raw</w:t>
+      </w:r>
+      <w:proofErr w:type="spellEnd"/>
+      <w:r>
+        <w:t xml:space="preserve">, the average of the </w:t>
+      </w:r>
+      <w:proofErr w:type="spellStart"/>
+      <w:r>
+        <w:t>api</w:t>
+      </w:r>
+      <w:proofErr w:type="spellEnd"/>
+      <w:r>
+        <w:t xml:space="preserve"> scores</w:t>
       </w:r>
     </w:p>
     <w:p>
@@ -1135,9 +1216,11 @@
           <w:numId w:val="17"/>
         </w:numPr>
       </w:pPr>
+      <w:proofErr w:type="spellStart"/>
       <w:r>
         <w:t>element_score_raw</w:t>
       </w:r>
+      <w:proofErr w:type="spellEnd"/>
       <w:r>
         <w:tab/>
       </w:r>
@@ -1150,10 +1233,12 @@
           <w:numId w:val="17"/>
         </w:numPr>
       </w:pPr>
+      <w:proofErr w:type="spellStart"/>
       <w:r>
         <w:lastRenderedPageBreak/>
         <w:t>element_score_calibrated</w:t>
       </w:r>
+      <w:proofErr w:type="spellEnd"/>
       <w:r>
         <w:tab/>
       </w:r>
@@ -1166,9 +1251,11 @@
           <w:numId w:val="17"/>
         </w:numPr>
       </w:pPr>
+      <w:proofErr w:type="spellStart"/>
       <w:r>
         <w:t>calibration_delta</w:t>
       </w:r>
+      <w:proofErr w:type="spellEnd"/>
     </w:p>
     <w:p>
       <w:pPr>
@@ -1499,8 +1586,13 @@
           <w:numId w:val="12"/>
         </w:numPr>
       </w:pPr>
-      <w:r>
-        <w:t>Subscore drift analysis</w:t>
+      <w:proofErr w:type="spellStart"/>
+      <w:r>
+        <w:t>Subscore</w:t>
+      </w:r>
+      <w:proofErr w:type="spellEnd"/>
+      <w:r>
+        <w:t xml:space="preserve"> drift analysis</w:t>
       </w:r>
     </w:p>
     <w:p>
@@ -1550,6 +1642,12 @@
         <w:t>│</w:t>
       </w:r>
       <w:r>
+        <w:t>──</w:t>
+      </w:r>
+      <w:r>
+        <w:t xml:space="preserve"> core/</w:t>
+      </w:r>
+      <w:r>
         <w:br/>
       </w:r>
       <w:r>
@@ -1565,13 +1663,22 @@
         <w:t>──</w:t>
       </w:r>
       <w:r>
-        <w:t xml:space="preserve"> core/</w:t>
+        <w:t xml:space="preserve"> config/</w:t>
       </w:r>
       <w:r>
         <w:br/>
       </w:r>
       <w:r>
         <w:rPr>
+          <w:rFonts w:ascii="Aptos" w:hAnsi="Aptos" w:cs="Aptos"/>
+        </w:rPr>
+        <w:t>│</w:t>
+      </w:r>
+      <w:r>
+        <w:t xml:space="preserve"> </w:t>
+      </w:r>
+      <w:r>
+        <w:rPr>
           <w:rFonts w:ascii="MS Gothic" w:eastAsia="MS Gothic" w:hAnsi="MS Gothic" w:cs="MS Gothic" w:hint="eastAsia"/>
         </w:rPr>
         <w:t>├</w:t>
@@ -1583,6 +1690,179 @@
         <w:t>──</w:t>
       </w:r>
       <w:r>
+        <w:t xml:space="preserve"> </w:t>
+      </w:r>
+      <w:proofErr w:type="spellStart"/>
+      <w:r>
+        <w:t>golden_C_current.json</w:t>
+      </w:r>
+      <w:proofErr w:type="spellEnd"/>
+      <w:r>
+        <w:br/>
+      </w:r>
+      <w:r>
+        <w:rPr>
+          <w:rFonts w:ascii="Aptos" w:hAnsi="Aptos" w:cs="Aptos"/>
+        </w:rPr>
+        <w:t>│</w:t>
+      </w:r>
+      <w:r>
+        <w:t xml:space="preserve"> </w:t>
+      </w:r>
+      <w:r>
+        <w:rPr>
+          <w:rFonts w:ascii="MS Gothic" w:eastAsia="MS Gothic" w:hAnsi="MS Gothic" w:cs="MS Gothic" w:hint="eastAsia"/>
+        </w:rPr>
+        <w:t>├</w:t>
+      </w:r>
+      <w:r>
+        <w:rPr>
+          <w:rFonts w:ascii="Aptos" w:hAnsi="Aptos" w:cs="Aptos"/>
+        </w:rPr>
+        <w:t>──</w:t>
+      </w:r>
+      <w:r>
+        <w:t xml:space="preserve"> </w:t>
+      </w:r>
+      <w:proofErr w:type="spellStart"/>
+      <w:r>
+        <w:t>golden_C_legacy.json</w:t>
+      </w:r>
+      <w:proofErr w:type="spellEnd"/>
+      <w:r>
+        <w:br/>
+      </w:r>
+      <w:r>
+        <w:rPr>
+          <w:rFonts w:ascii="Aptos" w:hAnsi="Aptos" w:cs="Aptos"/>
+        </w:rPr>
+        <w:t>│</w:t>
+      </w:r>
+      <w:r>
+        <w:t xml:space="preserve"> </w:t>
+      </w:r>
+      <w:r>
+        <w:rPr>
+          <w:rFonts w:ascii="MS Gothic" w:eastAsia="MS Gothic" w:hAnsi="MS Gothic" w:cs="MS Gothic" w:hint="eastAsia"/>
+        </w:rPr>
+        <w:t>├</w:t>
+      </w:r>
+      <w:r>
+        <w:rPr>
+          <w:rFonts w:ascii="Aptos" w:hAnsi="Aptos" w:cs="Aptos"/>
+        </w:rPr>
+        <w:t>──</w:t>
+      </w:r>
+      <w:r>
+        <w:t xml:space="preserve"> golden20_metrics_current.json</w:t>
+      </w:r>
+      <w:r>
+        <w:br/>
+      </w:r>
+      <w:r>
+        <w:rPr>
+          <w:rFonts w:ascii="Aptos" w:hAnsi="Aptos" w:cs="Aptos"/>
+        </w:rPr>
+        <w:t>│</w:t>
+      </w:r>
+      <w:r>
+        <w:t xml:space="preserve"> </w:t>
+      </w:r>
+      <w:r>
+        <w:rPr>
+          <w:rFonts w:ascii="MS Gothic" w:eastAsia="MS Gothic" w:hAnsi="MS Gothic" w:cs="MS Gothic" w:hint="eastAsia"/>
+        </w:rPr>
+        <w:t>├</w:t>
+      </w:r>
+      <w:r>
+        <w:rPr>
+          <w:rFonts w:ascii="Aptos" w:hAnsi="Aptos" w:cs="Aptos"/>
+        </w:rPr>
+        <w:t>──</w:t>
+      </w:r>
+      <w:r>
+        <w:t xml:space="preserve"> golden20_metrics_legacy.json</w:t>
+      </w:r>
+      <w:r>
+        <w:br/>
+      </w:r>
+      <w:r>
+        <w:rPr>
+          <w:rFonts w:ascii="Aptos" w:hAnsi="Aptos" w:cs="Aptos"/>
+        </w:rPr>
+        <w:t>│</w:t>
+      </w:r>
+      <w:r>
+        <w:t xml:space="preserve"> </w:t>
+      </w:r>
+      <w:r>
+        <w:rPr>
+          <w:rFonts w:ascii="MS Gothic" w:eastAsia="MS Gothic" w:hAnsi="MS Gothic" w:cs="MS Gothic" w:hint="eastAsia"/>
+        </w:rPr>
+        <w:t>├</w:t>
+      </w:r>
+      <w:r>
+        <w:rPr>
+          <w:rFonts w:ascii="Aptos" w:hAnsi="Aptos" w:cs="Aptos"/>
+        </w:rPr>
+        <w:t>──</w:t>
+      </w:r>
+      <w:r>
+        <w:t xml:space="preserve"> golden20_current_scores.json </w:t>
+      </w:r>
+      <w:r>
+        <w:rPr>
+          <w:rFonts w:ascii="Aptos" w:hAnsi="Aptos" w:cs="Aptos"/>
+        </w:rPr>
+        <w:t>←</w:t>
+      </w:r>
+      <w:r>
+        <w:t xml:space="preserve"> cache</w:t>
+      </w:r>
+      <w:r>
+        <w:br/>
+      </w:r>
+      <w:r>
+        <w:rPr>
+          <w:rFonts w:ascii="Aptos" w:hAnsi="Aptos" w:cs="Aptos"/>
+        </w:rPr>
+        <w:t>│</w:t>
+      </w:r>
+      <w:r>
+        <w:t xml:space="preserve"> </w:t>
+      </w:r>
+      <w:r>
+        <w:t xml:space="preserve"> </w:t>
+      </w:r>
+      <w:r>
+        <w:rPr>
+          <w:rFonts w:ascii="Aptos" w:hAnsi="Aptos" w:cs="Aptos"/>
+        </w:rPr>
+        <w:t>└──</w:t>
+      </w:r>
+      <w:r>
+        <w:t xml:space="preserve"> golden20_legacy_scores.json </w:t>
+      </w:r>
+      <w:r>
+        <w:rPr>
+          <w:rFonts w:ascii="Aptos" w:hAnsi="Aptos" w:cs="Aptos"/>
+        </w:rPr>
+        <w:t>←</w:t>
+      </w:r>
+      <w:r>
+        <w:t xml:space="preserve"> cache</w:t>
+      </w:r>
+      <w:r>
+        <w:br/>
+        <w:t>│</w:t>
+      </w:r>
+      <w:r>
+        <w:rPr>
+          <w:rFonts w:ascii="Aptos" w:hAnsi="Aptos" w:cs="Aptos"/>
+        </w:rPr>
+        <w:t>──</w:t>
+      </w:r>
+      <w:r>
         <w:t xml:space="preserve"> elements/</w:t>
       </w:r>
       <w:r>
@@ -1604,7 +1884,15 @@
         <w:t>└──</w:t>
       </w:r>
       <w:r>
-        <w:t xml:space="preserve"> element_C/</w:t>
+        <w:t xml:space="preserve"> </w:t>
+      </w:r>
+      <w:proofErr w:type="spellStart"/>
+      <w:r>
+        <w:t>element_C</w:t>
+      </w:r>
+      <w:proofErr w:type="spellEnd"/>
+      <w:r>
+        <w:t>/</w:t>
       </w:r>
       <w:r>
         <w:br/>
@@ -1739,7 +2027,15 @@
         <w:t>──</w:t>
       </w:r>
       <w:r>
-        <w:t xml:space="preserve"> current_api_scoring_documents/</w:t>
+        <w:t xml:space="preserve"> </w:t>
+      </w:r>
+      <w:proofErr w:type="spellStart"/>
+      <w:r>
+        <w:t>current_api_scoring_documents</w:t>
+      </w:r>
+      <w:proofErr w:type="spellEnd"/>
+      <w:r>
+        <w:t>/</w:t>
       </w:r>
       <w:r>
         <w:br/>
@@ -1760,7 +2056,15 @@
         <w:t>└──</w:t>
       </w:r>
       <w:r>
-        <w:t xml:space="preserve"> legacy_api_scoring_documents/</w:t>
+        <w:t xml:space="preserve"> </w:t>
+      </w:r>
+      <w:proofErr w:type="spellStart"/>
+      <w:r>
+        <w:t>legacy_api_scoring_documents</w:t>
+      </w:r>
+      <w:proofErr w:type="spellEnd"/>
+      <w:r>
+        <w:t>/</w:t>
       </w:r>
       <w:r>
         <w:br/>
@@ -1772,6 +2076,18 @@
         <w:t>│</w:t>
       </w:r>
       <w:r>
+        <w:rPr>
+          <w:rFonts w:ascii="Aptos" w:hAnsi="Aptos" w:cs="Aptos"/>
+        </w:rPr>
+        <w:t xml:space="preserve">       </w:t>
+      </w:r>
+      <w:r>
+        <w:rPr>
+          <w:rFonts w:ascii="Aptos" w:hAnsi="Aptos" w:cs="Aptos"/>
+        </w:rPr>
+        <w:t>└── validate_golden20_C.py</w:t>
+      </w:r>
+      <w:r>
         <w:br/>
       </w:r>
       <w:r>
@@ -1796,6 +2112,7 @@
         <w:rPr>
           <w:rFonts w:ascii="MS Gothic" w:eastAsia="MS Gothic" w:hAnsi="MS Gothic" w:cs="MS Gothic" w:hint="eastAsia"/>
         </w:rPr>
+        <w:lastRenderedPageBreak/>
         <w:t>├</w:t>
       </w:r>
       <w:r>
@@ -1805,7 +2122,15 @@
         <w:t>──</w:t>
       </w:r>
       <w:r>
-        <w:t xml:space="preserve"> simple_ui/</w:t>
+        <w:t xml:space="preserve"> </w:t>
+      </w:r>
+      <w:proofErr w:type="spellStart"/>
+      <w:r>
+        <w:t>simple_ui</w:t>
+      </w:r>
+      <w:proofErr w:type="spellEnd"/>
+      <w:r>
+        <w:t>/</w:t>
       </w:r>
       <w:r>
         <w:br/>
@@ -1848,7 +2173,6 @@
     </w:p>
     <w:p>
       <w:r>
-        <w:lastRenderedPageBreak/>
         <w:pict w14:anchorId="382B2E9B">
           <v:rect id="_x0000_i1034" style="width:0;height:1.5pt" o:hralign="center" o:hrstd="t" o:hr="t" fillcolor="#a0a0a0" stroked="f"/>
         </w:pict>
@@ -1925,6 +2249,858 @@
     </w:p>
     <w:p>
       <w:r>
+        <w:pict w14:anchorId="03FCAD0D">
+          <v:rect id="_x0000_i1094" style="width:0;height:1.5pt" o:hralign="center" o:hrstd="t" o:hr="t" fillcolor="#a0a0a0" stroked="f"/>
+        </w:pict>
+      </w:r>
+    </w:p>
+    <w:p>
+      <w:pPr>
+        <w:rPr>
+          <w:b/>
+          <w:bCs/>
+        </w:rPr>
+      </w:pPr>
+      <w:r>
+        <w:rPr>
+          <w:b/>
+          <w:bCs/>
+        </w:rPr>
+        <w:t>Diagnostics and Golden Benchmark Validation</w:t>
+      </w:r>
+    </w:p>
+    <w:p>
+      <w:r>
+        <w:t xml:space="preserve">This update adds a </w:t>
+      </w:r>
+      <w:r>
+        <w:rPr>
+          <w:b/>
+          <w:bCs/>
+        </w:rPr>
+        <w:t>quality assurance framework</w:t>
+      </w:r>
+      <w:r>
+        <w:t xml:space="preserve"> for the Element C scoring pipeline. The goal is to detect unintended changes in scoring behavior caused by model updates, prompt changes, calibration adjustments, or shifts in student responses.</w:t>
+      </w:r>
+    </w:p>
+    <w:p>
+      <w:r>
+        <w:t xml:space="preserve">The system consists of three components: </w:t>
+      </w:r>
+      <w:r>
+        <w:rPr>
+          <w:b/>
+          <w:bCs/>
+        </w:rPr>
+        <w:t>drift diagnostics</w:t>
+      </w:r>
+      <w:r>
+        <w:t xml:space="preserve">, </w:t>
+      </w:r>
+      <w:r>
+        <w:rPr>
+          <w:b/>
+          <w:bCs/>
+        </w:rPr>
+        <w:t>Golden 20 benchmark validation</w:t>
+      </w:r>
+      <w:r>
+        <w:t xml:space="preserve">, and </w:t>
+      </w:r>
+      <w:r>
+        <w:rPr>
+          <w:b/>
+          <w:bCs/>
+        </w:rPr>
+        <w:t>cached API scoring for reproducibility</w:t>
+      </w:r>
+      <w:r>
+        <w:t>.</w:t>
+      </w:r>
+    </w:p>
+    <w:p>
+      <w:r>
+        <w:pict w14:anchorId="6B42F7BD">
+          <v:rect id="_x0000_i1080" style="width:0;height:1.5pt" o:hralign="center" o:hrstd="t" o:hr="t" fillcolor="#a0a0a0" stroked="f"/>
+        </w:pict>
+      </w:r>
+    </w:p>
+    <w:p>
+      <w:pPr>
+        <w:rPr>
+          <w:b/>
+          <w:bCs/>
+        </w:rPr>
+      </w:pPr>
+      <w:r>
+        <w:rPr>
+          <w:b/>
+          <w:bCs/>
+        </w:rPr>
+        <w:t>Drift Diagnostics</w:t>
+      </w:r>
+    </w:p>
+    <w:p>
+      <w:r>
+        <w:t>The scoring pipeline now includes statistical monitoring of scoring outputs.</w:t>
+      </w:r>
+    </w:p>
+    <w:p>
+      <w:r>
+        <w:t>After each batch scoring run, the system computes summary statistics for both:</w:t>
+      </w:r>
+    </w:p>
+    <w:p>
+      <w:pPr>
+        <w:numPr>
+          <w:ilvl w:val="0"/>
+          <w:numId w:val="20"/>
+        </w:numPr>
+      </w:pPr>
+      <w:r>
+        <w:t xml:space="preserve">Raw API </w:t>
+      </w:r>
+      <w:proofErr w:type="spellStart"/>
+      <w:r>
+        <w:t>subscores</w:t>
+      </w:r>
+      <w:proofErr w:type="spellEnd"/>
+    </w:p>
+    <w:p>
+      <w:pPr>
+        <w:numPr>
+          <w:ilvl w:val="0"/>
+          <w:numId w:val="20"/>
+        </w:numPr>
+      </w:pPr>
+      <w:r>
+        <w:t>Final calibrated scores</w:t>
+      </w:r>
+    </w:p>
+    <w:p>
+      <w:r>
+        <w:lastRenderedPageBreak/>
+        <w:t>The following metrics are tracked:</w:t>
+      </w:r>
+    </w:p>
+    <w:p>
+      <w:pPr>
+        <w:numPr>
+          <w:ilvl w:val="0"/>
+          <w:numId w:val="21"/>
+        </w:numPr>
+      </w:pPr>
+      <w:r>
+        <w:t>Mean score</w:t>
+      </w:r>
+    </w:p>
+    <w:p>
+      <w:pPr>
+        <w:numPr>
+          <w:ilvl w:val="0"/>
+          <w:numId w:val="21"/>
+        </w:numPr>
+      </w:pPr>
+      <w:r>
+        <w:t>Standard deviation</w:t>
+      </w:r>
+    </w:p>
+    <w:p>
+      <w:pPr>
+        <w:numPr>
+          <w:ilvl w:val="0"/>
+          <w:numId w:val="21"/>
+        </w:numPr>
+      </w:pPr>
+      <w:r>
+        <w:t>Sample size</w:t>
+      </w:r>
+    </w:p>
+    <w:p>
+      <w:r>
+        <w:t xml:space="preserve">These metrics are compared to stored baseline values. If differences exceed defined thresholds, the system reports </w:t>
+      </w:r>
+      <w:r>
+        <w:rPr>
+          <w:b/>
+          <w:bCs/>
+        </w:rPr>
+        <w:t>drift detected</w:t>
+      </w:r>
+      <w:r>
+        <w:t>.</w:t>
+      </w:r>
+    </w:p>
+    <w:p>
+      <w:r>
+        <w:t>This helps identify situations such as:</w:t>
+      </w:r>
+    </w:p>
+    <w:p>
+      <w:pPr>
+        <w:numPr>
+          <w:ilvl w:val="0"/>
+          <w:numId w:val="22"/>
+        </w:numPr>
+      </w:pPr>
+      <w:r>
+        <w:t>Changes in GPT model behavior</w:t>
+      </w:r>
+    </w:p>
+    <w:p>
+      <w:pPr>
+        <w:numPr>
+          <w:ilvl w:val="0"/>
+          <w:numId w:val="22"/>
+        </w:numPr>
+      </w:pPr>
+      <w:r>
+        <w:t>Calibration parameter changes</w:t>
+      </w:r>
+    </w:p>
+    <w:p>
+      <w:pPr>
+        <w:numPr>
+          <w:ilvl w:val="0"/>
+          <w:numId w:val="22"/>
+        </w:numPr>
+      </w:pPr>
+      <w:r>
+        <w:t>Unexpected scoring shifts</w:t>
+      </w:r>
+    </w:p>
+    <w:p>
+      <w:r>
+        <w:t xml:space="preserve">Diagnostic output is displayed in the </w:t>
+      </w:r>
+      <w:r>
+        <w:rPr>
+          <w:b/>
+          <w:bCs/>
+        </w:rPr>
+        <w:t>Admin Diagnostics panel</w:t>
+      </w:r>
+      <w:r>
+        <w:t xml:space="preserve"> in the scoring interface.</w:t>
+      </w:r>
+    </w:p>
+    <w:p>
+      <w:r>
+        <w:pict w14:anchorId="032705ED">
+          <v:rect id="_x0000_i1081" style="width:0;height:1.5pt" o:hralign="center" o:hrstd="t" o:hr="t" fillcolor="#a0a0a0" stroked="f"/>
+        </w:pict>
+      </w:r>
+    </w:p>
+    <w:p>
+      <w:pPr>
+        <w:rPr>
+          <w:b/>
+          <w:bCs/>
+        </w:rPr>
+      </w:pPr>
+      <w:r>
+        <w:rPr>
+          <w:b/>
+          <w:bCs/>
+        </w:rPr>
+        <w:t>Golden 20 Benchmark Validation</w:t>
+      </w:r>
+    </w:p>
+    <w:p>
+      <w:r>
+        <w:t>A separate validation script verifies scoring accuracy against a fixed benchmark set.</w:t>
+      </w:r>
+    </w:p>
+    <w:p>
+      <w:r>
+        <w:t>validate_golden20_C.py</w:t>
+      </w:r>
+    </w:p>
+    <w:p>
+      <w:r>
+        <w:t xml:space="preserve">The Golden benchmark consists of </w:t>
+      </w:r>
+      <w:r>
+        <w:rPr>
+          <w:b/>
+          <w:bCs/>
+        </w:rPr>
+        <w:t>20 representative student submissions</w:t>
+      </w:r>
+      <w:r>
+        <w:t xml:space="preserve"> covering the full score range. Each document has an associated </w:t>
+      </w:r>
+      <w:r>
+        <w:rPr>
+          <w:b/>
+          <w:bCs/>
+        </w:rPr>
+        <w:t>expert score</w:t>
+      </w:r>
+      <w:r>
+        <w:t>.</w:t>
+      </w:r>
+    </w:p>
+    <w:p>
+      <w:r>
+        <w:t>During validation:</w:t>
+      </w:r>
+    </w:p>
+    <w:p>
+      <w:pPr>
+        <w:numPr>
+          <w:ilvl w:val="0"/>
+          <w:numId w:val="23"/>
+        </w:numPr>
+      </w:pPr>
+      <w:r>
+        <w:t>Each document is scored by the scoring pipeline</w:t>
+      </w:r>
+    </w:p>
+    <w:p>
+      <w:pPr>
+        <w:numPr>
+          <w:ilvl w:val="0"/>
+          <w:numId w:val="23"/>
+        </w:numPr>
+      </w:pPr>
+      <w:r>
+        <w:t>Calibration is applied</w:t>
+      </w:r>
+    </w:p>
+    <w:p>
+      <w:pPr>
+        <w:numPr>
+          <w:ilvl w:val="0"/>
+          <w:numId w:val="23"/>
+        </w:numPr>
+      </w:pPr>
+      <w:r>
+        <w:t>Final scores are compared to expert scores</w:t>
+      </w:r>
+    </w:p>
+    <w:p>
+      <w:r>
+        <w:t>The following evaluation metrics are calculated:</w:t>
+      </w:r>
+    </w:p>
+    <w:p>
+      <w:pPr>
+        <w:numPr>
+          <w:ilvl w:val="0"/>
+          <w:numId w:val="24"/>
+        </w:numPr>
+      </w:pPr>
+      <w:r>
+        <w:rPr>
+          <w:b/>
+          <w:bCs/>
+        </w:rPr>
+        <w:t>Bias</w:t>
+      </w:r>
+      <w:r>
+        <w:t xml:space="preserve"> – average difference between model and expert scores</w:t>
+      </w:r>
+    </w:p>
+    <w:p>
+      <w:pPr>
+        <w:numPr>
+          <w:ilvl w:val="0"/>
+          <w:numId w:val="24"/>
+        </w:numPr>
+      </w:pPr>
+      <w:r>
+        <w:rPr>
+          <w:b/>
+          <w:bCs/>
+        </w:rPr>
+        <w:t>MAE (Mean Absolute Error)</w:t>
+      </w:r>
+      <w:r>
+        <w:t xml:space="preserve"> – average absolute difference</w:t>
+      </w:r>
+    </w:p>
+    <w:p>
+      <w:pPr>
+        <w:numPr>
+          <w:ilvl w:val="0"/>
+          <w:numId w:val="24"/>
+        </w:numPr>
+      </w:pPr>
+      <w:r>
+        <w:rPr>
+          <w:b/>
+          <w:bCs/>
+        </w:rPr>
+        <w:t>95% Confidence Interval</w:t>
+      </w:r>
+      <w:r>
+        <w:t xml:space="preserve"> for bias</w:t>
+      </w:r>
+    </w:p>
+    <w:p>
+      <w:pPr>
+        <w:numPr>
+          <w:ilvl w:val="0"/>
+          <w:numId w:val="24"/>
+        </w:numPr>
+      </w:pPr>
+      <w:r>
+        <w:rPr>
+          <w:b/>
+          <w:bCs/>
+        </w:rPr>
+        <w:t>Mean calibrated score</w:t>
+      </w:r>
+    </w:p>
+    <w:p>
+      <w:r>
+        <w:lastRenderedPageBreak/>
+        <w:t>These metrics are compared to stored baseline metrics to determine whether scoring behavior has changed.</w:t>
+      </w:r>
+    </w:p>
+    <w:p>
+      <w:r>
+        <w:pict w14:anchorId="0B1AF6BE">
+          <v:rect id="_x0000_i1082" style="width:0;height:1.5pt" o:hralign="center" o:hrstd="t" o:hr="t" fillcolor="#a0a0a0" stroked="f"/>
+        </w:pict>
+      </w:r>
+    </w:p>
+    <w:p>
+      <w:pPr>
+        <w:rPr>
+          <w:b/>
+          <w:bCs/>
+        </w:rPr>
+      </w:pPr>
+      <w:r>
+        <w:rPr>
+          <w:b/>
+          <w:bCs/>
+        </w:rPr>
+        <w:t>Cached API Scoring</w:t>
+      </w:r>
+    </w:p>
+    <w:p>
+      <w:r>
+        <w:t>Golden benchmark runs can require multiple GPT calls. To avoid repeated API costs, the system caches the API scoring results.</w:t>
+      </w:r>
+    </w:p>
+    <w:p>
+      <w:r>
+        <w:t>On the first run:</w:t>
+      </w:r>
+    </w:p>
+    <w:p>
+      <w:pPr>
+        <w:numPr>
+          <w:ilvl w:val="0"/>
+          <w:numId w:val="25"/>
+        </w:numPr>
+      </w:pPr>
+      <w:r>
+        <w:t>Each Golden document is scored using GPT</w:t>
+      </w:r>
+    </w:p>
+    <w:p>
+      <w:pPr>
+        <w:numPr>
+          <w:ilvl w:val="0"/>
+          <w:numId w:val="25"/>
+        </w:numPr>
+      </w:pPr>
+      <w:proofErr w:type="spellStart"/>
+      <w:r>
+        <w:t>Subscores</w:t>
+      </w:r>
+      <w:proofErr w:type="spellEnd"/>
+      <w:r>
+        <w:t xml:space="preserve"> (C1–C6) are stored in cache files</w:t>
+      </w:r>
+    </w:p>
+    <w:p>
+      <w:r>
+        <w:t>golden20_current</w:t>
+      </w:r>
+      <w:r>
+        <w:t>_scores</w:t>
+      </w:r>
+      <w:r>
+        <w:t>.json</w:t>
+      </w:r>
+      <w:r>
+        <w:br/>
+        <w:t>golden20_legacy</w:t>
+      </w:r>
+      <w:r>
+        <w:t>_scores</w:t>
+      </w:r>
+      <w:r>
+        <w:t>.json</w:t>
+      </w:r>
+    </w:p>
+    <w:p>
+      <w:r>
+        <w:t>Subsequent validation runs reuse these cached scores, allowing the benchmark to run:</w:t>
+      </w:r>
+    </w:p>
+    <w:p>
+      <w:pPr>
+        <w:numPr>
+          <w:ilvl w:val="0"/>
+          <w:numId w:val="26"/>
+        </w:numPr>
+      </w:pPr>
+      <w:r>
+        <w:rPr>
+          <w:b/>
+          <w:bCs/>
+        </w:rPr>
+        <w:t>instantly</w:t>
+      </w:r>
+    </w:p>
+    <w:p>
+      <w:pPr>
+        <w:numPr>
+          <w:ilvl w:val="0"/>
+          <w:numId w:val="26"/>
+        </w:numPr>
+      </w:pPr>
+      <w:r>
+        <w:rPr>
+          <w:b/>
+          <w:bCs/>
+        </w:rPr>
+        <w:t>without API calls</w:t>
+      </w:r>
+    </w:p>
+    <w:p>
+      <w:pPr>
+        <w:numPr>
+          <w:ilvl w:val="0"/>
+          <w:numId w:val="26"/>
+        </w:numPr>
+      </w:pPr>
+      <w:r>
+        <w:rPr>
+          <w:b/>
+          <w:bCs/>
+        </w:rPr>
+        <w:t>without requiring an API key</w:t>
+      </w:r>
+    </w:p>
+    <w:p>
+      <w:r>
+        <w:t>This makes the validation process deterministic and reproducible for reviewers.</w:t>
+      </w:r>
+    </w:p>
+    <w:p>
+      <w:r>
+        <w:pict w14:anchorId="24789FDC">
+          <v:rect id="_x0000_i1083" style="width:0;height:1.5pt" o:hralign="center" o:hrstd="t" o:hr="t" fillcolor="#a0a0a0" stroked="f"/>
+        </w:pict>
+      </w:r>
+    </w:p>
+    <w:p>
+      <w:pPr>
+        <w:rPr>
+          <w:b/>
+          <w:bCs/>
+        </w:rPr>
+      </w:pPr>
+      <w:r>
+        <w:rPr>
+          <w:b/>
+          <w:bCs/>
+        </w:rPr>
+        <w:t>Baseline Metrics</w:t>
+      </w:r>
+    </w:p>
+    <w:p>
+      <w:r>
+        <w:t>Baseline evaluation results are stored in:</w:t>
+      </w:r>
+    </w:p>
+    <w:p>
+      <w:proofErr w:type="spellStart"/>
+      <w:r>
+        <w:t>golden_C_current_metrics.json</w:t>
+      </w:r>
+      <w:proofErr w:type="spellEnd"/>
+      <w:r>
+        <w:br/>
+      </w:r>
+      <w:proofErr w:type="spellStart"/>
+      <w:r>
+        <w:t>golden_C_legacy_metrics.json</w:t>
+      </w:r>
+      <w:proofErr w:type="spellEnd"/>
+    </w:p>
+    <w:p>
+      <w:r>
+        <w:t>These files represent the expected scoring behavior of the system. Future validation runs compare against these baselines to detect deviations.</w:t>
+      </w:r>
+    </w:p>
+    <w:p>
+      <w:r>
+        <w:pict w14:anchorId="4299744F">
+          <v:rect id="_x0000_i1084" style="width:0;height:1.5pt" o:hralign="center" o:hrstd="t" o:hr="t" fillcolor="#a0a0a0" stroked="f"/>
+        </w:pict>
+      </w:r>
+    </w:p>
+    <w:p>
+      <w:pPr>
+        <w:rPr>
+          <w:b/>
+          <w:bCs/>
+        </w:rPr>
+      </w:pPr>
+      <w:r>
+        <w:rPr>
+          <w:b/>
+          <w:bCs/>
+        </w:rPr>
+        <w:t>Running the Validator</w:t>
+      </w:r>
+    </w:p>
+    <w:p>
+      <w:r>
+        <w:t>To run the Golden benchmark validation:</w:t>
+      </w:r>
+    </w:p>
+    <w:p>
+      <w:r>
+        <w:t>python validate_golden20_C.py</w:t>
+      </w:r>
+    </w:p>
+    <w:p>
+      <w:r>
+        <w:lastRenderedPageBreak/>
+        <w:t>The script will:</w:t>
+      </w:r>
+    </w:p>
+    <w:p>
+      <w:pPr>
+        <w:numPr>
+          <w:ilvl w:val="0"/>
+          <w:numId w:val="27"/>
+        </w:numPr>
+      </w:pPr>
+      <w:r>
+        <w:t>Load cached API scores</w:t>
+      </w:r>
+    </w:p>
+    <w:p>
+      <w:pPr>
+        <w:numPr>
+          <w:ilvl w:val="0"/>
+          <w:numId w:val="27"/>
+        </w:numPr>
+      </w:pPr>
+      <w:r>
+        <w:t>Apply the calibration pipeline</w:t>
+      </w:r>
+    </w:p>
+    <w:p>
+      <w:pPr>
+        <w:numPr>
+          <w:ilvl w:val="0"/>
+          <w:numId w:val="27"/>
+        </w:numPr>
+      </w:pPr>
+      <w:r>
+        <w:t>Compute evaluation metrics</w:t>
+      </w:r>
+    </w:p>
+    <w:p>
+      <w:pPr>
+        <w:numPr>
+          <w:ilvl w:val="0"/>
+          <w:numId w:val="27"/>
+        </w:numPr>
+      </w:pPr>
+      <w:r>
+        <w:t>Compare results to stored baseline values</w:t>
+      </w:r>
+    </w:p>
+    <w:p>
+      <w:pPr>
+        <w:numPr>
+          <w:ilvl w:val="0"/>
+          <w:numId w:val="27"/>
+        </w:numPr>
+      </w:pPr>
+      <w:r>
+        <w:t>Report whether drift is detected</w:t>
+      </w:r>
+    </w:p>
+    <w:p>
+      <w:r>
+        <w:pict w14:anchorId="140FCA8A">
+          <v:rect id="_x0000_i1085" style="width:0;height:1.5pt" o:hralign="center" o:hrstd="t" o:hr="t" fillcolor="#a0a0a0" stroked="f"/>
+        </w:pict>
+      </w:r>
+    </w:p>
+    <w:p>
+      <w:pPr>
+        <w:rPr>
+          <w:b/>
+          <w:bCs/>
+        </w:rPr>
+      </w:pPr>
+      <w:r>
+        <w:rPr>
+          <w:b/>
+          <w:bCs/>
+        </w:rPr>
+        <w:t>Repository Contents</w:t>
+      </w:r>
+    </w:p>
+    <w:p>
+      <w:r>
+        <w:t>The repository includes the following benchmark configuration files:</w:t>
+      </w:r>
+    </w:p>
+    <w:p>
+      <w:r>
+        <w:t>validate_golden20_C.py</w:t>
+      </w:r>
+      <w:r>
+        <w:br/>
+      </w:r>
+      <w:proofErr w:type="spellStart"/>
+      <w:r>
+        <w:t>golden_C_current_cases.json</w:t>
+      </w:r>
+      <w:proofErr w:type="spellEnd"/>
+      <w:r>
+        <w:br/>
+      </w:r>
+      <w:proofErr w:type="spellStart"/>
+      <w:r>
+        <w:t>golden_C_legacy_cases.json</w:t>
+      </w:r>
+      <w:proofErr w:type="spellEnd"/>
+      <w:r>
+        <w:br/>
+      </w:r>
+      <w:proofErr w:type="spellStart"/>
+      <w:r>
+        <w:t>golden_C_current_metrics.json</w:t>
+      </w:r>
+      <w:proofErr w:type="spellEnd"/>
+      <w:r>
+        <w:br/>
+      </w:r>
+      <w:proofErr w:type="spellStart"/>
+      <w:r>
+        <w:t>golden_C_legacy_metrics.json</w:t>
+      </w:r>
+      <w:proofErr w:type="spellEnd"/>
+      <w:r>
+        <w:br/>
+        <w:t>golden20_api_scores_current.json</w:t>
+      </w:r>
+      <w:r>
+        <w:br/>
+        <w:t>golden20_api_scores_legacy.json</w:t>
+      </w:r>
+    </w:p>
+    <w:p>
+      <w:r>
+        <w:t xml:space="preserve">The actual Golden benchmark documents are </w:t>
+      </w:r>
+      <w:r>
+        <w:rPr>
+          <w:b/>
+          <w:bCs/>
+        </w:rPr>
+        <w:t>not included in the repository</w:t>
+      </w:r>
+      <w:r>
+        <w:t>.</w:t>
+      </w:r>
+    </w:p>
+    <w:p>
+      <w:r>
+        <w:pict w14:anchorId="3CD9C508">
+          <v:rect id="_x0000_i1086" style="width:0;height:1.5pt" o:hralign="center" o:hrstd="t" o:hr="t" fillcolor="#a0a0a0" stroked="f"/>
+        </w:pict>
+      </w:r>
+    </w:p>
+    <w:p>
+      <w:pPr>
+        <w:rPr>
+          <w:b/>
+          <w:bCs/>
+        </w:rPr>
+      </w:pPr>
+      <w:r>
+        <w:rPr>
+          <w:b/>
+          <w:bCs/>
+        </w:rPr>
+        <w:t>Purpose</w:t>
+      </w:r>
+    </w:p>
+    <w:p>
+      <w:r>
+        <w:t>Together, the diagnostics system and Golden benchmark validation provide a reproducible way to detect:</w:t>
+      </w:r>
+    </w:p>
+    <w:p>
+      <w:pPr>
+        <w:numPr>
+          <w:ilvl w:val="0"/>
+          <w:numId w:val="28"/>
+        </w:numPr>
+      </w:pPr>
+      <w:r>
+        <w:t>GPT model drift</w:t>
+      </w:r>
+    </w:p>
+    <w:p>
+      <w:pPr>
+        <w:numPr>
+          <w:ilvl w:val="0"/>
+          <w:numId w:val="28"/>
+        </w:numPr>
+      </w:pPr>
+      <w:r>
+        <w:t>calibration changes</w:t>
+      </w:r>
+    </w:p>
+    <w:p>
+      <w:pPr>
+        <w:numPr>
+          <w:ilvl w:val="0"/>
+          <w:numId w:val="28"/>
+        </w:numPr>
+      </w:pPr>
+      <w:r>
+        <w:t>scoring pipeline errors</w:t>
+      </w:r>
+    </w:p>
+    <w:p>
+      <w:pPr>
+        <w:numPr>
+          <w:ilvl w:val="0"/>
+          <w:numId w:val="28"/>
+        </w:numPr>
+      </w:pPr>
+      <w:r>
+        <w:t>shifts in scoring accuracy</w:t>
+      </w:r>
+    </w:p>
+    <w:p>
+      <w:r>
+        <w:t>This ensures that automated scoring remains stable and consistent over time.</w:t>
+      </w:r>
+    </w:p>
+    <w:p/>
+    <w:p>
+      <w:r>
         <w:pict w14:anchorId="6BA7B863">
           <v:rect id="_x0000_i1035" style="width:0;height:1.5pt" o:hralign="center" o:hrstd="t" o:hr="t" fillcolor="#a0a0a0" stroked="f"/>
         </w:pict>
@@ -1942,6 +3118,7 @@
           <w:b/>
           <w:bCs/>
         </w:rPr>
+        <w:lastRenderedPageBreak/>
         <w:t>Known Limitations</w:t>
       </w:r>
     </w:p>
@@ -2013,20 +3190,10 @@
     </w:p>
     <w:p>
       <w:pPr>
-        <w:numPr>
-          <w:ilvl w:val="0"/>
-          <w:numId w:val="15"/>
-        </w:numPr>
-      </w:pPr>
-      <w:r>
-        <w:t>Rebaseline with expanded Current document corpus</w:t>
-      </w:r>
-    </w:p>
-    <w:p>
-      <w:pPr>
-        <w:numPr>
-          <w:ilvl w:val="0"/>
-          <w:numId w:val="15"/>
+        <w:pStyle w:val="ListParagraph"/>
+        <w:numPr>
+          <w:ilvl w:val="0"/>
+          <w:numId w:val="19"/>
         </w:numPr>
       </w:pPr>
       <w:r>
@@ -2035,20 +3202,22 @@
     </w:p>
     <w:p>
       <w:pPr>
-        <w:numPr>
-          <w:ilvl w:val="0"/>
-          <w:numId w:val="15"/>
-        </w:numPr>
-      </w:pPr>
-      <w:r>
-        <w:t>Implement drift monitoring comparison tool</w:t>
-      </w:r>
-    </w:p>
-    <w:p>
-      <w:pPr>
-        <w:numPr>
-          <w:ilvl w:val="0"/>
-          <w:numId w:val="15"/>
+        <w:pStyle w:val="ListParagraph"/>
+        <w:numPr>
+          <w:ilvl w:val="0"/>
+          <w:numId w:val="19"/>
+        </w:numPr>
+      </w:pPr>
+      <w:r>
+        <w:t>Integrate Golden 20 Regression testing with scoring pipeline and diagnostics</w:t>
+      </w:r>
+    </w:p>
+    <w:p>
+      <w:pPr>
+        <w:pStyle w:val="ListParagraph"/>
+        <w:numPr>
+          <w:ilvl w:val="0"/>
+          <w:numId w:val="19"/>
         </w:numPr>
       </w:pPr>
       <w:r>
@@ -2101,6 +3270,119 @@
 <file path=word/numbering.xml><?xml version="1.0" encoding="utf-8"?>
 <w:numbering xmlns:wpc="http://schemas.microsoft.com/office/word/2010/wordprocessingCanvas" xmlns:cx="http://schemas.microsoft.com/office/drawing/2014/chartex" xmlns:cx1="http://schemas.microsoft.com/office/drawing/2015/9/8/chartex" xmlns:cx2="http://schemas.microsoft.com/office/drawing/2015/10/21/chartex" xmlns:cx3="http://schemas.microsoft.com/office/drawing/2016/5/9/chartex" xmlns:cx4="http://schemas.microsoft.com/office/drawing/2016/5/10/chartex" xmlns:cx5="http://schemas.microsoft.com/office/drawing/2016/5/11/chartex" xmlns:cx6="http://schemas.microsoft.com/office/drawing/2016/5/12/chartex" xmlns:cx7="http://schemas.microsoft.com/office/drawing/2016/5/13/chartex" xmlns:cx8="http://schemas.microsoft.com/office/drawing/2016/5/14/chartex" xmlns:mc="http://schemas.openxmlformats.org/markup-compatibility/2006" xmlns:aink="http://schemas.microsoft.com/office/drawing/2016/ink" xmlns:am3d="http://schemas.microsoft.com/office/drawing/2017/model3d" xmlns:o="urn:schemas-microsoft-com:office:office" xmlns:oel="http://schemas.microsoft.com/office/2019/extlst" xmlns:r="http://schemas.openxmlformats.org/officeDocument/2006/relationships" xmlns:m="http://schemas.openxmlformats.org/officeDocument/2006/math" xmlns:v="urn:schemas-microsoft-com:vml" xmlns:wp14="http://schemas.microsoft.com/office/word/2010/wordprocessingDrawing" xmlns:wp="http://schemas.openxmlformats.org/drawingml/2006/wordprocessingDrawing" xmlns:w10="urn:schemas-microsoft-com:office:word" xmlns:w="http://schemas.openxmlformats.org/wordprocessingml/2006/main" xmlns:w14="http://schemas.microsoft.com/office/word/2010/wordml" xmlns:w15="http://schemas.microsoft.com/office/word/2012/wordml" xmlns:w16cex="http://schemas.microsoft.com/office/word/2018/wordml/cex" xmlns:w16cid="http://schemas.microsoft.com/office/word/2016/wordml/cid" xmlns:w16="http://schemas.microsoft.com/office/word/2018/wordml" xmlns:w16du="http://schemas.microsoft.com/office/word/2023/wordml/word16du" xmlns:w16sdtdh="http://schemas.microsoft.com/office/word/2020/wordml/sdtdatahash" xmlns:w16sdtfl="http://schemas.microsoft.com/office/word/2024/wordml/sdtformatlock" xmlns:w16se="http://schemas.microsoft.com/office/word/2015/wordml/symex" xmlns:wpg="http://schemas.microsoft.com/office/word/2010/wordprocessingGroup" xmlns:wpi="http://schemas.microsoft.com/office/word/2010/wordprocessingInk" xmlns:wne="http://schemas.microsoft.com/office/word/2006/wordml" xmlns:wps="http://schemas.microsoft.com/office/word/2010/wordprocessingShape" mc:Ignorable="w14 w15 w16se w16cid w16 w16cex w16sdtdh w16sdtfl w16du wp14">
   <w:abstractNum w:abstractNumId="0" w15:restartNumberingAfterBreak="0">
+    <w:nsid w:val="027B4D16"/>
+    <w:multiLevelType w:val="multilevel"/>
+    <w:tmpl w:val="1312F32C"/>
+    <w:lvl w:ilvl="0">
+      <w:start w:val="1"/>
+      <w:numFmt w:val="decimal"/>
+      <w:lvlText w:val="%1."/>
+      <w:lvlJc w:val="left"/>
+      <w:pPr>
+        <w:tabs>
+          <w:tab w:val="num" w:pos="720"/>
+        </w:tabs>
+        <w:ind w:left="720" w:hanging="360"/>
+      </w:pPr>
+    </w:lvl>
+    <w:lvl w:ilvl="1" w:tentative="1">
+      <w:start w:val="1"/>
+      <w:numFmt w:val="decimal"/>
+      <w:lvlText w:val="%2."/>
+      <w:lvlJc w:val="left"/>
+      <w:pPr>
+        <w:tabs>
+          <w:tab w:val="num" w:pos="1440"/>
+        </w:tabs>
+        <w:ind w:left="1440" w:hanging="360"/>
+      </w:pPr>
+    </w:lvl>
+    <w:lvl w:ilvl="2" w:tentative="1">
+      <w:start w:val="1"/>
+      <w:numFmt w:val="decimal"/>
+      <w:lvlText w:val="%3."/>
+      <w:lvlJc w:val="left"/>
+      <w:pPr>
+        <w:tabs>
+          <w:tab w:val="num" w:pos="2160"/>
+        </w:tabs>
+        <w:ind w:left="2160" w:hanging="360"/>
+      </w:pPr>
+    </w:lvl>
+    <w:lvl w:ilvl="3" w:tentative="1">
+      <w:start w:val="1"/>
+      <w:numFmt w:val="decimal"/>
+      <w:lvlText w:val="%4."/>
+      <w:lvlJc w:val="left"/>
+      <w:pPr>
+        <w:tabs>
+          <w:tab w:val="num" w:pos="2880"/>
+        </w:tabs>
+        <w:ind w:left="2880" w:hanging="360"/>
+      </w:pPr>
+    </w:lvl>
+    <w:lvl w:ilvl="4" w:tentative="1">
+      <w:start w:val="1"/>
+      <w:numFmt w:val="decimal"/>
+      <w:lvlText w:val="%5."/>
+      <w:lvlJc w:val="left"/>
+      <w:pPr>
+        <w:tabs>
+          <w:tab w:val="num" w:pos="3600"/>
+        </w:tabs>
+        <w:ind w:left="3600" w:hanging="360"/>
+      </w:pPr>
+    </w:lvl>
+    <w:lvl w:ilvl="5" w:tentative="1">
+      <w:start w:val="1"/>
+      <w:numFmt w:val="decimal"/>
+      <w:lvlText w:val="%6."/>
+      <w:lvlJc w:val="left"/>
+      <w:pPr>
+        <w:tabs>
+          <w:tab w:val="num" w:pos="4320"/>
+        </w:tabs>
+        <w:ind w:left="4320" w:hanging="360"/>
+      </w:pPr>
+    </w:lvl>
+    <w:lvl w:ilvl="6" w:tentative="1">
+      <w:start w:val="1"/>
+      <w:numFmt w:val="decimal"/>
+      <w:lvlText w:val="%7."/>
+      <w:lvlJc w:val="left"/>
+      <w:pPr>
+        <w:tabs>
+          <w:tab w:val="num" w:pos="5040"/>
+        </w:tabs>
+        <w:ind w:left="5040" w:hanging="360"/>
+      </w:pPr>
+    </w:lvl>
+    <w:lvl w:ilvl="7" w:tentative="1">
+      <w:start w:val="1"/>
+      <w:numFmt w:val="decimal"/>
+      <w:lvlText w:val="%8."/>
+      <w:lvlJc w:val="left"/>
+      <w:pPr>
+        <w:tabs>
+          <w:tab w:val="num" w:pos="5760"/>
+        </w:tabs>
+        <w:ind w:left="5760" w:hanging="360"/>
+      </w:pPr>
+    </w:lvl>
+    <w:lvl w:ilvl="8" w:tentative="1">
+      <w:start w:val="1"/>
+      <w:numFmt w:val="decimal"/>
+      <w:lvlText w:val="%9."/>
+      <w:lvlJc w:val="left"/>
+      <w:pPr>
+        <w:tabs>
+          <w:tab w:val="num" w:pos="6480"/>
+        </w:tabs>
+        <w:ind w:left="6480" w:hanging="360"/>
+      </w:pPr>
+    </w:lvl>
+  </w:abstractNum>
+  <w:abstractNum w:abstractNumId="1" w15:restartNumberingAfterBreak="0">
     <w:nsid w:val="05CE525E"/>
     <w:multiLevelType w:val="multilevel"/>
     <w:tmpl w:val="3A648B90"/>
@@ -2249,7 +3531,7 @@
       </w:rPr>
     </w:lvl>
   </w:abstractNum>
-  <w:abstractNum w:abstractNumId="1" w15:restartNumberingAfterBreak="0">
+  <w:abstractNum w:abstractNumId="2" w15:restartNumberingAfterBreak="0">
     <w:nsid w:val="09D857C4"/>
     <w:multiLevelType w:val="multilevel"/>
     <w:tmpl w:val="70C83624"/>
@@ -2398,7 +3680,120 @@
       </w:rPr>
     </w:lvl>
   </w:abstractNum>
-  <w:abstractNum w:abstractNumId="2" w15:restartNumberingAfterBreak="0">
+  <w:abstractNum w:abstractNumId="3" w15:restartNumberingAfterBreak="0">
+    <w:nsid w:val="0AD52BBB"/>
+    <w:multiLevelType w:val="hybridMultilevel"/>
+    <w:tmpl w:val="C88C4386"/>
+    <w:lvl w:ilvl="0" w:tplc="04090001">
+      <w:start w:val="1"/>
+      <w:numFmt w:val="bullet"/>
+      <w:lvlText w:val=""/>
+      <w:lvlJc w:val="left"/>
+      <w:pPr>
+        <w:ind w:left="720" w:hanging="360"/>
+      </w:pPr>
+      <w:rPr>
+        <w:rFonts w:ascii="Symbol" w:hAnsi="Symbol" w:hint="default"/>
+      </w:rPr>
+    </w:lvl>
+    <w:lvl w:ilvl="1" w:tplc="04090003" w:tentative="1">
+      <w:start w:val="1"/>
+      <w:numFmt w:val="bullet"/>
+      <w:lvlText w:val="o"/>
+      <w:lvlJc w:val="left"/>
+      <w:pPr>
+        <w:ind w:left="1440" w:hanging="360"/>
+      </w:pPr>
+      <w:rPr>
+        <w:rFonts w:ascii="Courier New" w:hAnsi="Courier New" w:cs="Courier New" w:hint="default"/>
+      </w:rPr>
+    </w:lvl>
+    <w:lvl w:ilvl="2" w:tplc="04090005" w:tentative="1">
+      <w:start w:val="1"/>
+      <w:numFmt w:val="bullet"/>
+      <w:lvlText w:val=""/>
+      <w:lvlJc w:val="left"/>
+      <w:pPr>
+        <w:ind w:left="2160" w:hanging="360"/>
+      </w:pPr>
+      <w:rPr>
+        <w:rFonts w:ascii="Wingdings" w:hAnsi="Wingdings" w:hint="default"/>
+      </w:rPr>
+    </w:lvl>
+    <w:lvl w:ilvl="3" w:tplc="04090001" w:tentative="1">
+      <w:start w:val="1"/>
+      <w:numFmt w:val="bullet"/>
+      <w:lvlText w:val=""/>
+      <w:lvlJc w:val="left"/>
+      <w:pPr>
+        <w:ind w:left="2880" w:hanging="360"/>
+      </w:pPr>
+      <w:rPr>
+        <w:rFonts w:ascii="Symbol" w:hAnsi="Symbol" w:hint="default"/>
+      </w:rPr>
+    </w:lvl>
+    <w:lvl w:ilvl="4" w:tplc="04090003" w:tentative="1">
+      <w:start w:val="1"/>
+      <w:numFmt w:val="bullet"/>
+      <w:lvlText w:val="o"/>
+      <w:lvlJc w:val="left"/>
+      <w:pPr>
+        <w:ind w:left="3600" w:hanging="360"/>
+      </w:pPr>
+      <w:rPr>
+        <w:rFonts w:ascii="Courier New" w:hAnsi="Courier New" w:cs="Courier New" w:hint="default"/>
+      </w:rPr>
+    </w:lvl>
+    <w:lvl w:ilvl="5" w:tplc="04090005" w:tentative="1">
+      <w:start w:val="1"/>
+      <w:numFmt w:val="bullet"/>
+      <w:lvlText w:val=""/>
+      <w:lvlJc w:val="left"/>
+      <w:pPr>
+        <w:ind w:left="4320" w:hanging="360"/>
+      </w:pPr>
+      <w:rPr>
+        <w:rFonts w:ascii="Wingdings" w:hAnsi="Wingdings" w:hint="default"/>
+      </w:rPr>
+    </w:lvl>
+    <w:lvl w:ilvl="6" w:tplc="04090001" w:tentative="1">
+      <w:start w:val="1"/>
+      <w:numFmt w:val="bullet"/>
+      <w:lvlText w:val=""/>
+      <w:lvlJc w:val="left"/>
+      <w:pPr>
+        <w:ind w:left="5040" w:hanging="360"/>
+      </w:pPr>
+      <w:rPr>
+        <w:rFonts w:ascii="Symbol" w:hAnsi="Symbol" w:hint="default"/>
+      </w:rPr>
+    </w:lvl>
+    <w:lvl w:ilvl="7" w:tplc="04090003" w:tentative="1">
+      <w:start w:val="1"/>
+      <w:numFmt w:val="bullet"/>
+      <w:lvlText w:val="o"/>
+      <w:lvlJc w:val="left"/>
+      <w:pPr>
+        <w:ind w:left="5760" w:hanging="360"/>
+      </w:pPr>
+      <w:rPr>
+        <w:rFonts w:ascii="Courier New" w:hAnsi="Courier New" w:cs="Courier New" w:hint="default"/>
+      </w:rPr>
+    </w:lvl>
+    <w:lvl w:ilvl="8" w:tplc="04090005" w:tentative="1">
+      <w:start w:val="1"/>
+      <w:numFmt w:val="bullet"/>
+      <w:lvlText w:val=""/>
+      <w:lvlJc w:val="left"/>
+      <w:pPr>
+        <w:ind w:left="6480" w:hanging="360"/>
+      </w:pPr>
+      <w:rPr>
+        <w:rFonts w:ascii="Wingdings" w:hAnsi="Wingdings" w:hint="default"/>
+      </w:rPr>
+    </w:lvl>
+  </w:abstractNum>
+  <w:abstractNum w:abstractNumId="4" w15:restartNumberingAfterBreak="0">
     <w:nsid w:val="0D4414A0"/>
     <w:multiLevelType w:val="multilevel"/>
     <w:tmpl w:val="EBFA69B4"/>
@@ -2547,7 +3942,7 @@
       </w:rPr>
     </w:lvl>
   </w:abstractNum>
-  <w:abstractNum w:abstractNumId="3" w15:restartNumberingAfterBreak="0">
+  <w:abstractNum w:abstractNumId="5" w15:restartNumberingAfterBreak="0">
     <w:nsid w:val="116629C5"/>
     <w:multiLevelType w:val="multilevel"/>
     <w:tmpl w:val="4EC2DAC0"/>
@@ -2696,7 +4091,7 @@
       </w:rPr>
     </w:lvl>
   </w:abstractNum>
-  <w:abstractNum w:abstractNumId="4" w15:restartNumberingAfterBreak="0">
+  <w:abstractNum w:abstractNumId="6" w15:restartNumberingAfterBreak="0">
     <w:nsid w:val="15E4708E"/>
     <w:multiLevelType w:val="multilevel"/>
     <w:tmpl w:val="21EEF558"/>
@@ -2845,7 +4240,7 @@
       </w:rPr>
     </w:lvl>
   </w:abstractNum>
-  <w:abstractNum w:abstractNumId="5" w15:restartNumberingAfterBreak="0">
+  <w:abstractNum w:abstractNumId="7" w15:restartNumberingAfterBreak="0">
     <w:nsid w:val="191D2ACE"/>
     <w:multiLevelType w:val="multilevel"/>
     <w:tmpl w:val="9C40C218"/>
@@ -2994,7 +4389,7 @@
       </w:rPr>
     </w:lvl>
   </w:abstractNum>
-  <w:abstractNum w:abstractNumId="6" w15:restartNumberingAfterBreak="0">
+  <w:abstractNum w:abstractNumId="8" w15:restartNumberingAfterBreak="0">
     <w:nsid w:val="1D1C7519"/>
     <w:multiLevelType w:val="multilevel"/>
     <w:tmpl w:val="3EEC5508"/>
@@ -3143,7 +4538,7 @@
       </w:rPr>
     </w:lvl>
   </w:abstractNum>
-  <w:abstractNum w:abstractNumId="7" w15:restartNumberingAfterBreak="0">
+  <w:abstractNum w:abstractNumId="9" w15:restartNumberingAfterBreak="0">
     <w:nsid w:val="1FEE1A53"/>
     <w:multiLevelType w:val="multilevel"/>
     <w:tmpl w:val="21EEF558"/>
@@ -3292,7 +4687,7 @@
       </w:rPr>
     </w:lvl>
   </w:abstractNum>
-  <w:abstractNum w:abstractNumId="8" w15:restartNumberingAfterBreak="0">
+  <w:abstractNum w:abstractNumId="10" w15:restartNumberingAfterBreak="0">
     <w:nsid w:val="2A3872E5"/>
     <w:multiLevelType w:val="multilevel"/>
     <w:tmpl w:val="F592972E"/>
@@ -3441,7 +4836,7 @@
       </w:rPr>
     </w:lvl>
   </w:abstractNum>
-  <w:abstractNum w:abstractNumId="9" w15:restartNumberingAfterBreak="0">
+  <w:abstractNum w:abstractNumId="11" w15:restartNumberingAfterBreak="0">
     <w:nsid w:val="31DD1C96"/>
     <w:multiLevelType w:val="multilevel"/>
     <w:tmpl w:val="CC789F9A"/>
@@ -3590,7 +4985,156 @@
       </w:rPr>
     </w:lvl>
   </w:abstractNum>
-  <w:abstractNum w:abstractNumId="10" w15:restartNumberingAfterBreak="0">
+  <w:abstractNum w:abstractNumId="12" w15:restartNumberingAfterBreak="0">
+    <w:nsid w:val="37224089"/>
+    <w:multiLevelType w:val="multilevel"/>
+    <w:tmpl w:val="FE0480E8"/>
+    <w:lvl w:ilvl="0">
+      <w:start w:val="1"/>
+      <w:numFmt w:val="bullet"/>
+      <w:lvlText w:val=""/>
+      <w:lvlJc w:val="left"/>
+      <w:pPr>
+        <w:tabs>
+          <w:tab w:val="num" w:pos="720"/>
+        </w:tabs>
+        <w:ind w:left="720" w:hanging="360"/>
+      </w:pPr>
+      <w:rPr>
+        <w:rFonts w:ascii="Symbol" w:hAnsi="Symbol" w:hint="default"/>
+        <w:sz w:val="20"/>
+      </w:rPr>
+    </w:lvl>
+    <w:lvl w:ilvl="1" w:tentative="1">
+      <w:start w:val="1"/>
+      <w:numFmt w:val="bullet"/>
+      <w:lvlText w:val="o"/>
+      <w:lvlJc w:val="left"/>
+      <w:pPr>
+        <w:tabs>
+          <w:tab w:val="num" w:pos="1440"/>
+        </w:tabs>
+        <w:ind w:left="1440" w:hanging="360"/>
+      </w:pPr>
+      <w:rPr>
+        <w:rFonts w:ascii="Courier New" w:hAnsi="Courier New" w:hint="default"/>
+        <w:sz w:val="20"/>
+      </w:rPr>
+    </w:lvl>
+    <w:lvl w:ilvl="2" w:tentative="1">
+      <w:start w:val="1"/>
+      <w:numFmt w:val="bullet"/>
+      <w:lvlText w:val=""/>
+      <w:lvlJc w:val="left"/>
+      <w:pPr>
+        <w:tabs>
+          <w:tab w:val="num" w:pos="2160"/>
+        </w:tabs>
+        <w:ind w:left="2160" w:hanging="360"/>
+      </w:pPr>
+      <w:rPr>
+        <w:rFonts w:ascii="Wingdings" w:hAnsi="Wingdings" w:hint="default"/>
+        <w:sz w:val="20"/>
+      </w:rPr>
+    </w:lvl>
+    <w:lvl w:ilvl="3" w:tentative="1">
+      <w:start w:val="1"/>
+      <w:numFmt w:val="bullet"/>
+      <w:lvlText w:val=""/>
+      <w:lvlJc w:val="left"/>
+      <w:pPr>
+        <w:tabs>
+          <w:tab w:val="num" w:pos="2880"/>
+        </w:tabs>
+        <w:ind w:left="2880" w:hanging="360"/>
+      </w:pPr>
+      <w:rPr>
+        <w:rFonts w:ascii="Wingdings" w:hAnsi="Wingdings" w:hint="default"/>
+        <w:sz w:val="20"/>
+      </w:rPr>
+    </w:lvl>
+    <w:lvl w:ilvl="4" w:tentative="1">
+      <w:start w:val="1"/>
+      <w:numFmt w:val="bullet"/>
+      <w:lvlText w:val=""/>
+      <w:lvlJc w:val="left"/>
+      <w:pPr>
+        <w:tabs>
+          <w:tab w:val="num" w:pos="3600"/>
+        </w:tabs>
+        <w:ind w:left="3600" w:hanging="360"/>
+      </w:pPr>
+      <w:rPr>
+        <w:rFonts w:ascii="Wingdings" w:hAnsi="Wingdings" w:hint="default"/>
+        <w:sz w:val="20"/>
+      </w:rPr>
+    </w:lvl>
+    <w:lvl w:ilvl="5" w:tentative="1">
+      <w:start w:val="1"/>
+      <w:numFmt w:val="bullet"/>
+      <w:lvlText w:val=""/>
+      <w:lvlJc w:val="left"/>
+      <w:pPr>
+        <w:tabs>
+          <w:tab w:val="num" w:pos="4320"/>
+        </w:tabs>
+        <w:ind w:left="4320" w:hanging="360"/>
+      </w:pPr>
+      <w:rPr>
+        <w:rFonts w:ascii="Wingdings" w:hAnsi="Wingdings" w:hint="default"/>
+        <w:sz w:val="20"/>
+      </w:rPr>
+    </w:lvl>
+    <w:lvl w:ilvl="6" w:tentative="1">
+      <w:start w:val="1"/>
+      <w:numFmt w:val="bullet"/>
+      <w:lvlText w:val=""/>
+      <w:lvlJc w:val="left"/>
+      <w:pPr>
+        <w:tabs>
+          <w:tab w:val="num" w:pos="5040"/>
+        </w:tabs>
+        <w:ind w:left="5040" w:hanging="360"/>
+      </w:pPr>
+      <w:rPr>
+        <w:rFonts w:ascii="Wingdings" w:hAnsi="Wingdings" w:hint="default"/>
+        <w:sz w:val="20"/>
+      </w:rPr>
+    </w:lvl>
+    <w:lvl w:ilvl="7" w:tentative="1">
+      <w:start w:val="1"/>
+      <w:numFmt w:val="bullet"/>
+      <w:lvlText w:val=""/>
+      <w:lvlJc w:val="left"/>
+      <w:pPr>
+        <w:tabs>
+          <w:tab w:val="num" w:pos="5760"/>
+        </w:tabs>
+        <w:ind w:left="5760" w:hanging="360"/>
+      </w:pPr>
+      <w:rPr>
+        <w:rFonts w:ascii="Wingdings" w:hAnsi="Wingdings" w:hint="default"/>
+        <w:sz w:val="20"/>
+      </w:rPr>
+    </w:lvl>
+    <w:lvl w:ilvl="8" w:tentative="1">
+      <w:start w:val="1"/>
+      <w:numFmt w:val="bullet"/>
+      <w:lvlText w:val=""/>
+      <w:lvlJc w:val="left"/>
+      <w:pPr>
+        <w:tabs>
+          <w:tab w:val="num" w:pos="6480"/>
+        </w:tabs>
+        <w:ind w:left="6480" w:hanging="360"/>
+      </w:pPr>
+      <w:rPr>
+        <w:rFonts w:ascii="Wingdings" w:hAnsi="Wingdings" w:hint="default"/>
+        <w:sz w:val="20"/>
+      </w:rPr>
+    </w:lvl>
+  </w:abstractNum>
+  <w:abstractNum w:abstractNumId="13" w15:restartNumberingAfterBreak="0">
     <w:nsid w:val="3E2B3C44"/>
     <w:multiLevelType w:val="multilevel"/>
     <w:tmpl w:val="21EEF558"/>
@@ -3739,7 +5283,156 @@
       </w:rPr>
     </w:lvl>
   </w:abstractNum>
-  <w:abstractNum w:abstractNumId="11" w15:restartNumberingAfterBreak="0">
+  <w:abstractNum w:abstractNumId="14" w15:restartNumberingAfterBreak="0">
+    <w:nsid w:val="3E7D7F89"/>
+    <w:multiLevelType w:val="multilevel"/>
+    <w:tmpl w:val="09BCDC46"/>
+    <w:lvl w:ilvl="0">
+      <w:start w:val="1"/>
+      <w:numFmt w:val="bullet"/>
+      <w:lvlText w:val=""/>
+      <w:lvlJc w:val="left"/>
+      <w:pPr>
+        <w:tabs>
+          <w:tab w:val="num" w:pos="720"/>
+        </w:tabs>
+        <w:ind w:left="720" w:hanging="360"/>
+      </w:pPr>
+      <w:rPr>
+        <w:rFonts w:ascii="Symbol" w:hAnsi="Symbol" w:hint="default"/>
+        <w:sz w:val="20"/>
+      </w:rPr>
+    </w:lvl>
+    <w:lvl w:ilvl="1" w:tentative="1">
+      <w:start w:val="1"/>
+      <w:numFmt w:val="bullet"/>
+      <w:lvlText w:val="o"/>
+      <w:lvlJc w:val="left"/>
+      <w:pPr>
+        <w:tabs>
+          <w:tab w:val="num" w:pos="1440"/>
+        </w:tabs>
+        <w:ind w:left="1440" w:hanging="360"/>
+      </w:pPr>
+      <w:rPr>
+        <w:rFonts w:ascii="Courier New" w:hAnsi="Courier New" w:hint="default"/>
+        <w:sz w:val="20"/>
+      </w:rPr>
+    </w:lvl>
+    <w:lvl w:ilvl="2" w:tentative="1">
+      <w:start w:val="1"/>
+      <w:numFmt w:val="bullet"/>
+      <w:lvlText w:val=""/>
+      <w:lvlJc w:val="left"/>
+      <w:pPr>
+        <w:tabs>
+          <w:tab w:val="num" w:pos="2160"/>
+        </w:tabs>
+        <w:ind w:left="2160" w:hanging="360"/>
+      </w:pPr>
+      <w:rPr>
+        <w:rFonts w:ascii="Wingdings" w:hAnsi="Wingdings" w:hint="default"/>
+        <w:sz w:val="20"/>
+      </w:rPr>
+    </w:lvl>
+    <w:lvl w:ilvl="3" w:tentative="1">
+      <w:start w:val="1"/>
+      <w:numFmt w:val="bullet"/>
+      <w:lvlText w:val=""/>
+      <w:lvlJc w:val="left"/>
+      <w:pPr>
+        <w:tabs>
+          <w:tab w:val="num" w:pos="2880"/>
+        </w:tabs>
+        <w:ind w:left="2880" w:hanging="360"/>
+      </w:pPr>
+      <w:rPr>
+        <w:rFonts w:ascii="Wingdings" w:hAnsi="Wingdings" w:hint="default"/>
+        <w:sz w:val="20"/>
+      </w:rPr>
+    </w:lvl>
+    <w:lvl w:ilvl="4" w:tentative="1">
+      <w:start w:val="1"/>
+      <w:numFmt w:val="bullet"/>
+      <w:lvlText w:val=""/>
+      <w:lvlJc w:val="left"/>
+      <w:pPr>
+        <w:tabs>
+          <w:tab w:val="num" w:pos="3600"/>
+        </w:tabs>
+        <w:ind w:left="3600" w:hanging="360"/>
+      </w:pPr>
+      <w:rPr>
+        <w:rFonts w:ascii="Wingdings" w:hAnsi="Wingdings" w:hint="default"/>
+        <w:sz w:val="20"/>
+      </w:rPr>
+    </w:lvl>
+    <w:lvl w:ilvl="5" w:tentative="1">
+      <w:start w:val="1"/>
+      <w:numFmt w:val="bullet"/>
+      <w:lvlText w:val=""/>
+      <w:lvlJc w:val="left"/>
+      <w:pPr>
+        <w:tabs>
+          <w:tab w:val="num" w:pos="4320"/>
+        </w:tabs>
+        <w:ind w:left="4320" w:hanging="360"/>
+      </w:pPr>
+      <w:rPr>
+        <w:rFonts w:ascii="Wingdings" w:hAnsi="Wingdings" w:hint="default"/>
+        <w:sz w:val="20"/>
+      </w:rPr>
+    </w:lvl>
+    <w:lvl w:ilvl="6" w:tentative="1">
+      <w:start w:val="1"/>
+      <w:numFmt w:val="bullet"/>
+      <w:lvlText w:val=""/>
+      <w:lvlJc w:val="left"/>
+      <w:pPr>
+        <w:tabs>
+          <w:tab w:val="num" w:pos="5040"/>
+        </w:tabs>
+        <w:ind w:left="5040" w:hanging="360"/>
+      </w:pPr>
+      <w:rPr>
+        <w:rFonts w:ascii="Wingdings" w:hAnsi="Wingdings" w:hint="default"/>
+        <w:sz w:val="20"/>
+      </w:rPr>
+    </w:lvl>
+    <w:lvl w:ilvl="7" w:tentative="1">
+      <w:start w:val="1"/>
+      <w:numFmt w:val="bullet"/>
+      <w:lvlText w:val=""/>
+      <w:lvlJc w:val="left"/>
+      <w:pPr>
+        <w:tabs>
+          <w:tab w:val="num" w:pos="5760"/>
+        </w:tabs>
+        <w:ind w:left="5760" w:hanging="360"/>
+      </w:pPr>
+      <w:rPr>
+        <w:rFonts w:ascii="Wingdings" w:hAnsi="Wingdings" w:hint="default"/>
+        <w:sz w:val="20"/>
+      </w:rPr>
+    </w:lvl>
+    <w:lvl w:ilvl="8" w:tentative="1">
+      <w:start w:val="1"/>
+      <w:numFmt w:val="bullet"/>
+      <w:lvlText w:val=""/>
+      <w:lvlJc w:val="left"/>
+      <w:pPr>
+        <w:tabs>
+          <w:tab w:val="num" w:pos="6480"/>
+        </w:tabs>
+        <w:ind w:left="6480" w:hanging="360"/>
+      </w:pPr>
+      <w:rPr>
+        <w:rFonts w:ascii="Wingdings" w:hAnsi="Wingdings" w:hint="default"/>
+        <w:sz w:val="20"/>
+      </w:rPr>
+    </w:lvl>
+  </w:abstractNum>
+  <w:abstractNum w:abstractNumId="15" w15:restartNumberingAfterBreak="0">
     <w:nsid w:val="417D0C6D"/>
     <w:multiLevelType w:val="multilevel"/>
     <w:tmpl w:val="A14E9ACA"/>
@@ -3888,7 +5581,156 @@
       </w:rPr>
     </w:lvl>
   </w:abstractNum>
-  <w:abstractNum w:abstractNumId="12" w15:restartNumberingAfterBreak="0">
+  <w:abstractNum w:abstractNumId="16" w15:restartNumberingAfterBreak="0">
+    <w:nsid w:val="42335EEB"/>
+    <w:multiLevelType w:val="multilevel"/>
+    <w:tmpl w:val="64C8C33C"/>
+    <w:lvl w:ilvl="0">
+      <w:start w:val="1"/>
+      <w:numFmt w:val="bullet"/>
+      <w:lvlText w:val=""/>
+      <w:lvlJc w:val="left"/>
+      <w:pPr>
+        <w:tabs>
+          <w:tab w:val="num" w:pos="720"/>
+        </w:tabs>
+        <w:ind w:left="720" w:hanging="360"/>
+      </w:pPr>
+      <w:rPr>
+        <w:rFonts w:ascii="Symbol" w:hAnsi="Symbol" w:hint="default"/>
+        <w:sz w:val="20"/>
+      </w:rPr>
+    </w:lvl>
+    <w:lvl w:ilvl="1" w:tentative="1">
+      <w:start w:val="1"/>
+      <w:numFmt w:val="bullet"/>
+      <w:lvlText w:val="o"/>
+      <w:lvlJc w:val="left"/>
+      <w:pPr>
+        <w:tabs>
+          <w:tab w:val="num" w:pos="1440"/>
+        </w:tabs>
+        <w:ind w:left="1440" w:hanging="360"/>
+      </w:pPr>
+      <w:rPr>
+        <w:rFonts w:ascii="Courier New" w:hAnsi="Courier New" w:hint="default"/>
+        <w:sz w:val="20"/>
+      </w:rPr>
+    </w:lvl>
+    <w:lvl w:ilvl="2" w:tentative="1">
+      <w:start w:val="1"/>
+      <w:numFmt w:val="bullet"/>
+      <w:lvlText w:val=""/>
+      <w:lvlJc w:val="left"/>
+      <w:pPr>
+        <w:tabs>
+          <w:tab w:val="num" w:pos="2160"/>
+        </w:tabs>
+        <w:ind w:left="2160" w:hanging="360"/>
+      </w:pPr>
+      <w:rPr>
+        <w:rFonts w:ascii="Wingdings" w:hAnsi="Wingdings" w:hint="default"/>
+        <w:sz w:val="20"/>
+      </w:rPr>
+    </w:lvl>
+    <w:lvl w:ilvl="3" w:tentative="1">
+      <w:start w:val="1"/>
+      <w:numFmt w:val="bullet"/>
+      <w:lvlText w:val=""/>
+      <w:lvlJc w:val="left"/>
+      <w:pPr>
+        <w:tabs>
+          <w:tab w:val="num" w:pos="2880"/>
+        </w:tabs>
+        <w:ind w:left="2880" w:hanging="360"/>
+      </w:pPr>
+      <w:rPr>
+        <w:rFonts w:ascii="Wingdings" w:hAnsi="Wingdings" w:hint="default"/>
+        <w:sz w:val="20"/>
+      </w:rPr>
+    </w:lvl>
+    <w:lvl w:ilvl="4" w:tentative="1">
+      <w:start w:val="1"/>
+      <w:numFmt w:val="bullet"/>
+      <w:lvlText w:val=""/>
+      <w:lvlJc w:val="left"/>
+      <w:pPr>
+        <w:tabs>
+          <w:tab w:val="num" w:pos="3600"/>
+        </w:tabs>
+        <w:ind w:left="3600" w:hanging="360"/>
+      </w:pPr>
+      <w:rPr>
+        <w:rFonts w:ascii="Wingdings" w:hAnsi="Wingdings" w:hint="default"/>
+        <w:sz w:val="20"/>
+      </w:rPr>
+    </w:lvl>
+    <w:lvl w:ilvl="5" w:tentative="1">
+      <w:start w:val="1"/>
+      <w:numFmt w:val="bullet"/>
+      <w:lvlText w:val=""/>
+      <w:lvlJc w:val="left"/>
+      <w:pPr>
+        <w:tabs>
+          <w:tab w:val="num" w:pos="4320"/>
+        </w:tabs>
+        <w:ind w:left="4320" w:hanging="360"/>
+      </w:pPr>
+      <w:rPr>
+        <w:rFonts w:ascii="Wingdings" w:hAnsi="Wingdings" w:hint="default"/>
+        <w:sz w:val="20"/>
+      </w:rPr>
+    </w:lvl>
+    <w:lvl w:ilvl="6" w:tentative="1">
+      <w:start w:val="1"/>
+      <w:numFmt w:val="bullet"/>
+      <w:lvlText w:val=""/>
+      <w:lvlJc w:val="left"/>
+      <w:pPr>
+        <w:tabs>
+          <w:tab w:val="num" w:pos="5040"/>
+        </w:tabs>
+        <w:ind w:left="5040" w:hanging="360"/>
+      </w:pPr>
+      <w:rPr>
+        <w:rFonts w:ascii="Wingdings" w:hAnsi="Wingdings" w:hint="default"/>
+        <w:sz w:val="20"/>
+      </w:rPr>
+    </w:lvl>
+    <w:lvl w:ilvl="7" w:tentative="1">
+      <w:start w:val="1"/>
+      <w:numFmt w:val="bullet"/>
+      <w:lvlText w:val=""/>
+      <w:lvlJc w:val="left"/>
+      <w:pPr>
+        <w:tabs>
+          <w:tab w:val="num" w:pos="5760"/>
+        </w:tabs>
+        <w:ind w:left="5760" w:hanging="360"/>
+      </w:pPr>
+      <w:rPr>
+        <w:rFonts w:ascii="Wingdings" w:hAnsi="Wingdings" w:hint="default"/>
+        <w:sz w:val="20"/>
+      </w:rPr>
+    </w:lvl>
+    <w:lvl w:ilvl="8" w:tentative="1">
+      <w:start w:val="1"/>
+      <w:numFmt w:val="bullet"/>
+      <w:lvlText w:val=""/>
+      <w:lvlJc w:val="left"/>
+      <w:pPr>
+        <w:tabs>
+          <w:tab w:val="num" w:pos="6480"/>
+        </w:tabs>
+        <w:ind w:left="6480" w:hanging="360"/>
+      </w:pPr>
+      <w:rPr>
+        <w:rFonts w:ascii="Wingdings" w:hAnsi="Wingdings" w:hint="default"/>
+        <w:sz w:val="20"/>
+      </w:rPr>
+    </w:lvl>
+  </w:abstractNum>
+  <w:abstractNum w:abstractNumId="17" w15:restartNumberingAfterBreak="0">
     <w:nsid w:val="49F45C30"/>
     <w:multiLevelType w:val="multilevel"/>
     <w:tmpl w:val="C0200E68"/>
@@ -4037,7 +5879,269 @@
       </w:rPr>
     </w:lvl>
   </w:abstractNum>
-  <w:abstractNum w:abstractNumId="13" w15:restartNumberingAfterBreak="0">
+  <w:abstractNum w:abstractNumId="18" w15:restartNumberingAfterBreak="0">
+    <w:nsid w:val="543B1D80"/>
+    <w:multiLevelType w:val="multilevel"/>
+    <w:tmpl w:val="DDA6B3C0"/>
+    <w:lvl w:ilvl="0">
+      <w:start w:val="1"/>
+      <w:numFmt w:val="bullet"/>
+      <w:lvlText w:val=""/>
+      <w:lvlJc w:val="left"/>
+      <w:pPr>
+        <w:tabs>
+          <w:tab w:val="num" w:pos="720"/>
+        </w:tabs>
+        <w:ind w:left="720" w:hanging="360"/>
+      </w:pPr>
+      <w:rPr>
+        <w:rFonts w:ascii="Symbol" w:hAnsi="Symbol" w:hint="default"/>
+        <w:sz w:val="20"/>
+      </w:rPr>
+    </w:lvl>
+    <w:lvl w:ilvl="1" w:tentative="1">
+      <w:start w:val="1"/>
+      <w:numFmt w:val="bullet"/>
+      <w:lvlText w:val="o"/>
+      <w:lvlJc w:val="left"/>
+      <w:pPr>
+        <w:tabs>
+          <w:tab w:val="num" w:pos="1440"/>
+        </w:tabs>
+        <w:ind w:left="1440" w:hanging="360"/>
+      </w:pPr>
+      <w:rPr>
+        <w:rFonts w:ascii="Courier New" w:hAnsi="Courier New" w:hint="default"/>
+        <w:sz w:val="20"/>
+      </w:rPr>
+    </w:lvl>
+    <w:lvl w:ilvl="2" w:tentative="1">
+      <w:start w:val="1"/>
+      <w:numFmt w:val="bullet"/>
+      <w:lvlText w:val=""/>
+      <w:lvlJc w:val="left"/>
+      <w:pPr>
+        <w:tabs>
+          <w:tab w:val="num" w:pos="2160"/>
+        </w:tabs>
+        <w:ind w:left="2160" w:hanging="360"/>
+      </w:pPr>
+      <w:rPr>
+        <w:rFonts w:ascii="Wingdings" w:hAnsi="Wingdings" w:hint="default"/>
+        <w:sz w:val="20"/>
+      </w:rPr>
+    </w:lvl>
+    <w:lvl w:ilvl="3" w:tentative="1">
+      <w:start w:val="1"/>
+      <w:numFmt w:val="bullet"/>
+      <w:lvlText w:val=""/>
+      <w:lvlJc w:val="left"/>
+      <w:pPr>
+        <w:tabs>
+          <w:tab w:val="num" w:pos="2880"/>
+        </w:tabs>
+        <w:ind w:left="2880" w:hanging="360"/>
+      </w:pPr>
+      <w:rPr>
+        <w:rFonts w:ascii="Wingdings" w:hAnsi="Wingdings" w:hint="default"/>
+        <w:sz w:val="20"/>
+      </w:rPr>
+    </w:lvl>
+    <w:lvl w:ilvl="4" w:tentative="1">
+      <w:start w:val="1"/>
+      <w:numFmt w:val="bullet"/>
+      <w:lvlText w:val=""/>
+      <w:lvlJc w:val="left"/>
+      <w:pPr>
+        <w:tabs>
+          <w:tab w:val="num" w:pos="3600"/>
+        </w:tabs>
+        <w:ind w:left="3600" w:hanging="360"/>
+      </w:pPr>
+      <w:rPr>
+        <w:rFonts w:ascii="Wingdings" w:hAnsi="Wingdings" w:hint="default"/>
+        <w:sz w:val="20"/>
+      </w:rPr>
+    </w:lvl>
+    <w:lvl w:ilvl="5" w:tentative="1">
+      <w:start w:val="1"/>
+      <w:numFmt w:val="bullet"/>
+      <w:lvlText w:val=""/>
+      <w:lvlJc w:val="left"/>
+      <w:pPr>
+        <w:tabs>
+          <w:tab w:val="num" w:pos="4320"/>
+        </w:tabs>
+        <w:ind w:left="4320" w:hanging="360"/>
+      </w:pPr>
+      <w:rPr>
+        <w:rFonts w:ascii="Wingdings" w:hAnsi="Wingdings" w:hint="default"/>
+        <w:sz w:val="20"/>
+      </w:rPr>
+    </w:lvl>
+    <w:lvl w:ilvl="6" w:tentative="1">
+      <w:start w:val="1"/>
+      <w:numFmt w:val="bullet"/>
+      <w:lvlText w:val=""/>
+      <w:lvlJc w:val="left"/>
+      <w:pPr>
+        <w:tabs>
+          <w:tab w:val="num" w:pos="5040"/>
+        </w:tabs>
+        <w:ind w:left="5040" w:hanging="360"/>
+      </w:pPr>
+      <w:rPr>
+        <w:rFonts w:ascii="Wingdings" w:hAnsi="Wingdings" w:hint="default"/>
+        <w:sz w:val="20"/>
+      </w:rPr>
+    </w:lvl>
+    <w:lvl w:ilvl="7" w:tentative="1">
+      <w:start w:val="1"/>
+      <w:numFmt w:val="bullet"/>
+      <w:lvlText w:val=""/>
+      <w:lvlJc w:val="left"/>
+      <w:pPr>
+        <w:tabs>
+          <w:tab w:val="num" w:pos="5760"/>
+        </w:tabs>
+        <w:ind w:left="5760" w:hanging="360"/>
+      </w:pPr>
+      <w:rPr>
+        <w:rFonts w:ascii="Wingdings" w:hAnsi="Wingdings" w:hint="default"/>
+        <w:sz w:val="20"/>
+      </w:rPr>
+    </w:lvl>
+    <w:lvl w:ilvl="8" w:tentative="1">
+      <w:start w:val="1"/>
+      <w:numFmt w:val="bullet"/>
+      <w:lvlText w:val=""/>
+      <w:lvlJc w:val="left"/>
+      <w:pPr>
+        <w:tabs>
+          <w:tab w:val="num" w:pos="6480"/>
+        </w:tabs>
+        <w:ind w:left="6480" w:hanging="360"/>
+      </w:pPr>
+      <w:rPr>
+        <w:rFonts w:ascii="Wingdings" w:hAnsi="Wingdings" w:hint="default"/>
+        <w:sz w:val="20"/>
+      </w:rPr>
+    </w:lvl>
+  </w:abstractNum>
+  <w:abstractNum w:abstractNumId="19" w15:restartNumberingAfterBreak="0">
+    <w:nsid w:val="615F32A9"/>
+    <w:multiLevelType w:val="multilevel"/>
+    <w:tmpl w:val="5D4EE4BC"/>
+    <w:lvl w:ilvl="0">
+      <w:start w:val="1"/>
+      <w:numFmt w:val="decimal"/>
+      <w:lvlText w:val="%1."/>
+      <w:lvlJc w:val="left"/>
+      <w:pPr>
+        <w:tabs>
+          <w:tab w:val="num" w:pos="720"/>
+        </w:tabs>
+        <w:ind w:left="720" w:hanging="360"/>
+      </w:pPr>
+    </w:lvl>
+    <w:lvl w:ilvl="1" w:tentative="1">
+      <w:start w:val="1"/>
+      <w:numFmt w:val="decimal"/>
+      <w:lvlText w:val="%2."/>
+      <w:lvlJc w:val="left"/>
+      <w:pPr>
+        <w:tabs>
+          <w:tab w:val="num" w:pos="1440"/>
+        </w:tabs>
+        <w:ind w:left="1440" w:hanging="360"/>
+      </w:pPr>
+    </w:lvl>
+    <w:lvl w:ilvl="2" w:tentative="1">
+      <w:start w:val="1"/>
+      <w:numFmt w:val="decimal"/>
+      <w:lvlText w:val="%3."/>
+      <w:lvlJc w:val="left"/>
+      <w:pPr>
+        <w:tabs>
+          <w:tab w:val="num" w:pos="2160"/>
+        </w:tabs>
+        <w:ind w:left="2160" w:hanging="360"/>
+      </w:pPr>
+    </w:lvl>
+    <w:lvl w:ilvl="3" w:tentative="1">
+      <w:start w:val="1"/>
+      <w:numFmt w:val="decimal"/>
+      <w:lvlText w:val="%4."/>
+      <w:lvlJc w:val="left"/>
+      <w:pPr>
+        <w:tabs>
+          <w:tab w:val="num" w:pos="2880"/>
+        </w:tabs>
+        <w:ind w:left="2880" w:hanging="360"/>
+      </w:pPr>
+    </w:lvl>
+    <w:lvl w:ilvl="4" w:tentative="1">
+      <w:start w:val="1"/>
+      <w:numFmt w:val="decimal"/>
+      <w:lvlText w:val="%5."/>
+      <w:lvlJc w:val="left"/>
+      <w:pPr>
+        <w:tabs>
+          <w:tab w:val="num" w:pos="3600"/>
+        </w:tabs>
+        <w:ind w:left="3600" w:hanging="360"/>
+      </w:pPr>
+    </w:lvl>
+    <w:lvl w:ilvl="5" w:tentative="1">
+      <w:start w:val="1"/>
+      <w:numFmt w:val="decimal"/>
+      <w:lvlText w:val="%6."/>
+      <w:lvlJc w:val="left"/>
+      <w:pPr>
+        <w:tabs>
+          <w:tab w:val="num" w:pos="4320"/>
+        </w:tabs>
+        <w:ind w:left="4320" w:hanging="360"/>
+      </w:pPr>
+    </w:lvl>
+    <w:lvl w:ilvl="6" w:tentative="1">
+      <w:start w:val="1"/>
+      <w:numFmt w:val="decimal"/>
+      <w:lvlText w:val="%7."/>
+      <w:lvlJc w:val="left"/>
+      <w:pPr>
+        <w:tabs>
+          <w:tab w:val="num" w:pos="5040"/>
+        </w:tabs>
+        <w:ind w:left="5040" w:hanging="360"/>
+      </w:pPr>
+    </w:lvl>
+    <w:lvl w:ilvl="7" w:tentative="1">
+      <w:start w:val="1"/>
+      <w:numFmt w:val="decimal"/>
+      <w:lvlText w:val="%8."/>
+      <w:lvlJc w:val="left"/>
+      <w:pPr>
+        <w:tabs>
+          <w:tab w:val="num" w:pos="5760"/>
+        </w:tabs>
+        <w:ind w:left="5760" w:hanging="360"/>
+      </w:pPr>
+    </w:lvl>
+    <w:lvl w:ilvl="8" w:tentative="1">
+      <w:start w:val="1"/>
+      <w:numFmt w:val="decimal"/>
+      <w:lvlText w:val="%9."/>
+      <w:lvlJc w:val="left"/>
+      <w:pPr>
+        <w:tabs>
+          <w:tab w:val="num" w:pos="6480"/>
+        </w:tabs>
+        <w:ind w:left="6480" w:hanging="360"/>
+      </w:pPr>
+    </w:lvl>
+  </w:abstractNum>
+  <w:abstractNum w:abstractNumId="20" w15:restartNumberingAfterBreak="0">
     <w:nsid w:val="646423F5"/>
     <w:multiLevelType w:val="multilevel"/>
     <w:tmpl w:val="3D50B834"/>
@@ -4186,7 +6290,7 @@
       </w:rPr>
     </w:lvl>
   </w:abstractNum>
-  <w:abstractNum w:abstractNumId="14" w15:restartNumberingAfterBreak="0">
+  <w:abstractNum w:abstractNumId="21" w15:restartNumberingAfterBreak="0">
     <w:nsid w:val="6973419B"/>
     <w:multiLevelType w:val="multilevel"/>
     <w:tmpl w:val="541E57E0"/>
@@ -4335,7 +6439,156 @@
       </w:rPr>
     </w:lvl>
   </w:abstractNum>
-  <w:abstractNum w:abstractNumId="15" w15:restartNumberingAfterBreak="0">
+  <w:abstractNum w:abstractNumId="22" w15:restartNumberingAfterBreak="0">
+    <w:nsid w:val="6A2010A5"/>
+    <w:multiLevelType w:val="multilevel"/>
+    <w:tmpl w:val="9CD2932E"/>
+    <w:lvl w:ilvl="0">
+      <w:start w:val="1"/>
+      <w:numFmt w:val="bullet"/>
+      <w:lvlText w:val=""/>
+      <w:lvlJc w:val="left"/>
+      <w:pPr>
+        <w:tabs>
+          <w:tab w:val="num" w:pos="720"/>
+        </w:tabs>
+        <w:ind w:left="720" w:hanging="360"/>
+      </w:pPr>
+      <w:rPr>
+        <w:rFonts w:ascii="Symbol" w:hAnsi="Symbol" w:hint="default"/>
+        <w:sz w:val="20"/>
+      </w:rPr>
+    </w:lvl>
+    <w:lvl w:ilvl="1" w:tentative="1">
+      <w:start w:val="1"/>
+      <w:numFmt w:val="bullet"/>
+      <w:lvlText w:val="o"/>
+      <w:lvlJc w:val="left"/>
+      <w:pPr>
+        <w:tabs>
+          <w:tab w:val="num" w:pos="1440"/>
+        </w:tabs>
+        <w:ind w:left="1440" w:hanging="360"/>
+      </w:pPr>
+      <w:rPr>
+        <w:rFonts w:ascii="Courier New" w:hAnsi="Courier New" w:hint="default"/>
+        <w:sz w:val="20"/>
+      </w:rPr>
+    </w:lvl>
+    <w:lvl w:ilvl="2" w:tentative="1">
+      <w:start w:val="1"/>
+      <w:numFmt w:val="bullet"/>
+      <w:lvlText w:val=""/>
+      <w:lvlJc w:val="left"/>
+      <w:pPr>
+        <w:tabs>
+          <w:tab w:val="num" w:pos="2160"/>
+        </w:tabs>
+        <w:ind w:left="2160" w:hanging="360"/>
+      </w:pPr>
+      <w:rPr>
+        <w:rFonts w:ascii="Wingdings" w:hAnsi="Wingdings" w:hint="default"/>
+        <w:sz w:val="20"/>
+      </w:rPr>
+    </w:lvl>
+    <w:lvl w:ilvl="3" w:tentative="1">
+      <w:start w:val="1"/>
+      <w:numFmt w:val="bullet"/>
+      <w:lvlText w:val=""/>
+      <w:lvlJc w:val="left"/>
+      <w:pPr>
+        <w:tabs>
+          <w:tab w:val="num" w:pos="2880"/>
+        </w:tabs>
+        <w:ind w:left="2880" w:hanging="360"/>
+      </w:pPr>
+      <w:rPr>
+        <w:rFonts w:ascii="Wingdings" w:hAnsi="Wingdings" w:hint="default"/>
+        <w:sz w:val="20"/>
+      </w:rPr>
+    </w:lvl>
+    <w:lvl w:ilvl="4" w:tentative="1">
+      <w:start w:val="1"/>
+      <w:numFmt w:val="bullet"/>
+      <w:lvlText w:val=""/>
+      <w:lvlJc w:val="left"/>
+      <w:pPr>
+        <w:tabs>
+          <w:tab w:val="num" w:pos="3600"/>
+        </w:tabs>
+        <w:ind w:left="3600" w:hanging="360"/>
+      </w:pPr>
+      <w:rPr>
+        <w:rFonts w:ascii="Wingdings" w:hAnsi="Wingdings" w:hint="default"/>
+        <w:sz w:val="20"/>
+      </w:rPr>
+    </w:lvl>
+    <w:lvl w:ilvl="5" w:tentative="1">
+      <w:start w:val="1"/>
+      <w:numFmt w:val="bullet"/>
+      <w:lvlText w:val=""/>
+      <w:lvlJc w:val="left"/>
+      <w:pPr>
+        <w:tabs>
+          <w:tab w:val="num" w:pos="4320"/>
+        </w:tabs>
+        <w:ind w:left="4320" w:hanging="360"/>
+      </w:pPr>
+      <w:rPr>
+        <w:rFonts w:ascii="Wingdings" w:hAnsi="Wingdings" w:hint="default"/>
+        <w:sz w:val="20"/>
+      </w:rPr>
+    </w:lvl>
+    <w:lvl w:ilvl="6" w:tentative="1">
+      <w:start w:val="1"/>
+      <w:numFmt w:val="bullet"/>
+      <w:lvlText w:val=""/>
+      <w:lvlJc w:val="left"/>
+      <w:pPr>
+        <w:tabs>
+          <w:tab w:val="num" w:pos="5040"/>
+        </w:tabs>
+        <w:ind w:left="5040" w:hanging="360"/>
+      </w:pPr>
+      <w:rPr>
+        <w:rFonts w:ascii="Wingdings" w:hAnsi="Wingdings" w:hint="default"/>
+        <w:sz w:val="20"/>
+      </w:rPr>
+    </w:lvl>
+    <w:lvl w:ilvl="7" w:tentative="1">
+      <w:start w:val="1"/>
+      <w:numFmt w:val="bullet"/>
+      <w:lvlText w:val=""/>
+      <w:lvlJc w:val="left"/>
+      <w:pPr>
+        <w:tabs>
+          <w:tab w:val="num" w:pos="5760"/>
+        </w:tabs>
+        <w:ind w:left="5760" w:hanging="360"/>
+      </w:pPr>
+      <w:rPr>
+        <w:rFonts w:ascii="Wingdings" w:hAnsi="Wingdings" w:hint="default"/>
+        <w:sz w:val="20"/>
+      </w:rPr>
+    </w:lvl>
+    <w:lvl w:ilvl="8" w:tentative="1">
+      <w:start w:val="1"/>
+      <w:numFmt w:val="bullet"/>
+      <w:lvlText w:val=""/>
+      <w:lvlJc w:val="left"/>
+      <w:pPr>
+        <w:tabs>
+          <w:tab w:val="num" w:pos="6480"/>
+        </w:tabs>
+        <w:ind w:left="6480" w:hanging="360"/>
+      </w:pPr>
+      <w:rPr>
+        <w:rFonts w:ascii="Wingdings" w:hAnsi="Wingdings" w:hint="default"/>
+        <w:sz w:val="20"/>
+      </w:rPr>
+    </w:lvl>
+  </w:abstractNum>
+  <w:abstractNum w:abstractNumId="23" w15:restartNumberingAfterBreak="0">
     <w:nsid w:val="6B1727B8"/>
     <w:multiLevelType w:val="multilevel"/>
     <w:tmpl w:val="163682A2"/>
@@ -4484,7 +6737,305 @@
       </w:rPr>
     </w:lvl>
   </w:abstractNum>
-  <w:abstractNum w:abstractNumId="16" w15:restartNumberingAfterBreak="0">
+  <w:abstractNum w:abstractNumId="24" w15:restartNumberingAfterBreak="0">
+    <w:nsid w:val="6C2F1012"/>
+    <w:multiLevelType w:val="multilevel"/>
+    <w:tmpl w:val="71762A5C"/>
+    <w:lvl w:ilvl="0">
+      <w:start w:val="1"/>
+      <w:numFmt w:val="bullet"/>
+      <w:lvlText w:val=""/>
+      <w:lvlJc w:val="left"/>
+      <w:pPr>
+        <w:tabs>
+          <w:tab w:val="num" w:pos="720"/>
+        </w:tabs>
+        <w:ind w:left="720" w:hanging="360"/>
+      </w:pPr>
+      <w:rPr>
+        <w:rFonts w:ascii="Symbol" w:hAnsi="Symbol" w:hint="default"/>
+        <w:sz w:val="20"/>
+      </w:rPr>
+    </w:lvl>
+    <w:lvl w:ilvl="1" w:tentative="1">
+      <w:start w:val="1"/>
+      <w:numFmt w:val="bullet"/>
+      <w:lvlText w:val="o"/>
+      <w:lvlJc w:val="left"/>
+      <w:pPr>
+        <w:tabs>
+          <w:tab w:val="num" w:pos="1440"/>
+        </w:tabs>
+        <w:ind w:left="1440" w:hanging="360"/>
+      </w:pPr>
+      <w:rPr>
+        <w:rFonts w:ascii="Courier New" w:hAnsi="Courier New" w:hint="default"/>
+        <w:sz w:val="20"/>
+      </w:rPr>
+    </w:lvl>
+    <w:lvl w:ilvl="2" w:tentative="1">
+      <w:start w:val="1"/>
+      <w:numFmt w:val="bullet"/>
+      <w:lvlText w:val=""/>
+      <w:lvlJc w:val="left"/>
+      <w:pPr>
+        <w:tabs>
+          <w:tab w:val="num" w:pos="2160"/>
+        </w:tabs>
+        <w:ind w:left="2160" w:hanging="360"/>
+      </w:pPr>
+      <w:rPr>
+        <w:rFonts w:ascii="Wingdings" w:hAnsi="Wingdings" w:hint="default"/>
+        <w:sz w:val="20"/>
+      </w:rPr>
+    </w:lvl>
+    <w:lvl w:ilvl="3" w:tentative="1">
+      <w:start w:val="1"/>
+      <w:numFmt w:val="bullet"/>
+      <w:lvlText w:val=""/>
+      <w:lvlJc w:val="left"/>
+      <w:pPr>
+        <w:tabs>
+          <w:tab w:val="num" w:pos="2880"/>
+        </w:tabs>
+        <w:ind w:left="2880" w:hanging="360"/>
+      </w:pPr>
+      <w:rPr>
+        <w:rFonts w:ascii="Wingdings" w:hAnsi="Wingdings" w:hint="default"/>
+        <w:sz w:val="20"/>
+      </w:rPr>
+    </w:lvl>
+    <w:lvl w:ilvl="4" w:tentative="1">
+      <w:start w:val="1"/>
+      <w:numFmt w:val="bullet"/>
+      <w:lvlText w:val=""/>
+      <w:lvlJc w:val="left"/>
+      <w:pPr>
+        <w:tabs>
+          <w:tab w:val="num" w:pos="3600"/>
+        </w:tabs>
+        <w:ind w:left="3600" w:hanging="360"/>
+      </w:pPr>
+      <w:rPr>
+        <w:rFonts w:ascii="Wingdings" w:hAnsi="Wingdings" w:hint="default"/>
+        <w:sz w:val="20"/>
+      </w:rPr>
+    </w:lvl>
+    <w:lvl w:ilvl="5" w:tentative="1">
+      <w:start w:val="1"/>
+      <w:numFmt w:val="bullet"/>
+      <w:lvlText w:val=""/>
+      <w:lvlJc w:val="left"/>
+      <w:pPr>
+        <w:tabs>
+          <w:tab w:val="num" w:pos="4320"/>
+        </w:tabs>
+        <w:ind w:left="4320" w:hanging="360"/>
+      </w:pPr>
+      <w:rPr>
+        <w:rFonts w:ascii="Wingdings" w:hAnsi="Wingdings" w:hint="default"/>
+        <w:sz w:val="20"/>
+      </w:rPr>
+    </w:lvl>
+    <w:lvl w:ilvl="6" w:tentative="1">
+      <w:start w:val="1"/>
+      <w:numFmt w:val="bullet"/>
+      <w:lvlText w:val=""/>
+      <w:lvlJc w:val="left"/>
+      <w:pPr>
+        <w:tabs>
+          <w:tab w:val="num" w:pos="5040"/>
+        </w:tabs>
+        <w:ind w:left="5040" w:hanging="360"/>
+      </w:pPr>
+      <w:rPr>
+        <w:rFonts w:ascii="Wingdings" w:hAnsi="Wingdings" w:hint="default"/>
+        <w:sz w:val="20"/>
+      </w:rPr>
+    </w:lvl>
+    <w:lvl w:ilvl="7" w:tentative="1">
+      <w:start w:val="1"/>
+      <w:numFmt w:val="bullet"/>
+      <w:lvlText w:val=""/>
+      <w:lvlJc w:val="left"/>
+      <w:pPr>
+        <w:tabs>
+          <w:tab w:val="num" w:pos="5760"/>
+        </w:tabs>
+        <w:ind w:left="5760" w:hanging="360"/>
+      </w:pPr>
+      <w:rPr>
+        <w:rFonts w:ascii="Wingdings" w:hAnsi="Wingdings" w:hint="default"/>
+        <w:sz w:val="20"/>
+      </w:rPr>
+    </w:lvl>
+    <w:lvl w:ilvl="8" w:tentative="1">
+      <w:start w:val="1"/>
+      <w:numFmt w:val="bullet"/>
+      <w:lvlText w:val=""/>
+      <w:lvlJc w:val="left"/>
+      <w:pPr>
+        <w:tabs>
+          <w:tab w:val="num" w:pos="6480"/>
+        </w:tabs>
+        <w:ind w:left="6480" w:hanging="360"/>
+      </w:pPr>
+      <w:rPr>
+        <w:rFonts w:ascii="Wingdings" w:hAnsi="Wingdings" w:hint="default"/>
+        <w:sz w:val="20"/>
+      </w:rPr>
+    </w:lvl>
+  </w:abstractNum>
+  <w:abstractNum w:abstractNumId="25" w15:restartNumberingAfterBreak="0">
+    <w:nsid w:val="70D73050"/>
+    <w:multiLevelType w:val="multilevel"/>
+    <w:tmpl w:val="2DE6585C"/>
+    <w:lvl w:ilvl="0">
+      <w:start w:val="1"/>
+      <w:numFmt w:val="bullet"/>
+      <w:lvlText w:val=""/>
+      <w:lvlJc w:val="left"/>
+      <w:pPr>
+        <w:tabs>
+          <w:tab w:val="num" w:pos="720"/>
+        </w:tabs>
+        <w:ind w:left="720" w:hanging="360"/>
+      </w:pPr>
+      <w:rPr>
+        <w:rFonts w:ascii="Symbol" w:hAnsi="Symbol" w:hint="default"/>
+        <w:sz w:val="20"/>
+      </w:rPr>
+    </w:lvl>
+    <w:lvl w:ilvl="1" w:tentative="1">
+      <w:start w:val="1"/>
+      <w:numFmt w:val="bullet"/>
+      <w:lvlText w:val="o"/>
+      <w:lvlJc w:val="left"/>
+      <w:pPr>
+        <w:tabs>
+          <w:tab w:val="num" w:pos="1440"/>
+        </w:tabs>
+        <w:ind w:left="1440" w:hanging="360"/>
+      </w:pPr>
+      <w:rPr>
+        <w:rFonts w:ascii="Courier New" w:hAnsi="Courier New" w:hint="default"/>
+        <w:sz w:val="20"/>
+      </w:rPr>
+    </w:lvl>
+    <w:lvl w:ilvl="2" w:tentative="1">
+      <w:start w:val="1"/>
+      <w:numFmt w:val="bullet"/>
+      <w:lvlText w:val=""/>
+      <w:lvlJc w:val="left"/>
+      <w:pPr>
+        <w:tabs>
+          <w:tab w:val="num" w:pos="2160"/>
+        </w:tabs>
+        <w:ind w:left="2160" w:hanging="360"/>
+      </w:pPr>
+      <w:rPr>
+        <w:rFonts w:ascii="Wingdings" w:hAnsi="Wingdings" w:hint="default"/>
+        <w:sz w:val="20"/>
+      </w:rPr>
+    </w:lvl>
+    <w:lvl w:ilvl="3" w:tentative="1">
+      <w:start w:val="1"/>
+      <w:numFmt w:val="bullet"/>
+      <w:lvlText w:val=""/>
+      <w:lvlJc w:val="left"/>
+      <w:pPr>
+        <w:tabs>
+          <w:tab w:val="num" w:pos="2880"/>
+        </w:tabs>
+        <w:ind w:left="2880" w:hanging="360"/>
+      </w:pPr>
+      <w:rPr>
+        <w:rFonts w:ascii="Wingdings" w:hAnsi="Wingdings" w:hint="default"/>
+        <w:sz w:val="20"/>
+      </w:rPr>
+    </w:lvl>
+    <w:lvl w:ilvl="4" w:tentative="1">
+      <w:start w:val="1"/>
+      <w:numFmt w:val="bullet"/>
+      <w:lvlText w:val=""/>
+      <w:lvlJc w:val="left"/>
+      <w:pPr>
+        <w:tabs>
+          <w:tab w:val="num" w:pos="3600"/>
+        </w:tabs>
+        <w:ind w:left="3600" w:hanging="360"/>
+      </w:pPr>
+      <w:rPr>
+        <w:rFonts w:ascii="Wingdings" w:hAnsi="Wingdings" w:hint="default"/>
+        <w:sz w:val="20"/>
+      </w:rPr>
+    </w:lvl>
+    <w:lvl w:ilvl="5" w:tentative="1">
+      <w:start w:val="1"/>
+      <w:numFmt w:val="bullet"/>
+      <w:lvlText w:val=""/>
+      <w:lvlJc w:val="left"/>
+      <w:pPr>
+        <w:tabs>
+          <w:tab w:val="num" w:pos="4320"/>
+        </w:tabs>
+        <w:ind w:left="4320" w:hanging="360"/>
+      </w:pPr>
+      <w:rPr>
+        <w:rFonts w:ascii="Wingdings" w:hAnsi="Wingdings" w:hint="default"/>
+        <w:sz w:val="20"/>
+      </w:rPr>
+    </w:lvl>
+    <w:lvl w:ilvl="6" w:tentative="1">
+      <w:start w:val="1"/>
+      <w:numFmt w:val="bullet"/>
+      <w:lvlText w:val=""/>
+      <w:lvlJc w:val="left"/>
+      <w:pPr>
+        <w:tabs>
+          <w:tab w:val="num" w:pos="5040"/>
+        </w:tabs>
+        <w:ind w:left="5040" w:hanging="360"/>
+      </w:pPr>
+      <w:rPr>
+        <w:rFonts w:ascii="Wingdings" w:hAnsi="Wingdings" w:hint="default"/>
+        <w:sz w:val="20"/>
+      </w:rPr>
+    </w:lvl>
+    <w:lvl w:ilvl="7" w:tentative="1">
+      <w:start w:val="1"/>
+      <w:numFmt w:val="bullet"/>
+      <w:lvlText w:val=""/>
+      <w:lvlJc w:val="left"/>
+      <w:pPr>
+        <w:tabs>
+          <w:tab w:val="num" w:pos="5760"/>
+        </w:tabs>
+        <w:ind w:left="5760" w:hanging="360"/>
+      </w:pPr>
+      <w:rPr>
+        <w:rFonts w:ascii="Wingdings" w:hAnsi="Wingdings" w:hint="default"/>
+        <w:sz w:val="20"/>
+      </w:rPr>
+    </w:lvl>
+    <w:lvl w:ilvl="8" w:tentative="1">
+      <w:start w:val="1"/>
+      <w:numFmt w:val="bullet"/>
+      <w:lvlText w:val=""/>
+      <w:lvlJc w:val="left"/>
+      <w:pPr>
+        <w:tabs>
+          <w:tab w:val="num" w:pos="6480"/>
+        </w:tabs>
+        <w:ind w:left="6480" w:hanging="360"/>
+      </w:pPr>
+      <w:rPr>
+        <w:rFonts w:ascii="Wingdings" w:hAnsi="Wingdings" w:hint="default"/>
+        <w:sz w:val="20"/>
+      </w:rPr>
+    </w:lvl>
+  </w:abstractNum>
+  <w:abstractNum w:abstractNumId="26" w15:restartNumberingAfterBreak="0">
     <w:nsid w:val="769C0B9E"/>
     <w:multiLevelType w:val="multilevel"/>
     <w:tmpl w:val="21EEF558"/>
@@ -4633,7 +7184,7 @@
       </w:rPr>
     </w:lvl>
   </w:abstractNum>
-  <w:abstractNum w:abstractNumId="17" w15:restartNumberingAfterBreak="0">
+  <w:abstractNum w:abstractNumId="27" w15:restartNumberingAfterBreak="0">
     <w:nsid w:val="7BDF6955"/>
     <w:multiLevelType w:val="multilevel"/>
     <w:tmpl w:val="71E4D6FE"/>
@@ -4783,58 +7334,88 @@
     </w:lvl>
   </w:abstractNum>
   <w:num w:numId="1" w16cid:durableId="1450201466">
+    <w:abstractNumId w:val="7"/>
+  </w:num>
+  <w:num w:numId="2" w16cid:durableId="1211377900">
+    <w:abstractNumId w:val="1"/>
+  </w:num>
+  <w:num w:numId="3" w16cid:durableId="750584815">
+    <w:abstractNumId w:val="11"/>
+  </w:num>
+  <w:num w:numId="4" w16cid:durableId="1552881310">
+    <w:abstractNumId w:val="4"/>
+  </w:num>
+  <w:num w:numId="5" w16cid:durableId="180053639">
+    <w:abstractNumId w:val="20"/>
+  </w:num>
+  <w:num w:numId="6" w16cid:durableId="1841189146">
+    <w:abstractNumId w:val="9"/>
+  </w:num>
+  <w:num w:numId="7" w16cid:durableId="1177234043">
     <w:abstractNumId w:val="5"/>
   </w:num>
-  <w:num w:numId="2" w16cid:durableId="1211377900">
+  <w:num w:numId="8" w16cid:durableId="1679388415">
+    <w:abstractNumId w:val="21"/>
+  </w:num>
+  <w:num w:numId="9" w16cid:durableId="1038893817">
+    <w:abstractNumId w:val="27"/>
+  </w:num>
+  <w:num w:numId="10" w16cid:durableId="1455252884">
+    <w:abstractNumId w:val="8"/>
+  </w:num>
+  <w:num w:numId="11" w16cid:durableId="683172275">
+    <w:abstractNumId w:val="10"/>
+  </w:num>
+  <w:num w:numId="12" w16cid:durableId="309869857">
+    <w:abstractNumId w:val="23"/>
+  </w:num>
+  <w:num w:numId="13" w16cid:durableId="1945845942">
+    <w:abstractNumId w:val="17"/>
+  </w:num>
+  <w:num w:numId="14" w16cid:durableId="1865941788">
+    <w:abstractNumId w:val="15"/>
+  </w:num>
+  <w:num w:numId="15" w16cid:durableId="1016813472">
+    <w:abstractNumId w:val="2"/>
+  </w:num>
+  <w:num w:numId="16" w16cid:durableId="106197883">
+    <w:abstractNumId w:val="6"/>
+  </w:num>
+  <w:num w:numId="17" w16cid:durableId="105737973">
+    <w:abstractNumId w:val="26"/>
+  </w:num>
+  <w:num w:numId="18" w16cid:durableId="663627092">
+    <w:abstractNumId w:val="13"/>
+  </w:num>
+  <w:num w:numId="19" w16cid:durableId="524707479">
+    <w:abstractNumId w:val="3"/>
+  </w:num>
+  <w:num w:numId="20" w16cid:durableId="1454983525">
+    <w:abstractNumId w:val="12"/>
+  </w:num>
+  <w:num w:numId="21" w16cid:durableId="1801266680">
+    <w:abstractNumId w:val="22"/>
+  </w:num>
+  <w:num w:numId="22" w16cid:durableId="826215883">
+    <w:abstractNumId w:val="16"/>
+  </w:num>
+  <w:num w:numId="23" w16cid:durableId="1183789654">
+    <w:abstractNumId w:val="19"/>
+  </w:num>
+  <w:num w:numId="24" w16cid:durableId="1044790375">
+    <w:abstractNumId w:val="18"/>
+  </w:num>
+  <w:num w:numId="25" w16cid:durableId="536817041">
+    <w:abstractNumId w:val="25"/>
+  </w:num>
+  <w:num w:numId="26" w16cid:durableId="226380517">
+    <w:abstractNumId w:val="14"/>
+  </w:num>
+  <w:num w:numId="27" w16cid:durableId="1307005886">
     <w:abstractNumId w:val="0"/>
   </w:num>
-  <w:num w:numId="3" w16cid:durableId="750584815">
-    <w:abstractNumId w:val="9"/>
-  </w:num>
-  <w:num w:numId="4" w16cid:durableId="1552881310">
-    <w:abstractNumId w:val="2"/>
-  </w:num>
-  <w:num w:numId="5" w16cid:durableId="180053639">
-    <w:abstractNumId w:val="13"/>
-  </w:num>
-  <w:num w:numId="6" w16cid:durableId="1841189146">
-    <w:abstractNumId w:val="7"/>
-  </w:num>
-  <w:num w:numId="7" w16cid:durableId="1177234043">
-    <w:abstractNumId w:val="3"/>
-  </w:num>
-  <w:num w:numId="8" w16cid:durableId="1679388415">
-    <w:abstractNumId w:val="14"/>
-  </w:num>
-  <w:num w:numId="9" w16cid:durableId="1038893817">
-    <w:abstractNumId w:val="17"/>
-  </w:num>
-  <w:num w:numId="10" w16cid:durableId="1455252884">
-    <w:abstractNumId w:val="6"/>
-  </w:num>
-  <w:num w:numId="11" w16cid:durableId="683172275">
-    <w:abstractNumId w:val="8"/>
-  </w:num>
-  <w:num w:numId="12" w16cid:durableId="309869857">
-    <w:abstractNumId w:val="15"/>
-  </w:num>
-  <w:num w:numId="13" w16cid:durableId="1945845942">
-    <w:abstractNumId w:val="12"/>
-  </w:num>
-  <w:num w:numId="14" w16cid:durableId="1865941788">
-    <w:abstractNumId w:val="11"/>
-  </w:num>
-  <w:num w:numId="15" w16cid:durableId="1016813472">
-    <w:abstractNumId w:val="1"/>
-  </w:num>
-  <w:num w:numId="16" w16cid:durableId="106197883">
-    <w:abstractNumId w:val="4"/>
-  </w:num>
-  <w:num w:numId="17" w16cid:durableId="105737973">
-    <w:abstractNumId w:val="16"/>
-  </w:num>
-  <w:num w:numId="18" w16cid:durableId="663627092">
-    <w:abstractNumId w:val="10"/>
+  <w:num w:numId="28" w16cid:durableId="1276059390">
+    <w:abstractNumId w:val="24"/>
   </w:num>
 </w:numbering>
 </file>
@@ -5442,7 +8023,6 @@
   <w:style w:type="character" w:default="1" w:styleId="DefaultParagraphFont">
     <w:name w:val="Default Paragraph Font"/>
     <w:uiPriority w:val="1"/>
-    <w:semiHidden/>
     <w:unhideWhenUsed/>
   </w:style>
   <w:style w:type="table" w:default="1" w:styleId="TableNormal">

</xml_diff>

<commit_message>
all apps are now element agnostic except for those in root/elements/element_C
</commit_message>
<xml_diff>
--- a/Readme.docx
+++ b/Readme.docx
@@ -9,21 +9,12 @@
           <w:bCs/>
         </w:rPr>
       </w:pPr>
-      <w:proofErr w:type="spellStart"/>
       <w:r>
         <w:rPr>
           <w:b/>
           <w:bCs/>
         </w:rPr>
-        <w:t>GPTScorer</w:t>
-      </w:r>
-      <w:proofErr w:type="spellEnd"/>
-      <w:r>
-        <w:rPr>
-          <w:b/>
-          <w:bCs/>
-        </w:rPr>
-        <w:t xml:space="preserve"> – Element C Scoring Application</w:t>
+        <w:t>GPTScorer – Element C Scoring Application</w:t>
       </w:r>
     </w:p>
     <w:p>
@@ -34,15 +25,7 @@
         <w:t>validated</w:t>
       </w:r>
       <w:r>
-        <w:t xml:space="preserve"> scoring application for </w:t>
-      </w:r>
-      <w:proofErr w:type="spellStart"/>
-      <w:r>
-        <w:t>MyDesign</w:t>
-      </w:r>
-      <w:proofErr w:type="spellEnd"/>
-      <w:r>
-        <w:t xml:space="preserve"> – Element C (Presentation and Justification of Solution Design Requirements).</w:t>
+        <w:t xml:space="preserve"> scoring application for MyDesign – Element C (Presentation and Justification of Solution Design Requirements).</w:t>
       </w:r>
     </w:p>
     <w:p/>
@@ -158,15 +141,7 @@
       </w:r>
       <w:r>
         <w:br/>
-        <w:t xml:space="preserve">Raw Element Score (mean of </w:t>
-      </w:r>
-      <w:proofErr w:type="spellStart"/>
-      <w:r>
-        <w:t>subscores</w:t>
-      </w:r>
-      <w:proofErr w:type="spellEnd"/>
-      <w:r>
-        <w:t>)</w:t>
+        <w:t>Raw Element Score (mean of subscores)</w:t>
       </w:r>
       <w:r>
         <w:br/>
@@ -663,13 +638,8 @@
     </w:p>
     <w:p>
       <w:r>
-        <w:t>set OPENAI_API_KEY=</w:t>
-      </w:r>
-      <w:proofErr w:type="spellStart"/>
-      <w:r>
-        <w:t>your_key_here</w:t>
-      </w:r>
-      <w:proofErr w:type="spellEnd"/>
+        <w:t>set OPENAI_API_KEY=your_key_here</w:t>
+      </w:r>
     </w:p>
     <w:p>
       <w:r>
@@ -728,35 +698,11 @@
     </w:p>
     <w:p>
       <w:r>
-        <w:t xml:space="preserve">python -m </w:t>
-      </w:r>
-      <w:proofErr w:type="spellStart"/>
-      <w:r>
-        <w:t>elements.element_C.score_with_API_C</w:t>
-      </w:r>
-      <w:proofErr w:type="spellEnd"/>
-      <w:r>
-        <w:t xml:space="preserve"> ^</w:t>
+        <w:t>python -m elements.element_C.score_with_API_C ^</w:t>
       </w:r>
       <w:r>
         <w:br/>
-        <w:t xml:space="preserve">  --folder elements/</w:t>
-      </w:r>
-      <w:proofErr w:type="spellStart"/>
-      <w:r>
-        <w:t>element_C</w:t>
-      </w:r>
-      <w:proofErr w:type="spellEnd"/>
-      <w:r>
-        <w:t>/</w:t>
-      </w:r>
-      <w:proofErr w:type="spellStart"/>
-      <w:r>
-        <w:t>current_api_scoring_documents</w:t>
-      </w:r>
-      <w:proofErr w:type="spellEnd"/>
-      <w:r>
-        <w:t xml:space="preserve"> ^</w:t>
+        <w:t xml:space="preserve">  --folder elements/element_C/current_api_scoring_documents ^</w:t>
       </w:r>
       <w:r>
         <w:br/>
@@ -766,15 +712,7 @@
         <w:t xml:space="preserve"> </w:t>
       </w:r>
       <w:r>
-        <w:t>elements/</w:t>
-      </w:r>
-      <w:proofErr w:type="spellStart"/>
-      <w:r>
-        <w:t>element_C</w:t>
-      </w:r>
-      <w:proofErr w:type="spellEnd"/>
-      <w:r>
-        <w:t>/</w:t>
+        <w:t>elements/element_C/</w:t>
       </w:r>
       <w:r>
         <w:t>scored_results</w:t>
@@ -952,96 +890,140 @@
       </w:r>
     </w:p>
     <w:p>
-      <w:proofErr w:type="spellStart"/>
-      <w:r>
-        <w:t>uvicorn</w:t>
-      </w:r>
-      <w:proofErr w:type="spellEnd"/>
+      <w:r>
+        <w:t>uvicorn elements.element_C.scorer_app_C:app --reload</w:t>
+      </w:r>
+    </w:p>
+    <w:p/>
+    <w:p>
+      <w:r>
+        <w:t>Then open the local server in your browser</w:t>
+      </w:r>
+      <w:r>
+        <w:t xml:space="preserve">, </w:t>
+      </w:r>
+      <w:r>
+        <w:t>http://127.0.0.1:8000/</w:t>
+      </w:r>
+      <w:r>
+        <w:t>.</w:t>
+      </w:r>
+    </w:p>
+    <w:p>
+      <w:r>
+        <w:t>UI Features:</w:t>
+      </w:r>
+    </w:p>
+    <w:p>
+      <w:pPr>
+        <w:numPr>
+          <w:ilvl w:val="0"/>
+          <w:numId w:val="7"/>
+        </w:numPr>
+      </w:pPr>
+      <w:r>
+        <w:t>Upload documents</w:t>
+      </w:r>
+    </w:p>
+    <w:p>
+      <w:pPr>
+        <w:numPr>
+          <w:ilvl w:val="0"/>
+          <w:numId w:val="7"/>
+        </w:numPr>
+      </w:pPr>
+      <w:r>
+        <w:t>View calibrated C1–C6 scores</w:t>
+      </w:r>
+    </w:p>
+    <w:p>
+      <w:pPr>
+        <w:numPr>
+          <w:ilvl w:val="0"/>
+          <w:numId w:val="7"/>
+        </w:numPr>
+      </w:pPr>
+      <w:r>
+        <w:t>View narrative feedback</w:t>
+      </w:r>
+    </w:p>
+    <w:p>
+      <w:pPr>
+        <w:numPr>
+          <w:ilvl w:val="0"/>
+          <w:numId w:val="7"/>
+        </w:numPr>
+      </w:pPr>
+      <w:r>
+        <w:t>Download CSV results</w:t>
+      </w:r>
+    </w:p>
+    <w:p>
+      <w:r>
+        <w:t xml:space="preserve">The UI mode can be used to upload one or more documents for scoring through the API or alternatively, a csv input </w:t>
+      </w:r>
+      <w:r>
+        <w:t>file</w:t>
+      </w:r>
+      <w:r>
+        <w:t xml:space="preserve"> that includes previously scored data from the score_with_api_C.py app.   The csv input file includes:</w:t>
+      </w:r>
+    </w:p>
+    <w:p>
+      <w:pPr>
+        <w:pStyle w:val="ListParagraph"/>
+        <w:numPr>
+          <w:ilvl w:val="0"/>
+          <w:numId w:val="18"/>
+        </w:numPr>
+      </w:pPr>
+      <w:r>
+        <w:t xml:space="preserve">Metadata for each document row </w:t>
+      </w:r>
+    </w:p>
+    <w:p>
+      <w:pPr>
+        <w:pStyle w:val="ListParagraph"/>
+        <w:numPr>
+          <w:ilvl w:val="0"/>
+          <w:numId w:val="18"/>
+        </w:numPr>
+      </w:pPr>
+      <w:r>
+        <w:t>C1_expert – C_expert</w:t>
+      </w:r>
+      <w:r>
+        <w:t xml:space="preserve"> scores</w:t>
+      </w:r>
+    </w:p>
+    <w:p>
+      <w:pPr>
+        <w:pStyle w:val="ListParagraph"/>
+        <w:numPr>
+          <w:ilvl w:val="0"/>
+          <w:numId w:val="18"/>
+        </w:numPr>
+      </w:pPr>
+      <w:r>
+        <w:t>C1 – C6 scores output from score_with_api_C.py</w:t>
+      </w:r>
+    </w:p>
+    <w:p>
+      <w:pPr>
+        <w:pStyle w:val="ListParagraph"/>
+        <w:numPr>
+          <w:ilvl w:val="0"/>
+          <w:numId w:val="18"/>
+        </w:numPr>
+      </w:pPr>
+      <w:r>
+        <w:t>C1 – C6 flags</w:t>
+      </w:r>
       <w:r>
         <w:t xml:space="preserve"> </w:t>
       </w:r>
-      <w:proofErr w:type="spellStart"/>
-      <w:r>
-        <w:t>elements.element_C.scorer_app_C:app</w:t>
-      </w:r>
-      <w:proofErr w:type="spellEnd"/>
-      <w:r>
-        <w:t xml:space="preserve"> --reload</w:t>
-      </w:r>
-    </w:p>
-    <w:p/>
-    <w:p>
-      <w:r>
-        <w:t>Then open the local server in your browser</w:t>
-      </w:r>
-      <w:r>
-        <w:t xml:space="preserve">, </w:t>
-      </w:r>
-      <w:r>
-        <w:t>http://127.0.0.1:8000/</w:t>
-      </w:r>
-      <w:r>
-        <w:t>.</w:t>
-      </w:r>
-    </w:p>
-    <w:p>
-      <w:r>
-        <w:t>UI Features:</w:t>
-      </w:r>
-    </w:p>
-    <w:p>
-      <w:pPr>
-        <w:numPr>
-          <w:ilvl w:val="0"/>
-          <w:numId w:val="7"/>
-        </w:numPr>
-      </w:pPr>
-      <w:r>
-        <w:t>Upload documents</w:t>
-      </w:r>
-    </w:p>
-    <w:p>
-      <w:pPr>
-        <w:numPr>
-          <w:ilvl w:val="0"/>
-          <w:numId w:val="7"/>
-        </w:numPr>
-      </w:pPr>
-      <w:r>
-        <w:t>View calibrated C1–C6 scores</w:t>
-      </w:r>
-    </w:p>
-    <w:p>
-      <w:pPr>
-        <w:numPr>
-          <w:ilvl w:val="0"/>
-          <w:numId w:val="7"/>
-        </w:numPr>
-      </w:pPr>
-      <w:r>
-        <w:t>View narrative feedback</w:t>
-      </w:r>
-    </w:p>
-    <w:p>
-      <w:pPr>
-        <w:numPr>
-          <w:ilvl w:val="0"/>
-          <w:numId w:val="7"/>
-        </w:numPr>
-      </w:pPr>
-      <w:r>
-        <w:t>Download CSV results</w:t>
-      </w:r>
-    </w:p>
-    <w:p>
-      <w:r>
-        <w:t xml:space="preserve">The UI mode can be used to upload one or more documents for scoring through the API or alternatively, a csv input </w:t>
-      </w:r>
-      <w:r>
-        <w:t>file</w:t>
-      </w:r>
-      <w:r>
-        <w:t xml:space="preserve"> that includes previously scored data from the score_with_api_C.py app.   The csv input file includes:</w:t>
+      <w:r>
+        <w:t>from score_with_api_C.py</w:t>
       </w:r>
     </w:p>
     <w:p>
@@ -1053,7 +1035,13 @@
         </w:numPr>
       </w:pPr>
       <w:r>
-        <w:t xml:space="preserve">Metadata for each document row </w:t>
+        <w:t>C1 – C6 bulleted rationale</w:t>
+      </w:r>
+      <w:r>
+        <w:t xml:space="preserve"> </w:t>
+      </w:r>
+      <w:r>
+        <w:t>from score_with_api_C.py</w:t>
       </w:r>
     </w:p>
     <w:p>
@@ -1065,15 +1053,13 @@
         </w:numPr>
       </w:pPr>
       <w:r>
-        <w:t xml:space="preserve">C1_expert – </w:t>
-      </w:r>
-      <w:proofErr w:type="spellStart"/>
-      <w:r>
-        <w:t>C_expert</w:t>
-      </w:r>
-      <w:proofErr w:type="spellEnd"/>
-      <w:r>
-        <w:t xml:space="preserve"> scores</w:t>
+        <w:t>Narrative ra</w:t>
+      </w:r>
+      <w:r>
+        <w:t>t</w:t>
+      </w:r>
+      <w:r>
+        <w:t>ionale</w:t>
       </w:r>
     </w:p>
     <w:p>
@@ -1085,7 +1071,12 @@
         </w:numPr>
       </w:pPr>
       <w:r>
-        <w:t>C1 – C6 scores output from score_with_api_C.py</w:t>
+        <w:t>Element_score_raw, the average of the api scores</w:t>
+      </w:r>
+    </w:p>
+    <w:p>
+      <w:r>
+        <w:t>Whether uploading a csv file or document files, the UI output is sub-element scores and narrative rationale.  A downloadable csv contains the following outputs:</w:t>
       </w:r>
     </w:p>
     <w:p>
@@ -1093,17 +1084,11 @@
         <w:pStyle w:val="ListParagraph"/>
         <w:numPr>
           <w:ilvl w:val="0"/>
-          <w:numId w:val="18"/>
-        </w:numPr>
-      </w:pPr>
-      <w:r>
-        <w:t>C1 – C6 flags</w:t>
-      </w:r>
-      <w:r>
-        <w:t xml:space="preserve"> </w:t>
-      </w:r>
-      <w:r>
-        <w:t>from score_with_api_C.py</w:t>
+          <w:numId w:val="17"/>
+        </w:numPr>
+      </w:pPr>
+      <w:r>
+        <w:t>Filename</w:t>
       </w:r>
     </w:p>
     <w:p>
@@ -1111,17 +1096,11 @@
         <w:pStyle w:val="ListParagraph"/>
         <w:numPr>
           <w:ilvl w:val="0"/>
-          <w:numId w:val="18"/>
-        </w:numPr>
-      </w:pPr>
-      <w:r>
-        <w:t>C1 – C6 bulleted rationale</w:t>
-      </w:r>
-      <w:r>
-        <w:t xml:space="preserve"> </w:t>
-      </w:r>
-      <w:r>
-        <w:t>from score_with_api_C.py</w:t>
+          <w:numId w:val="17"/>
+        </w:numPr>
+      </w:pPr>
+      <w:r>
+        <w:t>C1 – C6 outputs from score_with_API_C.py (aka C1_api-C6_api)</w:t>
       </w:r>
     </w:p>
     <w:p>
@@ -1129,17 +1108,11 @@
         <w:pStyle w:val="ListParagraph"/>
         <w:numPr>
           <w:ilvl w:val="0"/>
-          <w:numId w:val="18"/>
-        </w:numPr>
-      </w:pPr>
-      <w:r>
-        <w:t>Narrative ra</w:t>
-      </w:r>
-      <w:r>
-        <w:t>t</w:t>
-      </w:r>
-      <w:r>
-        <w:t>ionale</w:t>
+          <w:numId w:val="17"/>
+        </w:numPr>
+      </w:pPr>
+      <w:r>
+        <w:t>C1_final  – C6_final calibrated scores for output</w:t>
       </w:r>
     </w:p>
     <w:p>
@@ -1147,29 +1120,14 @@
         <w:pStyle w:val="ListParagraph"/>
         <w:numPr>
           <w:ilvl w:val="0"/>
-          <w:numId w:val="18"/>
-        </w:numPr>
-      </w:pPr>
-      <w:proofErr w:type="spellStart"/>
-      <w:r>
-        <w:t>Element_score_raw</w:t>
-      </w:r>
-      <w:proofErr w:type="spellEnd"/>
-      <w:r>
-        <w:t xml:space="preserve">, the average of the </w:t>
-      </w:r>
-      <w:proofErr w:type="spellStart"/>
-      <w:r>
-        <w:t>api</w:t>
-      </w:r>
-      <w:proofErr w:type="spellEnd"/>
-      <w:r>
-        <w:t xml:space="preserve"> scores</w:t>
-      </w:r>
-    </w:p>
-    <w:p>
-      <w:r>
-        <w:t>Whether uploading a csv file or document files, the UI output is sub-element scores and narrative rationale.  A downloadable csv contains the following outputs:</w:t>
+          <w:numId w:val="17"/>
+        </w:numPr>
+      </w:pPr>
+      <w:r>
+        <w:t>element_score_raw</w:t>
+      </w:r>
+      <w:r>
+        <w:tab/>
       </w:r>
     </w:p>
     <w:p>
@@ -1180,65 +1138,10 @@
           <w:numId w:val="17"/>
         </w:numPr>
       </w:pPr>
-      <w:r>
-        <w:t>Filename</w:t>
-      </w:r>
-    </w:p>
-    <w:p>
-      <w:pPr>
-        <w:pStyle w:val="ListParagraph"/>
-        <w:numPr>
-          <w:ilvl w:val="0"/>
-          <w:numId w:val="17"/>
-        </w:numPr>
-      </w:pPr>
-      <w:r>
-        <w:t>C1 – C6 outputs from score_with_API_C.py (aka C1_api-C6_api)</w:t>
-      </w:r>
-    </w:p>
-    <w:p>
-      <w:pPr>
-        <w:pStyle w:val="ListParagraph"/>
-        <w:numPr>
-          <w:ilvl w:val="0"/>
-          <w:numId w:val="17"/>
-        </w:numPr>
-      </w:pPr>
-      <w:r>
-        <w:t>C1_final  – C6_final calibrated scores for output</w:t>
-      </w:r>
-    </w:p>
-    <w:p>
-      <w:pPr>
-        <w:pStyle w:val="ListParagraph"/>
-        <w:numPr>
-          <w:ilvl w:val="0"/>
-          <w:numId w:val="17"/>
-        </w:numPr>
-      </w:pPr>
-      <w:proofErr w:type="spellStart"/>
-      <w:r>
-        <w:t>element_score_raw</w:t>
-      </w:r>
-      <w:proofErr w:type="spellEnd"/>
-      <w:r>
-        <w:tab/>
-      </w:r>
-    </w:p>
-    <w:p>
-      <w:pPr>
-        <w:pStyle w:val="ListParagraph"/>
-        <w:numPr>
-          <w:ilvl w:val="0"/>
-          <w:numId w:val="17"/>
-        </w:numPr>
-      </w:pPr>
-      <w:proofErr w:type="spellStart"/>
       <w:r>
         <w:lastRenderedPageBreak/>
         <w:t>element_score_calibrated</w:t>
       </w:r>
-      <w:proofErr w:type="spellEnd"/>
       <w:r>
         <w:tab/>
       </w:r>
@@ -1251,11 +1154,9 @@
           <w:numId w:val="17"/>
         </w:numPr>
       </w:pPr>
-      <w:proofErr w:type="spellStart"/>
       <w:r>
         <w:t>calibration_delta</w:t>
       </w:r>
-      <w:proofErr w:type="spellEnd"/>
     </w:p>
     <w:p>
       <w:pPr>
@@ -1586,13 +1487,8 @@
           <w:numId w:val="12"/>
         </w:numPr>
       </w:pPr>
-      <w:proofErr w:type="spellStart"/>
-      <w:r>
-        <w:t>Subscore</w:t>
-      </w:r>
-      <w:proofErr w:type="spellEnd"/>
-      <w:r>
-        <w:t xml:space="preserve"> drift analysis</w:t>
+      <w:r>
+        <w:t>Subscore drift analysis</w:t>
       </w:r>
     </w:p>
     <w:p>
@@ -1632,23 +1528,44 @@
         </w:rPr>
         <w:t>Repository Structure</w:t>
       </w:r>
+      <w:r>
+        <w:rPr>
+          <w:b/>
+          <w:bCs/>
+        </w:rPr>
+        <w:t xml:space="preserve"> (all core, scripts and simple_ui apps are now element agnostic to facilitate cloning the architecture for other elements)</w:t>
+      </w:r>
     </w:p>
     <w:p>
       <w:r>
         <w:t>root/</w:t>
       </w:r>
-      <w:r>
-        <w:br/>
+    </w:p>
+    <w:p>
+      <w:r>
         <w:t>│</w:t>
       </w:r>
-      <w:r>
+    </w:p>
+    <w:p>
+      <w:r>
+        <w:rPr>
+          <w:rFonts w:ascii="MS Gothic" w:eastAsia="MS Gothic" w:hAnsi="MS Gothic" w:cs="MS Gothic" w:hint="eastAsia"/>
+        </w:rPr>
+        <w:t>├</w:t>
+      </w:r>
+      <w:r>
+        <w:rPr>
+          <w:rFonts w:ascii="Aptos" w:hAnsi="Aptos" w:cs="Aptos"/>
+        </w:rPr>
         <w:t>──</w:t>
       </w:r>
       <w:r>
         <w:t xml:space="preserve"> core/</w:t>
       </w:r>
-      <w:r>
-        <w:br/>
+    </w:p>
+    <w:p>
+      <w:r>
+        <w:t xml:space="preserve">│   </w:t>
       </w:r>
       <w:r>
         <w:rPr>
@@ -1663,20 +1580,167 @@
         <w:t>──</w:t>
       </w:r>
       <w:r>
+        <w:t xml:space="preserve"> diagnostics.py</w:t>
+      </w:r>
+    </w:p>
+    <w:p>
+      <w:r>
+        <w:t>│   └── job_manager.py</w:t>
+      </w:r>
+    </w:p>
+    <w:p>
+      <w:r>
+        <w:t>│</w:t>
+      </w:r>
+    </w:p>
+    <w:p>
+      <w:r>
+        <w:rPr>
+          <w:rFonts w:ascii="MS Gothic" w:eastAsia="MS Gothic" w:hAnsi="MS Gothic" w:cs="MS Gothic" w:hint="eastAsia"/>
+        </w:rPr>
+        <w:t>├</w:t>
+      </w:r>
+      <w:r>
+        <w:rPr>
+          <w:rFonts w:ascii="Aptos" w:hAnsi="Aptos" w:cs="Aptos"/>
+        </w:rPr>
+        <w:t>──</w:t>
+      </w:r>
+      <w:r>
         <w:t xml:space="preserve"> config/</w:t>
       </w:r>
-      <w:r>
-        <w:br/>
+    </w:p>
+    <w:p>
+      <w:r>
+        <w:t xml:space="preserve">│   </w:t>
+      </w:r>
+      <w:r>
+        <w:rPr>
+          <w:rFonts w:ascii="MS Gothic" w:eastAsia="MS Gothic" w:hAnsi="MS Gothic" w:cs="MS Gothic" w:hint="eastAsia"/>
+        </w:rPr>
+        <w:t>├</w:t>
       </w:r>
       <w:r>
         <w:rPr>
           <w:rFonts w:ascii="Aptos" w:hAnsi="Aptos" w:cs="Aptos"/>
         </w:rPr>
+        <w:t>──</w:t>
+      </w:r>
+      <w:r>
+        <w:t xml:space="preserve"> golden_C_current.json</w:t>
+      </w:r>
+    </w:p>
+    <w:p>
+      <w:r>
+        <w:t xml:space="preserve">│   </w:t>
+      </w:r>
+      <w:r>
+        <w:rPr>
+          <w:rFonts w:ascii="MS Gothic" w:eastAsia="MS Gothic" w:hAnsi="MS Gothic" w:cs="MS Gothic" w:hint="eastAsia"/>
+        </w:rPr>
+        <w:t>├</w:t>
+      </w:r>
+      <w:r>
+        <w:rPr>
+          <w:rFonts w:ascii="Aptos" w:hAnsi="Aptos" w:cs="Aptos"/>
+        </w:rPr>
+        <w:t>──</w:t>
+      </w:r>
+      <w:r>
+        <w:t xml:space="preserve"> golden_C_legacy.json</w:t>
+      </w:r>
+    </w:p>
+    <w:p>
+      <w:r>
+        <w:t>│   │</w:t>
+      </w:r>
+    </w:p>
+    <w:p>
+      <w:r>
+        <w:t xml:space="preserve">│   </w:t>
+      </w:r>
+      <w:r>
+        <w:rPr>
+          <w:rFonts w:ascii="MS Gothic" w:eastAsia="MS Gothic" w:hAnsi="MS Gothic" w:cs="MS Gothic" w:hint="eastAsia"/>
+        </w:rPr>
+        <w:t>├</w:t>
+      </w:r>
+      <w:r>
+        <w:rPr>
+          <w:rFonts w:ascii="Aptos" w:hAnsi="Aptos" w:cs="Aptos"/>
+        </w:rPr>
+        <w:t>──</w:t>
+      </w:r>
+      <w:r>
+        <w:t xml:space="preserve"> golden20_metrics_current.json</w:t>
+      </w:r>
+    </w:p>
+    <w:p>
+      <w:r>
+        <w:t xml:space="preserve">│   </w:t>
+      </w:r>
+      <w:r>
+        <w:rPr>
+          <w:rFonts w:ascii="MS Gothic" w:eastAsia="MS Gothic" w:hAnsi="MS Gothic" w:cs="MS Gothic" w:hint="eastAsia"/>
+        </w:rPr>
+        <w:t>├</w:t>
+      </w:r>
+      <w:r>
+        <w:rPr>
+          <w:rFonts w:ascii="Aptos" w:hAnsi="Aptos" w:cs="Aptos"/>
+        </w:rPr>
+        <w:t>──</w:t>
+      </w:r>
+      <w:r>
+        <w:t xml:space="preserve"> golden20_metrics_legacy.json</w:t>
+      </w:r>
+    </w:p>
+    <w:p>
+      <w:r>
+        <w:t>│   │</w:t>
+      </w:r>
+    </w:p>
+    <w:p>
+      <w:r>
+        <w:lastRenderedPageBreak/>
+        <w:t xml:space="preserve">│   </w:t>
+      </w:r>
+      <w:r>
+        <w:rPr>
+          <w:rFonts w:ascii="MS Gothic" w:eastAsia="MS Gothic" w:hAnsi="MS Gothic" w:cs="MS Gothic" w:hint="eastAsia"/>
+        </w:rPr>
+        <w:t>├</w:t>
+      </w:r>
+      <w:r>
+        <w:rPr>
+          <w:rFonts w:ascii="Aptos" w:hAnsi="Aptos" w:cs="Aptos"/>
+        </w:rPr>
+        <w:t>──</w:t>
+      </w:r>
+      <w:r>
+        <w:t xml:space="preserve"> golden20_current_scores.json      </w:t>
+      </w:r>
+      <w:r>
+        <w:rPr>
+          <w:rFonts w:ascii="Aptos" w:hAnsi="Aptos" w:cs="Aptos"/>
+        </w:rPr>
+        <w:t>←</w:t>
+      </w:r>
+      <w:r>
+        <w:t xml:space="preserve"> cached API scores</w:t>
+      </w:r>
+    </w:p>
+    <w:p>
+      <w:r>
+        <w:t>│   └── golden20_legacy_scores.json       ← cached API scores</w:t>
+      </w:r>
+    </w:p>
+    <w:p>
+      <w:r>
         <w:t>│</w:t>
       </w:r>
-      <w:r>
-        <w:t xml:space="preserve"> </w:t>
-      </w:r>
+    </w:p>
+    <w:p>
       <w:r>
         <w:rPr>
           <w:rFonts w:ascii="MS Gothic" w:eastAsia="MS Gothic" w:hAnsi="MS Gothic" w:cs="MS Gothic" w:hint="eastAsia"/>
@@ -1690,25 +1754,150 @@
         <w:t>──</w:t>
       </w:r>
       <w:r>
-        <w:t xml:space="preserve"> </w:t>
-      </w:r>
-      <w:proofErr w:type="spellStart"/>
-      <w:r>
-        <w:t>golden_C_current.json</w:t>
-      </w:r>
-      <w:proofErr w:type="spellEnd"/>
-      <w:r>
-        <w:br/>
+        <w:t xml:space="preserve"> elements/</w:t>
+      </w:r>
+    </w:p>
+    <w:p>
+      <w:r>
+        <w:t>│   └── element_C/</w:t>
+      </w:r>
+    </w:p>
+    <w:p>
+      <w:r>
+        <w:t xml:space="preserve">│       </w:t>
+      </w:r>
+      <w:r>
+        <w:rPr>
+          <w:rFonts w:ascii="MS Gothic" w:eastAsia="MS Gothic" w:hAnsi="MS Gothic" w:cs="MS Gothic" w:hint="eastAsia"/>
+        </w:rPr>
+        <w:t>├</w:t>
       </w:r>
       <w:r>
         <w:rPr>
           <w:rFonts w:ascii="Aptos" w:hAnsi="Aptos" w:cs="Aptos"/>
         </w:rPr>
+        <w:t>──</w:t>
+      </w:r>
+      <w:r>
+        <w:t xml:space="preserve"> score_with_API_C.py</w:t>
+      </w:r>
+    </w:p>
+    <w:p>
+      <w:r>
+        <w:t xml:space="preserve">│       </w:t>
+      </w:r>
+      <w:r>
+        <w:rPr>
+          <w:rFonts w:ascii="MS Gothic" w:eastAsia="MS Gothic" w:hAnsi="MS Gothic" w:cs="MS Gothic" w:hint="eastAsia"/>
+        </w:rPr>
+        <w:t>├</w:t>
+      </w:r>
+      <w:r>
+        <w:rPr>
+          <w:rFonts w:ascii="Aptos" w:hAnsi="Aptos" w:cs="Aptos"/>
+        </w:rPr>
+        <w:t>──</w:t>
+      </w:r>
+      <w:r>
+        <w:t xml:space="preserve"> scorer_app_C.py</w:t>
+      </w:r>
+    </w:p>
+    <w:p>
+      <w:r>
+        <w:t>│       │</w:t>
+      </w:r>
+    </w:p>
+    <w:p>
+      <w:r>
+        <w:t xml:space="preserve">│       </w:t>
+      </w:r>
+      <w:r>
+        <w:rPr>
+          <w:rFonts w:ascii="MS Gothic" w:eastAsia="MS Gothic" w:hAnsi="MS Gothic" w:cs="MS Gothic" w:hint="eastAsia"/>
+        </w:rPr>
+        <w:t>├</w:t>
+      </w:r>
+      <w:r>
+        <w:rPr>
+          <w:rFonts w:ascii="Aptos" w:hAnsi="Aptos" w:cs="Aptos"/>
+        </w:rPr>
+        <w:t>──</w:t>
+      </w:r>
+      <w:r>
+        <w:t xml:space="preserve"> Current_GPT.csv</w:t>
+      </w:r>
+    </w:p>
+    <w:p>
+      <w:r>
+        <w:t xml:space="preserve">│       </w:t>
+      </w:r>
+      <w:r>
+        <w:rPr>
+          <w:rFonts w:ascii="MS Gothic" w:eastAsia="MS Gothic" w:hAnsi="MS Gothic" w:cs="MS Gothic" w:hint="eastAsia"/>
+        </w:rPr>
+        <w:t>├</w:t>
+      </w:r>
+      <w:r>
+        <w:rPr>
+          <w:rFonts w:ascii="Aptos" w:hAnsi="Aptos" w:cs="Aptos"/>
+        </w:rPr>
+        <w:t>──</w:t>
+      </w:r>
+      <w:r>
+        <w:t xml:space="preserve"> Legacy_GPT.csv</w:t>
+      </w:r>
+    </w:p>
+    <w:p>
+      <w:r>
+        <w:t>│       │</w:t>
+      </w:r>
+    </w:p>
+    <w:p>
+      <w:r>
+        <w:t xml:space="preserve">│       </w:t>
+      </w:r>
+      <w:r>
+        <w:rPr>
+          <w:rFonts w:ascii="MS Gothic" w:eastAsia="MS Gothic" w:hAnsi="MS Gothic" w:cs="MS Gothic" w:hint="eastAsia"/>
+        </w:rPr>
+        <w:t>├</w:t>
+      </w:r>
+      <w:r>
+        <w:rPr>
+          <w:rFonts w:ascii="Aptos" w:hAnsi="Aptos" w:cs="Aptos"/>
+        </w:rPr>
+        <w:t>──</w:t>
+      </w:r>
+      <w:r>
+        <w:t xml:space="preserve"> current_api_scoring_documents/</w:t>
+      </w:r>
+    </w:p>
+    <w:p>
+      <w:r>
+        <w:t>│       │   └── (documents scored using current model)</w:t>
+      </w:r>
+    </w:p>
+    <w:p>
+      <w:r>
+        <w:t>│       │</w:t>
+      </w:r>
+    </w:p>
+    <w:p>
+      <w:r>
+        <w:t>│       └── legacy_api_scoring_documents/</w:t>
+      </w:r>
+    </w:p>
+    <w:p>
+      <w:r>
+        <w:t>│           └── (documents scored using legacy model)</w:t>
+      </w:r>
+    </w:p>
+    <w:p>
+      <w:r>
         <w:t>│</w:t>
       </w:r>
-      <w:r>
-        <w:t xml:space="preserve"> </w:t>
-      </w:r>
+    </w:p>
+    <w:p>
       <w:r>
         <w:rPr>
           <w:rFonts w:ascii="MS Gothic" w:eastAsia="MS Gothic" w:hAnsi="MS Gothic" w:cs="MS Gothic" w:hint="eastAsia"/>
@@ -1722,25 +1911,90 @@
         <w:t>──</w:t>
       </w:r>
       <w:r>
-        <w:t xml:space="preserve"> </w:t>
-      </w:r>
-      <w:proofErr w:type="spellStart"/>
-      <w:r>
-        <w:t>golden_C_legacy.json</w:t>
-      </w:r>
-      <w:proofErr w:type="spellEnd"/>
-      <w:r>
-        <w:br/>
+        <w:t xml:space="preserve"> scripts/</w:t>
+      </w:r>
+    </w:p>
+    <w:p>
+      <w:r>
+        <w:t>│   └── shared/</w:t>
+      </w:r>
+    </w:p>
+    <w:p>
+      <w:r>
+        <w:t>│       └── utils.py</w:t>
+      </w:r>
+    </w:p>
+    <w:p>
+      <w:r>
+        <w:t xml:space="preserve">│       └── </w:t>
+      </w:r>
+      <w:r>
+        <w:t>validate_golden20</w:t>
+      </w:r>
+      <w:r>
+        <w:t>.py</w:t>
+      </w:r>
+    </w:p>
+    <w:p/>
+    <w:p>
+      <w:r>
+        <w:t>│</w:t>
+      </w:r>
+    </w:p>
+    <w:p>
+      <w:r>
+        <w:rPr>
+          <w:rFonts w:ascii="MS Gothic" w:eastAsia="MS Gothic" w:hAnsi="MS Gothic" w:cs="MS Gothic" w:hint="eastAsia"/>
+        </w:rPr>
+        <w:t>├</w:t>
       </w:r>
       <w:r>
         <w:rPr>
           <w:rFonts w:ascii="Aptos" w:hAnsi="Aptos" w:cs="Aptos"/>
         </w:rPr>
+        <w:t>──</w:t>
+      </w:r>
+      <w:r>
+        <w:t xml:space="preserve"> simple_ui/</w:t>
+      </w:r>
+    </w:p>
+    <w:p>
+      <w:r>
+        <w:t xml:space="preserve">│   </w:t>
+      </w:r>
+      <w:r>
+        <w:rPr>
+          <w:rFonts w:ascii="MS Gothic" w:eastAsia="MS Gothic" w:hAnsi="MS Gothic" w:cs="MS Gothic" w:hint="eastAsia"/>
+        </w:rPr>
+        <w:t>├</w:t>
+      </w:r>
+      <w:r>
+        <w:rPr>
+          <w:rFonts w:ascii="Aptos" w:hAnsi="Aptos" w:cs="Aptos"/>
+        </w:rPr>
+        <w:t>──</w:t>
+      </w:r>
+      <w:r>
+        <w:t xml:space="preserve"> shared/</w:t>
+      </w:r>
+    </w:p>
+    <w:p>
+      <w:r>
+        <w:lastRenderedPageBreak/>
+        <w:t>│   │   └── script.js</w:t>
+      </w:r>
+    </w:p>
+    <w:p>
+      <w:r>
+        <w:t>│       └── index.html</w:t>
+      </w:r>
+    </w:p>
+    <w:p>
+      <w:r>
         <w:t>│</w:t>
       </w:r>
-      <w:r>
-        <w:t xml:space="preserve"> </w:t>
-      </w:r>
+    </w:p>
+    <w:p>
       <w:r>
         <w:rPr>
           <w:rFonts w:ascii="MS Gothic" w:eastAsia="MS Gothic" w:hAnsi="MS Gothic" w:cs="MS Gothic" w:hint="eastAsia"/>
@@ -1754,418 +2008,24 @@
         <w:t>──</w:t>
       </w:r>
       <w:r>
-        <w:t xml:space="preserve"> golden20_metrics_current.json</w:t>
-      </w:r>
-      <w:r>
-        <w:br/>
-      </w:r>
-      <w:r>
-        <w:rPr>
-          <w:rFonts w:ascii="Aptos" w:hAnsi="Aptos" w:cs="Aptos"/>
-        </w:rPr>
-        <w:t>│</w:t>
-      </w:r>
-      <w:r>
-        <w:t xml:space="preserve"> </w:t>
-      </w:r>
-      <w:r>
-        <w:rPr>
-          <w:rFonts w:ascii="MS Gothic" w:eastAsia="MS Gothic" w:hAnsi="MS Gothic" w:cs="MS Gothic" w:hint="eastAsia"/>
-        </w:rPr>
-        <w:t>├</w:t>
-      </w:r>
-      <w:r>
-        <w:rPr>
-          <w:rFonts w:ascii="Aptos" w:hAnsi="Aptos" w:cs="Aptos"/>
-        </w:rPr>
-        <w:t>──</w:t>
-      </w:r>
-      <w:r>
-        <w:t xml:space="preserve"> golden20_metrics_legacy.json</w:t>
-      </w:r>
-      <w:r>
-        <w:br/>
-      </w:r>
-      <w:r>
-        <w:rPr>
-          <w:rFonts w:ascii="Aptos" w:hAnsi="Aptos" w:cs="Aptos"/>
-        </w:rPr>
-        <w:t>│</w:t>
-      </w:r>
-      <w:r>
-        <w:t xml:space="preserve"> </w:t>
-      </w:r>
-      <w:r>
-        <w:rPr>
-          <w:rFonts w:ascii="MS Gothic" w:eastAsia="MS Gothic" w:hAnsi="MS Gothic" w:cs="MS Gothic" w:hint="eastAsia"/>
-        </w:rPr>
-        <w:t>├</w:t>
-      </w:r>
-      <w:r>
-        <w:rPr>
-          <w:rFonts w:ascii="Aptos" w:hAnsi="Aptos" w:cs="Aptos"/>
-        </w:rPr>
-        <w:t>──</w:t>
-      </w:r>
-      <w:r>
-        <w:t xml:space="preserve"> golden20_current_scores.json </w:t>
-      </w:r>
-      <w:r>
-        <w:rPr>
-          <w:rFonts w:ascii="Aptos" w:hAnsi="Aptos" w:cs="Aptos"/>
-        </w:rPr>
-        <w:t>←</w:t>
-      </w:r>
-      <w:r>
-        <w:t xml:space="preserve"> cache</w:t>
-      </w:r>
-      <w:r>
-        <w:br/>
-      </w:r>
-      <w:r>
-        <w:rPr>
-          <w:rFonts w:ascii="Aptos" w:hAnsi="Aptos" w:cs="Aptos"/>
-        </w:rPr>
-        <w:t>│</w:t>
-      </w:r>
-      <w:r>
-        <w:t xml:space="preserve"> </w:t>
-      </w:r>
-      <w:r>
-        <w:t xml:space="preserve"> </w:t>
-      </w:r>
-      <w:r>
-        <w:rPr>
-          <w:rFonts w:ascii="Aptos" w:hAnsi="Aptos" w:cs="Aptos"/>
-        </w:rPr>
-        <w:t>└──</w:t>
-      </w:r>
-      <w:r>
-        <w:t xml:space="preserve"> golden20_legacy_scores.json </w:t>
-      </w:r>
-      <w:r>
-        <w:rPr>
-          <w:rFonts w:ascii="Aptos" w:hAnsi="Aptos" w:cs="Aptos"/>
-        </w:rPr>
-        <w:t>←</w:t>
-      </w:r>
-      <w:r>
-        <w:t xml:space="preserve"> cache</w:t>
-      </w:r>
-      <w:r>
-        <w:br/>
-        <w:t>│</w:t>
-      </w:r>
-      <w:r>
-        <w:rPr>
-          <w:rFonts w:ascii="Aptos" w:hAnsi="Aptos" w:cs="Aptos"/>
-        </w:rPr>
-        <w:t>──</w:t>
-      </w:r>
-      <w:r>
-        <w:t xml:space="preserve"> elements/</w:t>
-      </w:r>
-      <w:r>
-        <w:br/>
-      </w:r>
-      <w:r>
-        <w:rPr>
-          <w:rFonts w:ascii="Aptos" w:hAnsi="Aptos" w:cs="Aptos"/>
-        </w:rPr>
-        <w:t>│</w:t>
-      </w:r>
-      <w:r>
-        <w:t xml:space="preserve">   </w:t>
-      </w:r>
-      <w:r>
-        <w:rPr>
-          <w:rFonts w:ascii="Aptos" w:hAnsi="Aptos" w:cs="Aptos"/>
-        </w:rPr>
-        <w:t>└──</w:t>
-      </w:r>
-      <w:r>
-        <w:t xml:space="preserve"> </w:t>
-      </w:r>
-      <w:proofErr w:type="spellStart"/>
-      <w:r>
-        <w:t>element_C</w:t>
-      </w:r>
-      <w:proofErr w:type="spellEnd"/>
-      <w:r>
-        <w:t>/</w:t>
-      </w:r>
-      <w:r>
-        <w:br/>
-      </w:r>
-      <w:r>
-        <w:rPr>
-          <w:rFonts w:ascii="Aptos" w:hAnsi="Aptos" w:cs="Aptos"/>
-        </w:rPr>
-        <w:t>│</w:t>
-      </w:r>
-      <w:r>
-        <w:t xml:space="preserve">       </w:t>
-      </w:r>
-      <w:r>
-        <w:rPr>
-          <w:rFonts w:ascii="MS Gothic" w:eastAsia="MS Gothic" w:hAnsi="MS Gothic" w:cs="MS Gothic" w:hint="eastAsia"/>
-        </w:rPr>
-        <w:t>├</w:t>
-      </w:r>
-      <w:r>
-        <w:rPr>
-          <w:rFonts w:ascii="Aptos" w:hAnsi="Aptos" w:cs="Aptos"/>
-        </w:rPr>
-        <w:t>──</w:t>
-      </w:r>
-      <w:r>
-        <w:t xml:space="preserve"> score_with_API_C.py</w:t>
-      </w:r>
-      <w:r>
-        <w:br/>
-      </w:r>
-      <w:r>
-        <w:rPr>
-          <w:rFonts w:ascii="Aptos" w:hAnsi="Aptos" w:cs="Aptos"/>
-        </w:rPr>
-        <w:t>│</w:t>
-      </w:r>
-      <w:r>
-        <w:t xml:space="preserve">       </w:t>
-      </w:r>
-      <w:r>
-        <w:rPr>
-          <w:rFonts w:ascii="MS Gothic" w:eastAsia="MS Gothic" w:hAnsi="MS Gothic" w:cs="MS Gothic" w:hint="eastAsia"/>
-        </w:rPr>
-        <w:t>├</w:t>
-      </w:r>
-      <w:r>
-        <w:rPr>
-          <w:rFonts w:ascii="Aptos" w:hAnsi="Aptos" w:cs="Aptos"/>
-        </w:rPr>
-        <w:t>──</w:t>
-      </w:r>
-      <w:r>
-        <w:t xml:space="preserve"> scorer_app_C.py</w:t>
-      </w:r>
-      <w:r>
-        <w:br/>
-      </w:r>
-      <w:r>
-        <w:rPr>
-          <w:rFonts w:ascii="Aptos" w:hAnsi="Aptos" w:cs="Aptos"/>
-        </w:rPr>
-        <w:t>│</w:t>
-      </w:r>
-      <w:r>
-        <w:t xml:space="preserve">       </w:t>
-      </w:r>
-      <w:r>
-        <w:rPr>
-          <w:rFonts w:ascii="MS Gothic" w:eastAsia="MS Gothic" w:hAnsi="MS Gothic" w:cs="MS Gothic" w:hint="eastAsia"/>
-        </w:rPr>
-        <w:t>├</w:t>
-      </w:r>
-      <w:r>
-        <w:rPr>
-          <w:rFonts w:ascii="Aptos" w:hAnsi="Aptos" w:cs="Aptos"/>
-        </w:rPr>
-        <w:t>──</w:t>
-      </w:r>
-      <w:r>
-        <w:t xml:space="preserve"> Current_GPT.csv</w:t>
-      </w:r>
-      <w:r>
-        <w:br/>
-      </w:r>
-      <w:r>
-        <w:rPr>
-          <w:rFonts w:ascii="Aptos" w:hAnsi="Aptos" w:cs="Aptos"/>
-        </w:rPr>
-        <w:t>│</w:t>
-      </w:r>
-      <w:r>
-        <w:t xml:space="preserve">       </w:t>
-      </w:r>
-      <w:r>
-        <w:rPr>
-          <w:rFonts w:ascii="MS Gothic" w:eastAsia="MS Gothic" w:hAnsi="MS Gothic" w:cs="MS Gothic" w:hint="eastAsia"/>
-        </w:rPr>
-        <w:t>├</w:t>
-      </w:r>
-      <w:r>
-        <w:rPr>
-          <w:rFonts w:ascii="Aptos" w:hAnsi="Aptos" w:cs="Aptos"/>
-        </w:rPr>
-        <w:t>──</w:t>
-      </w:r>
-      <w:r>
-        <w:t xml:space="preserve"> Legacy_GPT.csv</w:t>
-      </w:r>
-      <w:r>
-        <w:br/>
-      </w:r>
-      <w:r>
-        <w:rPr>
-          <w:rFonts w:ascii="Aptos" w:hAnsi="Aptos" w:cs="Aptos"/>
-        </w:rPr>
-        <w:t>│</w:t>
-      </w:r>
-      <w:r>
-        <w:t xml:space="preserve">       </w:t>
-      </w:r>
-      <w:r>
-        <w:rPr>
-          <w:rFonts w:ascii="MS Gothic" w:eastAsia="MS Gothic" w:hAnsi="MS Gothic" w:cs="MS Gothic" w:hint="eastAsia"/>
-        </w:rPr>
-        <w:t>├</w:t>
-      </w:r>
-      <w:r>
-        <w:rPr>
-          <w:rFonts w:ascii="Aptos" w:hAnsi="Aptos" w:cs="Aptos"/>
-        </w:rPr>
-        <w:t>──</w:t>
-      </w:r>
-      <w:r>
-        <w:t xml:space="preserve"> </w:t>
-      </w:r>
-      <w:proofErr w:type="spellStart"/>
-      <w:r>
-        <w:t>current_api_scoring_documents</w:t>
-      </w:r>
-      <w:proofErr w:type="spellEnd"/>
-      <w:r>
-        <w:t>/</w:t>
-      </w:r>
-      <w:r>
-        <w:br/>
-      </w:r>
-      <w:r>
-        <w:rPr>
-          <w:rFonts w:ascii="Aptos" w:hAnsi="Aptos" w:cs="Aptos"/>
-        </w:rPr>
-        <w:t>│</w:t>
-      </w:r>
-      <w:r>
-        <w:t xml:space="preserve">       </w:t>
-      </w:r>
-      <w:r>
-        <w:rPr>
-          <w:rFonts w:ascii="Aptos" w:hAnsi="Aptos" w:cs="Aptos"/>
-        </w:rPr>
-        <w:t>└──</w:t>
-      </w:r>
-      <w:r>
-        <w:t xml:space="preserve"> </w:t>
-      </w:r>
-      <w:proofErr w:type="spellStart"/>
-      <w:r>
-        <w:t>legacy_api_scoring_documents</w:t>
-      </w:r>
-      <w:proofErr w:type="spellEnd"/>
-      <w:r>
-        <w:t>/</w:t>
-      </w:r>
-      <w:r>
-        <w:br/>
-      </w:r>
-      <w:r>
-        <w:rPr>
-          <w:rFonts w:ascii="Aptos" w:hAnsi="Aptos" w:cs="Aptos"/>
-        </w:rPr>
-        <w:t>│</w:t>
-      </w:r>
-      <w:r>
-        <w:rPr>
-          <w:rFonts w:ascii="Aptos" w:hAnsi="Aptos" w:cs="Aptos"/>
-        </w:rPr>
-        <w:t xml:space="preserve">       </w:t>
-      </w:r>
-      <w:r>
-        <w:rPr>
-          <w:rFonts w:ascii="Aptos" w:hAnsi="Aptos" w:cs="Aptos"/>
-        </w:rPr>
-        <w:t>└── validate_golden20_C.py</w:t>
-      </w:r>
-      <w:r>
-        <w:br/>
-      </w:r>
-      <w:r>
-        <w:rPr>
-          <w:rFonts w:ascii="MS Gothic" w:eastAsia="MS Gothic" w:hAnsi="MS Gothic" w:cs="MS Gothic" w:hint="eastAsia"/>
-        </w:rPr>
-        <w:t>├</w:t>
-      </w:r>
-      <w:r>
-        <w:rPr>
-          <w:rFonts w:ascii="Aptos" w:hAnsi="Aptos" w:cs="Aptos"/>
-        </w:rPr>
-        <w:t>──</w:t>
-      </w:r>
-      <w:r>
-        <w:t xml:space="preserve"> scripts/shared/utils.py</w:t>
-      </w:r>
-      <w:r>
-        <w:br/>
-      </w:r>
-      <w:r>
-        <w:rPr>
-          <w:rFonts w:ascii="MS Gothic" w:eastAsia="MS Gothic" w:hAnsi="MS Gothic" w:cs="MS Gothic" w:hint="eastAsia"/>
-        </w:rPr>
-        <w:lastRenderedPageBreak/>
-        <w:t>├</w:t>
-      </w:r>
-      <w:r>
-        <w:rPr>
-          <w:rFonts w:ascii="Aptos" w:hAnsi="Aptos" w:cs="Aptos"/>
-        </w:rPr>
-        <w:t>──</w:t>
-      </w:r>
-      <w:r>
-        <w:t xml:space="preserve"> </w:t>
-      </w:r>
-      <w:proofErr w:type="spellStart"/>
-      <w:r>
-        <w:t>simple_ui</w:t>
-      </w:r>
-      <w:proofErr w:type="spellEnd"/>
-      <w:r>
-        <w:t>/</w:t>
-      </w:r>
-      <w:r>
-        <w:br/>
-      </w:r>
-      <w:r>
-        <w:rPr>
-          <w:rFonts w:ascii="MS Gothic" w:eastAsia="MS Gothic" w:hAnsi="MS Gothic" w:cs="MS Gothic" w:hint="eastAsia"/>
-        </w:rPr>
-        <w:t>├</w:t>
-      </w:r>
-      <w:r>
-        <w:rPr>
-          <w:rFonts w:ascii="Aptos" w:hAnsi="Aptos" w:cs="Aptos"/>
-        </w:rPr>
-        <w:t>──</w:t>
-      </w:r>
-      <w:r>
         <w:t xml:space="preserve"> requirements.txt</w:t>
       </w:r>
-      <w:r>
-        <w:br/>
-      </w:r>
-      <w:r>
-        <w:rPr>
-          <w:rFonts w:ascii="Aptos" w:hAnsi="Aptos" w:cs="Aptos"/>
-        </w:rPr>
-        <w:t>└──</w:t>
-      </w:r>
-      <w:r>
-        <w:t xml:space="preserve"> train_env_setup.bat</w:t>
-      </w:r>
-    </w:p>
-    <w:p>
-      <w:r>
-        <w:t>Training scripts, model artifacts, and experimental calibration files are intentionally excluded from this release.</w:t>
+    </w:p>
+    <w:p>
+      <w:r>
+        <w:t>└── train_env_setup.bat,</w:t>
+      </w:r>
+    </w:p>
+    <w:p/>
+    <w:p>
+      <w:r>
+        <w:t>Training scripts, model</w:t>
+      </w:r>
+      <w:r>
+        <w:t>s, a</w:t>
+      </w:r>
+      <w:r>
+        <w:t>rtifacts, and experimental calibration files are intentionally excluded from this release.</w:t>
       </w:r>
       <w:r>
         <w:t xml:space="preserve">  This element is not currently using lightweight ML, having opted for the linear calibration technique described above.</w:t>
@@ -2250,7 +2110,7 @@
     <w:p>
       <w:r>
         <w:pict w14:anchorId="03FCAD0D">
-          <v:rect id="_x0000_i1094" style="width:0;height:1.5pt" o:hralign="center" o:hrstd="t" o:hr="t" fillcolor="#a0a0a0" stroked="f"/>
+          <v:rect id="_x0000_i1035" style="width:0;height:1.5pt" o:hralign="center" o:hrstd="t" o:hr="t" fillcolor="#a0a0a0" stroked="f"/>
         </w:pict>
       </w:r>
     </w:p>
@@ -2322,7 +2182,7 @@
     <w:p>
       <w:r>
         <w:pict w14:anchorId="6B42F7BD">
-          <v:rect id="_x0000_i1080" style="width:0;height:1.5pt" o:hralign="center" o:hrstd="t" o:hr="t" fillcolor="#a0a0a0" stroked="f"/>
+          <v:rect id="_x0000_i1036" style="width:0;height:1.5pt" o:hralign="center" o:hrstd="t" o:hr="t" fillcolor="#a0a0a0" stroked="f"/>
         </w:pict>
       </w:r>
     </w:p>
@@ -2348,6 +2208,7 @@
     </w:p>
     <w:p>
       <w:r>
+        <w:lastRenderedPageBreak/>
         <w:t>After each batch scoring run, the system computes summary statistics for both:</w:t>
       </w:r>
     </w:p>
@@ -2359,13 +2220,8 @@
         </w:numPr>
       </w:pPr>
       <w:r>
-        <w:t xml:space="preserve">Raw API </w:t>
-      </w:r>
-      <w:proofErr w:type="spellStart"/>
-      <w:r>
-        <w:t>subscores</w:t>
-      </w:r>
-      <w:proofErr w:type="spellEnd"/>
+        <w:t>Raw API subscores</w:t>
+      </w:r>
     </w:p>
     <w:p>
       <w:pPr>
@@ -2380,7 +2236,6 @@
     </w:p>
     <w:p>
       <w:r>
-        <w:lastRenderedPageBreak/>
         <w:t>The following metrics are tracked:</w:t>
       </w:r>
     </w:p>
@@ -2488,7 +2343,7 @@
     <w:p>
       <w:r>
         <w:pict w14:anchorId="032705ED">
-          <v:rect id="_x0000_i1081" style="width:0;height:1.5pt" o:hralign="center" o:hrstd="t" o:hr="t" fillcolor="#a0a0a0" stroked="f"/>
+          <v:rect id="_x0000_i1037" style="width:0;height:1.5pt" o:hralign="center" o:hrstd="t" o:hr="t" fillcolor="#a0a0a0" stroked="f"/>
         </w:pict>
       </w:r>
     </w:p>
@@ -2514,7 +2369,7 @@
     </w:p>
     <w:p>
       <w:r>
-        <w:t>validate_golden20_C.py</w:t>
+        <w:t>validate_golden20.py</w:t>
       </w:r>
     </w:p>
     <w:p>
@@ -2633,6 +2488,7 @@
           <w:b/>
           <w:bCs/>
         </w:rPr>
+        <w:lastRenderedPageBreak/>
         <w:t>95% Confidence Interval</w:t>
       </w:r>
       <w:r>
@@ -2656,14 +2512,13 @@
     </w:p>
     <w:p>
       <w:r>
-        <w:lastRenderedPageBreak/>
         <w:t>These metrics are compared to stored baseline metrics to determine whether scoring behavior has changed.</w:t>
       </w:r>
     </w:p>
     <w:p>
       <w:r>
         <w:pict w14:anchorId="0B1AF6BE">
-          <v:rect id="_x0000_i1082" style="width:0;height:1.5pt" o:hralign="center" o:hrstd="t" o:hr="t" fillcolor="#a0a0a0" stroked="f"/>
+          <v:rect id="_x0000_i1038" style="width:0;height:1.5pt" o:hralign="center" o:hrstd="t" o:hr="t" fillcolor="#a0a0a0" stroked="f"/>
         </w:pict>
       </w:r>
     </w:p>
@@ -2710,13 +2565,8 @@
           <w:numId w:val="25"/>
         </w:numPr>
       </w:pPr>
-      <w:proofErr w:type="spellStart"/>
-      <w:r>
-        <w:t>Subscores</w:t>
-      </w:r>
-      <w:proofErr w:type="spellEnd"/>
-      <w:r>
-        <w:t xml:space="preserve"> (C1–C6) are stored in cache files</w:t>
+      <w:r>
+        <w:t>Subscores (C1–C6) are stored in cache files</w:t>
       </w:r>
     </w:p>
     <w:p>
@@ -2798,7 +2648,7 @@
     <w:p>
       <w:r>
         <w:pict w14:anchorId="24789FDC">
-          <v:rect id="_x0000_i1083" style="width:0;height:1.5pt" o:hralign="center" o:hrstd="t" o:hr="t" fillcolor="#a0a0a0" stroked="f"/>
+          <v:rect id="_x0000_i1039" style="width:0;height:1.5pt" o:hralign="center" o:hrstd="t" o:hr="t" fillcolor="#a0a0a0" stroked="f"/>
         </w:pict>
       </w:r>
     </w:p>
@@ -2823,19 +2673,13 @@
       </w:r>
     </w:p>
     <w:p>
-      <w:proofErr w:type="spellStart"/>
       <w:r>
         <w:t>golden_C_current_metrics.json</w:t>
       </w:r>
-      <w:proofErr w:type="spellEnd"/>
       <w:r>
         <w:br/>
-      </w:r>
-      <w:proofErr w:type="spellStart"/>
-      <w:r>
         <w:t>golden_C_legacy_metrics.json</w:t>
       </w:r>
-      <w:proofErr w:type="spellEnd"/>
     </w:p>
     <w:p>
       <w:r>
@@ -2845,7 +2689,7 @@
     <w:p>
       <w:r>
         <w:pict w14:anchorId="4299744F">
-          <v:rect id="_x0000_i1084" style="width:0;height:1.5pt" o:hralign="center" o:hrstd="t" o:hr="t" fillcolor="#a0a0a0" stroked="f"/>
+          <v:rect id="_x0000_i1040" style="width:0;height:1.5pt" o:hralign="center" o:hrstd="t" o:hr="t" fillcolor="#a0a0a0" stroked="f"/>
         </w:pict>
       </w:r>
     </w:p>
@@ -2866,17 +2710,28 @@
     </w:p>
     <w:p>
       <w:r>
+        <w:lastRenderedPageBreak/>
         <w:t>To run the Golden benchmark validation:</w:t>
       </w:r>
     </w:p>
     <w:p>
       <w:r>
-        <w:t>python validate_golden20_C.py</w:t>
-      </w:r>
-    </w:p>
-    <w:p>
-      <w:r>
-        <w:lastRenderedPageBreak/>
+        <w:t>cd c:\GPTScorer\scripts\shared</w:t>
+      </w:r>
+    </w:p>
+    <w:p>
+      <w:r>
+        <w:t>c:\GPTScorer\scripts\shared</w:t>
+      </w:r>
+      <w:r>
+        <w:t xml:space="preserve">&gt; </w:t>
+      </w:r>
+      <w:r>
+        <w:t>python validate_golden20.py</w:t>
+      </w:r>
+    </w:p>
+    <w:p>
+      <w:r>
         <w:t>The script will:</w:t>
       </w:r>
     </w:p>
@@ -2938,7 +2793,7 @@
     <w:p>
       <w:r>
         <w:pict w14:anchorId="140FCA8A">
-          <v:rect id="_x0000_i1085" style="width:0;height:1.5pt" o:hralign="center" o:hrstd="t" o:hr="t" fillcolor="#a0a0a0" stroked="f"/>
+          <v:rect id="_x0000_i1041" style="width:0;height:1.5pt" o:hralign="center" o:hrstd="t" o:hr="t" fillcolor="#a0a0a0" stroked="f"/>
         </w:pict>
       </w:r>
     </w:p>
@@ -2968,36 +2823,20 @@
       </w:r>
       <w:r>
         <w:br/>
-      </w:r>
-      <w:proofErr w:type="spellStart"/>
-      <w:r>
         <w:t>golden_C_current_cases.json</w:t>
       </w:r>
-      <w:proofErr w:type="spellEnd"/>
       <w:r>
         <w:br/>
-      </w:r>
-      <w:proofErr w:type="spellStart"/>
-      <w:r>
         <w:t>golden_C_legacy_cases.json</w:t>
       </w:r>
-      <w:proofErr w:type="spellEnd"/>
       <w:r>
         <w:br/>
-      </w:r>
-      <w:proofErr w:type="spellStart"/>
-      <w:r>
         <w:t>golden_C_current_metrics.json</w:t>
       </w:r>
-      <w:proofErr w:type="spellEnd"/>
       <w:r>
         <w:br/>
-      </w:r>
-      <w:proofErr w:type="spellStart"/>
-      <w:r>
         <w:t>golden_C_legacy_metrics.json</w:t>
       </w:r>
-      <w:proofErr w:type="spellEnd"/>
       <w:r>
         <w:br/>
         <w:t>golden20_api_scores_current.json</w:t>
@@ -3025,7 +2864,7 @@
     <w:p>
       <w:r>
         <w:pict w14:anchorId="3CD9C508">
-          <v:rect id="_x0000_i1086" style="width:0;height:1.5pt" o:hralign="center" o:hrstd="t" o:hr="t" fillcolor="#a0a0a0" stroked="f"/>
+          <v:rect id="_x0000_i1042" style="width:0;height:1.5pt" o:hralign="center" o:hrstd="t" o:hr="t" fillcolor="#a0a0a0" stroked="f"/>
         </w:pict>
       </w:r>
     </w:p>
@@ -3095,6 +2934,7 @@
     </w:p>
     <w:p>
       <w:r>
+        <w:lastRenderedPageBreak/>
         <w:t>This ensures that automated scoring remains stable and consistent over time.</w:t>
       </w:r>
     </w:p>
@@ -3102,7 +2942,7 @@
     <w:p>
       <w:r>
         <w:pict w14:anchorId="6BA7B863">
-          <v:rect id="_x0000_i1035" style="width:0;height:1.5pt" o:hralign="center" o:hrstd="t" o:hr="t" fillcolor="#a0a0a0" stroked="f"/>
+          <v:rect id="_x0000_i1043" style="width:0;height:1.5pt" o:hralign="center" o:hrstd="t" o:hr="t" fillcolor="#a0a0a0" stroked="f"/>
         </w:pict>
       </w:r>
     </w:p>
@@ -3118,7 +2958,6 @@
           <w:b/>
           <w:bCs/>
         </w:rPr>
-        <w:lastRenderedPageBreak/>
         <w:t>Known Limitations</w:t>
       </w:r>
     </w:p>
@@ -3169,7 +3008,7 @@
     <w:p>
       <w:r>
         <w:pict w14:anchorId="1C59A421">
-          <v:rect id="_x0000_i1036" style="width:0;height:1.5pt" o:hralign="center" o:hrstd="t" o:hr="t" fillcolor="#a0a0a0" stroked="f"/>
+          <v:rect id="_x0000_i1044" style="width:0;height:1.5pt" o:hralign="center" o:hrstd="t" o:hr="t" fillcolor="#a0a0a0" stroked="f"/>
         </w:pict>
       </w:r>
     </w:p>
@@ -3227,7 +3066,7 @@
     <w:p>
       <w:r>
         <w:pict w14:anchorId="35FA4AB3">
-          <v:rect id="_x0000_i1037" style="width:0;height:1.5pt" o:hralign="center" o:hrstd="t" o:hr="t" fillcolor="#a0a0a0" stroked="f"/>
+          <v:rect id="_x0000_i1045" style="width:0;height:1.5pt" o:hralign="center" o:hrstd="t" o:hr="t" fillcolor="#a0a0a0" stroked="f"/>
         </w:pict>
       </w:r>
     </w:p>
@@ -8023,6 +7862,7 @@
   <w:style w:type="character" w:default="1" w:styleId="DefaultParagraphFont">
     <w:name w:val="Default Paragraph Font"/>
     <w:uiPriority w:val="1"/>
+    <w:semiHidden/>
     <w:unhideWhenUsed/>
   </w:style>
   <w:style w:type="table" w:default="1" w:styleId="TableNormal">

</xml_diff>

<commit_message>
Element A added to repo
</commit_message>
<xml_diff>
--- a/Readme.docx
+++ b/Readme.docx
@@ -14,7 +14,7 @@
           <w:b/>
           <w:bCs/>
         </w:rPr>
-        <w:t>GPTScorer – Element C Scoring Application</w:t>
+        <w:t>GPTScorer – Element  Scoring Application</w:t>
       </w:r>
     </w:p>
     <w:p>
@@ -27,8 +27,10 @@
       <w:r>
         <w:t xml:space="preserve"> scoring application for MyDesign – Element C (Presentation and Justification of Solution Design Requirements).</w:t>
       </w:r>
-    </w:p>
-    <w:p/>
+      <w:r>
+        <w:t xml:space="preserve">  Element A has also been added with the same architecture.  The discussion below describes Element C but is applicable to Element A as well.</w:t>
+      </w:r>
+    </w:p>
     <w:p>
       <w:r>
         <w:t>The system uses deterministic GPT-based evaluation combined with post-processing calibration to generate rubric-aligned sub-scores (C1–C6), a calibrated element score, and structured narrative feedback suitable for educator review.</w:t>
@@ -1926,13 +1928,7 @@
     </w:p>
     <w:p>
       <w:r>
-        <w:t xml:space="preserve">│       └── </w:t>
-      </w:r>
-      <w:r>
-        <w:t>validate_golden20</w:t>
-      </w:r>
-      <w:r>
-        <w:t>.py</w:t>
+        <w:t>│       └── validate_golden20.py</w:t>
       </w:r>
     </w:p>
     <w:p/>
@@ -2721,10 +2717,7 @@
     </w:p>
     <w:p>
       <w:r>
-        <w:t>c:\GPTScorer\scripts\shared</w:t>
-      </w:r>
-      <w:r>
-        <w:t xml:space="preserve">&gt; </w:t>
+        <w:t xml:space="preserve">c:\GPTScorer\scripts\shared&gt; </w:t>
       </w:r>
       <w:r>
         <w:t>python validate_golden20.py</w:t>

</xml_diff>

<commit_message>
Added diagnostics to regression test; added Element D
</commit_message>
<xml_diff>
--- a/Readme.docx
+++ b/Readme.docx
@@ -28,7 +28,34 @@
         <w:t xml:space="preserve"> scoring application for MyDesign – Element C (Presentation and Justification of Solution Design Requirements).</w:t>
       </w:r>
       <w:r>
-        <w:t xml:space="preserve">  Element A has also been added with the same architecture.  The discussion below describes Element C but is applicable to Element A as well.</w:t>
+        <w:t xml:space="preserve">  Element</w:t>
+      </w:r>
+      <w:r>
+        <w:t>s</w:t>
+      </w:r>
+      <w:r>
+        <w:t xml:space="preserve"> A </w:t>
+      </w:r>
+      <w:r>
+        <w:t>and D have</w:t>
+      </w:r>
+      <w:r>
+        <w:t xml:space="preserve"> also been added with the same architecture.  The discussion below describes Element C but is applicable to Element</w:t>
+      </w:r>
+      <w:r>
+        <w:t>s</w:t>
+      </w:r>
+      <w:r>
+        <w:t xml:space="preserve"> A </w:t>
+      </w:r>
+      <w:r>
+        <w:t xml:space="preserve">and D </w:t>
+      </w:r>
+      <w:r>
+        <w:t>as well</w:t>
+      </w:r>
+      <w:r>
+        <w:t xml:space="preserve"> for operation.  The discussion discloses  detailed parameters that are specific to Element C so they will obviously change for the other elements.</w:t>
       </w:r>
     </w:p>
     <w:p>
@@ -1452,12 +1479,18 @@
           <w:b/>
           <w:bCs/>
         </w:rPr>
-        <w:t>Drift Monitoring (Planned)</w:t>
-      </w:r>
-    </w:p>
-    <w:p>
-      <w:r>
-        <w:t>A “Check Saved Results” feature will allow:</w:t>
+        <w:t>Drift Monitoring</w:t>
+      </w:r>
+    </w:p>
+    <w:p>
+      <w:r>
+        <w:t>A “Check Saved Results” feature allow</w:t>
+      </w:r>
+      <w:r>
+        <w:t>s</w:t>
+      </w:r>
+      <w:r>
+        <w:t>:</w:t>
       </w:r>
     </w:p>
     <w:p>
@@ -1614,9 +1647,63 @@
     </w:p>
     <w:p>
       <w:r>
+        <w:t xml:space="preserve"> </w:t>
+      </w:r>
+      <w:r>
+        <w:t xml:space="preserve">│ </w:t>
+      </w:r>
+      <w:r>
+        <w:t xml:space="preserve">    </w:t>
+      </w:r>
+      <w:r>
+        <w:t>└── element_</w:t>
+      </w:r>
+      <w:r>
+        <w:t xml:space="preserve">A/ -  </w:t>
+      </w:r>
+      <w:r>
+        <w:t>analogous</w:t>
+      </w:r>
+      <w:r>
+        <w:t xml:space="preserve"> to C</w:t>
+      </w:r>
+    </w:p>
+    <w:p>
+      <w:r>
+        <w:t xml:space="preserve"> │     └── element_</w:t>
+      </w:r>
+      <w:r>
+        <w:t>D</w:t>
+      </w:r>
+      <w:r>
+        <w:t>/</w:t>
+      </w:r>
+      <w:r>
+        <w:t xml:space="preserve"> - analogous to C</w:t>
+      </w:r>
+    </w:p>
+    <w:p>
+      <w:r>
+        <w:t xml:space="preserve"> </w:t>
+      </w:r>
+      <w:r>
+        <w:t xml:space="preserve">│ </w:t>
+      </w:r>
+      <w:r>
+        <w:t xml:space="preserve">   </w:t>
+      </w:r>
+      <w:r>
+        <w:t>└── element_C/</w:t>
+      </w:r>
+    </w:p>
+    <w:p>
+      <w:r>
         <w:t xml:space="preserve">│   </w:t>
       </w:r>
       <w:r>
+        <w:t xml:space="preserve">     </w:t>
+      </w:r>
+      <w:r>
         <w:rPr>
           <w:rFonts w:ascii="MS Gothic" w:eastAsia="MS Gothic" w:hAnsi="MS Gothic" w:cs="MS Gothic" w:hint="eastAsia"/>
         </w:rPr>
@@ -1637,6 +1724,9 @@
         <w:t xml:space="preserve">│   </w:t>
       </w:r>
       <w:r>
+        <w:t xml:space="preserve">     </w:t>
+      </w:r>
+      <w:r>
         <w:rPr>
           <w:rFonts w:ascii="MS Gothic" w:eastAsia="MS Gothic" w:hAnsi="MS Gothic" w:cs="MS Gothic" w:hint="eastAsia"/>
         </w:rPr>
@@ -1654,14 +1744,12 @@
     </w:p>
     <w:p>
       <w:r>
-        <w:t>│   │</w:t>
-      </w:r>
-    </w:p>
-    <w:p>
-      <w:r>
         <w:t xml:space="preserve">│   </w:t>
       </w:r>
       <w:r>
+        <w:t xml:space="preserve">     </w:t>
+      </w:r>
+      <w:r>
         <w:rPr>
           <w:rFonts w:ascii="MS Gothic" w:eastAsia="MS Gothic" w:hAnsi="MS Gothic" w:cs="MS Gothic" w:hint="eastAsia"/>
         </w:rPr>
@@ -1675,31 +1763,6 @@
       </w:r>
       <w:r>
         <w:t xml:space="preserve"> golden20_metrics_current.json</w:t>
-      </w:r>
-    </w:p>
-    <w:p>
-      <w:r>
-        <w:t xml:space="preserve">│   </w:t>
-      </w:r>
-      <w:r>
-        <w:rPr>
-          <w:rFonts w:ascii="MS Gothic" w:eastAsia="MS Gothic" w:hAnsi="MS Gothic" w:cs="MS Gothic" w:hint="eastAsia"/>
-        </w:rPr>
-        <w:t>├</w:t>
-      </w:r>
-      <w:r>
-        <w:rPr>
-          <w:rFonts w:ascii="Aptos" w:hAnsi="Aptos" w:cs="Aptos"/>
-        </w:rPr>
-        <w:t>──</w:t>
-      </w:r>
-      <w:r>
-        <w:t xml:space="preserve"> golden20_metrics_legacy.json</w:t>
-      </w:r>
-    </w:p>
-    <w:p>
-      <w:r>
-        <w:t>│   │</w:t>
       </w:r>
     </w:p>
     <w:p>
@@ -1708,6 +1771,9 @@
         <w:t xml:space="preserve">│   </w:t>
       </w:r>
       <w:r>
+        <w:t xml:space="preserve">     </w:t>
+      </w:r>
+      <w:r>
         <w:rPr>
           <w:rFonts w:ascii="MS Gothic" w:eastAsia="MS Gothic" w:hAnsi="MS Gothic" w:cs="MS Gothic" w:hint="eastAsia"/>
         </w:rPr>
@@ -1720,6 +1786,29 @@
         <w:t>──</w:t>
       </w:r>
       <w:r>
+        <w:t xml:space="preserve"> golden20_metrics_legacy.json</w:t>
+      </w:r>
+    </w:p>
+    <w:p>
+      <w:r>
+        <w:t xml:space="preserve">│   </w:t>
+      </w:r>
+      <w:r>
+        <w:t xml:space="preserve">     </w:t>
+      </w:r>
+      <w:r>
+        <w:rPr>
+          <w:rFonts w:ascii="MS Gothic" w:eastAsia="MS Gothic" w:hAnsi="MS Gothic" w:cs="MS Gothic" w:hint="eastAsia"/>
+        </w:rPr>
+        <w:t>├</w:t>
+      </w:r>
+      <w:r>
+        <w:rPr>
+          <w:rFonts w:ascii="Aptos" w:hAnsi="Aptos" w:cs="Aptos"/>
+        </w:rPr>
+        <w:t>──</w:t>
+      </w:r>
+      <w:r>
         <w:t xml:space="preserve"> golden20_current_scores.json      </w:t>
       </w:r>
       <w:r>
@@ -1734,7 +1823,19 @@
     </w:p>
     <w:p>
       <w:r>
-        <w:t>│   └── golden20_legacy_scores.json       ← cached API scores</w:t>
+        <w:t xml:space="preserve">│ </w:t>
+      </w:r>
+      <w:r>
+        <w:t xml:space="preserve">    </w:t>
+      </w:r>
+      <w:r>
+        <w:t xml:space="preserve">  </w:t>
+      </w:r>
+      <w:r>
+        <w:t xml:space="preserve">  </w:t>
+      </w:r>
+      <w:r>
+        <w:t>└── golden20_legacy_scores.json       ← cached API scores</w:t>
       </w:r>
     </w:p>
     <w:p>
@@ -1761,6 +1862,16 @@
     </w:p>
     <w:p>
       <w:r>
+        <w:t xml:space="preserve"> │   └── element_A/ -  analogous to C</w:t>
+      </w:r>
+    </w:p>
+    <w:p>
+      <w:r>
+        <w:t xml:space="preserve"> │   └── element_D/ - analogous to C</w:t>
+      </w:r>
+    </w:p>
+    <w:p>
+      <w:r>
         <w:t>│   └── element_C/</w:t>
       </w:r>
     </w:p>
@@ -1934,6 +2045,7 @@
     <w:p/>
     <w:p>
       <w:r>
+        <w:lastRenderedPageBreak/>
         <w:t>│</w:t>
       </w:r>
     </w:p>
@@ -1976,7 +2088,6 @@
     </w:p>
     <w:p>
       <w:r>
-        <w:lastRenderedPageBreak/>
         <w:t>│   │   └── script.js</w:t>
       </w:r>
     </w:p>
@@ -2100,7 +2211,7 @@
     </w:p>
     <w:p>
       <w:r>
-        <w:t>Note: Validation sample sizes are moderate; future re-baselining will use expanded Current document sets.</w:t>
+        <w:t>.</w:t>
       </w:r>
     </w:p>
     <w:p>
@@ -2177,6 +2288,7 @@
     </w:p>
     <w:p>
       <w:r>
+        <w:lastRenderedPageBreak/>
         <w:pict w14:anchorId="6B42F7BD">
           <v:rect id="_x0000_i1036" style="width:0;height:1.5pt" o:hralign="center" o:hrstd="t" o:hr="t" fillcolor="#a0a0a0" stroked="f"/>
         </w:pict>
@@ -2204,7 +2316,6 @@
     </w:p>
     <w:p>
       <w:r>
-        <w:lastRenderedPageBreak/>
         <w:t>After each batch scoring run, the system computes summary statistics for both:</w:t>
       </w:r>
     </w:p>
@@ -2433,6 +2544,7 @@
     </w:p>
     <w:p>
       <w:r>
+        <w:lastRenderedPageBreak/>
         <w:t>The following evaluation metrics are calculated:</w:t>
       </w:r>
     </w:p>
@@ -2484,7 +2596,6 @@
           <w:b/>
           <w:bCs/>
         </w:rPr>
-        <w:lastRenderedPageBreak/>
         <w:t>95% Confidence Interval</w:t>
       </w:r>
       <w:r>
@@ -2679,6 +2790,7 @@
     </w:p>
     <w:p>
       <w:r>
+        <w:lastRenderedPageBreak/>
         <w:t>These files represent the expected scoring behavior of the system. Future validation runs compare against these baselines to detect deviations.</w:t>
       </w:r>
     </w:p>
@@ -2706,7 +2818,6 @@
     </w:p>
     <w:p>
       <w:r>
-        <w:lastRenderedPageBreak/>
         <w:t>To run the Golden benchmark validation:</w:t>
       </w:r>
     </w:p>
@@ -2889,6 +3000,7 @@
         </w:numPr>
       </w:pPr>
       <w:r>
+        <w:lastRenderedPageBreak/>
         <w:t>GPT model drift</w:t>
       </w:r>
     </w:p>
@@ -2927,7 +3039,6 @@
     </w:p>
     <w:p>
       <w:r>
-        <w:lastRenderedPageBreak/>
         <w:t>This ensures that automated scoring remains stable and consistent over time.</w:t>
       </w:r>
     </w:p>
@@ -3029,7 +3140,13 @@
         </w:numPr>
       </w:pPr>
       <w:r>
-        <w:t>Align Element A and D with this architecture</w:t>
+        <w:t xml:space="preserve">Align Element </w:t>
+      </w:r>
+      <w:r>
+        <w:t>B, E - L</w:t>
+      </w:r>
+      <w:r>
+        <w:t xml:space="preserve"> with this architecture</w:t>
       </w:r>
     </w:p>
     <w:p>

</xml_diff>

<commit_message>
bug fix, relax reconcile logic, add controller_app.py, add element B
</commit_message>
<xml_diff>
--- a/Readme.docx
+++ b/Readme.docx
@@ -9,12 +9,37 @@
           <w:bCs/>
         </w:rPr>
       </w:pPr>
+      <w:proofErr w:type="spellStart"/>
       <w:r>
         <w:rPr>
           <w:b/>
           <w:bCs/>
         </w:rPr>
-        <w:t>GPTScorer – Element  Scoring Application</w:t>
+        <w:t>GPTScorer</w:t>
+      </w:r>
+      <w:proofErr w:type="spellEnd"/>
+      <w:r>
+        <w:rPr>
+          <w:b/>
+          <w:bCs/>
+        </w:rPr>
+        <w:t xml:space="preserve"> – </w:t>
+      </w:r>
+      <w:proofErr w:type="gramStart"/>
+      <w:r>
+        <w:rPr>
+          <w:b/>
+          <w:bCs/>
+        </w:rPr>
+        <w:t>Element  Scoring</w:t>
+      </w:r>
+      <w:proofErr w:type="gramEnd"/>
+      <w:r>
+        <w:rPr>
+          <w:b/>
+          <w:bCs/>
+        </w:rPr>
+        <w:t xml:space="preserve"> Application</w:t>
       </w:r>
     </w:p>
     <w:p>
@@ -25,7 +50,15 @@
         <w:t>validated</w:t>
       </w:r>
       <w:r>
-        <w:t xml:space="preserve"> scoring application for MyDesign – Element C (Presentation and Justification of Solution Design Requirements).</w:t>
+        <w:t xml:space="preserve"> scoring application for </w:t>
+      </w:r>
+      <w:proofErr w:type="spellStart"/>
+      <w:r>
+        <w:t>MyDesign</w:t>
+      </w:r>
+      <w:proofErr w:type="spellEnd"/>
+      <w:r>
+        <w:t xml:space="preserve"> – Element C (Presentation and Justification of Solution Design Requirements).</w:t>
       </w:r>
       <w:r>
         <w:t xml:space="preserve">  Element</w:t>
@@ -46,7 +79,13 @@
         <w:t>s</w:t>
       </w:r>
       <w:r>
-        <w:t xml:space="preserve"> A </w:t>
+        <w:t xml:space="preserve"> A</w:t>
+      </w:r>
+      <w:r>
+        <w:t>, B</w:t>
+      </w:r>
+      <w:r>
+        <w:t xml:space="preserve"> </w:t>
       </w:r>
       <w:r>
         <w:t xml:space="preserve">and D </w:t>
@@ -55,7 +94,15 @@
         <w:t>as well</w:t>
       </w:r>
       <w:r>
-        <w:t xml:space="preserve"> for operation.  The discussion discloses  detailed parameters that are specific to Element C so they will obviously change for the other elements.</w:t>
+        <w:t xml:space="preserve"> for operation.  The discussion </w:t>
+      </w:r>
+      <w:proofErr w:type="gramStart"/>
+      <w:r>
+        <w:t>discloses  detailed</w:t>
+      </w:r>
+      <w:proofErr w:type="gramEnd"/>
+      <w:r>
+        <w:t xml:space="preserve"> parameters that are specific to Element C so they will obviously change for the other elements.</w:t>
       </w:r>
     </w:p>
     <w:p>
@@ -170,7 +217,15 @@
       </w:r>
       <w:r>
         <w:br/>
-        <w:t>Raw Element Score (mean of subscores)</w:t>
+        <w:t xml:space="preserve">Raw Element Score (mean of </w:t>
+      </w:r>
+      <w:proofErr w:type="spellStart"/>
+      <w:r>
+        <w:t>subscores</w:t>
+      </w:r>
+      <w:proofErr w:type="spellEnd"/>
+      <w:r>
+        <w:t>)</w:t>
       </w:r>
       <w:r>
         <w:br/>
@@ -667,8 +722,13 @@
     </w:p>
     <w:p>
       <w:r>
-        <w:t>set OPENAI_API_KEY=your_key_here</w:t>
-      </w:r>
+        <w:t>set OPENAI_API_KEY=</w:t>
+      </w:r>
+      <w:proofErr w:type="spellStart"/>
+      <w:r>
+        <w:t>your_key_here</w:t>
+      </w:r>
+      <w:proofErr w:type="spellEnd"/>
     </w:p>
     <w:p>
       <w:r>
@@ -712,6 +772,7 @@
         <w:t xml:space="preserve"> CLI Mode</w:t>
       </w:r>
     </w:p>
+    <w:p/>
     <w:p>
       <w:r>
         <w:t>score_with_API_C.py can be used to score documents and generate both raw GPT outputs and calibrated scores.</w:t>
@@ -722,16 +783,56 @@
     </w:p>
     <w:p>
       <w:r>
-        <w:t xml:space="preserve">cd c:\GPTScorer_Element_C </w:t>
-      </w:r>
-    </w:p>
-    <w:p>
-      <w:r>
-        <w:t>python -m elements.element_C.score_with_API_C ^</w:t>
+        <w:t xml:space="preserve">cd </w:t>
+      </w:r>
+      <w:r>
+        <w:t>c:\MyDesign_GPTScorer</w:t>
+      </w:r>
+    </w:p>
+    <w:p>
+      <w:r>
+        <w:t xml:space="preserve">python -m </w:t>
+      </w:r>
+      <w:proofErr w:type="spellStart"/>
+      <w:proofErr w:type="gramStart"/>
+      <w:r>
+        <w:t>elements.element</w:t>
+      </w:r>
+      <w:proofErr w:type="gramEnd"/>
+      <w:r>
+        <w:t>_</w:t>
+      </w:r>
+      <w:proofErr w:type="gramStart"/>
+      <w:r>
+        <w:t>C.score</w:t>
+      </w:r>
+      <w:proofErr w:type="gramEnd"/>
+      <w:r>
+        <w:t>_with_API_C</w:t>
+      </w:r>
+      <w:proofErr w:type="spellEnd"/>
+      <w:r>
+        <w:t xml:space="preserve"> ^</w:t>
       </w:r>
       <w:r>
         <w:br/>
-        <w:t xml:space="preserve">  --folder elements/element_C/current_api_scoring_documents ^</w:t>
+        <w:t xml:space="preserve">  --folder elements/</w:t>
+      </w:r>
+      <w:proofErr w:type="spellStart"/>
+      <w:r>
+        <w:t>element_C</w:t>
+      </w:r>
+      <w:proofErr w:type="spellEnd"/>
+      <w:r>
+        <w:t>/</w:t>
+      </w:r>
+      <w:proofErr w:type="spellStart"/>
+      <w:r>
+        <w:t>current_api_scoring_documents</w:t>
+      </w:r>
+      <w:proofErr w:type="spellEnd"/>
+      <w:r>
+        <w:t xml:space="preserve"> ^</w:t>
       </w:r>
       <w:r>
         <w:br/>
@@ -741,7 +842,15 @@
         <w:t xml:space="preserve"> </w:t>
       </w:r>
       <w:r>
-        <w:t>elements/element_C/</w:t>
+        <w:t>elements/</w:t>
+      </w:r>
+      <w:proofErr w:type="spellStart"/>
+      <w:r>
+        <w:t>element_C</w:t>
+      </w:r>
+      <w:proofErr w:type="spellEnd"/>
+      <w:r>
+        <w:t>/</w:t>
       </w:r>
       <w:r>
         <w:t>scored_results</w:t>
@@ -830,6 +939,7 @@
         </w:numPr>
       </w:pPr>
       <w:r>
+        <w:lastRenderedPageBreak/>
         <w:t>C1-C6 Flags used internally</w:t>
       </w:r>
     </w:p>
@@ -841,8 +951,15 @@
         </w:numPr>
       </w:pPr>
       <w:r>
-        <w:lastRenderedPageBreak/>
-        <w:t>C1-C6  Bulleted rationale</w:t>
+        <w:t>C1-C</w:t>
+      </w:r>
+      <w:proofErr w:type="gramStart"/>
+      <w:r>
+        <w:t>6  Bulleted</w:t>
+      </w:r>
+      <w:proofErr w:type="gramEnd"/>
+      <w:r>
+        <w:t xml:space="preserve"> rationale</w:t>
       </w:r>
     </w:p>
     <w:p>
@@ -899,6 +1016,23 @@
         <w:t xml:space="preserve"> UI Mode</w:t>
       </w:r>
     </w:p>
+    <w:p/>
+    <w:p>
+      <w:r>
+        <w:t>Controller_app.py</w:t>
+      </w:r>
+      <w:r>
+        <w:t xml:space="preserve"> is the backend for all elements.  Scripts.js and index.html are the frontend.  Elements to be scored can be selected in the UI.</w:t>
+      </w:r>
+    </w:p>
+    <w:p>
+      <w:pPr>
+        <w:rPr>
+          <w:b/>
+          <w:bCs/>
+        </w:rPr>
+      </w:pPr>
+    </w:p>
     <w:p>
       <w:r>
         <w:t>Scorer_app_C.py is the backend.</w:t>
@@ -909,21 +1043,20 @@
     </w:p>
     <w:p>
       <w:r>
-        <w:t>cd c:\GPTScorer_</w:t>
-      </w:r>
-      <w:r>
-        <w:t>E</w:t>
-      </w:r>
-      <w:r>
-        <w:t>lement_C</w:t>
-      </w:r>
-    </w:p>
-    <w:p>
-      <w:r>
-        <w:t>uvicorn elements.element_C.scorer_app_C:app --reload</w:t>
-      </w:r>
-    </w:p>
-    <w:p/>
+        <w:t>cd c:\GPTScore</w:t>
+      </w:r>
+      <w:r>
+        <w:t>t</w:t>
+      </w:r>
+    </w:p>
+    <w:p>
+      <w:r>
+        <w:t xml:space="preserve">python </w:t>
+      </w:r>
+      <w:r>
+        <w:t>controller_app.py</w:t>
+      </w:r>
+    </w:p>
     <w:p>
       <w:r>
         <w:t>Then open the local server in your browser</w:t>
@@ -951,6 +1084,34 @@
         </w:numPr>
       </w:pPr>
       <w:r>
+        <w:t>Select element to score</w:t>
+      </w:r>
+    </w:p>
+    <w:p>
+      <w:pPr>
+        <w:numPr>
+          <w:ilvl w:val="0"/>
+          <w:numId w:val="7"/>
+        </w:numPr>
+      </w:pPr>
+      <w:r>
+        <w:t xml:space="preserve">Select mode for legacy </w:t>
+      </w:r>
+      <w:r>
+        <w:t xml:space="preserve">documents </w:t>
+      </w:r>
+      <w:r>
+        <w:t>(submitted prior to 10/1/2024) vs current documents (submitted from 10/2/2024 to present)</w:t>
+      </w:r>
+    </w:p>
+    <w:p>
+      <w:pPr>
+        <w:numPr>
+          <w:ilvl w:val="0"/>
+          <w:numId w:val="7"/>
+        </w:numPr>
+      </w:pPr>
+      <w:r>
         <w:t>Upload documents</w:t>
       </w:r>
     </w:p>
@@ -988,6 +1149,17 @@
       </w:r>
     </w:p>
     <w:p>
+      <w:pPr>
+        <w:numPr>
+          <w:ilvl w:val="0"/>
+          <w:numId w:val="7"/>
+        </w:numPr>
+      </w:pPr>
+      <w:r>
+        <w:t>Check Saved Results to review diagnostics for model drift</w:t>
+      </w:r>
+    </w:p>
+    <w:p>
       <w:r>
         <w:t xml:space="preserve">The UI mode can be used to upload one or more documents for scoring through the API or alternatively, a csv input </w:t>
       </w:r>
@@ -1019,8 +1191,13 @@
         </w:numPr>
       </w:pPr>
       <w:r>
-        <w:t>C1_expert – C_expert</w:t>
-      </w:r>
+        <w:t xml:space="preserve">C1_expert – </w:t>
+      </w:r>
+      <w:proofErr w:type="spellStart"/>
+      <w:r>
+        <w:t>C_expert</w:t>
+      </w:r>
+      <w:proofErr w:type="spellEnd"/>
       <w:r>
         <w:t xml:space="preserve"> scores</w:t>
       </w:r>
@@ -1046,6 +1223,7 @@
         </w:numPr>
       </w:pPr>
       <w:r>
+        <w:lastRenderedPageBreak/>
         <w:t>C1 – C6 flags</w:t>
       </w:r>
       <w:r>
@@ -1099,8 +1277,21 @@
           <w:numId w:val="18"/>
         </w:numPr>
       </w:pPr>
-      <w:r>
-        <w:t>Element_score_raw, the average of the api scores</w:t>
+      <w:proofErr w:type="spellStart"/>
+      <w:r>
+        <w:t>Element_score_raw</w:t>
+      </w:r>
+      <w:proofErr w:type="spellEnd"/>
+      <w:r>
+        <w:t xml:space="preserve">, the average of the </w:t>
+      </w:r>
+      <w:proofErr w:type="spellStart"/>
+      <w:r>
+        <w:t>api</w:t>
+      </w:r>
+      <w:proofErr w:type="spellEnd"/>
+      <w:r>
+        <w:t xml:space="preserve"> scores</w:t>
       </w:r>
     </w:p>
     <w:p>
@@ -1141,7 +1332,15 @@
         </w:numPr>
       </w:pPr>
       <w:r>
-        <w:t>C1_final  – C6_final calibrated scores for output</w:t>
+        <w:t>C1_</w:t>
+      </w:r>
+      <w:proofErr w:type="gramStart"/>
+      <w:r>
+        <w:t>final  –</w:t>
+      </w:r>
+      <w:proofErr w:type="gramEnd"/>
+      <w:r>
+        <w:t xml:space="preserve"> C6_final calibrated scores for output</w:t>
       </w:r>
     </w:p>
     <w:p>
@@ -1152,9 +1351,11 @@
           <w:numId w:val="17"/>
         </w:numPr>
       </w:pPr>
+      <w:proofErr w:type="spellStart"/>
       <w:r>
         <w:t>element_score_raw</w:t>
       </w:r>
+      <w:proofErr w:type="spellEnd"/>
       <w:r>
         <w:tab/>
       </w:r>
@@ -1167,10 +1368,11 @@
           <w:numId w:val="17"/>
         </w:numPr>
       </w:pPr>
-      <w:r>
-        <w:lastRenderedPageBreak/>
+      <w:proofErr w:type="spellStart"/>
+      <w:r>
         <w:t>element_score_calibrated</w:t>
       </w:r>
+      <w:proofErr w:type="spellEnd"/>
       <w:r>
         <w:tab/>
       </w:r>
@@ -1183,9 +1385,11 @@
           <w:numId w:val="17"/>
         </w:numPr>
       </w:pPr>
+      <w:proofErr w:type="spellStart"/>
       <w:r>
         <w:t>calibration_delta</w:t>
       </w:r>
+      <w:proofErr w:type="spellEnd"/>
     </w:p>
     <w:p>
       <w:pPr>
@@ -1271,8 +1475,13 @@
         </w:numPr>
       </w:pPr>
       <w:r>
-        <w:t>Drift slightly over time</w:t>
-      </w:r>
+        <w:t xml:space="preserve">Drift slightly </w:t>
+      </w:r>
+      <w:proofErr w:type="gramStart"/>
+      <w:r>
+        <w:t>over time</w:t>
+      </w:r>
+      <w:proofErr w:type="gramEnd"/>
     </w:p>
     <w:p>
       <w:pPr>
@@ -1380,6 +1589,7 @@
     </w:p>
     <w:p>
       <w:r>
+        <w:lastRenderedPageBreak/>
         <w:pict w14:anchorId="5B151077">
           <v:rect id="_x0000_i1031" style="width:0;height:1.5pt" o:hralign="center" o:hrstd="t" o:hr="t" fillcolor="#a0a0a0" stroked="f"/>
         </w:pict>
@@ -1423,8 +1633,13 @@
           <w:numId w:val="11"/>
         </w:numPr>
       </w:pPr>
-      <w:r>
-        <w:t>Explains strengths and weaknesses</w:t>
+      <w:proofErr w:type="gramStart"/>
+      <w:r>
+        <w:t>Explains</w:t>
+      </w:r>
+      <w:proofErr w:type="gramEnd"/>
+      <w:r>
+        <w:t xml:space="preserve"> strengths and weaknesses</w:t>
       </w:r>
     </w:p>
     <w:p>
@@ -1445,13 +1660,17 @@
           <w:numId w:val="11"/>
         </w:numPr>
       </w:pPr>
-      <w:r>
-        <w:t>Uses educator-friendly language</w:t>
-      </w:r>
-    </w:p>
-    <w:p>
-      <w:r>
-        <w:lastRenderedPageBreak/>
+      <w:proofErr w:type="gramStart"/>
+      <w:r>
+        <w:t>Uses</w:t>
+      </w:r>
+      <w:proofErr w:type="gramEnd"/>
+      <w:r>
+        <w:t xml:space="preserve"> educator-friendly language</w:t>
+      </w:r>
+    </w:p>
+    <w:p>
+      <w:r>
         <w:t>This is intended for teacher-facing use and instructional support.</w:t>
       </w:r>
     </w:p>
@@ -1522,8 +1741,13 @@
           <w:numId w:val="12"/>
         </w:numPr>
       </w:pPr>
-      <w:r>
-        <w:t>Subscore drift analysis</w:t>
+      <w:proofErr w:type="spellStart"/>
+      <w:r>
+        <w:t>Subscore</w:t>
+      </w:r>
+      <w:proofErr w:type="spellEnd"/>
+      <w:r>
+        <w:t xml:space="preserve"> drift analysis</w:t>
       </w:r>
     </w:p>
     <w:p>
@@ -1568,7 +1792,23 @@
           <w:b/>
           <w:bCs/>
         </w:rPr>
-        <w:t xml:space="preserve"> (all core, scripts and simple_ui apps are now element agnostic to facilitate cloning the architecture for other elements)</w:t>
+        <w:t xml:space="preserve"> (all core, scripts and </w:t>
+      </w:r>
+      <w:proofErr w:type="spellStart"/>
+      <w:r>
+        <w:rPr>
+          <w:b/>
+          <w:bCs/>
+        </w:rPr>
+        <w:t>simple_ui</w:t>
+      </w:r>
+      <w:proofErr w:type="spellEnd"/>
+      <w:r>
+        <w:rPr>
+          <w:b/>
+          <w:bCs/>
+        </w:rPr>
+        <w:t xml:space="preserve"> apps are now element agnostic to facilitate cloning the architecture for other elements)</w:t>
       </w:r>
     </w:p>
     <w:p>
@@ -1580,8 +1820,44 @@
       <w:r>
         <w:t>│</w:t>
       </w:r>
-    </w:p>
-    <w:p>
+      <w:r>
+        <w:t xml:space="preserve"> </w:t>
+      </w:r>
+      <w:proofErr w:type="spellStart"/>
+      <w:r>
+        <w:t>GPTScorer</w:t>
+      </w:r>
+      <w:proofErr w:type="spellEnd"/>
+      <w:r>
+        <w:t>/</w:t>
+      </w:r>
+    </w:p>
+    <w:p>
+      <w:r>
+        <w:t xml:space="preserve">└── </w:t>
+      </w:r>
+      <w:r>
+        <w:t>controller</w:t>
+      </w:r>
+      <w:r>
+        <w:t xml:space="preserve">_app.py </w:t>
+      </w:r>
+    </w:p>
+    <w:p>
+      <w:r>
+        <w:rPr>
+          <w:rFonts w:ascii="Aptos" w:hAnsi="Aptos" w:cs="Aptos"/>
+        </w:rPr>
+        <w:t>──</w:t>
+      </w:r>
+      <w:r>
+        <w:t xml:space="preserve"> core/</w:t>
+      </w:r>
+    </w:p>
+    <w:p>
+      <w:r>
+        <w:t xml:space="preserve">│   </w:t>
+      </w:r>
       <w:r>
         <w:rPr>
           <w:rFonts w:ascii="MS Gothic" w:eastAsia="MS Gothic" w:hAnsi="MS Gothic" w:cs="MS Gothic" w:hint="eastAsia"/>
@@ -1595,26 +1871,6 @@
         <w:t>──</w:t>
       </w:r>
       <w:r>
-        <w:t xml:space="preserve"> core/</w:t>
-      </w:r>
-    </w:p>
-    <w:p>
-      <w:r>
-        <w:t xml:space="preserve">│   </w:t>
-      </w:r>
-      <w:r>
-        <w:rPr>
-          <w:rFonts w:ascii="MS Gothic" w:eastAsia="MS Gothic" w:hAnsi="MS Gothic" w:cs="MS Gothic" w:hint="eastAsia"/>
-        </w:rPr>
-        <w:t>├</w:t>
-      </w:r>
-      <w:r>
-        <w:rPr>
-          <w:rFonts w:ascii="Aptos" w:hAnsi="Aptos" w:cs="Aptos"/>
-        </w:rPr>
-        <w:t>──</w:t>
-      </w:r>
-      <w:r>
         <w:t xml:space="preserve"> diagnostics.py</w:t>
       </w:r>
     </w:p>
@@ -1623,426 +1879,6 @@
         <w:t>│   └── job_manager.py</w:t>
       </w:r>
     </w:p>
-    <w:p>
-      <w:r>
-        <w:t>│</w:t>
-      </w:r>
-    </w:p>
-    <w:p>
-      <w:r>
-        <w:rPr>
-          <w:rFonts w:ascii="MS Gothic" w:eastAsia="MS Gothic" w:hAnsi="MS Gothic" w:cs="MS Gothic" w:hint="eastAsia"/>
-        </w:rPr>
-        <w:t>├</w:t>
-      </w:r>
-      <w:r>
-        <w:rPr>
-          <w:rFonts w:ascii="Aptos" w:hAnsi="Aptos" w:cs="Aptos"/>
-        </w:rPr>
-        <w:t>──</w:t>
-      </w:r>
-      <w:r>
-        <w:t xml:space="preserve"> config/</w:t>
-      </w:r>
-    </w:p>
-    <w:p>
-      <w:r>
-        <w:t xml:space="preserve"> </w:t>
-      </w:r>
-      <w:r>
-        <w:t xml:space="preserve">│ </w:t>
-      </w:r>
-      <w:r>
-        <w:t xml:space="preserve">    </w:t>
-      </w:r>
-      <w:r>
-        <w:t>└── element_</w:t>
-      </w:r>
-      <w:r>
-        <w:t xml:space="preserve">A/ -  </w:t>
-      </w:r>
-      <w:r>
-        <w:t>analogous</w:t>
-      </w:r>
-      <w:r>
-        <w:t xml:space="preserve"> to C</w:t>
-      </w:r>
-    </w:p>
-    <w:p>
-      <w:r>
-        <w:t xml:space="preserve"> │     └── element_</w:t>
-      </w:r>
-      <w:r>
-        <w:t>D</w:t>
-      </w:r>
-      <w:r>
-        <w:t>/</w:t>
-      </w:r>
-      <w:r>
-        <w:t xml:space="preserve"> - analogous to C</w:t>
-      </w:r>
-    </w:p>
-    <w:p>
-      <w:r>
-        <w:t xml:space="preserve"> </w:t>
-      </w:r>
-      <w:r>
-        <w:t xml:space="preserve">│ </w:t>
-      </w:r>
-      <w:r>
-        <w:t xml:space="preserve">   </w:t>
-      </w:r>
-      <w:r>
-        <w:t>└── element_C/</w:t>
-      </w:r>
-    </w:p>
-    <w:p>
-      <w:r>
-        <w:t xml:space="preserve">│   </w:t>
-      </w:r>
-      <w:r>
-        <w:t xml:space="preserve">     </w:t>
-      </w:r>
-      <w:r>
-        <w:rPr>
-          <w:rFonts w:ascii="MS Gothic" w:eastAsia="MS Gothic" w:hAnsi="MS Gothic" w:cs="MS Gothic" w:hint="eastAsia"/>
-        </w:rPr>
-        <w:t>├</w:t>
-      </w:r>
-      <w:r>
-        <w:rPr>
-          <w:rFonts w:ascii="Aptos" w:hAnsi="Aptos" w:cs="Aptos"/>
-        </w:rPr>
-        <w:t>──</w:t>
-      </w:r>
-      <w:r>
-        <w:t xml:space="preserve"> golden_C_current.json</w:t>
-      </w:r>
-    </w:p>
-    <w:p>
-      <w:r>
-        <w:t xml:space="preserve">│   </w:t>
-      </w:r>
-      <w:r>
-        <w:t xml:space="preserve">     </w:t>
-      </w:r>
-      <w:r>
-        <w:rPr>
-          <w:rFonts w:ascii="MS Gothic" w:eastAsia="MS Gothic" w:hAnsi="MS Gothic" w:cs="MS Gothic" w:hint="eastAsia"/>
-        </w:rPr>
-        <w:t>├</w:t>
-      </w:r>
-      <w:r>
-        <w:rPr>
-          <w:rFonts w:ascii="Aptos" w:hAnsi="Aptos" w:cs="Aptos"/>
-        </w:rPr>
-        <w:t>──</w:t>
-      </w:r>
-      <w:r>
-        <w:t xml:space="preserve"> golden_C_legacy.json</w:t>
-      </w:r>
-    </w:p>
-    <w:p>
-      <w:r>
-        <w:t xml:space="preserve">│   </w:t>
-      </w:r>
-      <w:r>
-        <w:t xml:space="preserve">     </w:t>
-      </w:r>
-      <w:r>
-        <w:rPr>
-          <w:rFonts w:ascii="MS Gothic" w:eastAsia="MS Gothic" w:hAnsi="MS Gothic" w:cs="MS Gothic" w:hint="eastAsia"/>
-        </w:rPr>
-        <w:t>├</w:t>
-      </w:r>
-      <w:r>
-        <w:rPr>
-          <w:rFonts w:ascii="Aptos" w:hAnsi="Aptos" w:cs="Aptos"/>
-        </w:rPr>
-        <w:t>──</w:t>
-      </w:r>
-      <w:r>
-        <w:t xml:space="preserve"> golden20_metrics_current.json</w:t>
-      </w:r>
-    </w:p>
-    <w:p>
-      <w:r>
-        <w:lastRenderedPageBreak/>
-        <w:t xml:space="preserve">│   </w:t>
-      </w:r>
-      <w:r>
-        <w:t xml:space="preserve">     </w:t>
-      </w:r>
-      <w:r>
-        <w:rPr>
-          <w:rFonts w:ascii="MS Gothic" w:eastAsia="MS Gothic" w:hAnsi="MS Gothic" w:cs="MS Gothic" w:hint="eastAsia"/>
-        </w:rPr>
-        <w:t>├</w:t>
-      </w:r>
-      <w:r>
-        <w:rPr>
-          <w:rFonts w:ascii="Aptos" w:hAnsi="Aptos" w:cs="Aptos"/>
-        </w:rPr>
-        <w:t>──</w:t>
-      </w:r>
-      <w:r>
-        <w:t xml:space="preserve"> golden20_metrics_legacy.json</w:t>
-      </w:r>
-    </w:p>
-    <w:p>
-      <w:r>
-        <w:t xml:space="preserve">│   </w:t>
-      </w:r>
-      <w:r>
-        <w:t xml:space="preserve">     </w:t>
-      </w:r>
-      <w:r>
-        <w:rPr>
-          <w:rFonts w:ascii="MS Gothic" w:eastAsia="MS Gothic" w:hAnsi="MS Gothic" w:cs="MS Gothic" w:hint="eastAsia"/>
-        </w:rPr>
-        <w:t>├</w:t>
-      </w:r>
-      <w:r>
-        <w:rPr>
-          <w:rFonts w:ascii="Aptos" w:hAnsi="Aptos" w:cs="Aptos"/>
-        </w:rPr>
-        <w:t>──</w:t>
-      </w:r>
-      <w:r>
-        <w:t xml:space="preserve"> golden20_current_scores.json      </w:t>
-      </w:r>
-      <w:r>
-        <w:rPr>
-          <w:rFonts w:ascii="Aptos" w:hAnsi="Aptos" w:cs="Aptos"/>
-        </w:rPr>
-        <w:t>←</w:t>
-      </w:r>
-      <w:r>
-        <w:t xml:space="preserve"> cached API scores</w:t>
-      </w:r>
-    </w:p>
-    <w:p>
-      <w:r>
-        <w:t xml:space="preserve">│ </w:t>
-      </w:r>
-      <w:r>
-        <w:t xml:space="preserve">    </w:t>
-      </w:r>
-      <w:r>
-        <w:t xml:space="preserve">  </w:t>
-      </w:r>
-      <w:r>
-        <w:t xml:space="preserve">  </w:t>
-      </w:r>
-      <w:r>
-        <w:t>└── golden20_legacy_scores.json       ← cached API scores</w:t>
-      </w:r>
-    </w:p>
-    <w:p>
-      <w:r>
-        <w:t>│</w:t>
-      </w:r>
-    </w:p>
-    <w:p>
-      <w:r>
-        <w:rPr>
-          <w:rFonts w:ascii="MS Gothic" w:eastAsia="MS Gothic" w:hAnsi="MS Gothic" w:cs="MS Gothic" w:hint="eastAsia"/>
-        </w:rPr>
-        <w:t>├</w:t>
-      </w:r>
-      <w:r>
-        <w:rPr>
-          <w:rFonts w:ascii="Aptos" w:hAnsi="Aptos" w:cs="Aptos"/>
-        </w:rPr>
-        <w:t>──</w:t>
-      </w:r>
-      <w:r>
-        <w:t xml:space="preserve"> elements/</w:t>
-      </w:r>
-    </w:p>
-    <w:p>
-      <w:r>
-        <w:t xml:space="preserve"> │   └── element_A/ -  analogous to C</w:t>
-      </w:r>
-    </w:p>
-    <w:p>
-      <w:r>
-        <w:t xml:space="preserve"> │   └── element_D/ - analogous to C</w:t>
-      </w:r>
-    </w:p>
-    <w:p>
-      <w:r>
-        <w:t>│   └── element_C/</w:t>
-      </w:r>
-    </w:p>
-    <w:p>
-      <w:r>
-        <w:t xml:space="preserve">│       </w:t>
-      </w:r>
-      <w:r>
-        <w:rPr>
-          <w:rFonts w:ascii="MS Gothic" w:eastAsia="MS Gothic" w:hAnsi="MS Gothic" w:cs="MS Gothic" w:hint="eastAsia"/>
-        </w:rPr>
-        <w:t>├</w:t>
-      </w:r>
-      <w:r>
-        <w:rPr>
-          <w:rFonts w:ascii="Aptos" w:hAnsi="Aptos" w:cs="Aptos"/>
-        </w:rPr>
-        <w:t>──</w:t>
-      </w:r>
-      <w:r>
-        <w:t xml:space="preserve"> score_with_API_C.py</w:t>
-      </w:r>
-    </w:p>
-    <w:p>
-      <w:r>
-        <w:t xml:space="preserve">│       </w:t>
-      </w:r>
-      <w:r>
-        <w:rPr>
-          <w:rFonts w:ascii="MS Gothic" w:eastAsia="MS Gothic" w:hAnsi="MS Gothic" w:cs="MS Gothic" w:hint="eastAsia"/>
-        </w:rPr>
-        <w:t>├</w:t>
-      </w:r>
-      <w:r>
-        <w:rPr>
-          <w:rFonts w:ascii="Aptos" w:hAnsi="Aptos" w:cs="Aptos"/>
-        </w:rPr>
-        <w:t>──</w:t>
-      </w:r>
-      <w:r>
-        <w:t xml:space="preserve"> scorer_app_C.py</w:t>
-      </w:r>
-    </w:p>
-    <w:p>
-      <w:r>
-        <w:t>│       │</w:t>
-      </w:r>
-    </w:p>
-    <w:p>
-      <w:r>
-        <w:t xml:space="preserve">│       </w:t>
-      </w:r>
-      <w:r>
-        <w:rPr>
-          <w:rFonts w:ascii="MS Gothic" w:eastAsia="MS Gothic" w:hAnsi="MS Gothic" w:cs="MS Gothic" w:hint="eastAsia"/>
-        </w:rPr>
-        <w:t>├</w:t>
-      </w:r>
-      <w:r>
-        <w:rPr>
-          <w:rFonts w:ascii="Aptos" w:hAnsi="Aptos" w:cs="Aptos"/>
-        </w:rPr>
-        <w:t>──</w:t>
-      </w:r>
-      <w:r>
-        <w:t xml:space="preserve"> Current_GPT.csv</w:t>
-      </w:r>
-    </w:p>
-    <w:p>
-      <w:r>
-        <w:t xml:space="preserve">│       </w:t>
-      </w:r>
-      <w:r>
-        <w:rPr>
-          <w:rFonts w:ascii="MS Gothic" w:eastAsia="MS Gothic" w:hAnsi="MS Gothic" w:cs="MS Gothic" w:hint="eastAsia"/>
-        </w:rPr>
-        <w:t>├</w:t>
-      </w:r>
-      <w:r>
-        <w:rPr>
-          <w:rFonts w:ascii="Aptos" w:hAnsi="Aptos" w:cs="Aptos"/>
-        </w:rPr>
-        <w:t>──</w:t>
-      </w:r>
-      <w:r>
-        <w:t xml:space="preserve"> Legacy_GPT.csv</w:t>
-      </w:r>
-    </w:p>
-    <w:p>
-      <w:r>
-        <w:t>│       │</w:t>
-      </w:r>
-    </w:p>
-    <w:p>
-      <w:r>
-        <w:t xml:space="preserve">│       </w:t>
-      </w:r>
-      <w:r>
-        <w:rPr>
-          <w:rFonts w:ascii="MS Gothic" w:eastAsia="MS Gothic" w:hAnsi="MS Gothic" w:cs="MS Gothic" w:hint="eastAsia"/>
-        </w:rPr>
-        <w:t>├</w:t>
-      </w:r>
-      <w:r>
-        <w:rPr>
-          <w:rFonts w:ascii="Aptos" w:hAnsi="Aptos" w:cs="Aptos"/>
-        </w:rPr>
-        <w:t>──</w:t>
-      </w:r>
-      <w:r>
-        <w:t xml:space="preserve"> current_api_scoring_documents/</w:t>
-      </w:r>
-    </w:p>
-    <w:p>
-      <w:r>
-        <w:t>│       │   └── (documents scored using current model)</w:t>
-      </w:r>
-    </w:p>
-    <w:p>
-      <w:r>
-        <w:t>│       │</w:t>
-      </w:r>
-    </w:p>
-    <w:p>
-      <w:r>
-        <w:t>│       └── legacy_api_scoring_documents/</w:t>
-      </w:r>
-    </w:p>
-    <w:p>
-      <w:r>
-        <w:t>│           └── (documents scored using legacy model)</w:t>
-      </w:r>
-    </w:p>
-    <w:p>
-      <w:r>
-        <w:t>│</w:t>
-      </w:r>
-    </w:p>
-    <w:p>
-      <w:r>
-        <w:rPr>
-          <w:rFonts w:ascii="MS Gothic" w:eastAsia="MS Gothic" w:hAnsi="MS Gothic" w:cs="MS Gothic" w:hint="eastAsia"/>
-        </w:rPr>
-        <w:t>├</w:t>
-      </w:r>
-      <w:r>
-        <w:rPr>
-          <w:rFonts w:ascii="Aptos" w:hAnsi="Aptos" w:cs="Aptos"/>
-        </w:rPr>
-        <w:t>──</w:t>
-      </w:r>
-      <w:r>
-        <w:t xml:space="preserve"> scripts/</w:t>
-      </w:r>
-    </w:p>
-    <w:p>
-      <w:r>
-        <w:t>│   └── shared/</w:t>
-      </w:r>
-    </w:p>
-    <w:p>
-      <w:r>
-        <w:t>│       └── utils.py</w:t>
-      </w:r>
-    </w:p>
-    <w:p>
-      <w:r>
-        <w:t>│       └── validate_golden20.py</w:t>
-      </w:r>
-    </w:p>
-    <w:p/>
     <w:p>
       <w:r>
         <w:lastRenderedPageBreak/>
@@ -2063,7 +1899,525 @@
         <w:t>──</w:t>
       </w:r>
       <w:r>
-        <w:t xml:space="preserve"> simple_ui/</w:t>
+        <w:t xml:space="preserve"> config/</w:t>
+      </w:r>
+    </w:p>
+    <w:p>
+      <w:r>
+        <w:t xml:space="preserve"> │     └── </w:t>
+      </w:r>
+      <w:proofErr w:type="spellStart"/>
+      <w:r>
+        <w:t>element_A</w:t>
+      </w:r>
+      <w:proofErr w:type="spellEnd"/>
+      <w:r>
+        <w:t xml:space="preserve">/ </w:t>
+      </w:r>
+      <w:proofErr w:type="gramStart"/>
+      <w:r>
+        <w:t>-  analogous</w:t>
+      </w:r>
+      <w:proofErr w:type="gramEnd"/>
+      <w:r>
+        <w:t xml:space="preserve"> to C</w:t>
+      </w:r>
+    </w:p>
+    <w:p>
+      <w:r>
+        <w:t xml:space="preserve"> │     └── </w:t>
+      </w:r>
+      <w:proofErr w:type="spellStart"/>
+      <w:r>
+        <w:t>element_D</w:t>
+      </w:r>
+      <w:proofErr w:type="spellEnd"/>
+      <w:r>
+        <w:t>/ - analogous to C</w:t>
+      </w:r>
+    </w:p>
+    <w:p>
+      <w:r>
+        <w:t xml:space="preserve"> │    └── </w:t>
+      </w:r>
+      <w:proofErr w:type="spellStart"/>
+      <w:r>
+        <w:t>element_C</w:t>
+      </w:r>
+      <w:proofErr w:type="spellEnd"/>
+      <w:r>
+        <w:t>/</w:t>
+      </w:r>
+    </w:p>
+    <w:p>
+      <w:r>
+        <w:t xml:space="preserve">│   </w:t>
+      </w:r>
+      <w:r>
+        <w:t xml:space="preserve">     </w:t>
+      </w:r>
+      <w:r>
+        <w:rPr>
+          <w:rFonts w:ascii="MS Gothic" w:eastAsia="MS Gothic" w:hAnsi="MS Gothic" w:cs="MS Gothic" w:hint="eastAsia"/>
+        </w:rPr>
+        <w:t>├</w:t>
+      </w:r>
+      <w:r>
+        <w:rPr>
+          <w:rFonts w:ascii="Aptos" w:hAnsi="Aptos" w:cs="Aptos"/>
+        </w:rPr>
+        <w:t>──</w:t>
+      </w:r>
+      <w:r>
+        <w:t xml:space="preserve"> </w:t>
+      </w:r>
+      <w:proofErr w:type="spellStart"/>
+      <w:r>
+        <w:t>golden_C_</w:t>
+      </w:r>
+      <w:proofErr w:type="gramStart"/>
+      <w:r>
+        <w:t>current.json</w:t>
+      </w:r>
+      <w:proofErr w:type="spellEnd"/>
+      <w:proofErr w:type="gramEnd"/>
+    </w:p>
+    <w:p>
+      <w:r>
+        <w:t xml:space="preserve">│   </w:t>
+      </w:r>
+      <w:r>
+        <w:t xml:space="preserve">     </w:t>
+      </w:r>
+      <w:r>
+        <w:rPr>
+          <w:rFonts w:ascii="MS Gothic" w:eastAsia="MS Gothic" w:hAnsi="MS Gothic" w:cs="MS Gothic" w:hint="eastAsia"/>
+        </w:rPr>
+        <w:t>├</w:t>
+      </w:r>
+      <w:r>
+        <w:rPr>
+          <w:rFonts w:ascii="Aptos" w:hAnsi="Aptos" w:cs="Aptos"/>
+        </w:rPr>
+        <w:t>──</w:t>
+      </w:r>
+      <w:r>
+        <w:t xml:space="preserve"> </w:t>
+      </w:r>
+      <w:proofErr w:type="spellStart"/>
+      <w:r>
+        <w:t>golden_C_</w:t>
+      </w:r>
+      <w:proofErr w:type="gramStart"/>
+      <w:r>
+        <w:t>legacy.json</w:t>
+      </w:r>
+      <w:proofErr w:type="spellEnd"/>
+      <w:proofErr w:type="gramEnd"/>
+    </w:p>
+    <w:p>
+      <w:r>
+        <w:t xml:space="preserve">│   </w:t>
+      </w:r>
+      <w:r>
+        <w:t xml:space="preserve">     </w:t>
+      </w:r>
+      <w:r>
+        <w:rPr>
+          <w:rFonts w:ascii="MS Gothic" w:eastAsia="MS Gothic" w:hAnsi="MS Gothic" w:cs="MS Gothic" w:hint="eastAsia"/>
+        </w:rPr>
+        <w:t>├</w:t>
+      </w:r>
+      <w:r>
+        <w:rPr>
+          <w:rFonts w:ascii="Aptos" w:hAnsi="Aptos" w:cs="Aptos"/>
+        </w:rPr>
+        <w:t>──</w:t>
+      </w:r>
+      <w:r>
+        <w:t xml:space="preserve"> golden20_metrics_</w:t>
+      </w:r>
+      <w:proofErr w:type="gramStart"/>
+      <w:r>
+        <w:t>current.json</w:t>
+      </w:r>
+      <w:proofErr w:type="gramEnd"/>
+    </w:p>
+    <w:p>
+      <w:r>
+        <w:t xml:space="preserve">│   </w:t>
+      </w:r>
+      <w:r>
+        <w:t xml:space="preserve">     </w:t>
+      </w:r>
+      <w:r>
+        <w:rPr>
+          <w:rFonts w:ascii="MS Gothic" w:eastAsia="MS Gothic" w:hAnsi="MS Gothic" w:cs="MS Gothic" w:hint="eastAsia"/>
+        </w:rPr>
+        <w:t>├</w:t>
+      </w:r>
+      <w:r>
+        <w:rPr>
+          <w:rFonts w:ascii="Aptos" w:hAnsi="Aptos" w:cs="Aptos"/>
+        </w:rPr>
+        <w:t>──</w:t>
+      </w:r>
+      <w:r>
+        <w:t xml:space="preserve"> golden20_metrics_</w:t>
+      </w:r>
+      <w:proofErr w:type="gramStart"/>
+      <w:r>
+        <w:t>legacy.json</w:t>
+      </w:r>
+      <w:proofErr w:type="gramEnd"/>
+    </w:p>
+    <w:p>
+      <w:r>
+        <w:t xml:space="preserve">│   </w:t>
+      </w:r>
+      <w:r>
+        <w:t xml:space="preserve">     </w:t>
+      </w:r>
+      <w:r>
+        <w:rPr>
+          <w:rFonts w:ascii="MS Gothic" w:eastAsia="MS Gothic" w:hAnsi="MS Gothic" w:cs="MS Gothic" w:hint="eastAsia"/>
+        </w:rPr>
+        <w:t>├</w:t>
+      </w:r>
+      <w:r>
+        <w:rPr>
+          <w:rFonts w:ascii="Aptos" w:hAnsi="Aptos" w:cs="Aptos"/>
+        </w:rPr>
+        <w:t>──</w:t>
+      </w:r>
+      <w:r>
+        <w:t xml:space="preserve"> golden20_current_</w:t>
+      </w:r>
+      <w:proofErr w:type="gramStart"/>
+      <w:r>
+        <w:t>scores.json</w:t>
+      </w:r>
+      <w:proofErr w:type="gramEnd"/>
+      <w:r>
+        <w:t xml:space="preserve">      </w:t>
+      </w:r>
+      <w:r>
+        <w:rPr>
+          <w:rFonts w:ascii="Aptos" w:hAnsi="Aptos" w:cs="Aptos"/>
+        </w:rPr>
+        <w:t>←</w:t>
+      </w:r>
+      <w:r>
+        <w:t xml:space="preserve"> cached API scores</w:t>
+      </w:r>
+    </w:p>
+    <w:p>
+      <w:r>
+        <w:t xml:space="preserve">│ </w:t>
+      </w:r>
+      <w:r>
+        <w:t xml:space="preserve">    </w:t>
+      </w:r>
+      <w:r>
+        <w:t xml:space="preserve">  </w:t>
+      </w:r>
+      <w:r>
+        <w:t xml:space="preserve">  </w:t>
+      </w:r>
+      <w:r>
+        <w:t>└── golden20_legacy_</w:t>
+      </w:r>
+      <w:proofErr w:type="gramStart"/>
+      <w:r>
+        <w:t>scores.json</w:t>
+      </w:r>
+      <w:proofErr w:type="gramEnd"/>
+      <w:r>
+        <w:t xml:space="preserve">       ← cached API scores</w:t>
+      </w:r>
+    </w:p>
+    <w:p>
+      <w:r>
+        <w:t>│</w:t>
+      </w:r>
+    </w:p>
+    <w:p>
+      <w:r>
+        <w:rPr>
+          <w:rFonts w:ascii="MS Gothic" w:eastAsia="MS Gothic" w:hAnsi="MS Gothic" w:cs="MS Gothic" w:hint="eastAsia"/>
+        </w:rPr>
+        <w:t>├</w:t>
+      </w:r>
+      <w:r>
+        <w:rPr>
+          <w:rFonts w:ascii="Aptos" w:hAnsi="Aptos" w:cs="Aptos"/>
+        </w:rPr>
+        <w:t>──</w:t>
+      </w:r>
+      <w:r>
+        <w:t xml:space="preserve"> elements/</w:t>
+      </w:r>
+    </w:p>
+    <w:p>
+      <w:r>
+        <w:t xml:space="preserve"> │   └── </w:t>
+      </w:r>
+      <w:proofErr w:type="spellStart"/>
+      <w:r>
+        <w:t>element_A</w:t>
+      </w:r>
+      <w:proofErr w:type="spellEnd"/>
+      <w:r>
+        <w:t xml:space="preserve">/ </w:t>
+      </w:r>
+      <w:proofErr w:type="gramStart"/>
+      <w:r>
+        <w:t>-  analogous</w:t>
+      </w:r>
+      <w:proofErr w:type="gramEnd"/>
+      <w:r>
+        <w:t xml:space="preserve"> to C</w:t>
+      </w:r>
+    </w:p>
+    <w:p>
+      <w:r>
+        <w:t xml:space="preserve"> │   └── </w:t>
+      </w:r>
+      <w:proofErr w:type="spellStart"/>
+      <w:r>
+        <w:t>element_D</w:t>
+      </w:r>
+      <w:proofErr w:type="spellEnd"/>
+      <w:r>
+        <w:t>/ - analogous to C</w:t>
+      </w:r>
+    </w:p>
+    <w:p>
+      <w:r>
+        <w:t xml:space="preserve">│   └── </w:t>
+      </w:r>
+      <w:proofErr w:type="spellStart"/>
+      <w:r>
+        <w:t>element_C</w:t>
+      </w:r>
+      <w:proofErr w:type="spellEnd"/>
+      <w:r>
+        <w:t>/</w:t>
+      </w:r>
+    </w:p>
+    <w:p>
+      <w:r>
+        <w:t xml:space="preserve">│       </w:t>
+      </w:r>
+      <w:r>
+        <w:rPr>
+          <w:rFonts w:ascii="MS Gothic" w:eastAsia="MS Gothic" w:hAnsi="MS Gothic" w:cs="MS Gothic" w:hint="eastAsia"/>
+        </w:rPr>
+        <w:t>├</w:t>
+      </w:r>
+      <w:r>
+        <w:rPr>
+          <w:rFonts w:ascii="Aptos" w:hAnsi="Aptos" w:cs="Aptos"/>
+        </w:rPr>
+        <w:t>──</w:t>
+      </w:r>
+      <w:r>
+        <w:t xml:space="preserve"> score_with_API_C.py</w:t>
+      </w:r>
+    </w:p>
+    <w:p>
+      <w:r>
+        <w:t xml:space="preserve">│       </w:t>
+      </w:r>
+      <w:r>
+        <w:rPr>
+          <w:rFonts w:ascii="MS Gothic" w:eastAsia="MS Gothic" w:hAnsi="MS Gothic" w:cs="MS Gothic" w:hint="eastAsia"/>
+        </w:rPr>
+        <w:t>├</w:t>
+      </w:r>
+      <w:r>
+        <w:rPr>
+          <w:rFonts w:ascii="Aptos" w:hAnsi="Aptos" w:cs="Aptos"/>
+        </w:rPr>
+        <w:t>──</w:t>
+      </w:r>
+      <w:r>
+        <w:t xml:space="preserve"> scorer_app_C.py</w:t>
+      </w:r>
+    </w:p>
+    <w:p>
+      <w:r>
+        <w:t>│       │</w:t>
+      </w:r>
+    </w:p>
+    <w:p>
+      <w:r>
+        <w:t xml:space="preserve">│       </w:t>
+      </w:r>
+      <w:r>
+        <w:rPr>
+          <w:rFonts w:ascii="MS Gothic" w:eastAsia="MS Gothic" w:hAnsi="MS Gothic" w:cs="MS Gothic" w:hint="eastAsia"/>
+        </w:rPr>
+        <w:t>├</w:t>
+      </w:r>
+      <w:r>
+        <w:rPr>
+          <w:rFonts w:ascii="Aptos" w:hAnsi="Aptos" w:cs="Aptos"/>
+        </w:rPr>
+        <w:t>──</w:t>
+      </w:r>
+      <w:r>
+        <w:t xml:space="preserve"> Current_GPT.csv</w:t>
+      </w:r>
+    </w:p>
+    <w:p>
+      <w:r>
+        <w:t xml:space="preserve">│       </w:t>
+      </w:r>
+      <w:r>
+        <w:rPr>
+          <w:rFonts w:ascii="MS Gothic" w:eastAsia="MS Gothic" w:hAnsi="MS Gothic" w:cs="MS Gothic" w:hint="eastAsia"/>
+        </w:rPr>
+        <w:t>├</w:t>
+      </w:r>
+      <w:r>
+        <w:rPr>
+          <w:rFonts w:ascii="Aptos" w:hAnsi="Aptos" w:cs="Aptos"/>
+        </w:rPr>
+        <w:t>──</w:t>
+      </w:r>
+      <w:r>
+        <w:t xml:space="preserve"> Legacy_GPT.csv</w:t>
+      </w:r>
+    </w:p>
+    <w:p>
+      <w:r>
+        <w:t>│       │</w:t>
+      </w:r>
+    </w:p>
+    <w:p>
+      <w:r>
+        <w:t xml:space="preserve">│       </w:t>
+      </w:r>
+      <w:r>
+        <w:rPr>
+          <w:rFonts w:ascii="MS Gothic" w:eastAsia="MS Gothic" w:hAnsi="MS Gothic" w:cs="MS Gothic" w:hint="eastAsia"/>
+        </w:rPr>
+        <w:t>├</w:t>
+      </w:r>
+      <w:r>
+        <w:rPr>
+          <w:rFonts w:ascii="Aptos" w:hAnsi="Aptos" w:cs="Aptos"/>
+        </w:rPr>
+        <w:t>──</w:t>
+      </w:r>
+      <w:r>
+        <w:t xml:space="preserve"> </w:t>
+      </w:r>
+      <w:proofErr w:type="spellStart"/>
+      <w:r>
+        <w:t>current_api_scoring_documents</w:t>
+      </w:r>
+      <w:proofErr w:type="spellEnd"/>
+      <w:r>
+        <w:t>/</w:t>
+      </w:r>
+    </w:p>
+    <w:p>
+      <w:r>
+        <w:t>│       │   └── (documents scored using current model)</w:t>
+      </w:r>
+    </w:p>
+    <w:p>
+      <w:r>
+        <w:t>│       │</w:t>
+      </w:r>
+    </w:p>
+    <w:p>
+      <w:r>
+        <w:lastRenderedPageBreak/>
+        <w:t xml:space="preserve">│       └── </w:t>
+      </w:r>
+      <w:proofErr w:type="spellStart"/>
+      <w:r>
+        <w:t>legacy_api_scoring_documents</w:t>
+      </w:r>
+      <w:proofErr w:type="spellEnd"/>
+      <w:r>
+        <w:t>/</w:t>
+      </w:r>
+    </w:p>
+    <w:p>
+      <w:r>
+        <w:t>│           └── (documents scored using legacy model)</w:t>
+      </w:r>
+    </w:p>
+    <w:p>
+      <w:r>
+        <w:t>│</w:t>
+      </w:r>
+    </w:p>
+    <w:p>
+      <w:r>
+        <w:rPr>
+          <w:rFonts w:ascii="MS Gothic" w:eastAsia="MS Gothic" w:hAnsi="MS Gothic" w:cs="MS Gothic" w:hint="eastAsia"/>
+        </w:rPr>
+        <w:t>├</w:t>
+      </w:r>
+      <w:r>
+        <w:rPr>
+          <w:rFonts w:ascii="Aptos" w:hAnsi="Aptos" w:cs="Aptos"/>
+        </w:rPr>
+        <w:t>──</w:t>
+      </w:r>
+      <w:r>
+        <w:t xml:space="preserve"> scripts/</w:t>
+      </w:r>
+    </w:p>
+    <w:p>
+      <w:r>
+        <w:t>│   └── shared/</w:t>
+      </w:r>
+    </w:p>
+    <w:p>
+      <w:r>
+        <w:t>│       └── utils.py</w:t>
+      </w:r>
+    </w:p>
+    <w:p>
+      <w:r>
+        <w:t>│       └── validate_golden20.py</w:t>
+      </w:r>
+    </w:p>
+    <w:p/>
+    <w:p>
+      <w:r>
+        <w:t>│</w:t>
+      </w:r>
+    </w:p>
+    <w:p>
+      <w:r>
+        <w:rPr>
+          <w:rFonts w:ascii="MS Gothic" w:eastAsia="MS Gothic" w:hAnsi="MS Gothic" w:cs="MS Gothic" w:hint="eastAsia"/>
+        </w:rPr>
+        <w:t>├</w:t>
+      </w:r>
+      <w:r>
+        <w:rPr>
+          <w:rFonts w:ascii="Aptos" w:hAnsi="Aptos" w:cs="Aptos"/>
+        </w:rPr>
+        <w:t>──</w:t>
+      </w:r>
+      <w:r>
+        <w:t xml:space="preserve"> </w:t>
+      </w:r>
+      <w:proofErr w:type="spellStart"/>
+      <w:r>
+        <w:t>simple_ui</w:t>
+      </w:r>
+      <w:proofErr w:type="spellEnd"/>
+      <w:r>
+        <w:t>/</w:t>
       </w:r>
     </w:p>
     <w:p>
@@ -2195,7 +2549,15 @@
         </w:numPr>
       </w:pPr>
       <w:r>
-        <w:t>Bias controlled through intercept calibration</w:t>
+        <w:t xml:space="preserve">Bias controlled through </w:t>
+      </w:r>
+      <w:proofErr w:type="gramStart"/>
+      <w:r>
+        <w:t>intercept</w:t>
+      </w:r>
+      <w:proofErr w:type="gramEnd"/>
+      <w:r>
+        <w:t xml:space="preserve"> calibration</w:t>
       </w:r>
     </w:p>
     <w:p>
@@ -2206,6 +2568,7 @@
         </w:numPr>
       </w:pPr>
       <w:r>
+        <w:lastRenderedPageBreak/>
         <w:t>Narrative feedback reviewed for educator clarity</w:t>
       </w:r>
     </w:p>
@@ -2275,12 +2638,21 @@
       <w:r>
         <w:t xml:space="preserve">, and </w:t>
       </w:r>
+      <w:proofErr w:type="gramStart"/>
       <w:r>
         <w:rPr>
           <w:b/>
           <w:bCs/>
         </w:rPr>
-        <w:t>cached API scoring for reproducibility</w:t>
+        <w:t>cached</w:t>
+      </w:r>
+      <w:proofErr w:type="gramEnd"/>
+      <w:r>
+        <w:rPr>
+          <w:b/>
+          <w:bCs/>
+        </w:rPr>
+        <w:t xml:space="preserve"> API scoring for reproducibility</w:t>
       </w:r>
       <w:r>
         <w:t>.</w:t>
@@ -2288,7 +2660,6 @@
     </w:p>
     <w:p>
       <w:r>
-        <w:lastRenderedPageBreak/>
         <w:pict w14:anchorId="6B42F7BD">
           <v:rect id="_x0000_i1036" style="width:0;height:1.5pt" o:hralign="center" o:hrstd="t" o:hr="t" fillcolor="#a0a0a0" stroked="f"/>
         </w:pict>
@@ -2327,8 +2698,13 @@
         </w:numPr>
       </w:pPr>
       <w:r>
-        <w:t>Raw API subscores</w:t>
-      </w:r>
+        <w:t xml:space="preserve">Raw API </w:t>
+      </w:r>
+      <w:proofErr w:type="spellStart"/>
+      <w:r>
+        <w:t>subscores</w:t>
+      </w:r>
+      <w:proofErr w:type="spellEnd"/>
     </w:p>
     <w:p>
       <w:pPr>
@@ -2466,6 +2842,7 @@
           <w:b/>
           <w:bCs/>
         </w:rPr>
+        <w:lastRenderedPageBreak/>
         <w:t>Golden 20 Benchmark Validation</w:t>
       </w:r>
     </w:p>
@@ -2476,9 +2853,27 @@
     </w:p>
     <w:p>
       <w:r>
-        <w:t>validate_golden20.py</w:t>
-      </w:r>
-    </w:p>
+        <w:t xml:space="preserve">cd </w:t>
+      </w:r>
+      <w:r>
+        <w:t>c:\MyDesign_GPTScorer</w:t>
+      </w:r>
+      <w:r>
+        <w:t xml:space="preserve"> </w:t>
+      </w:r>
+    </w:p>
+    <w:p>
+      <w:r>
+        <w:t>python scripts/shared/validate_golden20.py</w:t>
+      </w:r>
+      <w:r>
+        <w:t xml:space="preserve"> </w:t>
+      </w:r>
+      <w:r>
+        <w:t>C</w:t>
+      </w:r>
+    </w:p>
+    <w:p/>
     <w:p>
       <w:r>
         <w:t xml:space="preserve">The Golden benchmark consists of </w:t>
@@ -2544,7 +2939,6 @@
     </w:p>
     <w:p>
       <w:r>
-        <w:lastRenderedPageBreak/>
         <w:t>The following evaluation metrics are calculated:</w:t>
       </w:r>
     </w:p>
@@ -2672,8 +3066,13 @@
           <w:numId w:val="25"/>
         </w:numPr>
       </w:pPr>
-      <w:r>
-        <w:t>Subscores (C1–C6) are stored in cache files</w:t>
+      <w:proofErr w:type="spellStart"/>
+      <w:r>
+        <w:t>Subscores</w:t>
+      </w:r>
+      <w:proofErr w:type="spellEnd"/>
+      <w:r>
+        <w:t xml:space="preserve"> (C1–C6) are stored in cache files</w:t>
       </w:r>
     </w:p>
     <w:p>
@@ -2681,24 +3080,35 @@
         <w:t>golden20_current</w:t>
       </w:r>
       <w:r>
-        <w:t>_scores</w:t>
+        <w:t>_</w:t>
+      </w:r>
+      <w:proofErr w:type="gramStart"/>
+      <w:r>
+        <w:t>scores</w:t>
       </w:r>
       <w:r>
         <w:t>.json</w:t>
       </w:r>
+      <w:proofErr w:type="gramEnd"/>
       <w:r>
         <w:br/>
         <w:t>golden20_legacy</w:t>
       </w:r>
       <w:r>
-        <w:t>_scores</w:t>
+        <w:t>_</w:t>
+      </w:r>
+      <w:proofErr w:type="gramStart"/>
+      <w:r>
+        <w:t>scores</w:t>
       </w:r>
       <w:r>
         <w:t>.json</w:t>
       </w:r>
-    </w:p>
-    <w:p>
-      <w:r>
+      <w:proofErr w:type="gramEnd"/>
+    </w:p>
+    <w:p>
+      <w:r>
+        <w:lastRenderedPageBreak/>
         <w:t>Subsequent validation runs reuse these cached scores, allowing the benchmark to run:</w:t>
       </w:r>
     </w:p>
@@ -2780,18 +3190,41 @@
       </w:r>
     </w:p>
     <w:p>
-      <w:r>
-        <w:t>golden_C_current_metrics.json</w:t>
-      </w:r>
+      <w:proofErr w:type="spellStart"/>
+      <w:r>
+        <w:t>golden_C_current_</w:t>
+      </w:r>
+      <w:proofErr w:type="gramStart"/>
+      <w:r>
+        <w:t>metrics.json</w:t>
+      </w:r>
+      <w:proofErr w:type="spellEnd"/>
+      <w:proofErr w:type="gramEnd"/>
       <w:r>
         <w:br/>
-        <w:t>golden_C_legacy_metrics.json</w:t>
-      </w:r>
-    </w:p>
-    <w:p>
-      <w:r>
-        <w:lastRenderedPageBreak/>
-        <w:t>These files represent the expected scoring behavior of the system. Future validation runs compare against these baselines to detect deviations.</w:t>
+      </w:r>
+      <w:proofErr w:type="spellStart"/>
+      <w:r>
+        <w:t>golden_C_legacy_</w:t>
+      </w:r>
+      <w:proofErr w:type="gramStart"/>
+      <w:r>
+        <w:t>metrics.json</w:t>
+      </w:r>
+      <w:proofErr w:type="spellEnd"/>
+      <w:proofErr w:type="gramEnd"/>
+    </w:p>
+    <w:p>
+      <w:r>
+        <w:t xml:space="preserve">These files represent the expected scoring behavior of the system. Future validation runs </w:t>
+      </w:r>
+      <w:proofErr w:type="gramStart"/>
+      <w:r>
+        <w:t>compare</w:t>
+      </w:r>
+      <w:proofErr w:type="gramEnd"/>
+      <w:r>
+        <w:t xml:space="preserve"> against these baselines to detect deviations.</w:t>
       </w:r>
     </w:p>
     <w:p>
@@ -2823,12 +3256,21 @@
     </w:p>
     <w:p>
       <w:r>
-        <w:t>cd c:\GPTScorer\scripts\shared</w:t>
-      </w:r>
-    </w:p>
-    <w:p>
-      <w:r>
-        <w:t xml:space="preserve">c:\GPTScorer\scripts\shared&gt; </w:t>
+        <w:t xml:space="preserve">cd </w:t>
+      </w:r>
+      <w:r>
+        <w:t>c:\MyDesign_GPTScorer</w:t>
+      </w:r>
+      <w:r>
+        <w:t>\scripts\shared</w:t>
+      </w:r>
+    </w:p>
+    <w:p>
+      <w:r>
+        <w:t>c:\MyDesign_GPTScorer</w:t>
+      </w:r>
+      <w:r>
+        <w:t xml:space="preserve">\scripts\shared&gt; </w:t>
       </w:r>
       <w:r>
         <w:t>python validate_golden20.py</w:t>
@@ -2868,8 +3310,13 @@
           <w:numId w:val="27"/>
         </w:numPr>
       </w:pPr>
-      <w:r>
-        <w:t>Compute evaluation metrics</w:t>
+      <w:proofErr w:type="gramStart"/>
+      <w:r>
+        <w:t>Compute</w:t>
+      </w:r>
+      <w:proofErr w:type="gramEnd"/>
+      <w:r>
+        <w:t xml:space="preserve"> evaluation metrics</w:t>
       </w:r>
     </w:p>
     <w:p>
@@ -2890,8 +3337,13 @@
           <w:numId w:val="27"/>
         </w:numPr>
       </w:pPr>
-      <w:r>
-        <w:t>Report whether drift is detected</w:t>
+      <w:proofErr w:type="gramStart"/>
+      <w:r>
+        <w:t>Report</w:t>
+      </w:r>
+      <w:proofErr w:type="gramEnd"/>
+      <w:r>
+        <w:t xml:space="preserve"> whether drift is detected</w:t>
       </w:r>
     </w:p>
     <w:p>
@@ -2923,32 +3375,79 @@
     </w:p>
     <w:p>
       <w:r>
+        <w:lastRenderedPageBreak/>
         <w:t>validate_golden20_C.py</w:t>
       </w:r>
       <w:r>
         <w:br/>
-        <w:t>golden_C_current_cases.json</w:t>
-      </w:r>
+      </w:r>
+      <w:proofErr w:type="spellStart"/>
+      <w:r>
+        <w:t>golden_C_current_</w:t>
+      </w:r>
+      <w:proofErr w:type="gramStart"/>
+      <w:r>
+        <w:t>cases.json</w:t>
+      </w:r>
+      <w:proofErr w:type="spellEnd"/>
+      <w:proofErr w:type="gramEnd"/>
       <w:r>
         <w:br/>
-        <w:t>golden_C_legacy_cases.json</w:t>
-      </w:r>
+      </w:r>
+      <w:proofErr w:type="spellStart"/>
+      <w:r>
+        <w:t>golden_C_legacy_</w:t>
+      </w:r>
+      <w:proofErr w:type="gramStart"/>
+      <w:r>
+        <w:t>cases.json</w:t>
+      </w:r>
+      <w:proofErr w:type="spellEnd"/>
+      <w:proofErr w:type="gramEnd"/>
       <w:r>
         <w:br/>
-        <w:t>golden_C_current_metrics.json</w:t>
-      </w:r>
+      </w:r>
+      <w:proofErr w:type="spellStart"/>
+      <w:r>
+        <w:t>golden_C_current_</w:t>
+      </w:r>
+      <w:proofErr w:type="gramStart"/>
+      <w:r>
+        <w:t>metrics.json</w:t>
+      </w:r>
+      <w:proofErr w:type="spellEnd"/>
+      <w:proofErr w:type="gramEnd"/>
       <w:r>
         <w:br/>
-        <w:t>golden_C_legacy_metrics.json</w:t>
-      </w:r>
+      </w:r>
+      <w:proofErr w:type="spellStart"/>
+      <w:r>
+        <w:t>golden_C_legacy_</w:t>
+      </w:r>
+      <w:proofErr w:type="gramStart"/>
+      <w:r>
+        <w:t>metrics.json</w:t>
+      </w:r>
+      <w:proofErr w:type="spellEnd"/>
+      <w:proofErr w:type="gramEnd"/>
       <w:r>
         <w:br/>
-        <w:t>golden20_api_scores_current.json</w:t>
-      </w:r>
+        <w:t>golden20_api_scores_</w:t>
+      </w:r>
+      <w:proofErr w:type="gramStart"/>
+      <w:r>
+        <w:t>current.json</w:t>
+      </w:r>
+      <w:proofErr w:type="gramEnd"/>
       <w:r>
         <w:br/>
-        <w:t>golden20_api_scores_legacy.json</w:t>
-      </w:r>
+        <w:t>golden20_api_scores_</w:t>
+      </w:r>
+      <w:proofErr w:type="gramStart"/>
+      <w:r>
+        <w:t>legacy.json</w:t>
+      </w:r>
+      <w:proofErr w:type="gramEnd"/>
     </w:p>
     <w:p>
       <w:r>
@@ -3000,7 +3499,6 @@
         </w:numPr>
       </w:pPr>
       <w:r>
-        <w:lastRenderedPageBreak/>
         <w:t>GPT model drift</w:t>
       </w:r>
     </w:p>
@@ -3143,7 +3641,7 @@
         <w:t xml:space="preserve">Align Element </w:t>
       </w:r>
       <w:r>
-        <w:t>B, E - L</w:t>
+        <w:t>E - L</w:t>
       </w:r>
       <w:r>
         <w:t xml:space="preserve"> with this architecture</w:t>
@@ -3160,20 +3658,6 @@
       <w:r>
         <w:t>Integrate Golden 20 Regression testing with scoring pipeline and diagnostics</w:t>
       </w:r>
-    </w:p>
-    <w:p>
-      <w:pPr>
-        <w:pStyle w:val="ListParagraph"/>
-        <w:numPr>
-          <w:ilvl w:val="0"/>
-          <w:numId w:val="19"/>
-        </w:numPr>
-      </w:pPr>
-      <w:r>
-        <w:t>Improve narrative feedback consistency</w:t>
-      </w:r>
-    </w:p>
-    <w:p>
       <w:r>
         <w:pict w14:anchorId="35FA4AB3">
           <v:rect id="_x0000_i1045" style="width:0;height:1.5pt" o:hralign="center" o:hrstd="t" o:hr="t" fillcolor="#a0a0a0" stroked="f"/>
@@ -3192,6 +3676,7 @@
           <w:b/>
           <w:bCs/>
         </w:rPr>
+        <w:lastRenderedPageBreak/>
         <w:t>Contact / Internal Use</w:t>
       </w:r>
     </w:p>
@@ -3202,7 +3687,15 @@
     </w:p>
     <w:p>
       <w:r>
-        <w:t>For questions regarding calibration methodology or validation metrics, contact the project lead.</w:t>
+        <w:t xml:space="preserve">For questions regarding calibration methodology or validation metrics, contact the project </w:t>
+      </w:r>
+      <w:proofErr w:type="gramStart"/>
+      <w:r>
+        <w:t>lead</w:t>
+      </w:r>
+      <w:proofErr w:type="gramEnd"/>
+      <w:r>
+        <w:t>.</w:t>
       </w:r>
     </w:p>
     <w:p/>

</xml_diff>

<commit_message>
Finalize v1.1 cleanup and stabilization
</commit_message>
<xml_diff>
--- a/Readme.docx
+++ b/Readme.docx
@@ -9,37 +9,12 @@
           <w:bCs/>
         </w:rPr>
       </w:pPr>
-      <w:proofErr w:type="spellStart"/>
-      <w:r>
-        <w:rPr>
-          <w:b/>
-          <w:bCs/>
-        </w:rPr>
-        <w:t>GPTScorer</w:t>
-      </w:r>
-      <w:proofErr w:type="spellEnd"/>
-      <w:r>
-        <w:rPr>
-          <w:b/>
-          <w:bCs/>
-        </w:rPr>
-        <w:t xml:space="preserve"> – </w:t>
-      </w:r>
-      <w:proofErr w:type="gramStart"/>
-      <w:r>
-        <w:rPr>
-          <w:b/>
-          <w:bCs/>
-        </w:rPr>
-        <w:t>Element  Scoring</w:t>
-      </w:r>
-      <w:proofErr w:type="gramEnd"/>
-      <w:r>
-        <w:rPr>
-          <w:b/>
-          <w:bCs/>
-        </w:rPr>
-        <w:t xml:space="preserve"> Application</w:t>
+      <w:r>
+        <w:rPr>
+          <w:b/>
+          <w:bCs/>
+        </w:rPr>
+        <w:t>GPTScorer – Element  Scoring Application</w:t>
       </w:r>
     </w:p>
     <w:p>
@@ -50,15 +25,7 @@
         <w:t>validated</w:t>
       </w:r>
       <w:r>
-        <w:t xml:space="preserve"> scoring application for </w:t>
-      </w:r>
-      <w:proofErr w:type="spellStart"/>
-      <w:r>
-        <w:t>MyDesign</w:t>
-      </w:r>
-      <w:proofErr w:type="spellEnd"/>
-      <w:r>
-        <w:t xml:space="preserve"> – Element C (Presentation and Justification of Solution Design Requirements).</w:t>
+        <w:t xml:space="preserve"> scoring application for MyDesign – Element C (Presentation and Justification of Solution Design Requirements).</w:t>
       </w:r>
       <w:r>
         <w:t xml:space="preserve">  Element</w:t>
@@ -94,15 +61,7 @@
         <w:t>as well</w:t>
       </w:r>
       <w:r>
-        <w:t xml:space="preserve"> for operation.  The discussion </w:t>
-      </w:r>
-      <w:proofErr w:type="gramStart"/>
-      <w:r>
-        <w:t>discloses  detailed</w:t>
-      </w:r>
-      <w:proofErr w:type="gramEnd"/>
-      <w:r>
-        <w:t xml:space="preserve"> parameters that are specific to Element C so they will obviously change for the other elements.</w:t>
+        <w:t xml:space="preserve"> for operation.  The discussion discloses  detailed parameters that are specific to Element C so they will obviously change for the other elements.</w:t>
       </w:r>
     </w:p>
     <w:p>
@@ -209,7 +168,9 @@
       </w:r>
       <w:r>
         <w:br/>
-        <w:t>Structured JSON Output (C1–C6 + rationales)</w:t>
+      </w:r>
+      <w:r>
+        <w:t>Blended Model Rules Engine</w:t>
       </w:r>
       <w:r>
         <w:br/>
@@ -217,15 +178,9 @@
       </w:r>
       <w:r>
         <w:br/>
-        <w:t xml:space="preserve">Raw Element Score (mean of </w:t>
-      </w:r>
-      <w:proofErr w:type="spellStart"/>
-      <w:r>
-        <w:t>subscores</w:t>
-      </w:r>
-      <w:proofErr w:type="spellEnd"/>
-      <w:r>
-        <w:t>)</w:t>
+      </w:r>
+      <w:r>
+        <w:t>Structured JSON Output (C1–C6 + rationales)</w:t>
       </w:r>
       <w:r>
         <w:br/>
@@ -233,7 +188,7 @@
       </w:r>
       <w:r>
         <w:br/>
-        <w:t>Mode-Dependent Calibration</w:t>
+        <w:t>Raw Element Score (mean of subscores)</w:t>
       </w:r>
       <w:r>
         <w:br/>
@@ -241,10 +196,21 @@
       </w:r>
       <w:r>
         <w:br/>
+        <w:t>Mode-Dependent Calibration</w:t>
+      </w:r>
+      <w:r>
+        <w:br/>
+        <w:t xml:space="preserve">        ↓</w:t>
+      </w:r>
+      <w:r>
+        <w:br/>
         <w:t>Narrative Feedback Generation</w:t>
       </w:r>
       <w:r>
         <w:br/>
+      </w:r>
+      <w:r>
+        <w:lastRenderedPageBreak/>
         <w:t xml:space="preserve">        ↓</w:t>
       </w:r>
       <w:r>
@@ -323,7 +289,14 @@
           <w:b/>
           <w:bCs/>
         </w:rPr>
-        <w:t>SYSTEM BLOCK DIAGRAM</w:t>
+        <w:t xml:space="preserve">SCORING PIPELINE </w:t>
+      </w:r>
+      <w:r>
+        <w:rPr>
+          <w:b/>
+          <w:bCs/>
+        </w:rPr>
+        <w:t>BLOCK DIAGRAM</w:t>
       </w:r>
     </w:p>
     <w:p>
@@ -338,6 +311,125 @@
       </w:r>
       <w:r>
         <w:t xml:space="preserve"> general system flow for each element model.   Element C does not use the Rule Engine or lightweight ML training model; therefore, related files are not included in this repository.  Element C uses a simple linear model for calibration.</w:t>
+      </w:r>
+    </w:p>
+    <w:p>
+      <w:pPr>
+        <w:rPr>
+          <w:b/>
+          <w:bCs/>
+        </w:rPr>
+      </w:pPr>
+      <w:r>
+        <w:rPr>
+          <w:b/>
+          <w:bCs/>
+        </w:rPr>
+        <w:lastRenderedPageBreak/>
+        <w:br w:type="page"/>
+      </w:r>
+    </w:p>
+    <w:p>
+      <w:pPr>
+        <w:rPr>
+          <w:b/>
+          <w:bCs/>
+        </w:rPr>
+      </w:pPr>
+      <w:r>
+        <w:rPr>
+          <w:b/>
+          <w:bCs/>
+          <w:noProof/>
+        </w:rPr>
+        <w:lastRenderedPageBreak/>
+        <w:drawing>
+          <wp:inline distT="0" distB="0" distL="0" distR="0" wp14:anchorId="73928313" wp14:editId="34D17AA7">
+            <wp:extent cx="8220075" cy="2800350"/>
+            <wp:effectExtent l="0" t="0" r="9525" b="0"/>
+            <wp:docPr id="42642569" name="Picture 2"/>
+            <wp:cNvGraphicFramePr>
+              <a:graphicFrameLocks xmlns:a="http://schemas.openxmlformats.org/drawingml/2006/main" noChangeAspect="1"/>
+            </wp:cNvGraphicFramePr>
+            <a:graphic xmlns:a="http://schemas.openxmlformats.org/drawingml/2006/main">
+              <a:graphicData uri="http://schemas.openxmlformats.org/drawingml/2006/picture">
+                <pic:pic xmlns:pic="http://schemas.openxmlformats.org/drawingml/2006/picture">
+                  <pic:nvPicPr>
+                    <pic:cNvPr id="0" name="Picture 23"/>
+                    <pic:cNvPicPr>
+                      <a:picLocks noChangeAspect="1" noChangeArrowheads="1"/>
+                    </pic:cNvPicPr>
+                  </pic:nvPicPr>
+                  <pic:blipFill>
+                    <a:blip r:embed="rId6">
+                      <a:extLst>
+                        <a:ext uri="{28A0092B-C50C-407E-A947-70E740481C1C}">
+                          <a14:useLocalDpi xmlns:a14="http://schemas.microsoft.com/office/drawing/2010/main" val="0"/>
+                        </a:ext>
+                      </a:extLst>
+                    </a:blip>
+                    <a:srcRect/>
+                    <a:stretch>
+                      <a:fillRect/>
+                    </a:stretch>
+                  </pic:blipFill>
+                  <pic:spPr bwMode="auto">
+                    <a:xfrm>
+                      <a:off x="0" y="0"/>
+                      <a:ext cx="8220075" cy="2800350"/>
+                    </a:xfrm>
+                    <a:prstGeom prst="rect">
+                      <a:avLst/>
+                    </a:prstGeom>
+                    <a:noFill/>
+                    <a:ln>
+                      <a:noFill/>
+                    </a:ln>
+                  </pic:spPr>
+                </pic:pic>
+              </a:graphicData>
+            </a:graphic>
+          </wp:inline>
+        </w:drawing>
+      </w:r>
+    </w:p>
+    <w:p>
+      <w:pPr>
+        <w:rPr>
+          <w:b/>
+          <w:bCs/>
+        </w:rPr>
+      </w:pPr>
+    </w:p>
+    <w:p>
+      <w:pPr>
+        <w:jc w:val="center"/>
+        <w:rPr>
+          <w:b/>
+          <w:bCs/>
+        </w:rPr>
+      </w:pPr>
+      <w:r>
+        <w:rPr>
+          <w:b/>
+          <w:bCs/>
+        </w:rPr>
+        <w:t>SYSTEM BLOCK DIAGRAM (SCORING, DIAGNOSTICS, REGRESSION TESTING</w:t>
+      </w:r>
+      <w:r>
+        <w:rPr>
+          <w:b/>
+          <w:bCs/>
+        </w:rPr>
+        <w:t>)</w:t>
+      </w:r>
+    </w:p>
+    <w:p>
+      <w:r>
+        <w:t>This b</w:t>
+      </w:r>
+      <w:r>
+        <w:t xml:space="preserve">lock diagram shows data flow for the overall system which is divided in two processes:  scoring and diagnostics.  Diagnostics include drift detection for scores of documents  submitted for scoring.  Regression testing using a Golden20 set of documents, chosen for their susceptibility for variations in scoring processes and philosophy.  Controller_app.py is an overall controller for system, controlling both scoring and diagnostics in one UI. </w:t>
       </w:r>
     </w:p>
     <w:p>
@@ -722,13 +814,8 @@
     </w:p>
     <w:p>
       <w:r>
-        <w:t>set OPENAI_API_KEY=</w:t>
-      </w:r>
-      <w:proofErr w:type="spellStart"/>
-      <w:r>
-        <w:t>your_key_here</w:t>
-      </w:r>
-      <w:proofErr w:type="spellEnd"/>
+        <w:t>set OPENAI_API_KEY=your_key_here</w:t>
+      </w:r>
     </w:p>
     <w:p>
       <w:r>
@@ -791,48 +878,11 @@
     </w:p>
     <w:p>
       <w:r>
-        <w:t xml:space="preserve">python -m </w:t>
-      </w:r>
-      <w:proofErr w:type="spellStart"/>
-      <w:proofErr w:type="gramStart"/>
-      <w:r>
-        <w:t>elements.element</w:t>
-      </w:r>
-      <w:proofErr w:type="gramEnd"/>
-      <w:r>
-        <w:t>_</w:t>
-      </w:r>
-      <w:proofErr w:type="gramStart"/>
-      <w:r>
-        <w:t>C.score</w:t>
-      </w:r>
-      <w:proofErr w:type="gramEnd"/>
-      <w:r>
-        <w:t>_with_API_C</w:t>
-      </w:r>
-      <w:proofErr w:type="spellEnd"/>
-      <w:r>
-        <w:t xml:space="preserve"> ^</w:t>
+        <w:t>python -m elements.element_C.score_with_API_C ^</w:t>
       </w:r>
       <w:r>
         <w:br/>
-        <w:t xml:space="preserve">  --folder elements/</w:t>
-      </w:r>
-      <w:proofErr w:type="spellStart"/>
-      <w:r>
-        <w:t>element_C</w:t>
-      </w:r>
-      <w:proofErr w:type="spellEnd"/>
-      <w:r>
-        <w:t>/</w:t>
-      </w:r>
-      <w:proofErr w:type="spellStart"/>
-      <w:r>
-        <w:t>current_api_scoring_documents</w:t>
-      </w:r>
-      <w:proofErr w:type="spellEnd"/>
-      <w:r>
-        <w:t xml:space="preserve"> ^</w:t>
+        <w:t xml:space="preserve">  --folder elements/element_C/current_api_scoring_documents ^</w:t>
       </w:r>
       <w:r>
         <w:br/>
@@ -842,15 +892,7 @@
         <w:t xml:space="preserve"> </w:t>
       </w:r>
       <w:r>
-        <w:t>elements/</w:t>
-      </w:r>
-      <w:proofErr w:type="spellStart"/>
-      <w:r>
-        <w:t>element_C</w:t>
-      </w:r>
-      <w:proofErr w:type="spellEnd"/>
-      <w:r>
-        <w:t>/</w:t>
+        <w:t>elements/element_C/</w:t>
       </w:r>
       <w:r>
         <w:t>scored_results</w:t>
@@ -951,15 +993,7 @@
         </w:numPr>
       </w:pPr>
       <w:r>
-        <w:t>C1-C</w:t>
-      </w:r>
-      <w:proofErr w:type="gramStart"/>
-      <w:r>
-        <w:t>6  Bulleted</w:t>
-      </w:r>
-      <w:proofErr w:type="gramEnd"/>
-      <w:r>
-        <w:t xml:space="preserve"> rationale</w:t>
+        <w:t>C1-C6  Bulleted rationale</w:t>
       </w:r>
     </w:p>
     <w:p>
@@ -1095,13 +1129,7 @@
         </w:numPr>
       </w:pPr>
       <w:r>
-        <w:t xml:space="preserve">Select mode for legacy </w:t>
-      </w:r>
-      <w:r>
-        <w:t xml:space="preserve">documents </w:t>
-      </w:r>
-      <w:r>
-        <w:t>(submitted prior to 10/1/2024) vs current documents (submitted from 10/2/2024 to present)</w:t>
+        <w:t>Select mode for legacy documents (submitted prior to 10/1/2024) vs current documents (submitted from 10/2/2024 to present)</w:t>
       </w:r>
     </w:p>
     <w:p>
@@ -1191,13 +1219,8 @@
         </w:numPr>
       </w:pPr>
       <w:r>
-        <w:t xml:space="preserve">C1_expert – </w:t>
-      </w:r>
-      <w:proofErr w:type="spellStart"/>
-      <w:r>
-        <w:t>C_expert</w:t>
-      </w:r>
-      <w:proofErr w:type="spellEnd"/>
+        <w:t>C1_expert – C_expert</w:t>
+      </w:r>
       <w:r>
         <w:t xml:space="preserve"> scores</w:t>
       </w:r>
@@ -1277,21 +1300,8 @@
           <w:numId w:val="18"/>
         </w:numPr>
       </w:pPr>
-      <w:proofErr w:type="spellStart"/>
-      <w:r>
-        <w:t>Element_score_raw</w:t>
-      </w:r>
-      <w:proofErr w:type="spellEnd"/>
-      <w:r>
-        <w:t xml:space="preserve">, the average of the </w:t>
-      </w:r>
-      <w:proofErr w:type="spellStart"/>
-      <w:r>
-        <w:t>api</w:t>
-      </w:r>
-      <w:proofErr w:type="spellEnd"/>
-      <w:r>
-        <w:t xml:space="preserve"> scores</w:t>
+      <w:r>
+        <w:t>Element_score_raw, the average of the api scores</w:t>
       </w:r>
     </w:p>
     <w:p>
@@ -1332,15 +1342,7 @@
         </w:numPr>
       </w:pPr>
       <w:r>
-        <w:t>C1_</w:t>
-      </w:r>
-      <w:proofErr w:type="gramStart"/>
-      <w:r>
-        <w:t>final  –</w:t>
-      </w:r>
-      <w:proofErr w:type="gramEnd"/>
-      <w:r>
-        <w:t xml:space="preserve"> C6_final calibrated scores for output</w:t>
+        <w:t>C1_final  – C6_final calibrated scores for output</w:t>
       </w:r>
     </w:p>
     <w:p>
@@ -1351,11 +1353,9 @@
           <w:numId w:val="17"/>
         </w:numPr>
       </w:pPr>
-      <w:proofErr w:type="spellStart"/>
       <w:r>
         <w:t>element_score_raw</w:t>
       </w:r>
-      <w:proofErr w:type="spellEnd"/>
       <w:r>
         <w:tab/>
       </w:r>
@@ -1368,11 +1368,9 @@
           <w:numId w:val="17"/>
         </w:numPr>
       </w:pPr>
-      <w:proofErr w:type="spellStart"/>
       <w:r>
         <w:t>element_score_calibrated</w:t>
       </w:r>
-      <w:proofErr w:type="spellEnd"/>
       <w:r>
         <w:tab/>
       </w:r>
@@ -1385,11 +1383,9 @@
           <w:numId w:val="17"/>
         </w:numPr>
       </w:pPr>
-      <w:proofErr w:type="spellStart"/>
       <w:r>
         <w:t>calibration_delta</w:t>
       </w:r>
-      <w:proofErr w:type="spellEnd"/>
     </w:p>
     <w:p>
       <w:pPr>
@@ -1475,13 +1471,8 @@
         </w:numPr>
       </w:pPr>
       <w:r>
-        <w:t xml:space="preserve">Drift slightly </w:t>
-      </w:r>
-      <w:proofErr w:type="gramStart"/>
-      <w:r>
-        <w:t>over time</w:t>
-      </w:r>
-      <w:proofErr w:type="gramEnd"/>
+        <w:t>Drift slightly over time</w:t>
+      </w:r>
     </w:p>
     <w:p>
       <w:pPr>
@@ -1633,13 +1624,8 @@
           <w:numId w:val="11"/>
         </w:numPr>
       </w:pPr>
-      <w:proofErr w:type="gramStart"/>
-      <w:r>
-        <w:t>Explains</w:t>
-      </w:r>
-      <w:proofErr w:type="gramEnd"/>
-      <w:r>
-        <w:t xml:space="preserve"> strengths and weaknesses</w:t>
+      <w:r>
+        <w:t>Explains strengths and weaknesses</w:t>
       </w:r>
     </w:p>
     <w:p>
@@ -1660,13 +1646,8 @@
           <w:numId w:val="11"/>
         </w:numPr>
       </w:pPr>
-      <w:proofErr w:type="gramStart"/>
-      <w:r>
-        <w:t>Uses</w:t>
-      </w:r>
-      <w:proofErr w:type="gramEnd"/>
-      <w:r>
-        <w:t xml:space="preserve"> educator-friendly language</w:t>
+      <w:r>
+        <w:t>Uses educator-friendly language</w:t>
       </w:r>
     </w:p>
     <w:p>
@@ -1741,13 +1722,8 @@
           <w:numId w:val="12"/>
         </w:numPr>
       </w:pPr>
-      <w:proofErr w:type="spellStart"/>
-      <w:r>
-        <w:t>Subscore</w:t>
-      </w:r>
-      <w:proofErr w:type="spellEnd"/>
-      <w:r>
-        <w:t xml:space="preserve"> drift analysis</w:t>
+      <w:r>
+        <w:t>Subscore drift analysis</w:t>
       </w:r>
     </w:p>
     <w:p>
@@ -1792,23 +1768,7 @@
           <w:b/>
           <w:bCs/>
         </w:rPr>
-        <w:t xml:space="preserve"> (all core, scripts and </w:t>
-      </w:r>
-      <w:proofErr w:type="spellStart"/>
-      <w:r>
-        <w:rPr>
-          <w:b/>
-          <w:bCs/>
-        </w:rPr>
-        <w:t>simple_ui</w:t>
-      </w:r>
-      <w:proofErr w:type="spellEnd"/>
-      <w:r>
-        <w:rPr>
-          <w:b/>
-          <w:bCs/>
-        </w:rPr>
-        <w:t xml:space="preserve"> apps are now element agnostic to facilitate cloning the architecture for other elements)</w:t>
+        <w:t xml:space="preserve"> (all core, scripts and simple_ui apps are now element agnostic to facilitate cloning the architecture for other elements)</w:t>
       </w:r>
     </w:p>
     <w:p>
@@ -1823,13 +1783,8 @@
       <w:r>
         <w:t xml:space="preserve"> </w:t>
       </w:r>
-      <w:proofErr w:type="spellStart"/>
-      <w:r>
-        <w:t>GPTScorer</w:t>
-      </w:r>
-      <w:proofErr w:type="spellEnd"/>
-      <w:r>
-        <w:t>/</w:t>
+      <w:r>
+        <w:t>GPTScorer/</w:t>
       </w:r>
     </w:p>
     <w:p>
@@ -1904,49 +1859,17 @@
     </w:p>
     <w:p>
       <w:r>
-        <w:t xml:space="preserve"> │     └── </w:t>
-      </w:r>
-      <w:proofErr w:type="spellStart"/>
-      <w:r>
-        <w:t>element_A</w:t>
-      </w:r>
-      <w:proofErr w:type="spellEnd"/>
-      <w:r>
-        <w:t xml:space="preserve">/ </w:t>
-      </w:r>
-      <w:proofErr w:type="gramStart"/>
-      <w:r>
-        <w:t>-  analogous</w:t>
-      </w:r>
-      <w:proofErr w:type="gramEnd"/>
-      <w:r>
-        <w:t xml:space="preserve"> to C</w:t>
-      </w:r>
-    </w:p>
-    <w:p>
-      <w:r>
-        <w:t xml:space="preserve"> │     └── </w:t>
-      </w:r>
-      <w:proofErr w:type="spellStart"/>
-      <w:r>
-        <w:t>element_D</w:t>
-      </w:r>
-      <w:proofErr w:type="spellEnd"/>
-      <w:r>
-        <w:t>/ - analogous to C</w:t>
-      </w:r>
-    </w:p>
-    <w:p>
-      <w:r>
-        <w:t xml:space="preserve"> │    └── </w:t>
-      </w:r>
-      <w:proofErr w:type="spellStart"/>
-      <w:r>
-        <w:t>element_C</w:t>
-      </w:r>
-      <w:proofErr w:type="spellEnd"/>
-      <w:r>
-        <w:t>/</w:t>
+        <w:t xml:space="preserve"> │     └── element_A/ -  analogous to C</w:t>
+      </w:r>
+    </w:p>
+    <w:p>
+      <w:r>
+        <w:t xml:space="preserve"> │     └── element_D/ - analogous to C</w:t>
+      </w:r>
+    </w:p>
+    <w:p>
+      <w:r>
+        <w:t xml:space="preserve"> │    └── element_C/</w:t>
       </w:r>
     </w:p>
     <w:p>
@@ -1969,18 +1892,8 @@
         <w:t>──</w:t>
       </w:r>
       <w:r>
-        <w:t xml:space="preserve"> </w:t>
-      </w:r>
-      <w:proofErr w:type="spellStart"/>
-      <w:r>
-        <w:t>golden_C_</w:t>
-      </w:r>
-      <w:proofErr w:type="gramStart"/>
-      <w:r>
-        <w:t>current.json</w:t>
-      </w:r>
-      <w:proofErr w:type="spellEnd"/>
-      <w:proofErr w:type="gramEnd"/>
+        <w:t xml:space="preserve"> golden_C_current.json</w:t>
+      </w:r>
     </w:p>
     <w:p>
       <w:r>
@@ -2002,18 +1915,8 @@
         <w:t>──</w:t>
       </w:r>
       <w:r>
-        <w:t xml:space="preserve"> </w:t>
-      </w:r>
-      <w:proofErr w:type="spellStart"/>
-      <w:r>
-        <w:t>golden_C_</w:t>
-      </w:r>
-      <w:proofErr w:type="gramStart"/>
-      <w:r>
-        <w:t>legacy.json</w:t>
-      </w:r>
-      <w:proofErr w:type="spellEnd"/>
-      <w:proofErr w:type="gramEnd"/>
+        <w:t xml:space="preserve"> golden_C_legacy.json</w:t>
+      </w:r>
     </w:p>
     <w:p>
       <w:r>
@@ -2035,13 +1938,8 @@
         <w:t>──</w:t>
       </w:r>
       <w:r>
-        <w:t xml:space="preserve"> golden20_metrics_</w:t>
-      </w:r>
-      <w:proofErr w:type="gramStart"/>
-      <w:r>
-        <w:t>current.json</w:t>
-      </w:r>
-      <w:proofErr w:type="gramEnd"/>
+        <w:t xml:space="preserve"> golden20_metrics_current.json</w:t>
+      </w:r>
     </w:p>
     <w:p>
       <w:r>
@@ -2063,13 +1961,8 @@
         <w:t>──</w:t>
       </w:r>
       <w:r>
-        <w:t xml:space="preserve"> golden20_metrics_</w:t>
-      </w:r>
-      <w:proofErr w:type="gramStart"/>
-      <w:r>
-        <w:t>legacy.json</w:t>
-      </w:r>
-      <w:proofErr w:type="gramEnd"/>
+        <w:t xml:space="preserve"> golden20_metrics_legacy.json</w:t>
+      </w:r>
     </w:p>
     <w:p>
       <w:r>
@@ -2091,15 +1984,7 @@
         <w:t>──</w:t>
       </w:r>
       <w:r>
-        <w:t xml:space="preserve"> golden20_current_</w:t>
-      </w:r>
-      <w:proofErr w:type="gramStart"/>
-      <w:r>
-        <w:t>scores.json</w:t>
-      </w:r>
-      <w:proofErr w:type="gramEnd"/>
-      <w:r>
-        <w:t xml:space="preserve">      </w:t>
+        <w:t xml:space="preserve"> golden20_current_scores.json      </w:t>
       </w:r>
       <w:r>
         <w:rPr>
@@ -2125,15 +2010,7 @@
         <w:t xml:space="preserve">  </w:t>
       </w:r>
       <w:r>
-        <w:t>└── golden20_legacy_</w:t>
-      </w:r>
-      <w:proofErr w:type="gramStart"/>
-      <w:r>
-        <w:t>scores.json</w:t>
-      </w:r>
-      <w:proofErr w:type="gramEnd"/>
-      <w:r>
-        <w:t xml:space="preserve">       ← cached API scores</w:t>
+        <w:t>└── golden20_legacy_scores.json       ← cached API scores</w:t>
       </w:r>
     </w:p>
     <w:p>
@@ -2160,49 +2037,17 @@
     </w:p>
     <w:p>
       <w:r>
-        <w:t xml:space="preserve"> │   └── </w:t>
-      </w:r>
-      <w:proofErr w:type="spellStart"/>
-      <w:r>
-        <w:t>element_A</w:t>
-      </w:r>
-      <w:proofErr w:type="spellEnd"/>
-      <w:r>
-        <w:t xml:space="preserve">/ </w:t>
-      </w:r>
-      <w:proofErr w:type="gramStart"/>
-      <w:r>
-        <w:t>-  analogous</w:t>
-      </w:r>
-      <w:proofErr w:type="gramEnd"/>
-      <w:r>
-        <w:t xml:space="preserve"> to C</w:t>
-      </w:r>
-    </w:p>
-    <w:p>
-      <w:r>
-        <w:t xml:space="preserve"> │   └── </w:t>
-      </w:r>
-      <w:proofErr w:type="spellStart"/>
-      <w:r>
-        <w:t>element_D</w:t>
-      </w:r>
-      <w:proofErr w:type="spellEnd"/>
-      <w:r>
-        <w:t>/ - analogous to C</w:t>
-      </w:r>
-    </w:p>
-    <w:p>
-      <w:r>
-        <w:t xml:space="preserve">│   └── </w:t>
-      </w:r>
-      <w:proofErr w:type="spellStart"/>
-      <w:r>
-        <w:t>element_C</w:t>
-      </w:r>
-      <w:proofErr w:type="spellEnd"/>
-      <w:r>
-        <w:t>/</w:t>
+        <w:t xml:space="preserve"> │   └── element_A/ -  analogous to C</w:t>
+      </w:r>
+    </w:p>
+    <w:p>
+      <w:r>
+        <w:t xml:space="preserve"> │   └── element_D/ - analogous to C</w:t>
+      </w:r>
+    </w:p>
+    <w:p>
+      <w:r>
+        <w:t>│   └── element_C/</w:t>
       </w:r>
     </w:p>
     <w:p>
@@ -2312,15 +2157,7 @@
         <w:t>──</w:t>
       </w:r>
       <w:r>
-        <w:t xml:space="preserve"> </w:t>
-      </w:r>
-      <w:proofErr w:type="spellStart"/>
-      <w:r>
-        <w:t>current_api_scoring_documents</w:t>
-      </w:r>
-      <w:proofErr w:type="spellEnd"/>
-      <w:r>
-        <w:t>/</w:t>
+        <w:t xml:space="preserve"> current_api_scoring_documents/</w:t>
       </w:r>
     </w:p>
     <w:p>
@@ -2336,15 +2173,7 @@
     <w:p>
       <w:r>
         <w:lastRenderedPageBreak/>
-        <w:t xml:space="preserve">│       └── </w:t>
-      </w:r>
-      <w:proofErr w:type="spellStart"/>
-      <w:r>
-        <w:t>legacy_api_scoring_documents</w:t>
-      </w:r>
-      <w:proofErr w:type="spellEnd"/>
-      <w:r>
-        <w:t>/</w:t>
+        <w:t>│       └── legacy_api_scoring_documents/</w:t>
       </w:r>
     </w:p>
     <w:p>
@@ -2409,15 +2238,7 @@
         <w:t>──</w:t>
       </w:r>
       <w:r>
-        <w:t xml:space="preserve"> </w:t>
-      </w:r>
-      <w:proofErr w:type="spellStart"/>
-      <w:r>
-        <w:t>simple_ui</w:t>
-      </w:r>
-      <w:proofErr w:type="spellEnd"/>
-      <w:r>
-        <w:t>/</w:t>
+        <w:t xml:space="preserve"> simple_ui/</w:t>
       </w:r>
     </w:p>
     <w:p>
@@ -2549,15 +2370,7 @@
         </w:numPr>
       </w:pPr>
       <w:r>
-        <w:t xml:space="preserve">Bias controlled through </w:t>
-      </w:r>
-      <w:proofErr w:type="gramStart"/>
-      <w:r>
-        <w:t>intercept</w:t>
-      </w:r>
-      <w:proofErr w:type="gramEnd"/>
-      <w:r>
-        <w:t xml:space="preserve"> calibration</w:t>
+        <w:t>Bias controlled through intercept calibration</w:t>
       </w:r>
     </w:p>
     <w:p>
@@ -2638,21 +2451,12 @@
       <w:r>
         <w:t xml:space="preserve">, and </w:t>
       </w:r>
-      <w:proofErr w:type="gramStart"/>
-      <w:r>
-        <w:rPr>
-          <w:b/>
-          <w:bCs/>
-        </w:rPr>
-        <w:t>cached</w:t>
-      </w:r>
-      <w:proofErr w:type="gramEnd"/>
-      <w:r>
-        <w:rPr>
-          <w:b/>
-          <w:bCs/>
-        </w:rPr>
-        <w:t xml:space="preserve"> API scoring for reproducibility</w:t>
+      <w:r>
+        <w:rPr>
+          <w:b/>
+          <w:bCs/>
+        </w:rPr>
+        <w:t>cached API scoring for reproducibility</w:t>
       </w:r>
       <w:r>
         <w:t>.</w:t>
@@ -2698,13 +2502,8 @@
         </w:numPr>
       </w:pPr>
       <w:r>
-        <w:t xml:space="preserve">Raw API </w:t>
-      </w:r>
-      <w:proofErr w:type="spellStart"/>
-      <w:r>
-        <w:t>subscores</w:t>
-      </w:r>
-      <w:proofErr w:type="spellEnd"/>
+        <w:t>Raw API subscores</w:t>
+      </w:r>
     </w:p>
     <w:p>
       <w:pPr>
@@ -2867,10 +2666,7 @@
         <w:t>python scripts/shared/validate_golden20.py</w:t>
       </w:r>
       <w:r>
-        <w:t xml:space="preserve"> </w:t>
-      </w:r>
-      <w:r>
-        <w:t>C</w:t>
+        <w:t xml:space="preserve"> C</w:t>
       </w:r>
     </w:p>
     <w:p/>
@@ -3066,13 +2862,8 @@
           <w:numId w:val="25"/>
         </w:numPr>
       </w:pPr>
-      <w:proofErr w:type="spellStart"/>
-      <w:r>
-        <w:t>Subscores</w:t>
-      </w:r>
-      <w:proofErr w:type="spellEnd"/>
-      <w:r>
-        <w:t xml:space="preserve"> (C1–C6) are stored in cache files</w:t>
+      <w:r>
+        <w:t>Subscores (C1–C6) are stored in cache files</w:t>
       </w:r>
     </w:p>
     <w:p>
@@ -3080,31 +2871,21 @@
         <w:t>golden20_current</w:t>
       </w:r>
       <w:r>
-        <w:t>_</w:t>
-      </w:r>
-      <w:proofErr w:type="gramStart"/>
-      <w:r>
-        <w:t>scores</w:t>
+        <w:t>_scores</w:t>
       </w:r>
       <w:r>
         <w:t>.json</w:t>
       </w:r>
-      <w:proofErr w:type="gramEnd"/>
       <w:r>
         <w:br/>
         <w:t>golden20_legacy</w:t>
       </w:r>
       <w:r>
-        <w:t>_</w:t>
-      </w:r>
-      <w:proofErr w:type="gramStart"/>
-      <w:r>
-        <w:t>scores</w:t>
+        <w:t>_scores</w:t>
       </w:r>
       <w:r>
         <w:t>.json</w:t>
       </w:r>
-      <w:proofErr w:type="gramEnd"/>
     </w:p>
     <w:p>
       <w:r>
@@ -3190,41 +2971,17 @@
       </w:r>
     </w:p>
     <w:p>
-      <w:proofErr w:type="spellStart"/>
-      <w:r>
-        <w:t>golden_C_current_</w:t>
-      </w:r>
-      <w:proofErr w:type="gramStart"/>
-      <w:r>
-        <w:t>metrics.json</w:t>
-      </w:r>
-      <w:proofErr w:type="spellEnd"/>
-      <w:proofErr w:type="gramEnd"/>
+      <w:r>
+        <w:t>golden_C_current_metrics.json</w:t>
+      </w:r>
       <w:r>
         <w:br/>
-      </w:r>
-      <w:proofErr w:type="spellStart"/>
-      <w:r>
-        <w:t>golden_C_legacy_</w:t>
-      </w:r>
-      <w:proofErr w:type="gramStart"/>
-      <w:r>
-        <w:t>metrics.json</w:t>
-      </w:r>
-      <w:proofErr w:type="spellEnd"/>
-      <w:proofErr w:type="gramEnd"/>
-    </w:p>
-    <w:p>
-      <w:r>
-        <w:t xml:space="preserve">These files represent the expected scoring behavior of the system. Future validation runs </w:t>
-      </w:r>
-      <w:proofErr w:type="gramStart"/>
-      <w:r>
-        <w:t>compare</w:t>
-      </w:r>
-      <w:proofErr w:type="gramEnd"/>
-      <w:r>
-        <w:t xml:space="preserve"> against these baselines to detect deviations.</w:t>
+        <w:t>golden_C_legacy_metrics.json</w:t>
+      </w:r>
+    </w:p>
+    <w:p>
+      <w:r>
+        <w:t>These files represent the expected scoring behavior of the system. Future validation runs compare against these baselines to detect deviations.</w:t>
       </w:r>
     </w:p>
     <w:p>
@@ -3310,13 +3067,8 @@
           <w:numId w:val="27"/>
         </w:numPr>
       </w:pPr>
-      <w:proofErr w:type="gramStart"/>
-      <w:r>
-        <w:t>Compute</w:t>
-      </w:r>
-      <w:proofErr w:type="gramEnd"/>
-      <w:r>
-        <w:t xml:space="preserve"> evaluation metrics</w:t>
+      <w:r>
+        <w:t>Compute evaluation metrics</w:t>
       </w:r>
     </w:p>
     <w:p>
@@ -3337,13 +3089,8 @@
           <w:numId w:val="27"/>
         </w:numPr>
       </w:pPr>
-      <w:proofErr w:type="gramStart"/>
-      <w:r>
-        <w:t>Report</w:t>
-      </w:r>
-      <w:proofErr w:type="gramEnd"/>
-      <w:r>
-        <w:t xml:space="preserve"> whether drift is detected</w:t>
+      <w:r>
+        <w:t>Report whether drift is detected</w:t>
       </w:r>
     </w:p>
     <w:p>
@@ -3380,74 +3127,28 @@
       </w:r>
       <w:r>
         <w:br/>
-      </w:r>
-      <w:proofErr w:type="spellStart"/>
-      <w:r>
-        <w:t>golden_C_current_</w:t>
-      </w:r>
-      <w:proofErr w:type="gramStart"/>
-      <w:r>
-        <w:t>cases.json</w:t>
-      </w:r>
-      <w:proofErr w:type="spellEnd"/>
-      <w:proofErr w:type="gramEnd"/>
+        <w:t>golden_C_current_cases.json</w:t>
+      </w:r>
       <w:r>
         <w:br/>
-      </w:r>
-      <w:proofErr w:type="spellStart"/>
-      <w:r>
-        <w:t>golden_C_legacy_</w:t>
-      </w:r>
-      <w:proofErr w:type="gramStart"/>
-      <w:r>
-        <w:t>cases.json</w:t>
-      </w:r>
-      <w:proofErr w:type="spellEnd"/>
-      <w:proofErr w:type="gramEnd"/>
+        <w:t>golden_C_legacy_cases.json</w:t>
+      </w:r>
       <w:r>
         <w:br/>
-      </w:r>
-      <w:proofErr w:type="spellStart"/>
-      <w:r>
-        <w:t>golden_C_current_</w:t>
-      </w:r>
-      <w:proofErr w:type="gramStart"/>
-      <w:r>
-        <w:t>metrics.json</w:t>
-      </w:r>
-      <w:proofErr w:type="spellEnd"/>
-      <w:proofErr w:type="gramEnd"/>
+        <w:t>golden_C_current_metrics.json</w:t>
+      </w:r>
       <w:r>
         <w:br/>
-      </w:r>
-      <w:proofErr w:type="spellStart"/>
-      <w:r>
-        <w:t>golden_C_legacy_</w:t>
-      </w:r>
-      <w:proofErr w:type="gramStart"/>
-      <w:r>
-        <w:t>metrics.json</w:t>
-      </w:r>
-      <w:proofErr w:type="spellEnd"/>
-      <w:proofErr w:type="gramEnd"/>
+        <w:t>golden_C_legacy_metrics.json</w:t>
+      </w:r>
       <w:r>
         <w:br/>
-        <w:t>golden20_api_scores_</w:t>
-      </w:r>
-      <w:proofErr w:type="gramStart"/>
-      <w:r>
-        <w:t>current.json</w:t>
-      </w:r>
-      <w:proofErr w:type="gramEnd"/>
+        <w:t>golden20_api_scores_current.json</w:t>
+      </w:r>
       <w:r>
         <w:br/>
-        <w:t>golden20_api_scores_</w:t>
-      </w:r>
-      <w:proofErr w:type="gramStart"/>
-      <w:r>
-        <w:t>legacy.json</w:t>
-      </w:r>
-      <w:proofErr w:type="gramEnd"/>
+        <w:t>golden20_api_scores_legacy.json</w:t>
+      </w:r>
     </w:p>
     <w:p>
       <w:r>
@@ -3687,15 +3388,7 @@
     </w:p>
     <w:p>
       <w:r>
-        <w:t xml:space="preserve">For questions regarding calibration methodology or validation metrics, contact the project </w:t>
-      </w:r>
-      <w:proofErr w:type="gramStart"/>
-      <w:r>
-        <w:t>lead</w:t>
-      </w:r>
-      <w:proofErr w:type="gramEnd"/>
-      <w:r>
-        <w:t>.</w:t>
+        <w:t>For questions regarding calibration methodology or validation metrics, contact the project lead.</w:t>
       </w:r>
     </w:p>
     <w:p/>

</xml_diff>

<commit_message>
Add Element F scoring, calibration, and validation
</commit_message>
<xml_diff>
--- a/Readme.docx
+++ b/Readme.docx
@@ -37,7 +37,16 @@
         <w:t xml:space="preserve"> A</w:t>
       </w:r>
       <w:r>
-        <w:t xml:space="preserve">, B, D and E </w:t>
+        <w:t>, B, D</w:t>
+      </w:r>
+      <w:r>
+        <w:t xml:space="preserve">, </w:t>
+      </w:r>
+      <w:r>
+        <w:t xml:space="preserve">E </w:t>
+      </w:r>
+      <w:r>
+        <w:t xml:space="preserve">and F </w:t>
       </w:r>
       <w:r>
         <w:t>have</w:t>
@@ -58,10 +67,16 @@
         <w:t>,</w:t>
       </w:r>
       <w:r>
-        <w:t xml:space="preserve">D </w:t>
-      </w:r>
-      <w:r>
-        <w:t xml:space="preserve">and E </w:t>
+        <w:t>D</w:t>
+      </w:r>
+      <w:r>
+        <w:t xml:space="preserve">, </w:t>
+      </w:r>
+      <w:r>
+        <w:t xml:space="preserve">E </w:t>
+      </w:r>
+      <w:r>
+        <w:t xml:space="preserve">and F </w:t>
       </w:r>
       <w:r>
         <w:t>as well</w:t>
@@ -1876,7 +1891,22 @@
     </w:p>
     <w:p>
       <w:r>
-        <w:t xml:space="preserve"> │     └── element_D/ - analogous to C</w:t>
+        <w:t xml:space="preserve"> │   └── element_B/ -  analogous to C</w:t>
+      </w:r>
+    </w:p>
+    <w:p>
+      <w:r>
+        <w:t xml:space="preserve"> │   └── element_D/ - analogous to C</w:t>
+      </w:r>
+    </w:p>
+    <w:p>
+      <w:r>
+        <w:t xml:space="preserve"> │   └── element_E/ -  analogous to C</w:t>
+      </w:r>
+    </w:p>
+    <w:p>
+      <w:r>
+        <w:t xml:space="preserve"> │   └── element_F/ -  analogous to C</w:t>
       </w:r>
     </w:p>
     <w:p>
@@ -2054,10 +2084,25 @@
     </w:p>
     <w:p>
       <w:r>
+        <w:t xml:space="preserve"> │   └── element_B/ -  analogous to C</w:t>
+      </w:r>
+    </w:p>
+    <w:p>
+      <w:r>
+        <w:t xml:space="preserve"> │   └── element_D/ - analogous to C</w:t>
+      </w:r>
+    </w:p>
+    <w:p>
+      <w:r>
+        <w:t xml:space="preserve"> │   └── element_E/ -  analogous to C</w:t>
+      </w:r>
+    </w:p>
+    <w:p>
+      <w:r>
         <w:t xml:space="preserve"> │   └── element_</w:t>
       </w:r>
       <w:r>
-        <w:t>B</w:t>
+        <w:t>F</w:t>
       </w:r>
       <w:r>
         <w:t>/ -  analogous to C</w:t>
@@ -2065,22 +2110,6 @@
     </w:p>
     <w:p>
       <w:r>
-        <w:t xml:space="preserve"> │   └── element_D/ - analogous to C</w:t>
-      </w:r>
-    </w:p>
-    <w:p>
-      <w:r>
-        <w:t xml:space="preserve"> │   └── element_</w:t>
-      </w:r>
-      <w:r>
-        <w:t>E</w:t>
-      </w:r>
-      <w:r>
-        <w:t>/ -  analogous to C</w:t>
-      </w:r>
-    </w:p>
-    <w:p>
-      <w:r>
         <w:t>│   └── element_C/</w:t>
       </w:r>
     </w:p>
@@ -2131,6 +2160,7 @@
     </w:p>
     <w:p>
       <w:r>
+        <w:lastRenderedPageBreak/>
         <w:t xml:space="preserve">│       </w:t>
       </w:r>
       <w:r>
@@ -2196,159 +2226,159 @@
     </w:p>
     <w:p>
       <w:r>
+        <w:t>│       │   └── (documents scored using current model)</w:t>
+      </w:r>
+    </w:p>
+    <w:p>
+      <w:r>
+        <w:t>│       │</w:t>
+      </w:r>
+    </w:p>
+    <w:p>
+      <w:r>
+        <w:t>│       └── legacy_api_scoring_documents/</w:t>
+      </w:r>
+    </w:p>
+    <w:p>
+      <w:r>
+        <w:t>│           └── (documents scored using legacy model)</w:t>
+      </w:r>
+    </w:p>
+    <w:p>
+      <w:r>
+        <w:t>│</w:t>
+      </w:r>
+    </w:p>
+    <w:p>
+      <w:r>
+        <w:rPr>
+          <w:rFonts w:ascii="MS Gothic" w:eastAsia="MS Gothic" w:hAnsi="MS Gothic" w:cs="MS Gothic" w:hint="eastAsia"/>
+        </w:rPr>
+        <w:t>├</w:t>
+      </w:r>
+      <w:r>
+        <w:rPr>
+          <w:rFonts w:ascii="Aptos" w:hAnsi="Aptos" w:cs="Aptos"/>
+        </w:rPr>
+        <w:t>──</w:t>
+      </w:r>
+      <w:r>
+        <w:t xml:space="preserve"> scripts/</w:t>
+      </w:r>
+    </w:p>
+    <w:p>
+      <w:r>
+        <w:t>│   └── shared/</w:t>
+      </w:r>
+    </w:p>
+    <w:p>
+      <w:r>
+        <w:t>│       └── utils.py</w:t>
+      </w:r>
+    </w:p>
+    <w:p>
+      <w:r>
+        <w:t>│       └── validate_golden20.py</w:t>
+      </w:r>
+    </w:p>
+    <w:p/>
+    <w:p>
+      <w:r>
+        <w:t>│</w:t>
+      </w:r>
+    </w:p>
+    <w:p>
+      <w:r>
+        <w:rPr>
+          <w:rFonts w:ascii="MS Gothic" w:eastAsia="MS Gothic" w:hAnsi="MS Gothic" w:cs="MS Gothic" w:hint="eastAsia"/>
+        </w:rPr>
+        <w:t>├</w:t>
+      </w:r>
+      <w:r>
+        <w:rPr>
+          <w:rFonts w:ascii="Aptos" w:hAnsi="Aptos" w:cs="Aptos"/>
+        </w:rPr>
+        <w:t>──</w:t>
+      </w:r>
+      <w:r>
+        <w:t xml:space="preserve"> simple_ui/</w:t>
+      </w:r>
+    </w:p>
+    <w:p>
+      <w:r>
+        <w:t xml:space="preserve">│   </w:t>
+      </w:r>
+      <w:r>
+        <w:rPr>
+          <w:rFonts w:ascii="MS Gothic" w:eastAsia="MS Gothic" w:hAnsi="MS Gothic" w:cs="MS Gothic" w:hint="eastAsia"/>
+        </w:rPr>
+        <w:t>├</w:t>
+      </w:r>
+      <w:r>
+        <w:rPr>
+          <w:rFonts w:ascii="Aptos" w:hAnsi="Aptos" w:cs="Aptos"/>
+        </w:rPr>
+        <w:t>──</w:t>
+      </w:r>
+      <w:r>
+        <w:t xml:space="preserve"> shared/</w:t>
+      </w:r>
+    </w:p>
+    <w:p>
+      <w:r>
+        <w:t>│   │   └── script.js</w:t>
+      </w:r>
+    </w:p>
+    <w:p>
+      <w:r>
+        <w:t>│       └── index.html</w:t>
+      </w:r>
+    </w:p>
+    <w:p>
+      <w:r>
+        <w:t>│</w:t>
+      </w:r>
+    </w:p>
+    <w:p>
+      <w:r>
+        <w:rPr>
+          <w:rFonts w:ascii="MS Gothic" w:eastAsia="MS Gothic" w:hAnsi="MS Gothic" w:cs="MS Gothic" w:hint="eastAsia"/>
+        </w:rPr>
+        <w:t>├</w:t>
+      </w:r>
+      <w:r>
+        <w:rPr>
+          <w:rFonts w:ascii="Aptos" w:hAnsi="Aptos" w:cs="Aptos"/>
+        </w:rPr>
+        <w:t>──</w:t>
+      </w:r>
+      <w:r>
+        <w:t xml:space="preserve"> requirements.txt</w:t>
+      </w:r>
+    </w:p>
+    <w:p>
+      <w:r>
+        <w:t>└── train_env_setup.bat,</w:t>
+      </w:r>
+    </w:p>
+    <w:p/>
+    <w:p>
+      <w:r>
+        <w:t>Training scripts, model</w:t>
+      </w:r>
+      <w:r>
+        <w:t>s, a</w:t>
+      </w:r>
+      <w:r>
+        <w:t>rtifacts, and experimental calibration files are intentionally excluded from this release.</w:t>
+      </w:r>
+      <w:r>
+        <w:t xml:space="preserve">  This element is not currently using lightweight ML, having opted for the linear calibration technique described above.</w:t>
+      </w:r>
+    </w:p>
+    <w:p>
+      <w:r>
         <w:lastRenderedPageBreak/>
-        <w:t>│       │   └── (documents scored using current model)</w:t>
-      </w:r>
-    </w:p>
-    <w:p>
-      <w:r>
-        <w:t>│       │</w:t>
-      </w:r>
-    </w:p>
-    <w:p>
-      <w:r>
-        <w:t>│       └── legacy_api_scoring_documents/</w:t>
-      </w:r>
-    </w:p>
-    <w:p>
-      <w:r>
-        <w:t>│           └── (documents scored using legacy model)</w:t>
-      </w:r>
-    </w:p>
-    <w:p>
-      <w:r>
-        <w:t>│</w:t>
-      </w:r>
-    </w:p>
-    <w:p>
-      <w:r>
-        <w:rPr>
-          <w:rFonts w:ascii="MS Gothic" w:eastAsia="MS Gothic" w:hAnsi="MS Gothic" w:cs="MS Gothic" w:hint="eastAsia"/>
-        </w:rPr>
-        <w:t>├</w:t>
-      </w:r>
-      <w:r>
-        <w:rPr>
-          <w:rFonts w:ascii="Aptos" w:hAnsi="Aptos" w:cs="Aptos"/>
-        </w:rPr>
-        <w:t>──</w:t>
-      </w:r>
-      <w:r>
-        <w:t xml:space="preserve"> scripts/</w:t>
-      </w:r>
-    </w:p>
-    <w:p>
-      <w:r>
-        <w:t>│   └── shared/</w:t>
-      </w:r>
-    </w:p>
-    <w:p>
-      <w:r>
-        <w:t>│       └── utils.py</w:t>
-      </w:r>
-    </w:p>
-    <w:p>
-      <w:r>
-        <w:t>│       └── validate_golden20.py</w:t>
-      </w:r>
-    </w:p>
-    <w:p/>
-    <w:p>
-      <w:r>
-        <w:t>│</w:t>
-      </w:r>
-    </w:p>
-    <w:p>
-      <w:r>
-        <w:rPr>
-          <w:rFonts w:ascii="MS Gothic" w:eastAsia="MS Gothic" w:hAnsi="MS Gothic" w:cs="MS Gothic" w:hint="eastAsia"/>
-        </w:rPr>
-        <w:t>├</w:t>
-      </w:r>
-      <w:r>
-        <w:rPr>
-          <w:rFonts w:ascii="Aptos" w:hAnsi="Aptos" w:cs="Aptos"/>
-        </w:rPr>
-        <w:t>──</w:t>
-      </w:r>
-      <w:r>
-        <w:t xml:space="preserve"> simple_ui/</w:t>
-      </w:r>
-    </w:p>
-    <w:p>
-      <w:r>
-        <w:t xml:space="preserve">│   </w:t>
-      </w:r>
-      <w:r>
-        <w:rPr>
-          <w:rFonts w:ascii="MS Gothic" w:eastAsia="MS Gothic" w:hAnsi="MS Gothic" w:cs="MS Gothic" w:hint="eastAsia"/>
-        </w:rPr>
-        <w:t>├</w:t>
-      </w:r>
-      <w:r>
-        <w:rPr>
-          <w:rFonts w:ascii="Aptos" w:hAnsi="Aptos" w:cs="Aptos"/>
-        </w:rPr>
-        <w:t>──</w:t>
-      </w:r>
-      <w:r>
-        <w:t xml:space="preserve"> shared/</w:t>
-      </w:r>
-    </w:p>
-    <w:p>
-      <w:r>
-        <w:t>│   │   └── script.js</w:t>
-      </w:r>
-    </w:p>
-    <w:p>
-      <w:r>
-        <w:t>│       └── index.html</w:t>
-      </w:r>
-    </w:p>
-    <w:p>
-      <w:r>
-        <w:t>│</w:t>
-      </w:r>
-    </w:p>
-    <w:p>
-      <w:r>
-        <w:rPr>
-          <w:rFonts w:ascii="MS Gothic" w:eastAsia="MS Gothic" w:hAnsi="MS Gothic" w:cs="MS Gothic" w:hint="eastAsia"/>
-        </w:rPr>
-        <w:t>├</w:t>
-      </w:r>
-      <w:r>
-        <w:rPr>
-          <w:rFonts w:ascii="Aptos" w:hAnsi="Aptos" w:cs="Aptos"/>
-        </w:rPr>
-        <w:t>──</w:t>
-      </w:r>
-      <w:r>
-        <w:t xml:space="preserve"> requirements.txt</w:t>
-      </w:r>
-    </w:p>
-    <w:p>
-      <w:r>
-        <w:t>└── train_env_setup.bat,</w:t>
-      </w:r>
-    </w:p>
-    <w:p/>
-    <w:p>
-      <w:r>
-        <w:t>Training scripts, model</w:t>
-      </w:r>
-      <w:r>
-        <w:t>s, a</w:t>
-      </w:r>
-      <w:r>
-        <w:t>rtifacts, and experimental calibration files are intentionally excluded from this release.</w:t>
-      </w:r>
-      <w:r>
-        <w:t xml:space="preserve">  This element is not currently using lightweight ML, having opted for the linear calibration technique described above.</w:t>
-      </w:r>
-    </w:p>
-    <w:p>
-      <w:r>
         <w:pict w14:anchorId="382B2E9B">
           <v:rect id="_x0000_i1034" style="width:0;height:1.5pt" o:hralign="center" o:hrstd="t" o:hr="t" fillcolor="#a0a0a0" stroked="f"/>
         </w:pict>
@@ -2393,7 +2423,6 @@
         </w:numPr>
       </w:pPr>
       <w:r>
-        <w:lastRenderedPageBreak/>
         <w:t>Within-one agreement &gt; 90%</w:t>
       </w:r>
     </w:p>
@@ -2605,6 +2634,7 @@
     </w:p>
     <w:p>
       <w:r>
+        <w:lastRenderedPageBreak/>
         <w:t>This helps identify situations such as:</w:t>
       </w:r>
     </w:p>
@@ -2643,7 +2673,6 @@
     </w:p>
     <w:p>
       <w:r>
-        <w:lastRenderedPageBreak/>
         <w:t xml:space="preserve">Diagnostic output is displayed in the </w:t>
       </w:r>
       <w:r>
@@ -2870,6 +2899,7 @@
     </w:p>
     <w:p>
       <w:r>
+        <w:lastRenderedPageBreak/>
         <w:t>Golden benchmark runs can require multiple GPT calls. To avoid repeated API costs, the system caches the API scoring results.</w:t>
       </w:r>
     </w:p>
@@ -2902,7 +2932,6 @@
     </w:p>
     <w:p>
       <w:r>
-        <w:lastRenderedPageBreak/>
         <w:t>golden20_current</w:t>
       </w:r>
       <w:r>
@@ -3102,6 +3131,7 @@
         </w:numPr>
       </w:pPr>
       <w:r>
+        <w:lastRenderedPageBreak/>
         <w:t>Compute evaluation metrics</w:t>
       </w:r>
     </w:p>
@@ -3151,7 +3181,6 @@
     </w:p>
     <w:p>
       <w:r>
-        <w:lastRenderedPageBreak/>
         <w:t>The repository includes the following benchmark configuration files:</w:t>
       </w:r>
     </w:p>
@@ -3328,6 +3357,7 @@
         </w:numPr>
       </w:pPr>
       <w:r>
+        <w:lastRenderedPageBreak/>
         <w:t>Narrative feedback is AI-generated and should be reviewed before formal reporting</w:t>
       </w:r>
     </w:p>
@@ -3376,7 +3406,7 @@
         <w:t xml:space="preserve">Align Element </w:t>
       </w:r>
       <w:r>
-        <w:t>F</w:t>
+        <w:t>G</w:t>
       </w:r>
       <w:r>
         <w:t xml:space="preserve"> - L</w:t>
@@ -3394,7 +3424,6 @@
         </w:numPr>
       </w:pPr>
       <w:r>
-        <w:lastRenderedPageBreak/>
         <w:t xml:space="preserve">Maintain quality of the scoring pipeline by running </w:t>
       </w:r>
       <w:r>

</xml_diff>

<commit_message>
Add Element G Legacy/Current blended scoring models and calibration baselines
</commit_message>
<xml_diff>
--- a/Readme.docx
+++ b/Readme.docx
@@ -43,10 +43,22 @@
         <w:t xml:space="preserve">, </w:t>
       </w:r>
       <w:r>
-        <w:t xml:space="preserve">E </w:t>
-      </w:r>
-      <w:r>
-        <w:t xml:space="preserve">and F </w:t>
+        <w:t>E</w:t>
+      </w:r>
+      <w:r>
+        <w:t>, F</w:t>
+      </w:r>
+      <w:r>
+        <w:t xml:space="preserve"> </w:t>
+      </w:r>
+      <w:r>
+        <w:t xml:space="preserve">and </w:t>
+      </w:r>
+      <w:r>
+        <w:t>G</w:t>
+      </w:r>
+      <w:r>
+        <w:t xml:space="preserve"> </w:t>
       </w:r>
       <w:r>
         <w:t>have</w:t>
@@ -73,10 +85,22 @@
         <w:t xml:space="preserve">, </w:t>
       </w:r>
       <w:r>
-        <w:t xml:space="preserve">E </w:t>
-      </w:r>
-      <w:r>
-        <w:t xml:space="preserve">and F </w:t>
+        <w:t>E</w:t>
+      </w:r>
+      <w:r>
+        <w:t>, F</w:t>
+      </w:r>
+      <w:r>
+        <w:t xml:space="preserve"> </w:t>
+      </w:r>
+      <w:r>
+        <w:t xml:space="preserve">and </w:t>
+      </w:r>
+      <w:r>
+        <w:t>G</w:t>
+      </w:r>
+      <w:r>
+        <w:t xml:space="preserve"> </w:t>
       </w:r>
       <w:r>
         <w:t>as well</w:t>
@@ -1911,6 +1935,17 @@
     </w:p>
     <w:p>
       <w:r>
+        <w:t xml:space="preserve"> │   └── element_</w:t>
+      </w:r>
+      <w:r>
+        <w:t>G</w:t>
+      </w:r>
+      <w:r>
+        <w:t>/ -  analogous to C</w:t>
+      </w:r>
+    </w:p>
+    <w:p>
+      <w:r>
         <w:t xml:space="preserve"> │    └── element_C/</w:t>
       </w:r>
     </w:p>
@@ -2099,13 +2134,12 @@
     </w:p>
     <w:p>
       <w:r>
-        <w:t xml:space="preserve"> │   └── element_</w:t>
-      </w:r>
-      <w:r>
-        <w:t>F</w:t>
-      </w:r>
-      <w:r>
-        <w:t>/ -  analogous to C</w:t>
+        <w:t xml:space="preserve"> │   └── element_F/ -  analogous to C</w:t>
+      </w:r>
+    </w:p>
+    <w:p>
+      <w:r>
+        <w:t xml:space="preserve"> │   └── element_G/ -  analogous to C</w:t>
       </w:r>
     </w:p>
     <w:p>
@@ -2131,31 +2165,6 @@
       </w:r>
       <w:r>
         <w:t xml:space="preserve"> score_with_API_C.py</w:t>
-      </w:r>
-    </w:p>
-    <w:p>
-      <w:r>
-        <w:t xml:space="preserve">│       </w:t>
-      </w:r>
-      <w:r>
-        <w:rPr>
-          <w:rFonts w:ascii="MS Gothic" w:eastAsia="MS Gothic" w:hAnsi="MS Gothic" w:cs="MS Gothic" w:hint="eastAsia"/>
-        </w:rPr>
-        <w:t>├</w:t>
-      </w:r>
-      <w:r>
-        <w:rPr>
-          <w:rFonts w:ascii="Aptos" w:hAnsi="Aptos" w:cs="Aptos"/>
-        </w:rPr>
-        <w:t>──</w:t>
-      </w:r>
-      <w:r>
-        <w:t xml:space="preserve"> scorer_app_C.py</w:t>
-      </w:r>
-    </w:p>
-    <w:p>
-      <w:r>
-        <w:t>│       │</w:t>
       </w:r>
     </w:p>
     <w:p>
@@ -2176,6 +2185,31 @@
         <w:t>──</w:t>
       </w:r>
       <w:r>
+        <w:t xml:space="preserve"> scorer_app_C.py</w:t>
+      </w:r>
+    </w:p>
+    <w:p>
+      <w:r>
+        <w:t>│       │</w:t>
+      </w:r>
+    </w:p>
+    <w:p>
+      <w:r>
+        <w:t xml:space="preserve">│       </w:t>
+      </w:r>
+      <w:r>
+        <w:rPr>
+          <w:rFonts w:ascii="MS Gothic" w:eastAsia="MS Gothic" w:hAnsi="MS Gothic" w:cs="MS Gothic" w:hint="eastAsia"/>
+        </w:rPr>
+        <w:t>├</w:t>
+      </w:r>
+      <w:r>
+        <w:rPr>
+          <w:rFonts w:ascii="Aptos" w:hAnsi="Aptos" w:cs="Aptos"/>
+        </w:rPr>
+        <w:t>──</w:t>
+      </w:r>
+      <w:r>
         <w:t xml:space="preserve"> Current_GPT.csv</w:t>
       </w:r>
     </w:p>
@@ -2364,6 +2398,7 @@
     <w:p/>
     <w:p>
       <w:r>
+        <w:lastRenderedPageBreak/>
         <w:t>Training scripts, model</w:t>
       </w:r>
       <w:r>
@@ -2378,7 +2413,6 @@
     </w:p>
     <w:p>
       <w:r>
-        <w:lastRenderedPageBreak/>
         <w:pict w14:anchorId="382B2E9B">
           <v:rect id="_x0000_i1034" style="width:0;height:1.5pt" o:hralign="center" o:hrstd="t" o:hr="t" fillcolor="#a0a0a0" stroked="f"/>
         </w:pict>
@@ -2614,6 +2648,7 @@
         </w:numPr>
       </w:pPr>
       <w:r>
+        <w:lastRenderedPageBreak/>
         <w:t>Sample size</w:t>
       </w:r>
     </w:p>
@@ -2634,7 +2669,6 @@
     </w:p>
     <w:p>
       <w:r>
-        <w:lastRenderedPageBreak/>
         <w:t>This helps identify situations such as:</w:t>
       </w:r>
     </w:p>
@@ -2877,6 +2911,7 @@
     </w:p>
     <w:p>
       <w:r>
+        <w:lastRenderedPageBreak/>
         <w:pict w14:anchorId="0B1AF6BE">
           <v:rect id="_x0000_i1038" style="width:0;height:1.5pt" o:hralign="center" o:hrstd="t" o:hr="t" fillcolor="#a0a0a0" stroked="f"/>
         </w:pict>
@@ -2899,7 +2934,6 @@
     </w:p>
     <w:p>
       <w:r>
-        <w:lastRenderedPageBreak/>
         <w:t>Golden benchmark runs can require multiple GPT calls. To avoid repeated API costs, the system caches the API scoring results.</w:t>
       </w:r>
     </w:p>
@@ -3109,6 +3143,7 @@
         </w:numPr>
       </w:pPr>
       <w:r>
+        <w:lastRenderedPageBreak/>
         <w:t>Load cached API scores</w:t>
       </w:r>
     </w:p>
@@ -3131,7 +3166,6 @@
         </w:numPr>
       </w:pPr>
       <w:r>
-        <w:lastRenderedPageBreak/>
         <w:t>Compute evaluation metrics</w:t>
       </w:r>
     </w:p>
@@ -3335,6 +3369,7 @@
         </w:numPr>
       </w:pPr>
       <w:r>
+        <w:lastRenderedPageBreak/>
         <w:t>Small validation sample may cause ICC variability</w:t>
       </w:r>
     </w:p>
@@ -3357,7 +3392,6 @@
         </w:numPr>
       </w:pPr>
       <w:r>
-        <w:lastRenderedPageBreak/>
         <w:t>Narrative feedback is AI-generated and should be reviewed before formal reporting</w:t>
       </w:r>
     </w:p>
@@ -3455,9 +3489,6 @@
       </w:pPr>
       <w:r>
         <w:t>Retest all Legacy documents in their original form (rather than screenshots of the pdf documents) in an attempt to eliminate the processing difference for Legacy and Current models.</w:t>
-      </w:r>
-      <w:r>
-        <w:t xml:space="preserve"> </w:t>
       </w:r>
       <w:r>
         <w:pict w14:anchorId="35FA4AB3">

</xml_diff>

<commit_message>
Add Element H scoring and calibration baselines
</commit_message>
<xml_diff>
--- a/Readme.docx
+++ b/Readme.docx
@@ -9,12 +9,37 @@
           <w:bCs/>
         </w:rPr>
       </w:pPr>
+      <w:proofErr w:type="spellStart"/>
       <w:r>
         <w:rPr>
           <w:b/>
           <w:bCs/>
         </w:rPr>
-        <w:t>GPTScorer – Element  Scoring Application</w:t>
+        <w:t>GPTScorer</w:t>
+      </w:r>
+      <w:proofErr w:type="spellEnd"/>
+      <w:r>
+        <w:rPr>
+          <w:b/>
+          <w:bCs/>
+        </w:rPr>
+        <w:t xml:space="preserve"> – </w:t>
+      </w:r>
+      <w:proofErr w:type="gramStart"/>
+      <w:r>
+        <w:rPr>
+          <w:b/>
+          <w:bCs/>
+        </w:rPr>
+        <w:t>Element  Scoring</w:t>
+      </w:r>
+      <w:proofErr w:type="gramEnd"/>
+      <w:r>
+        <w:rPr>
+          <w:b/>
+          <w:bCs/>
+        </w:rPr>
+        <w:t xml:space="preserve"> Application</w:t>
       </w:r>
     </w:p>
     <w:p>
@@ -25,7 +50,15 @@
         <w:t>validated</w:t>
       </w:r>
       <w:r>
-        <w:t xml:space="preserve"> scoring application for MyDesign – Element C (Presentation and Justification of Solution Design Requirements).</w:t>
+        <w:t xml:space="preserve"> scoring application for </w:t>
+      </w:r>
+      <w:proofErr w:type="spellStart"/>
+      <w:r>
+        <w:t>MyDesign</w:t>
+      </w:r>
+      <w:proofErr w:type="spellEnd"/>
+      <w:r>
+        <w:t xml:space="preserve"> – Element C (Presentation and Justification of Solution Design Requirements).</w:t>
       </w:r>
       <w:r>
         <w:t xml:space="preserve">  Element</w:t>
@@ -49,64 +82,80 @@
         <w:t>, F</w:t>
       </w:r>
       <w:r>
+        <w:t xml:space="preserve">, G </w:t>
+      </w:r>
+      <w:r>
+        <w:t xml:space="preserve">and </w:t>
+      </w:r>
+      <w:r>
+        <w:t>H</w:t>
+      </w:r>
+      <w:r>
         <w:t xml:space="preserve"> </w:t>
       </w:r>
       <w:r>
+        <w:t>have</w:t>
+      </w:r>
+      <w:r>
+        <w:t xml:space="preserve"> also been added with the same architecture.  The discussion below describes Element C but is applicable to Element</w:t>
+      </w:r>
+      <w:r>
+        <w:t>s</w:t>
+      </w:r>
+      <w:r>
+        <w:t xml:space="preserve"> A</w:t>
+      </w:r>
+      <w:r>
+        <w:t xml:space="preserve">, </w:t>
+      </w:r>
+      <w:proofErr w:type="gramStart"/>
+      <w:r>
+        <w:t>B</w:t>
+      </w:r>
+      <w:r>
+        <w:t>,</w:t>
+      </w:r>
+      <w:r>
+        <w:t>D</w:t>
+      </w:r>
+      <w:proofErr w:type="gramEnd"/>
+      <w:r>
+        <w:t xml:space="preserve">, </w:t>
+      </w:r>
+      <w:r>
+        <w:t>E</w:t>
+      </w:r>
+      <w:r>
+        <w:t>, F</w:t>
+      </w:r>
+      <w:r>
+        <w:t>, G</w:t>
+      </w:r>
+      <w:r>
+        <w:t xml:space="preserve"> </w:t>
+      </w:r>
+      <w:r>
         <w:t xml:space="preserve">and </w:t>
       </w:r>
       <w:r>
-        <w:t>G</w:t>
+        <w:t>H</w:t>
       </w:r>
       <w:r>
         <w:t xml:space="preserve"> </w:t>
       </w:r>
       <w:r>
-        <w:t>have</w:t>
-      </w:r>
-      <w:r>
-        <w:t xml:space="preserve"> also been added with the same architecture.  The discussion below describes Element C but is applicable to Element</w:t>
-      </w:r>
-      <w:r>
-        <w:t>s</w:t>
-      </w:r>
-      <w:r>
-        <w:t xml:space="preserve"> A</w:t>
-      </w:r>
-      <w:r>
-        <w:t>, B</w:t>
-      </w:r>
-      <w:r>
-        <w:t>,</w:t>
-      </w:r>
-      <w:r>
-        <w:t>D</w:t>
-      </w:r>
-      <w:r>
-        <w:t xml:space="preserve">, </w:t>
-      </w:r>
-      <w:r>
-        <w:t>E</w:t>
-      </w:r>
-      <w:r>
-        <w:t>, F</w:t>
-      </w:r>
-      <w:r>
-        <w:t xml:space="preserve"> </w:t>
-      </w:r>
-      <w:r>
-        <w:t xml:space="preserve">and </w:t>
-      </w:r>
-      <w:r>
-        <w:t>G</w:t>
-      </w:r>
-      <w:r>
-        <w:t xml:space="preserve"> </w:t>
-      </w:r>
-      <w:r>
         <w:t>as well</w:t>
       </w:r>
       <w:r>
-        <w:t xml:space="preserve"> for operation.  The discussion discloses  detailed parameters that are specific to Element C so they will obviously change for the other elements.</w:t>
+        <w:t xml:space="preserve"> for operation.  The discussion </w:t>
+      </w:r>
+      <w:proofErr w:type="gramStart"/>
+      <w:r>
+        <w:t>discloses  detailed</w:t>
+      </w:r>
+      <w:proofErr w:type="gramEnd"/>
+      <w:r>
+        <w:t xml:space="preserve"> parameters that are specific to Element C so they will obviously change for the other elements.</w:t>
       </w:r>
     </w:p>
     <w:p>
@@ -218,6 +267,9 @@
         <w:t>Blended Model Rules Engine</w:t>
       </w:r>
       <w:r>
+        <w:t xml:space="preserve"> (not currently used except for Legacy Element A)</w:t>
+      </w:r>
+      <w:r>
         <w:br/>
         <w:t xml:space="preserve">        ↓</w:t>
       </w:r>
@@ -233,7 +285,15 @@
       </w:r>
       <w:r>
         <w:br/>
-        <w:t>Raw Element Score (mean of subscores)</w:t>
+        <w:t xml:space="preserve">Raw Element Score (mean of </w:t>
+      </w:r>
+      <w:proofErr w:type="spellStart"/>
+      <w:r>
+        <w:t>subscores</w:t>
+      </w:r>
+      <w:proofErr w:type="spellEnd"/>
+      <w:r>
+        <w:t>)</w:t>
       </w:r>
       <w:r>
         <w:br/>
@@ -480,7 +540,31 @@
         <w:t>This b</w:t>
       </w:r>
       <w:r>
-        <w:t xml:space="preserve">lock diagram shows data flow for the overall system which is divided in two processes:  scoring and diagnostics.  Diagnostics include drift detection for scores of documents  submitted for scoring.  Regression testing using a Golden20 set of documents, chosen for their susceptibility for variations in scoring processes and philosophy.  Controller_app.py is an overall controller for system, controlling both scoring and diagnostics in one UI. </w:t>
+        <w:t xml:space="preserve">lock diagram shows data flow for the overall system which is divided </w:t>
+      </w:r>
+      <w:proofErr w:type="gramStart"/>
+      <w:r>
+        <w:t>in</w:t>
+      </w:r>
+      <w:proofErr w:type="gramEnd"/>
+      <w:r>
+        <w:t xml:space="preserve"> two processes</w:t>
+      </w:r>
+      <w:proofErr w:type="gramStart"/>
+      <w:r>
+        <w:t>:  scoring</w:t>
+      </w:r>
+      <w:proofErr w:type="gramEnd"/>
+      <w:r>
+        <w:t xml:space="preserve"> and diagnostics.  Diagnostics include drift detection for scores of </w:t>
+      </w:r>
+      <w:proofErr w:type="gramStart"/>
+      <w:r>
+        <w:t>documents  submitted</w:t>
+      </w:r>
+      <w:proofErr w:type="gramEnd"/>
+      <w:r>
+        <w:t xml:space="preserve"> for scoring.  Regression testing using a Golden20 set of documents, chosen for their susceptibility for variations in scoring processes and philosophy.  Controller_app.py is an overall controller for system, controlling both scoring and diagnostics in one UI. </w:t>
       </w:r>
     </w:p>
     <w:p>
@@ -865,8 +949,13 @@
     </w:p>
     <w:p>
       <w:r>
-        <w:t>set OPENAI_API_KEY=your_key_here</w:t>
-      </w:r>
+        <w:t>set OPENAI_API_KEY=</w:t>
+      </w:r>
+      <w:proofErr w:type="spellStart"/>
+      <w:r>
+        <w:t>your_key_here</w:t>
+      </w:r>
+      <w:proofErr w:type="spellEnd"/>
     </w:p>
     <w:p>
       <w:r>
@@ -929,11 +1018,48 @@
     </w:p>
     <w:p>
       <w:r>
-        <w:t>python -m elements.element_C.score_with_API_C ^</w:t>
+        <w:t xml:space="preserve">python -m </w:t>
+      </w:r>
+      <w:proofErr w:type="spellStart"/>
+      <w:proofErr w:type="gramStart"/>
+      <w:r>
+        <w:t>elements.element</w:t>
+      </w:r>
+      <w:proofErr w:type="gramEnd"/>
+      <w:r>
+        <w:t>_</w:t>
+      </w:r>
+      <w:proofErr w:type="gramStart"/>
+      <w:r>
+        <w:t>C.score</w:t>
+      </w:r>
+      <w:proofErr w:type="gramEnd"/>
+      <w:r>
+        <w:t>_with_API_C</w:t>
+      </w:r>
+      <w:proofErr w:type="spellEnd"/>
+      <w:r>
+        <w:t xml:space="preserve"> ^</w:t>
       </w:r>
       <w:r>
         <w:br/>
-        <w:t xml:space="preserve">  --folder elements/element_C/current_api_scoring_documents ^</w:t>
+        <w:t xml:space="preserve">  --folder elements/</w:t>
+      </w:r>
+      <w:proofErr w:type="spellStart"/>
+      <w:r>
+        <w:t>element_C</w:t>
+      </w:r>
+      <w:proofErr w:type="spellEnd"/>
+      <w:r>
+        <w:t>/</w:t>
+      </w:r>
+      <w:proofErr w:type="spellStart"/>
+      <w:r>
+        <w:t>current_api_scoring_documents</w:t>
+      </w:r>
+      <w:proofErr w:type="spellEnd"/>
+      <w:r>
+        <w:t xml:space="preserve"> ^</w:t>
       </w:r>
       <w:r>
         <w:br/>
@@ -943,7 +1069,15 @@
         <w:t xml:space="preserve"> </w:t>
       </w:r>
       <w:r>
-        <w:t>elements/element_C/</w:t>
+        <w:t>elements/</w:t>
+      </w:r>
+      <w:proofErr w:type="spellStart"/>
+      <w:r>
+        <w:t>element_C</w:t>
+      </w:r>
+      <w:proofErr w:type="spellEnd"/>
+      <w:r>
+        <w:t>/</w:t>
       </w:r>
       <w:r>
         <w:t>scored_results</w:t>
@@ -1044,7 +1178,15 @@
         </w:numPr>
       </w:pPr>
       <w:r>
-        <w:t>C1-C6  Bulleted rationale</w:t>
+        <w:t>C1-C</w:t>
+      </w:r>
+      <w:proofErr w:type="gramStart"/>
+      <w:r>
+        <w:t>6  Bulleted</w:t>
+      </w:r>
+      <w:proofErr w:type="gramEnd"/>
+      <w:r>
+        <w:t xml:space="preserve"> rationale</w:t>
       </w:r>
     </w:p>
     <w:p>
@@ -1270,8 +1412,13 @@
         </w:numPr>
       </w:pPr>
       <w:r>
-        <w:t>C1_expert – C_expert</w:t>
-      </w:r>
+        <w:t xml:space="preserve">C1_expert – </w:t>
+      </w:r>
+      <w:proofErr w:type="spellStart"/>
+      <w:r>
+        <w:t>C_expert</w:t>
+      </w:r>
+      <w:proofErr w:type="spellEnd"/>
       <w:r>
         <w:t xml:space="preserve"> scores</w:t>
       </w:r>
@@ -1351,8 +1498,21 @@
           <w:numId w:val="18"/>
         </w:numPr>
       </w:pPr>
-      <w:r>
-        <w:t>Element_score_raw, the average of the api scores</w:t>
+      <w:proofErr w:type="spellStart"/>
+      <w:r>
+        <w:t>Element_score_raw</w:t>
+      </w:r>
+      <w:proofErr w:type="spellEnd"/>
+      <w:r>
+        <w:t xml:space="preserve">, the average of the </w:t>
+      </w:r>
+      <w:proofErr w:type="spellStart"/>
+      <w:r>
+        <w:t>api</w:t>
+      </w:r>
+      <w:proofErr w:type="spellEnd"/>
+      <w:r>
+        <w:t xml:space="preserve"> scores</w:t>
       </w:r>
     </w:p>
     <w:p>
@@ -1393,7 +1553,15 @@
         </w:numPr>
       </w:pPr>
       <w:r>
-        <w:t>C1_final  – C6_final calibrated scores for output</w:t>
+        <w:t>C1_</w:t>
+      </w:r>
+      <w:proofErr w:type="gramStart"/>
+      <w:r>
+        <w:t>final  –</w:t>
+      </w:r>
+      <w:proofErr w:type="gramEnd"/>
+      <w:r>
+        <w:t xml:space="preserve"> C6_final calibrated scores for output</w:t>
       </w:r>
     </w:p>
     <w:p>
@@ -1404,9 +1572,11 @@
           <w:numId w:val="17"/>
         </w:numPr>
       </w:pPr>
+      <w:proofErr w:type="spellStart"/>
       <w:r>
         <w:t>element_score_raw</w:t>
       </w:r>
+      <w:proofErr w:type="spellEnd"/>
       <w:r>
         <w:tab/>
       </w:r>
@@ -1419,9 +1589,11 @@
           <w:numId w:val="17"/>
         </w:numPr>
       </w:pPr>
+      <w:proofErr w:type="spellStart"/>
       <w:r>
         <w:t>element_score_calibrated</w:t>
       </w:r>
+      <w:proofErr w:type="spellEnd"/>
       <w:r>
         <w:tab/>
       </w:r>
@@ -1434,9 +1606,11 @@
           <w:numId w:val="17"/>
         </w:numPr>
       </w:pPr>
+      <w:proofErr w:type="spellStart"/>
       <w:r>
         <w:t>calibration_delta</w:t>
       </w:r>
+      <w:proofErr w:type="spellEnd"/>
     </w:p>
     <w:p>
       <w:pPr>
@@ -1522,8 +1696,13 @@
         </w:numPr>
       </w:pPr>
       <w:r>
-        <w:t>Drift slightly over time</w:t>
-      </w:r>
+        <w:t xml:space="preserve">Drift slightly </w:t>
+      </w:r>
+      <w:proofErr w:type="gramStart"/>
+      <w:r>
+        <w:t>over time</w:t>
+      </w:r>
+      <w:proofErr w:type="gramEnd"/>
     </w:p>
     <w:p>
       <w:pPr>
@@ -1675,8 +1854,13 @@
           <w:numId w:val="11"/>
         </w:numPr>
       </w:pPr>
-      <w:r>
-        <w:t>Explains strengths and weaknesses</w:t>
+      <w:proofErr w:type="gramStart"/>
+      <w:r>
+        <w:t>Explains</w:t>
+      </w:r>
+      <w:proofErr w:type="gramEnd"/>
+      <w:r>
+        <w:t xml:space="preserve"> strengths and weaknesses</w:t>
       </w:r>
     </w:p>
     <w:p>
@@ -1697,8 +1881,13 @@
           <w:numId w:val="11"/>
         </w:numPr>
       </w:pPr>
-      <w:r>
-        <w:t>Uses educator-friendly language</w:t>
+      <w:proofErr w:type="gramStart"/>
+      <w:r>
+        <w:t>Uses</w:t>
+      </w:r>
+      <w:proofErr w:type="gramEnd"/>
+      <w:r>
+        <w:t xml:space="preserve"> educator-friendly language</w:t>
       </w:r>
     </w:p>
     <w:p>
@@ -1773,8 +1962,13 @@
           <w:numId w:val="12"/>
         </w:numPr>
       </w:pPr>
-      <w:r>
-        <w:t>Subscore drift analysis</w:t>
+      <w:proofErr w:type="spellStart"/>
+      <w:r>
+        <w:t>Subscore</w:t>
+      </w:r>
+      <w:proofErr w:type="spellEnd"/>
+      <w:r>
+        <w:t xml:space="preserve"> drift analysis</w:t>
       </w:r>
     </w:p>
     <w:p>
@@ -1819,7 +2013,23 @@
           <w:b/>
           <w:bCs/>
         </w:rPr>
-        <w:t xml:space="preserve"> (all core, scripts and simple_ui apps are now element agnostic to facilitate cloning the architecture for other elements)</w:t>
+        <w:t xml:space="preserve"> (all core, scripts and </w:t>
+      </w:r>
+      <w:proofErr w:type="spellStart"/>
+      <w:r>
+        <w:rPr>
+          <w:b/>
+          <w:bCs/>
+        </w:rPr>
+        <w:t>simple_ui</w:t>
+      </w:r>
+      <w:proofErr w:type="spellEnd"/>
+      <w:r>
+        <w:rPr>
+          <w:b/>
+          <w:bCs/>
+        </w:rPr>
+        <w:t xml:space="preserve"> apps are now element agnostic to facilitate cloning the architecture for other elements)</w:t>
       </w:r>
     </w:p>
     <w:p>
@@ -1834,8 +2044,13 @@
       <w:r>
         <w:t xml:space="preserve"> </w:t>
       </w:r>
-      <w:r>
-        <w:t>GPTScorer/</w:t>
+      <w:proofErr w:type="spellStart"/>
+      <w:r>
+        <w:t>GPTScorer</w:t>
+      </w:r>
+      <w:proofErr w:type="spellEnd"/>
+      <w:r>
+        <w:t>/</w:t>
       </w:r>
     </w:p>
     <w:p>
@@ -1910,43 +2125,157 @@
     </w:p>
     <w:p>
       <w:r>
-        <w:t xml:space="preserve"> │     └── element_A/ -  analogous to C</w:t>
-      </w:r>
-    </w:p>
-    <w:p>
-      <w:r>
-        <w:t xml:space="preserve"> │   └── element_B/ -  analogous to C</w:t>
-      </w:r>
-    </w:p>
-    <w:p>
-      <w:r>
-        <w:t xml:space="preserve"> │   └── element_D/ - analogous to C</w:t>
-      </w:r>
-    </w:p>
-    <w:p>
-      <w:r>
-        <w:t xml:space="preserve"> │   └── element_E/ -  analogous to C</w:t>
-      </w:r>
-    </w:p>
-    <w:p>
-      <w:r>
-        <w:t xml:space="preserve"> │   └── element_F/ -  analogous to C</w:t>
-      </w:r>
-    </w:p>
-    <w:p>
-      <w:r>
-        <w:t xml:space="preserve"> │   └── element_</w:t>
-      </w:r>
-      <w:r>
-        <w:t>G</w:t>
-      </w:r>
-      <w:r>
-        <w:t>/ -  analogous to C</w:t>
-      </w:r>
-    </w:p>
-    <w:p>
-      <w:r>
-        <w:t xml:space="preserve"> │    └── element_C/</w:t>
+        <w:t xml:space="preserve"> │     └── </w:t>
+      </w:r>
+      <w:proofErr w:type="spellStart"/>
+      <w:r>
+        <w:t>element_A</w:t>
+      </w:r>
+      <w:proofErr w:type="spellEnd"/>
+      <w:r>
+        <w:t xml:space="preserve">/ </w:t>
+      </w:r>
+      <w:proofErr w:type="gramStart"/>
+      <w:r>
+        <w:t>-  analogous</w:t>
+      </w:r>
+      <w:proofErr w:type="gramEnd"/>
+      <w:r>
+        <w:t xml:space="preserve"> to C</w:t>
+      </w:r>
+    </w:p>
+    <w:p>
+      <w:r>
+        <w:t xml:space="preserve"> │   └── </w:t>
+      </w:r>
+      <w:proofErr w:type="spellStart"/>
+      <w:r>
+        <w:t>element_B</w:t>
+      </w:r>
+      <w:proofErr w:type="spellEnd"/>
+      <w:r>
+        <w:t xml:space="preserve">/ </w:t>
+      </w:r>
+      <w:proofErr w:type="gramStart"/>
+      <w:r>
+        <w:t>-  analogous</w:t>
+      </w:r>
+      <w:proofErr w:type="gramEnd"/>
+      <w:r>
+        <w:t xml:space="preserve"> to C</w:t>
+      </w:r>
+    </w:p>
+    <w:p>
+      <w:r>
+        <w:t xml:space="preserve"> │   └── </w:t>
+      </w:r>
+      <w:proofErr w:type="spellStart"/>
+      <w:r>
+        <w:t>element_D</w:t>
+      </w:r>
+      <w:proofErr w:type="spellEnd"/>
+      <w:r>
+        <w:t>/ - analogous to C</w:t>
+      </w:r>
+    </w:p>
+    <w:p>
+      <w:r>
+        <w:t xml:space="preserve"> │   └── </w:t>
+      </w:r>
+      <w:proofErr w:type="spellStart"/>
+      <w:r>
+        <w:t>element_E</w:t>
+      </w:r>
+      <w:proofErr w:type="spellEnd"/>
+      <w:r>
+        <w:t xml:space="preserve">/ </w:t>
+      </w:r>
+      <w:proofErr w:type="gramStart"/>
+      <w:r>
+        <w:t>-  analogous</w:t>
+      </w:r>
+      <w:proofErr w:type="gramEnd"/>
+      <w:r>
+        <w:t xml:space="preserve"> to C</w:t>
+      </w:r>
+    </w:p>
+    <w:p>
+      <w:r>
+        <w:t xml:space="preserve"> │   └── </w:t>
+      </w:r>
+      <w:proofErr w:type="spellStart"/>
+      <w:r>
+        <w:t>element_F</w:t>
+      </w:r>
+      <w:proofErr w:type="spellEnd"/>
+      <w:r>
+        <w:t xml:space="preserve">/ </w:t>
+      </w:r>
+      <w:proofErr w:type="gramStart"/>
+      <w:r>
+        <w:t>-  analogous</w:t>
+      </w:r>
+      <w:proofErr w:type="gramEnd"/>
+      <w:r>
+        <w:t xml:space="preserve"> to C</w:t>
+      </w:r>
+    </w:p>
+    <w:p>
+      <w:r>
+        <w:t xml:space="preserve"> │   └── </w:t>
+      </w:r>
+      <w:proofErr w:type="spellStart"/>
+      <w:r>
+        <w:t>element_G</w:t>
+      </w:r>
+      <w:proofErr w:type="spellEnd"/>
+      <w:r>
+        <w:t xml:space="preserve">/ </w:t>
+      </w:r>
+      <w:proofErr w:type="gramStart"/>
+      <w:r>
+        <w:t>-  analogous</w:t>
+      </w:r>
+      <w:proofErr w:type="gramEnd"/>
+      <w:r>
+        <w:t xml:space="preserve"> to C</w:t>
+      </w:r>
+    </w:p>
+    <w:p>
+      <w:r>
+        <w:t xml:space="preserve"> │   └── </w:t>
+      </w:r>
+      <w:proofErr w:type="spellStart"/>
+      <w:r>
+        <w:t>element_</w:t>
+      </w:r>
+      <w:r>
+        <w:t>H</w:t>
+      </w:r>
+      <w:proofErr w:type="spellEnd"/>
+      <w:r>
+        <w:t xml:space="preserve">/ </w:t>
+      </w:r>
+      <w:proofErr w:type="gramStart"/>
+      <w:r>
+        <w:t>-  analogous</w:t>
+      </w:r>
+      <w:proofErr w:type="gramEnd"/>
+      <w:r>
+        <w:t xml:space="preserve"> to C</w:t>
+      </w:r>
+    </w:p>
+    <w:p>
+      <w:r>
+        <w:t xml:space="preserve"> │    └── </w:t>
+      </w:r>
+      <w:proofErr w:type="spellStart"/>
+      <w:r>
+        <w:t>element_C</w:t>
+      </w:r>
+      <w:proofErr w:type="spellEnd"/>
+      <w:r>
+        <w:t>/</w:t>
       </w:r>
     </w:p>
     <w:p>
@@ -1969,8 +2298,18 @@
         <w:t>──</w:t>
       </w:r>
       <w:r>
-        <w:t xml:space="preserve"> golden_C_current.json</w:t>
-      </w:r>
+        <w:t xml:space="preserve"> </w:t>
+      </w:r>
+      <w:proofErr w:type="spellStart"/>
+      <w:r>
+        <w:t>golden_C_</w:t>
+      </w:r>
+      <w:proofErr w:type="gramStart"/>
+      <w:r>
+        <w:t>current.json</w:t>
+      </w:r>
+      <w:proofErr w:type="spellEnd"/>
+      <w:proofErr w:type="gramEnd"/>
     </w:p>
     <w:p>
       <w:r>
@@ -1992,8 +2331,18 @@
         <w:t>──</w:t>
       </w:r>
       <w:r>
-        <w:t xml:space="preserve"> golden_C_legacy.json</w:t>
-      </w:r>
+        <w:t xml:space="preserve"> </w:t>
+      </w:r>
+      <w:proofErr w:type="spellStart"/>
+      <w:r>
+        <w:t>golden_C_</w:t>
+      </w:r>
+      <w:proofErr w:type="gramStart"/>
+      <w:r>
+        <w:t>legacy.json</w:t>
+      </w:r>
+      <w:proofErr w:type="spellEnd"/>
+      <w:proofErr w:type="gramEnd"/>
     </w:p>
     <w:p>
       <w:r>
@@ -2015,8 +2364,13 @@
         <w:t>──</w:t>
       </w:r>
       <w:r>
-        <w:t xml:space="preserve"> golden20_metrics_current.json</w:t>
-      </w:r>
+        <w:t xml:space="preserve"> golden20_metrics_</w:t>
+      </w:r>
+      <w:proofErr w:type="gramStart"/>
+      <w:r>
+        <w:t>current.json</w:t>
+      </w:r>
+      <w:proofErr w:type="gramEnd"/>
     </w:p>
     <w:p>
       <w:r>
@@ -2038,8 +2392,13 @@
         <w:t>──</w:t>
       </w:r>
       <w:r>
-        <w:t xml:space="preserve"> golden20_metrics_legacy.json</w:t>
-      </w:r>
+        <w:t xml:space="preserve"> golden20_metrics_</w:t>
+      </w:r>
+      <w:proofErr w:type="gramStart"/>
+      <w:r>
+        <w:t>legacy.json</w:t>
+      </w:r>
+      <w:proofErr w:type="gramEnd"/>
     </w:p>
     <w:p>
       <w:r>
@@ -2061,7 +2420,15 @@
         <w:t>──</w:t>
       </w:r>
       <w:r>
-        <w:t xml:space="preserve"> golden20_current_scores.json      </w:t>
+        <w:t xml:space="preserve"> golden20_current_</w:t>
+      </w:r>
+      <w:proofErr w:type="gramStart"/>
+      <w:r>
+        <w:t>scores.json</w:t>
+      </w:r>
+      <w:proofErr w:type="gramEnd"/>
+      <w:r>
+        <w:t xml:space="preserve">      </w:t>
       </w:r>
       <w:r>
         <w:rPr>
@@ -2087,7 +2454,15 @@
         <w:t xml:space="preserve">  </w:t>
       </w:r>
       <w:r>
-        <w:t>└── golden20_legacy_scores.json       ← cached API scores</w:t>
+        <w:t>└── golden20_legacy_</w:t>
+      </w:r>
+      <w:proofErr w:type="gramStart"/>
+      <w:r>
+        <w:t>scores.json</w:t>
+      </w:r>
+      <w:proofErr w:type="gramEnd"/>
+      <w:r>
+        <w:t xml:space="preserve">       ← cached API scores</w:t>
       </w:r>
     </w:p>
     <w:p>
@@ -2114,57 +2489,154 @@
     </w:p>
     <w:p>
       <w:r>
-        <w:t xml:space="preserve"> │   └── element_A/ -  analogous to C</w:t>
-      </w:r>
-    </w:p>
-    <w:p>
-      <w:r>
-        <w:t xml:space="preserve"> │   └── element_B/ -  analogous to C</w:t>
-      </w:r>
-    </w:p>
-    <w:p>
-      <w:r>
-        <w:t xml:space="preserve"> │   └── element_D/ - analogous to C</w:t>
-      </w:r>
-    </w:p>
-    <w:p>
-      <w:r>
-        <w:t xml:space="preserve"> │   └── element_E/ -  analogous to C</w:t>
-      </w:r>
-    </w:p>
-    <w:p>
-      <w:r>
-        <w:t xml:space="preserve"> │   └── element_F/ -  analogous to C</w:t>
-      </w:r>
-    </w:p>
-    <w:p>
-      <w:r>
-        <w:t xml:space="preserve"> │   └── element_G/ -  analogous to C</w:t>
-      </w:r>
-    </w:p>
-    <w:p>
-      <w:r>
-        <w:t>│   └── element_C/</w:t>
-      </w:r>
-    </w:p>
-    <w:p>
-      <w:r>
-        <w:t xml:space="preserve">│       </w:t>
-      </w:r>
-      <w:r>
-        <w:rPr>
-          <w:rFonts w:ascii="MS Gothic" w:eastAsia="MS Gothic" w:hAnsi="MS Gothic" w:cs="MS Gothic" w:hint="eastAsia"/>
-        </w:rPr>
-        <w:t>├</w:t>
-      </w:r>
-      <w:r>
-        <w:rPr>
-          <w:rFonts w:ascii="Aptos" w:hAnsi="Aptos" w:cs="Aptos"/>
-        </w:rPr>
-        <w:t>──</w:t>
-      </w:r>
-      <w:r>
-        <w:t xml:space="preserve"> score_with_API_C.py</w:t>
+        <w:t xml:space="preserve"> │   └── </w:t>
+      </w:r>
+      <w:proofErr w:type="spellStart"/>
+      <w:r>
+        <w:t>element_A</w:t>
+      </w:r>
+      <w:proofErr w:type="spellEnd"/>
+      <w:r>
+        <w:t xml:space="preserve">/ </w:t>
+      </w:r>
+      <w:proofErr w:type="gramStart"/>
+      <w:r>
+        <w:t>-  analogous</w:t>
+      </w:r>
+      <w:proofErr w:type="gramEnd"/>
+      <w:r>
+        <w:t xml:space="preserve"> to C</w:t>
+      </w:r>
+    </w:p>
+    <w:p>
+      <w:r>
+        <w:t xml:space="preserve"> │   └── </w:t>
+      </w:r>
+      <w:proofErr w:type="spellStart"/>
+      <w:r>
+        <w:t>element_B</w:t>
+      </w:r>
+      <w:proofErr w:type="spellEnd"/>
+      <w:r>
+        <w:t xml:space="preserve">/ </w:t>
+      </w:r>
+      <w:proofErr w:type="gramStart"/>
+      <w:r>
+        <w:t>-  analogous</w:t>
+      </w:r>
+      <w:proofErr w:type="gramEnd"/>
+      <w:r>
+        <w:t xml:space="preserve"> to C</w:t>
+      </w:r>
+    </w:p>
+    <w:p>
+      <w:r>
+        <w:t xml:space="preserve"> │   └── </w:t>
+      </w:r>
+      <w:proofErr w:type="spellStart"/>
+      <w:r>
+        <w:t>element_D</w:t>
+      </w:r>
+      <w:proofErr w:type="spellEnd"/>
+      <w:r>
+        <w:t>/ - analogous to C</w:t>
+      </w:r>
+    </w:p>
+    <w:p>
+      <w:r>
+        <w:t xml:space="preserve"> │   └── </w:t>
+      </w:r>
+      <w:proofErr w:type="spellStart"/>
+      <w:r>
+        <w:t>element_E</w:t>
+      </w:r>
+      <w:proofErr w:type="spellEnd"/>
+      <w:r>
+        <w:t xml:space="preserve">/ </w:t>
+      </w:r>
+      <w:proofErr w:type="gramStart"/>
+      <w:r>
+        <w:t>-  analogous</w:t>
+      </w:r>
+      <w:proofErr w:type="gramEnd"/>
+      <w:r>
+        <w:t xml:space="preserve"> to C</w:t>
+      </w:r>
+    </w:p>
+    <w:p>
+      <w:r>
+        <w:t xml:space="preserve"> │   └── </w:t>
+      </w:r>
+      <w:proofErr w:type="spellStart"/>
+      <w:r>
+        <w:t>element_F</w:t>
+      </w:r>
+      <w:proofErr w:type="spellEnd"/>
+      <w:r>
+        <w:t xml:space="preserve">/ </w:t>
+      </w:r>
+      <w:proofErr w:type="gramStart"/>
+      <w:r>
+        <w:t>-  analogous</w:t>
+      </w:r>
+      <w:proofErr w:type="gramEnd"/>
+      <w:r>
+        <w:t xml:space="preserve"> to C</w:t>
+      </w:r>
+    </w:p>
+    <w:p>
+      <w:r>
+        <w:t xml:space="preserve"> │   └── </w:t>
+      </w:r>
+      <w:proofErr w:type="spellStart"/>
+      <w:r>
+        <w:t>element_G</w:t>
+      </w:r>
+      <w:proofErr w:type="spellEnd"/>
+      <w:r>
+        <w:t xml:space="preserve">/ </w:t>
+      </w:r>
+      <w:proofErr w:type="gramStart"/>
+      <w:r>
+        <w:t>-  analogous</w:t>
+      </w:r>
+      <w:proofErr w:type="gramEnd"/>
+      <w:r>
+        <w:t xml:space="preserve"> to C</w:t>
+      </w:r>
+    </w:p>
+    <w:p>
+      <w:r>
+        <w:t xml:space="preserve"> │   └── </w:t>
+      </w:r>
+      <w:proofErr w:type="spellStart"/>
+      <w:r>
+        <w:t>element_H</w:t>
+      </w:r>
+      <w:proofErr w:type="spellEnd"/>
+      <w:r>
+        <w:t xml:space="preserve">/ </w:t>
+      </w:r>
+      <w:proofErr w:type="gramStart"/>
+      <w:r>
+        <w:t>-  analogous</w:t>
+      </w:r>
+      <w:proofErr w:type="gramEnd"/>
+      <w:r>
+        <w:t xml:space="preserve"> to C</w:t>
+      </w:r>
+    </w:p>
+    <w:p>
+      <w:r>
+        <w:t xml:space="preserve">│   └── </w:t>
+      </w:r>
+      <w:proofErr w:type="spellStart"/>
+      <w:r>
+        <w:t>element_C</w:t>
+      </w:r>
+      <w:proofErr w:type="spellEnd"/>
+      <w:r>
+        <w:t>/</w:t>
       </w:r>
     </w:p>
     <w:p>
@@ -2185,6 +2657,26 @@
         <w:t>──</w:t>
       </w:r>
       <w:r>
+        <w:t xml:space="preserve"> score_with_API_C.py</w:t>
+      </w:r>
+    </w:p>
+    <w:p>
+      <w:r>
+        <w:t xml:space="preserve">│       </w:t>
+      </w:r>
+      <w:r>
+        <w:rPr>
+          <w:rFonts w:ascii="MS Gothic" w:eastAsia="MS Gothic" w:hAnsi="MS Gothic" w:cs="MS Gothic" w:hint="eastAsia"/>
+        </w:rPr>
+        <w:t>├</w:t>
+      </w:r>
+      <w:r>
+        <w:rPr>
+          <w:rFonts w:ascii="Aptos" w:hAnsi="Aptos" w:cs="Aptos"/>
+        </w:rPr>
+        <w:t>──</w:t>
+      </w:r>
+      <w:r>
         <w:t xml:space="preserve"> scorer_app_C.py</w:t>
       </w:r>
     </w:p>
@@ -2255,7 +2747,15 @@
         <w:t>──</w:t>
       </w:r>
       <w:r>
-        <w:t xml:space="preserve"> current_api_scoring_documents/</w:t>
+        <w:t xml:space="preserve"> </w:t>
+      </w:r>
+      <w:proofErr w:type="spellStart"/>
+      <w:r>
+        <w:t>current_api_scoring_documents</w:t>
+      </w:r>
+      <w:proofErr w:type="spellEnd"/>
+      <w:r>
+        <w:t>/</w:t>
       </w:r>
     </w:p>
     <w:p>
@@ -2270,7 +2770,15 @@
     </w:p>
     <w:p>
       <w:r>
-        <w:t>│       └── legacy_api_scoring_documents/</w:t>
+        <w:t xml:space="preserve">│       └── </w:t>
+      </w:r>
+      <w:proofErr w:type="spellStart"/>
+      <w:r>
+        <w:t>legacy_api_scoring_documents</w:t>
+      </w:r>
+      <w:proofErr w:type="spellEnd"/>
+      <w:r>
+        <w:t>/</w:t>
       </w:r>
     </w:p>
     <w:p>
@@ -2335,7 +2843,15 @@
         <w:t>──</w:t>
       </w:r>
       <w:r>
-        <w:t xml:space="preserve"> simple_ui/</w:t>
+        <w:t xml:space="preserve"> </w:t>
+      </w:r>
+      <w:proofErr w:type="spellStart"/>
+      <w:r>
+        <w:t>simple_ui</w:t>
+      </w:r>
+      <w:proofErr w:type="spellEnd"/>
+      <w:r>
+        <w:t>/</w:t>
       </w:r>
     </w:p>
     <w:p>
@@ -2398,7 +2914,6 @@
     <w:p/>
     <w:p>
       <w:r>
-        <w:lastRenderedPageBreak/>
         <w:t>Training scripts, model</w:t>
       </w:r>
       <w:r>
@@ -2468,7 +2983,15 @@
         </w:numPr>
       </w:pPr>
       <w:r>
-        <w:t>Bias controlled through intercept calibration</w:t>
+        <w:t xml:space="preserve">Bias controlled through </w:t>
+      </w:r>
+      <w:proofErr w:type="gramStart"/>
+      <w:r>
+        <w:t>intercept</w:t>
+      </w:r>
+      <w:proofErr w:type="gramEnd"/>
+      <w:r>
+        <w:t xml:space="preserve"> calibration</w:t>
       </w:r>
     </w:p>
     <w:p>
@@ -2548,12 +3071,21 @@
       <w:r>
         <w:t xml:space="preserve">, and </w:t>
       </w:r>
+      <w:proofErr w:type="gramStart"/>
       <w:r>
         <w:rPr>
           <w:b/>
           <w:bCs/>
         </w:rPr>
-        <w:t>cached API scoring for reproducibility</w:t>
+        <w:t>cached</w:t>
+      </w:r>
+      <w:proofErr w:type="gramEnd"/>
+      <w:r>
+        <w:rPr>
+          <w:b/>
+          <w:bCs/>
+        </w:rPr>
+        <w:t xml:space="preserve"> API scoring for reproducibility</w:t>
       </w:r>
       <w:r>
         <w:t>.</w:t>
@@ -2599,8 +3131,13 @@
         </w:numPr>
       </w:pPr>
       <w:r>
-        <w:t>Raw API subscores</w:t>
-      </w:r>
+        <w:t xml:space="preserve">Raw API </w:t>
+      </w:r>
+      <w:proofErr w:type="spellStart"/>
+      <w:r>
+        <w:t>subscores</w:t>
+      </w:r>
+      <w:proofErr w:type="spellEnd"/>
     </w:p>
     <w:p>
       <w:pPr>
@@ -2637,6 +3174,7 @@
         </w:numPr>
       </w:pPr>
       <w:r>
+        <w:lastRenderedPageBreak/>
         <w:t>Standard deviation</w:t>
       </w:r>
     </w:p>
@@ -2648,7 +3186,6 @@
         </w:numPr>
       </w:pPr>
       <w:r>
-        <w:lastRenderedPageBreak/>
         <w:t>Sample size</w:t>
       </w:r>
     </w:p>
@@ -2906,12 +3443,12 @@
     </w:p>
     <w:p>
       <w:r>
+        <w:lastRenderedPageBreak/>
         <w:t>These metrics are compared to stored baseline metrics to determine whether scoring behavior has changed.</w:t>
       </w:r>
     </w:p>
     <w:p>
       <w:r>
-        <w:lastRenderedPageBreak/>
         <w:pict w14:anchorId="0B1AF6BE">
           <v:rect id="_x0000_i1038" style="width:0;height:1.5pt" o:hralign="center" o:hrstd="t" o:hr="t" fillcolor="#a0a0a0" stroked="f"/>
         </w:pict>
@@ -2960,8 +3497,13 @@
           <w:numId w:val="25"/>
         </w:numPr>
       </w:pPr>
-      <w:r>
-        <w:t>Subscores (C1–C6) are stored in cache files</w:t>
+      <w:proofErr w:type="spellStart"/>
+      <w:r>
+        <w:t>Subscores</w:t>
+      </w:r>
+      <w:proofErr w:type="spellEnd"/>
+      <w:r>
+        <w:t xml:space="preserve"> (C1–C6) are stored in cache files</w:t>
       </w:r>
     </w:p>
     <w:p>
@@ -2969,21 +3511,31 @@
         <w:t>golden20_current</w:t>
       </w:r>
       <w:r>
-        <w:t>_scores</w:t>
+        <w:t>_</w:t>
+      </w:r>
+      <w:proofErr w:type="gramStart"/>
+      <w:r>
+        <w:t>scores</w:t>
       </w:r>
       <w:r>
         <w:t>.json</w:t>
       </w:r>
+      <w:proofErr w:type="gramEnd"/>
       <w:r>
         <w:br/>
         <w:t>golden20_legacy</w:t>
       </w:r>
       <w:r>
-        <w:t>_scores</w:t>
+        <w:t>_</w:t>
+      </w:r>
+      <w:proofErr w:type="gramStart"/>
+      <w:r>
+        <w:t>scores</w:t>
       </w:r>
       <w:r>
         <w:t>.json</w:t>
       </w:r>
+      <w:proofErr w:type="gramEnd"/>
     </w:p>
     <w:p>
       <w:r>
@@ -3068,17 +3620,41 @@
       </w:r>
     </w:p>
     <w:p>
-      <w:r>
-        <w:t>golden_C_current_metrics.json</w:t>
-      </w:r>
+      <w:proofErr w:type="spellStart"/>
+      <w:r>
+        <w:t>golden_C_current_</w:t>
+      </w:r>
+      <w:proofErr w:type="gramStart"/>
+      <w:r>
+        <w:t>metrics.json</w:t>
+      </w:r>
+      <w:proofErr w:type="spellEnd"/>
+      <w:proofErr w:type="gramEnd"/>
       <w:r>
         <w:br/>
-        <w:t>golden_C_legacy_metrics.json</w:t>
-      </w:r>
-    </w:p>
-    <w:p>
-      <w:r>
-        <w:t>These files represent the expected scoring behavior of the system. Future validation runs compare against these baselines to detect deviations.</w:t>
+      </w:r>
+      <w:proofErr w:type="spellStart"/>
+      <w:r>
+        <w:t>golden_C_legacy_</w:t>
+      </w:r>
+      <w:proofErr w:type="gramStart"/>
+      <w:r>
+        <w:t>metrics.json</w:t>
+      </w:r>
+      <w:proofErr w:type="spellEnd"/>
+      <w:proofErr w:type="gramEnd"/>
+    </w:p>
+    <w:p>
+      <w:r>
+        <w:t xml:space="preserve">These files represent the expected scoring behavior of the system. Future validation runs </w:t>
+      </w:r>
+      <w:proofErr w:type="gramStart"/>
+      <w:r>
+        <w:t>compare</w:t>
+      </w:r>
+      <w:proofErr w:type="gramEnd"/>
+      <w:r>
+        <w:t xml:space="preserve"> against these baselines to detect deviations.</w:t>
       </w:r>
     </w:p>
     <w:p>
@@ -3121,6 +3697,7 @@
     </w:p>
     <w:p>
       <w:r>
+        <w:lastRenderedPageBreak/>
         <w:t>c:\MyDesign_GPTScorer</w:t>
       </w:r>
       <w:r>
@@ -3143,7 +3720,6 @@
         </w:numPr>
       </w:pPr>
       <w:r>
-        <w:lastRenderedPageBreak/>
         <w:t>Load cached API scores</w:t>
       </w:r>
     </w:p>
@@ -3187,8 +3763,13 @@
           <w:numId w:val="27"/>
         </w:numPr>
       </w:pPr>
-      <w:r>
-        <w:t>Report whether drift is detected</w:t>
+      <w:proofErr w:type="gramStart"/>
+      <w:r>
+        <w:t>Report</w:t>
+      </w:r>
+      <w:proofErr w:type="gramEnd"/>
+      <w:r>
+        <w:t xml:space="preserve"> whether drift is detected</w:t>
       </w:r>
     </w:p>
     <w:p>
@@ -3224,28 +3805,74 @@
       </w:r>
       <w:r>
         <w:br/>
-        <w:t>golden_C_current_cases.json</w:t>
-      </w:r>
+      </w:r>
+      <w:proofErr w:type="spellStart"/>
+      <w:r>
+        <w:t>golden_C_current_</w:t>
+      </w:r>
+      <w:proofErr w:type="gramStart"/>
+      <w:r>
+        <w:t>cases.json</w:t>
+      </w:r>
+      <w:proofErr w:type="spellEnd"/>
+      <w:proofErr w:type="gramEnd"/>
       <w:r>
         <w:br/>
-        <w:t>golden_C_legacy_cases.json</w:t>
-      </w:r>
+      </w:r>
+      <w:proofErr w:type="spellStart"/>
+      <w:r>
+        <w:t>golden_C_legacy_</w:t>
+      </w:r>
+      <w:proofErr w:type="gramStart"/>
+      <w:r>
+        <w:t>cases.json</w:t>
+      </w:r>
+      <w:proofErr w:type="spellEnd"/>
+      <w:proofErr w:type="gramEnd"/>
       <w:r>
         <w:br/>
-        <w:t>golden_C_current_metrics.json</w:t>
-      </w:r>
+      </w:r>
+      <w:proofErr w:type="spellStart"/>
+      <w:r>
+        <w:t>golden_C_current_</w:t>
+      </w:r>
+      <w:proofErr w:type="gramStart"/>
+      <w:r>
+        <w:t>metrics.json</w:t>
+      </w:r>
+      <w:proofErr w:type="spellEnd"/>
+      <w:proofErr w:type="gramEnd"/>
       <w:r>
         <w:br/>
-        <w:t>golden_C_legacy_metrics.json</w:t>
-      </w:r>
+      </w:r>
+      <w:proofErr w:type="spellStart"/>
+      <w:r>
+        <w:t>golden_C_legacy_</w:t>
+      </w:r>
+      <w:proofErr w:type="gramStart"/>
+      <w:r>
+        <w:t>metrics.json</w:t>
+      </w:r>
+      <w:proofErr w:type="spellEnd"/>
+      <w:proofErr w:type="gramEnd"/>
       <w:r>
         <w:br/>
-        <w:t>golden20_api_scores_current.json</w:t>
-      </w:r>
+        <w:t>golden20_api_scores_</w:t>
+      </w:r>
+      <w:proofErr w:type="gramStart"/>
+      <w:r>
+        <w:t>current.json</w:t>
+      </w:r>
+      <w:proofErr w:type="gramEnd"/>
       <w:r>
         <w:br/>
-        <w:t>golden20_api_scores_legacy.json</w:t>
-      </w:r>
+        <w:t>golden20_api_scores_</w:t>
+      </w:r>
+      <w:proofErr w:type="gramStart"/>
+      <w:r>
+        <w:t>legacy.json</w:t>
+      </w:r>
+      <w:proofErr w:type="gramEnd"/>
     </w:p>
     <w:p>
       <w:r>
@@ -3341,6 +3968,7 @@
     <w:p/>
     <w:p>
       <w:r>
+        <w:lastRenderedPageBreak/>
         <w:pict w14:anchorId="6BA7B863">
           <v:rect id="_x0000_i1043" style="width:0;height:1.5pt" o:hralign="center" o:hrstd="t" o:hr="t" fillcolor="#a0a0a0" stroked="f"/>
         </w:pict>
@@ -3369,7 +3997,6 @@
         </w:numPr>
       </w:pPr>
       <w:r>
-        <w:lastRenderedPageBreak/>
         <w:t>Small validation sample may cause ICC variability</w:t>
       </w:r>
     </w:p>
@@ -3440,7 +4067,7 @@
         <w:t xml:space="preserve">Align Element </w:t>
       </w:r>
       <w:r>
-        <w:t>G</w:t>
+        <w:t>I</w:t>
       </w:r>
       <w:r>
         <w:t xml:space="preserve"> - L</w:t>
@@ -3476,8 +4103,13 @@
         </w:numPr>
       </w:pPr>
       <w:r>
-        <w:t>Support integration with MyDesign</w:t>
-      </w:r>
+        <w:t xml:space="preserve">Support integration with </w:t>
+      </w:r>
+      <w:proofErr w:type="spellStart"/>
+      <w:r>
+        <w:t>MyDesign</w:t>
+      </w:r>
+      <w:proofErr w:type="spellEnd"/>
     </w:p>
     <w:p>
       <w:pPr>
@@ -3488,7 +4120,15 @@
         </w:numPr>
       </w:pPr>
       <w:r>
-        <w:t>Retest all Legacy documents in their original form (rather than screenshots of the pdf documents) in an attempt to eliminate the processing difference for Legacy and Current models.</w:t>
+        <w:t xml:space="preserve">Retest all Legacy documents in their original form (rather than screenshots of the pdf documents) </w:t>
+      </w:r>
+      <w:proofErr w:type="gramStart"/>
+      <w:r>
+        <w:t>in an attempt to</w:t>
+      </w:r>
+      <w:proofErr w:type="gramEnd"/>
+      <w:r>
+        <w:t xml:space="preserve"> eliminate the processing difference for Legacy and Current models.</w:t>
       </w:r>
       <w:r>
         <w:pict w14:anchorId="35FA4AB3">

</xml_diff>

<commit_message>
Add Element I scoring, clean Legacy extraction, and Current calibration
</commit_message>
<xml_diff>
--- a/Readme.docx
+++ b/Readme.docx
@@ -9,37 +9,12 @@
           <w:bCs/>
         </w:rPr>
       </w:pPr>
-      <w:proofErr w:type="spellStart"/>
       <w:r>
         <w:rPr>
           <w:b/>
           <w:bCs/>
         </w:rPr>
-        <w:t>GPTScorer</w:t>
-      </w:r>
-      <w:proofErr w:type="spellEnd"/>
-      <w:r>
-        <w:rPr>
-          <w:b/>
-          <w:bCs/>
-        </w:rPr>
-        <w:t xml:space="preserve"> – </w:t>
-      </w:r>
-      <w:proofErr w:type="gramStart"/>
-      <w:r>
-        <w:rPr>
-          <w:b/>
-          <w:bCs/>
-        </w:rPr>
-        <w:t>Element  Scoring</w:t>
-      </w:r>
-      <w:proofErr w:type="gramEnd"/>
-      <w:r>
-        <w:rPr>
-          <w:b/>
-          <w:bCs/>
-        </w:rPr>
-        <w:t xml:space="preserve"> Application</w:t>
+        <w:t>GPTScorer – Element  Scoring Application</w:t>
       </w:r>
     </w:p>
     <w:p>
@@ -50,15 +25,7 @@
         <w:t>validated</w:t>
       </w:r>
       <w:r>
-        <w:t xml:space="preserve"> scoring application for </w:t>
-      </w:r>
-      <w:proofErr w:type="spellStart"/>
-      <w:r>
-        <w:t>MyDesign</w:t>
-      </w:r>
-      <w:proofErr w:type="spellEnd"/>
-      <w:r>
-        <w:t xml:space="preserve"> – Element C (Presentation and Justification of Solution Design Requirements).</w:t>
+        <w:t xml:space="preserve"> scoring application for MyDesign – Element C (Presentation and Justification of Solution Design Requirements).</w:t>
       </w:r>
       <w:r>
         <w:t xml:space="preserve">  Element</w:t>
@@ -82,13 +49,19 @@
         <w:t>, F</w:t>
       </w:r>
       <w:r>
-        <w:t xml:space="preserve">, G </w:t>
+        <w:t>, G</w:t>
+      </w:r>
+      <w:r>
+        <w:t>, H</w:t>
+      </w:r>
+      <w:r>
+        <w:t xml:space="preserve"> </w:t>
       </w:r>
       <w:r>
         <w:t xml:space="preserve">and </w:t>
       </w:r>
       <w:r>
-        <w:t>H</w:t>
+        <w:t>I</w:t>
       </w:r>
       <w:r>
         <w:t xml:space="preserve"> </w:t>
@@ -106,22 +79,17 @@
         <w:t xml:space="preserve"> A</w:t>
       </w:r>
       <w:r>
+        <w:t>, B</w:t>
+      </w:r>
+      <w:r>
+        <w:t>,</w:t>
+      </w:r>
+      <w:r>
+        <w:t>D</w:t>
+      </w:r>
+      <w:r>
         <w:t xml:space="preserve">, </w:t>
       </w:r>
-      <w:proofErr w:type="gramStart"/>
-      <w:r>
-        <w:t>B</w:t>
-      </w:r>
-      <w:r>
-        <w:t>,</w:t>
-      </w:r>
-      <w:r>
-        <w:t>D</w:t>
-      </w:r>
-      <w:proofErr w:type="gramEnd"/>
-      <w:r>
-        <w:t xml:space="preserve">, </w:t>
-      </w:r>
       <w:r>
         <w:t>E</w:t>
       </w:r>
@@ -132,13 +100,16 @@
         <w:t>, G</w:t>
       </w:r>
       <w:r>
+        <w:t>, H</w:t>
+      </w:r>
+      <w:r>
         <w:t xml:space="preserve"> </w:t>
       </w:r>
       <w:r>
         <w:t xml:space="preserve">and </w:t>
       </w:r>
       <w:r>
-        <w:t>H</w:t>
+        <w:t>I</w:t>
       </w:r>
       <w:r>
         <w:t xml:space="preserve"> </w:t>
@@ -147,15 +118,7 @@
         <w:t>as well</w:t>
       </w:r>
       <w:r>
-        <w:t xml:space="preserve"> for operation.  The discussion </w:t>
-      </w:r>
-      <w:proofErr w:type="gramStart"/>
-      <w:r>
-        <w:t>discloses  detailed</w:t>
-      </w:r>
-      <w:proofErr w:type="gramEnd"/>
-      <w:r>
-        <w:t xml:space="preserve"> parameters that are specific to Element C so they will obviously change for the other elements.</w:t>
+        <w:t xml:space="preserve"> for operation.  The discussion discloses  detailed parameters that are specific to Element C so they will obviously change for the other elements.</w:t>
       </w:r>
     </w:p>
     <w:p>
@@ -285,15 +248,7 @@
       </w:r>
       <w:r>
         <w:br/>
-        <w:t xml:space="preserve">Raw Element Score (mean of </w:t>
-      </w:r>
-      <w:proofErr w:type="spellStart"/>
-      <w:r>
-        <w:t>subscores</w:t>
-      </w:r>
-      <w:proofErr w:type="spellEnd"/>
-      <w:r>
-        <w:t>)</w:t>
+        <w:t>Raw Element Score (mean of subscores)</w:t>
       </w:r>
       <w:r>
         <w:br/>
@@ -540,31 +495,7 @@
         <w:t>This b</w:t>
       </w:r>
       <w:r>
-        <w:t xml:space="preserve">lock diagram shows data flow for the overall system which is divided </w:t>
-      </w:r>
-      <w:proofErr w:type="gramStart"/>
-      <w:r>
-        <w:t>in</w:t>
-      </w:r>
-      <w:proofErr w:type="gramEnd"/>
-      <w:r>
-        <w:t xml:space="preserve"> two processes</w:t>
-      </w:r>
-      <w:proofErr w:type="gramStart"/>
-      <w:r>
-        <w:t>:  scoring</w:t>
-      </w:r>
-      <w:proofErr w:type="gramEnd"/>
-      <w:r>
-        <w:t xml:space="preserve"> and diagnostics.  Diagnostics include drift detection for scores of </w:t>
-      </w:r>
-      <w:proofErr w:type="gramStart"/>
-      <w:r>
-        <w:t>documents  submitted</w:t>
-      </w:r>
-      <w:proofErr w:type="gramEnd"/>
-      <w:r>
-        <w:t xml:space="preserve"> for scoring.  Regression testing using a Golden20 set of documents, chosen for their susceptibility for variations in scoring processes and philosophy.  Controller_app.py is an overall controller for system, controlling both scoring and diagnostics in one UI. </w:t>
+        <w:t xml:space="preserve">lock diagram shows data flow for the overall system which is divided in two processes:  scoring and diagnostics.  Diagnostics include drift detection for scores of documents  submitted for scoring.  Regression testing using a Golden20 set of documents, chosen for their susceptibility for variations in scoring processes and philosophy.  Controller_app.py is an overall controller for system, controlling both scoring and diagnostics in one UI. </w:t>
       </w:r>
     </w:p>
     <w:p>
@@ -949,13 +880,8 @@
     </w:p>
     <w:p>
       <w:r>
-        <w:t>set OPENAI_API_KEY=</w:t>
-      </w:r>
-      <w:proofErr w:type="spellStart"/>
-      <w:r>
-        <w:t>your_key_here</w:t>
-      </w:r>
-      <w:proofErr w:type="spellEnd"/>
+        <w:t>set OPENAI_API_KEY=your_key_here</w:t>
+      </w:r>
     </w:p>
     <w:p>
       <w:r>
@@ -1018,48 +944,11 @@
     </w:p>
     <w:p>
       <w:r>
-        <w:t xml:space="preserve">python -m </w:t>
-      </w:r>
-      <w:proofErr w:type="spellStart"/>
-      <w:proofErr w:type="gramStart"/>
-      <w:r>
-        <w:t>elements.element</w:t>
-      </w:r>
-      <w:proofErr w:type="gramEnd"/>
-      <w:r>
-        <w:t>_</w:t>
-      </w:r>
-      <w:proofErr w:type="gramStart"/>
-      <w:r>
-        <w:t>C.score</w:t>
-      </w:r>
-      <w:proofErr w:type="gramEnd"/>
-      <w:r>
-        <w:t>_with_API_C</w:t>
-      </w:r>
-      <w:proofErr w:type="spellEnd"/>
-      <w:r>
-        <w:t xml:space="preserve"> ^</w:t>
+        <w:t>python -m elements.element_C.score_with_API_C ^</w:t>
       </w:r>
       <w:r>
         <w:br/>
-        <w:t xml:space="preserve">  --folder elements/</w:t>
-      </w:r>
-      <w:proofErr w:type="spellStart"/>
-      <w:r>
-        <w:t>element_C</w:t>
-      </w:r>
-      <w:proofErr w:type="spellEnd"/>
-      <w:r>
-        <w:t>/</w:t>
-      </w:r>
-      <w:proofErr w:type="spellStart"/>
-      <w:r>
-        <w:t>current_api_scoring_documents</w:t>
-      </w:r>
-      <w:proofErr w:type="spellEnd"/>
-      <w:r>
-        <w:t xml:space="preserve"> ^</w:t>
+        <w:t xml:space="preserve">  --folder elements/element_C/current_api_scoring_documents ^</w:t>
       </w:r>
       <w:r>
         <w:br/>
@@ -1069,15 +958,7 @@
         <w:t xml:space="preserve"> </w:t>
       </w:r>
       <w:r>
-        <w:t>elements/</w:t>
-      </w:r>
-      <w:proofErr w:type="spellStart"/>
-      <w:r>
-        <w:t>element_C</w:t>
-      </w:r>
-      <w:proofErr w:type="spellEnd"/>
-      <w:r>
-        <w:t>/</w:t>
+        <w:t>elements/element_C/</w:t>
       </w:r>
       <w:r>
         <w:t>scored_results</w:t>
@@ -1178,15 +1059,7 @@
         </w:numPr>
       </w:pPr>
       <w:r>
-        <w:t>C1-C</w:t>
-      </w:r>
-      <w:proofErr w:type="gramStart"/>
-      <w:r>
-        <w:t>6  Bulleted</w:t>
-      </w:r>
-      <w:proofErr w:type="gramEnd"/>
-      <w:r>
-        <w:t xml:space="preserve"> rationale</w:t>
+        <w:t>C1-C6  Bulleted rationale</w:t>
       </w:r>
     </w:p>
     <w:p>
@@ -1412,13 +1285,8 @@
         </w:numPr>
       </w:pPr>
       <w:r>
-        <w:t xml:space="preserve">C1_expert – </w:t>
-      </w:r>
-      <w:proofErr w:type="spellStart"/>
-      <w:r>
-        <w:t>C_expert</w:t>
-      </w:r>
-      <w:proofErr w:type="spellEnd"/>
+        <w:t>C1_expert – C_expert</w:t>
+      </w:r>
       <w:r>
         <w:t xml:space="preserve"> scores</w:t>
       </w:r>
@@ -1498,21 +1366,8 @@
           <w:numId w:val="18"/>
         </w:numPr>
       </w:pPr>
-      <w:proofErr w:type="spellStart"/>
-      <w:r>
-        <w:t>Element_score_raw</w:t>
-      </w:r>
-      <w:proofErr w:type="spellEnd"/>
-      <w:r>
-        <w:t xml:space="preserve">, the average of the </w:t>
-      </w:r>
-      <w:proofErr w:type="spellStart"/>
-      <w:r>
-        <w:t>api</w:t>
-      </w:r>
-      <w:proofErr w:type="spellEnd"/>
-      <w:r>
-        <w:t xml:space="preserve"> scores</w:t>
+      <w:r>
+        <w:t>Element_score_raw, the average of the api scores</w:t>
       </w:r>
     </w:p>
     <w:p>
@@ -1553,15 +1408,7 @@
         </w:numPr>
       </w:pPr>
       <w:r>
-        <w:t>C1_</w:t>
-      </w:r>
-      <w:proofErr w:type="gramStart"/>
-      <w:r>
-        <w:t>final  –</w:t>
-      </w:r>
-      <w:proofErr w:type="gramEnd"/>
-      <w:r>
-        <w:t xml:space="preserve"> C6_final calibrated scores for output</w:t>
+        <w:t>C1_final  – C6_final calibrated scores for output</w:t>
       </w:r>
     </w:p>
     <w:p>
@@ -1572,11 +1419,9 @@
           <w:numId w:val="17"/>
         </w:numPr>
       </w:pPr>
-      <w:proofErr w:type="spellStart"/>
       <w:r>
         <w:t>element_score_raw</w:t>
       </w:r>
-      <w:proofErr w:type="spellEnd"/>
       <w:r>
         <w:tab/>
       </w:r>
@@ -1589,11 +1434,9 @@
           <w:numId w:val="17"/>
         </w:numPr>
       </w:pPr>
-      <w:proofErr w:type="spellStart"/>
       <w:r>
         <w:t>element_score_calibrated</w:t>
       </w:r>
-      <w:proofErr w:type="spellEnd"/>
       <w:r>
         <w:tab/>
       </w:r>
@@ -1606,11 +1449,9 @@
           <w:numId w:val="17"/>
         </w:numPr>
       </w:pPr>
-      <w:proofErr w:type="spellStart"/>
       <w:r>
         <w:t>calibration_delta</w:t>
       </w:r>
-      <w:proofErr w:type="spellEnd"/>
     </w:p>
     <w:p>
       <w:pPr>
@@ -1696,13 +1537,8 @@
         </w:numPr>
       </w:pPr>
       <w:r>
-        <w:t xml:space="preserve">Drift slightly </w:t>
-      </w:r>
-      <w:proofErr w:type="gramStart"/>
-      <w:r>
-        <w:t>over time</w:t>
-      </w:r>
-      <w:proofErr w:type="gramEnd"/>
+        <w:t>Drift slightly over time</w:t>
+      </w:r>
     </w:p>
     <w:p>
       <w:pPr>
@@ -1854,13 +1690,8 @@
           <w:numId w:val="11"/>
         </w:numPr>
       </w:pPr>
-      <w:proofErr w:type="gramStart"/>
-      <w:r>
-        <w:t>Explains</w:t>
-      </w:r>
-      <w:proofErr w:type="gramEnd"/>
-      <w:r>
-        <w:t xml:space="preserve"> strengths and weaknesses</w:t>
+      <w:r>
+        <w:t>Explains strengths and weaknesses</w:t>
       </w:r>
     </w:p>
     <w:p>
@@ -1881,13 +1712,8 @@
           <w:numId w:val="11"/>
         </w:numPr>
       </w:pPr>
-      <w:proofErr w:type="gramStart"/>
-      <w:r>
-        <w:t>Uses</w:t>
-      </w:r>
-      <w:proofErr w:type="gramEnd"/>
-      <w:r>
-        <w:t xml:space="preserve"> educator-friendly language</w:t>
+      <w:r>
+        <w:t>Uses educator-friendly language</w:t>
       </w:r>
     </w:p>
     <w:p>
@@ -1962,13 +1788,8 @@
           <w:numId w:val="12"/>
         </w:numPr>
       </w:pPr>
-      <w:proofErr w:type="spellStart"/>
-      <w:r>
-        <w:t>Subscore</w:t>
-      </w:r>
-      <w:proofErr w:type="spellEnd"/>
-      <w:r>
-        <w:t xml:space="preserve"> drift analysis</w:t>
+      <w:r>
+        <w:t>Subscore drift analysis</w:t>
       </w:r>
     </w:p>
     <w:p>
@@ -2013,23 +1834,7 @@
           <w:b/>
           <w:bCs/>
         </w:rPr>
-        <w:t xml:space="preserve"> (all core, scripts and </w:t>
-      </w:r>
-      <w:proofErr w:type="spellStart"/>
-      <w:r>
-        <w:rPr>
-          <w:b/>
-          <w:bCs/>
-        </w:rPr>
-        <w:t>simple_ui</w:t>
-      </w:r>
-      <w:proofErr w:type="spellEnd"/>
-      <w:r>
-        <w:rPr>
-          <w:b/>
-          <w:bCs/>
-        </w:rPr>
-        <w:t xml:space="preserve"> apps are now element agnostic to facilitate cloning the architecture for other elements)</w:t>
+        <w:t xml:space="preserve"> (all core, scripts and simple_ui apps are now element agnostic to facilitate cloning the architecture for other elements)</w:t>
       </w:r>
     </w:p>
     <w:p>
@@ -2044,13 +1849,8 @@
       <w:r>
         <w:t xml:space="preserve"> </w:t>
       </w:r>
-      <w:proofErr w:type="spellStart"/>
-      <w:r>
-        <w:t>GPTScorer</w:t>
-      </w:r>
-      <w:proofErr w:type="spellEnd"/>
-      <w:r>
-        <w:t>/</w:t>
+      <w:r>
+        <w:t>GPTScorer/</w:t>
       </w:r>
     </w:p>
     <w:p>
@@ -2125,157 +1925,53 @@
     </w:p>
     <w:p>
       <w:r>
-        <w:t xml:space="preserve"> │     └── </w:t>
-      </w:r>
-      <w:proofErr w:type="spellStart"/>
-      <w:r>
-        <w:t>element_A</w:t>
-      </w:r>
-      <w:proofErr w:type="spellEnd"/>
-      <w:r>
-        <w:t xml:space="preserve">/ </w:t>
-      </w:r>
-      <w:proofErr w:type="gramStart"/>
-      <w:r>
-        <w:t>-  analogous</w:t>
-      </w:r>
-      <w:proofErr w:type="gramEnd"/>
-      <w:r>
-        <w:t xml:space="preserve"> to C</w:t>
-      </w:r>
-    </w:p>
-    <w:p>
-      <w:r>
-        <w:t xml:space="preserve"> │   └── </w:t>
-      </w:r>
-      <w:proofErr w:type="spellStart"/>
-      <w:r>
-        <w:t>element_B</w:t>
-      </w:r>
-      <w:proofErr w:type="spellEnd"/>
-      <w:r>
-        <w:t xml:space="preserve">/ </w:t>
-      </w:r>
-      <w:proofErr w:type="gramStart"/>
-      <w:r>
-        <w:t>-  analogous</w:t>
-      </w:r>
-      <w:proofErr w:type="gramEnd"/>
-      <w:r>
-        <w:t xml:space="preserve"> to C</w:t>
-      </w:r>
-    </w:p>
-    <w:p>
-      <w:r>
-        <w:t xml:space="preserve"> │   └── </w:t>
-      </w:r>
-      <w:proofErr w:type="spellStart"/>
-      <w:r>
-        <w:t>element_D</w:t>
-      </w:r>
-      <w:proofErr w:type="spellEnd"/>
-      <w:r>
-        <w:t>/ - analogous to C</w:t>
-      </w:r>
-    </w:p>
-    <w:p>
-      <w:r>
-        <w:t xml:space="preserve"> │   └── </w:t>
-      </w:r>
-      <w:proofErr w:type="spellStart"/>
-      <w:r>
-        <w:t>element_E</w:t>
-      </w:r>
-      <w:proofErr w:type="spellEnd"/>
-      <w:r>
-        <w:t xml:space="preserve">/ </w:t>
-      </w:r>
-      <w:proofErr w:type="gramStart"/>
-      <w:r>
-        <w:t>-  analogous</w:t>
-      </w:r>
-      <w:proofErr w:type="gramEnd"/>
-      <w:r>
-        <w:t xml:space="preserve"> to C</w:t>
-      </w:r>
-    </w:p>
-    <w:p>
-      <w:r>
-        <w:t xml:space="preserve"> │   └── </w:t>
-      </w:r>
-      <w:proofErr w:type="spellStart"/>
-      <w:r>
-        <w:t>element_F</w:t>
-      </w:r>
-      <w:proofErr w:type="spellEnd"/>
-      <w:r>
-        <w:t xml:space="preserve">/ </w:t>
-      </w:r>
-      <w:proofErr w:type="gramStart"/>
-      <w:r>
-        <w:t>-  analogous</w:t>
-      </w:r>
-      <w:proofErr w:type="gramEnd"/>
-      <w:r>
-        <w:t xml:space="preserve"> to C</w:t>
-      </w:r>
-    </w:p>
-    <w:p>
-      <w:r>
-        <w:t xml:space="preserve"> │   └── </w:t>
-      </w:r>
-      <w:proofErr w:type="spellStart"/>
-      <w:r>
-        <w:t>element_G</w:t>
-      </w:r>
-      <w:proofErr w:type="spellEnd"/>
-      <w:r>
-        <w:t xml:space="preserve">/ </w:t>
-      </w:r>
-      <w:proofErr w:type="gramStart"/>
-      <w:r>
-        <w:t>-  analogous</w:t>
-      </w:r>
-      <w:proofErr w:type="gramEnd"/>
-      <w:r>
-        <w:t xml:space="preserve"> to C</w:t>
-      </w:r>
-    </w:p>
-    <w:p>
-      <w:r>
-        <w:t xml:space="preserve"> │   └── </w:t>
-      </w:r>
-      <w:proofErr w:type="spellStart"/>
-      <w:r>
-        <w:t>element_</w:t>
-      </w:r>
-      <w:r>
-        <w:t>H</w:t>
-      </w:r>
-      <w:proofErr w:type="spellEnd"/>
-      <w:r>
-        <w:t xml:space="preserve">/ </w:t>
-      </w:r>
-      <w:proofErr w:type="gramStart"/>
-      <w:r>
-        <w:t>-  analogous</w:t>
-      </w:r>
-      <w:proofErr w:type="gramEnd"/>
-      <w:r>
-        <w:t xml:space="preserve"> to C</w:t>
-      </w:r>
-    </w:p>
-    <w:p>
-      <w:r>
-        <w:t xml:space="preserve"> │    └── </w:t>
-      </w:r>
-      <w:proofErr w:type="spellStart"/>
-      <w:r>
-        <w:t>element_C</w:t>
-      </w:r>
-      <w:proofErr w:type="spellEnd"/>
-      <w:r>
-        <w:t>/</w:t>
+        <w:t xml:space="preserve"> │     └── element_A/ -  analogous to C</w:t>
+      </w:r>
+    </w:p>
+    <w:p>
+      <w:r>
+        <w:t xml:space="preserve"> │   └── element_B/ -  analogous to C</w:t>
+      </w:r>
+    </w:p>
+    <w:p>
+      <w:r>
+        <w:t xml:space="preserve"> │   └── element_D/ - analogous to C</w:t>
+      </w:r>
+    </w:p>
+    <w:p>
+      <w:r>
+        <w:t xml:space="preserve"> │   └── element_E/ -  analogous to C</w:t>
+      </w:r>
+    </w:p>
+    <w:p>
+      <w:r>
+        <w:t xml:space="preserve"> │   └── element_F/ -  analogous to C</w:t>
+      </w:r>
+    </w:p>
+    <w:p>
+      <w:r>
+        <w:t xml:space="preserve"> │   └── element_G/ -  analogous to C</w:t>
+      </w:r>
+    </w:p>
+    <w:p>
+      <w:r>
+        <w:t xml:space="preserve"> │   └── element_H/ -  analogous to C</w:t>
+      </w:r>
+    </w:p>
+    <w:p>
+      <w:r>
+        <w:t xml:space="preserve"> │   └── element_</w:t>
+      </w:r>
+      <w:r>
+        <w:t>I</w:t>
+      </w:r>
+      <w:r>
+        <w:t>/ -  analogous to C</w:t>
+      </w:r>
+    </w:p>
+    <w:p>
+      <w:r>
+        <w:t xml:space="preserve"> │    └── element_C/</w:t>
       </w:r>
     </w:p>
     <w:p>
@@ -2298,18 +1994,8 @@
         <w:t>──</w:t>
       </w:r>
       <w:r>
-        <w:t xml:space="preserve"> </w:t>
-      </w:r>
-      <w:proofErr w:type="spellStart"/>
-      <w:r>
-        <w:t>golden_C_</w:t>
-      </w:r>
-      <w:proofErr w:type="gramStart"/>
-      <w:r>
-        <w:t>current.json</w:t>
-      </w:r>
-      <w:proofErr w:type="spellEnd"/>
-      <w:proofErr w:type="gramEnd"/>
+        <w:t xml:space="preserve"> golden_C_current.json</w:t>
+      </w:r>
     </w:p>
     <w:p>
       <w:r>
@@ -2331,18 +2017,8 @@
         <w:t>──</w:t>
       </w:r>
       <w:r>
-        <w:t xml:space="preserve"> </w:t>
-      </w:r>
-      <w:proofErr w:type="spellStart"/>
-      <w:r>
-        <w:t>golden_C_</w:t>
-      </w:r>
-      <w:proofErr w:type="gramStart"/>
-      <w:r>
-        <w:t>legacy.json</w:t>
-      </w:r>
-      <w:proofErr w:type="spellEnd"/>
-      <w:proofErr w:type="gramEnd"/>
+        <w:t xml:space="preserve"> golden_C_legacy.json</w:t>
+      </w:r>
     </w:p>
     <w:p>
       <w:r>
@@ -2364,13 +2040,8 @@
         <w:t>──</w:t>
       </w:r>
       <w:r>
-        <w:t xml:space="preserve"> golden20_metrics_</w:t>
-      </w:r>
-      <w:proofErr w:type="gramStart"/>
-      <w:r>
-        <w:t>current.json</w:t>
-      </w:r>
-      <w:proofErr w:type="gramEnd"/>
+        <w:t xml:space="preserve"> golden20_metrics_current.json</w:t>
+      </w:r>
     </w:p>
     <w:p>
       <w:r>
@@ -2392,13 +2063,8 @@
         <w:t>──</w:t>
       </w:r>
       <w:r>
-        <w:t xml:space="preserve"> golden20_metrics_</w:t>
-      </w:r>
-      <w:proofErr w:type="gramStart"/>
-      <w:r>
-        <w:t>legacy.json</w:t>
-      </w:r>
-      <w:proofErr w:type="gramEnd"/>
+        <w:t xml:space="preserve"> golden20_metrics_legacy.json</w:t>
+      </w:r>
     </w:p>
     <w:p>
       <w:r>
@@ -2420,15 +2086,7 @@
         <w:t>──</w:t>
       </w:r>
       <w:r>
-        <w:t xml:space="preserve"> golden20_current_</w:t>
-      </w:r>
-      <w:proofErr w:type="gramStart"/>
-      <w:r>
-        <w:t>scores.json</w:t>
-      </w:r>
-      <w:proofErr w:type="gramEnd"/>
-      <w:r>
-        <w:t xml:space="preserve">      </w:t>
+        <w:t xml:space="preserve"> golden20_current_scores.json      </w:t>
       </w:r>
       <w:r>
         <w:rPr>
@@ -2454,15 +2112,7 @@
         <w:t xml:space="preserve">  </w:t>
       </w:r>
       <w:r>
-        <w:t>└── golden20_legacy_</w:t>
-      </w:r>
-      <w:proofErr w:type="gramStart"/>
-      <w:r>
-        <w:t>scores.json</w:t>
-      </w:r>
-      <w:proofErr w:type="gramEnd"/>
-      <w:r>
-        <w:t xml:space="preserve">       ← cached API scores</w:t>
+        <w:t>└── golden20_legacy_scores.json       ← cached API scores</w:t>
       </w:r>
     </w:p>
     <w:p>
@@ -2489,159 +2139,52 @@
     </w:p>
     <w:p>
       <w:r>
-        <w:t xml:space="preserve"> │   └── </w:t>
-      </w:r>
-      <w:proofErr w:type="spellStart"/>
-      <w:r>
-        <w:t>element_A</w:t>
-      </w:r>
-      <w:proofErr w:type="spellEnd"/>
-      <w:r>
-        <w:t xml:space="preserve">/ </w:t>
-      </w:r>
-      <w:proofErr w:type="gramStart"/>
-      <w:r>
-        <w:t>-  analogous</w:t>
-      </w:r>
-      <w:proofErr w:type="gramEnd"/>
-      <w:r>
-        <w:t xml:space="preserve"> to C</w:t>
-      </w:r>
-    </w:p>
-    <w:p>
-      <w:r>
-        <w:t xml:space="preserve"> │   └── </w:t>
-      </w:r>
-      <w:proofErr w:type="spellStart"/>
-      <w:r>
-        <w:t>element_B</w:t>
-      </w:r>
-      <w:proofErr w:type="spellEnd"/>
-      <w:r>
-        <w:t xml:space="preserve">/ </w:t>
-      </w:r>
-      <w:proofErr w:type="gramStart"/>
-      <w:r>
-        <w:t>-  analogous</w:t>
-      </w:r>
-      <w:proofErr w:type="gramEnd"/>
-      <w:r>
-        <w:t xml:space="preserve"> to C</w:t>
-      </w:r>
-    </w:p>
-    <w:p>
-      <w:r>
-        <w:t xml:space="preserve"> │   └── </w:t>
-      </w:r>
-      <w:proofErr w:type="spellStart"/>
-      <w:r>
-        <w:t>element_D</w:t>
-      </w:r>
-      <w:proofErr w:type="spellEnd"/>
-      <w:r>
-        <w:t>/ - analogous to C</w:t>
-      </w:r>
-    </w:p>
-    <w:p>
-      <w:r>
-        <w:t xml:space="preserve"> │   └── </w:t>
-      </w:r>
-      <w:proofErr w:type="spellStart"/>
-      <w:r>
-        <w:t>element_E</w:t>
-      </w:r>
-      <w:proofErr w:type="spellEnd"/>
-      <w:r>
-        <w:t xml:space="preserve">/ </w:t>
-      </w:r>
-      <w:proofErr w:type="gramStart"/>
-      <w:r>
-        <w:t>-  analogous</w:t>
-      </w:r>
-      <w:proofErr w:type="gramEnd"/>
-      <w:r>
-        <w:t xml:space="preserve"> to C</w:t>
-      </w:r>
-    </w:p>
-    <w:p>
-      <w:r>
-        <w:t xml:space="preserve"> │   └── </w:t>
-      </w:r>
-      <w:proofErr w:type="spellStart"/>
-      <w:r>
-        <w:t>element_F</w:t>
-      </w:r>
-      <w:proofErr w:type="spellEnd"/>
-      <w:r>
-        <w:t xml:space="preserve">/ </w:t>
-      </w:r>
-      <w:proofErr w:type="gramStart"/>
-      <w:r>
-        <w:t>-  analogous</w:t>
-      </w:r>
-      <w:proofErr w:type="gramEnd"/>
-      <w:r>
-        <w:t xml:space="preserve"> to C</w:t>
-      </w:r>
-    </w:p>
-    <w:p>
-      <w:r>
-        <w:t xml:space="preserve"> │   └── </w:t>
-      </w:r>
-      <w:proofErr w:type="spellStart"/>
-      <w:r>
-        <w:t>element_G</w:t>
-      </w:r>
-      <w:proofErr w:type="spellEnd"/>
-      <w:r>
-        <w:t xml:space="preserve">/ </w:t>
-      </w:r>
-      <w:proofErr w:type="gramStart"/>
-      <w:r>
-        <w:t>-  analogous</w:t>
-      </w:r>
-      <w:proofErr w:type="gramEnd"/>
-      <w:r>
-        <w:t xml:space="preserve"> to C</w:t>
-      </w:r>
-    </w:p>
-    <w:p>
-      <w:r>
-        <w:t xml:space="preserve"> │   └── </w:t>
-      </w:r>
-      <w:proofErr w:type="spellStart"/>
-      <w:r>
-        <w:t>element_H</w:t>
-      </w:r>
-      <w:proofErr w:type="spellEnd"/>
-      <w:r>
-        <w:t xml:space="preserve">/ </w:t>
-      </w:r>
-      <w:proofErr w:type="gramStart"/>
-      <w:r>
-        <w:t>-  analogous</w:t>
-      </w:r>
-      <w:proofErr w:type="gramEnd"/>
-      <w:r>
-        <w:t xml:space="preserve"> to C</w:t>
-      </w:r>
-    </w:p>
-    <w:p>
-      <w:r>
-        <w:t xml:space="preserve">│   └── </w:t>
-      </w:r>
-      <w:proofErr w:type="spellStart"/>
-      <w:r>
-        <w:t>element_C</w:t>
-      </w:r>
-      <w:proofErr w:type="spellEnd"/>
-      <w:r>
-        <w:t>/</w:t>
+        <w:t xml:space="preserve"> │   └── element_A/ -  analogous to C</w:t>
+      </w:r>
+    </w:p>
+    <w:p>
+      <w:r>
+        <w:t xml:space="preserve"> │   └── element_B/ -  analogous to C</w:t>
+      </w:r>
+    </w:p>
+    <w:p>
+      <w:r>
+        <w:t xml:space="preserve"> │   └── element_D/ - analogous to C</w:t>
+      </w:r>
+    </w:p>
+    <w:p>
+      <w:r>
+        <w:t xml:space="preserve"> │   └── element_E/ -  analogous to C</w:t>
+      </w:r>
+    </w:p>
+    <w:p>
+      <w:r>
+        <w:t xml:space="preserve"> │   └── element_F/ -  analogous to C</w:t>
+      </w:r>
+    </w:p>
+    <w:p>
+      <w:r>
+        <w:t xml:space="preserve"> │   └── element_G/ -  analogous to C</w:t>
+      </w:r>
+    </w:p>
+    <w:p>
+      <w:r>
+        <w:t xml:space="preserve"> │   └── element_H/ -  analogous to C</w:t>
       </w:r>
     </w:p>
     <w:p>
       <w:r>
         <w:lastRenderedPageBreak/>
+        <w:t xml:space="preserve"> │   └── element_I/ -  analogous to C</w:t>
+      </w:r>
+    </w:p>
+    <w:p>
+      <w:r>
+        <w:t>│   └── element_C/</w:t>
+      </w:r>
+    </w:p>
+    <w:p>
+      <w:r>
         <w:t xml:space="preserve">│       </w:t>
       </w:r>
       <w:r>
@@ -2747,15 +2290,7 @@
         <w:t>──</w:t>
       </w:r>
       <w:r>
-        <w:t xml:space="preserve"> </w:t>
-      </w:r>
-      <w:proofErr w:type="spellStart"/>
-      <w:r>
-        <w:t>current_api_scoring_documents</w:t>
-      </w:r>
-      <w:proofErr w:type="spellEnd"/>
-      <w:r>
-        <w:t>/</w:t>
+        <w:t xml:space="preserve"> current_api_scoring_documents/</w:t>
       </w:r>
     </w:p>
     <w:p>
@@ -2770,15 +2305,7 @@
     </w:p>
     <w:p>
       <w:r>
-        <w:t xml:space="preserve">│       └── </w:t>
-      </w:r>
-      <w:proofErr w:type="spellStart"/>
-      <w:r>
-        <w:t>legacy_api_scoring_documents</w:t>
-      </w:r>
-      <w:proofErr w:type="spellEnd"/>
-      <w:r>
-        <w:t>/</w:t>
+        <w:t>│       └── legacy_api_scoring_documents/</w:t>
       </w:r>
     </w:p>
     <w:p>
@@ -2843,15 +2370,7 @@
         <w:t>──</w:t>
       </w:r>
       <w:r>
-        <w:t xml:space="preserve"> </w:t>
-      </w:r>
-      <w:proofErr w:type="spellStart"/>
-      <w:r>
-        <w:t>simple_ui</w:t>
-      </w:r>
-      <w:proofErr w:type="spellEnd"/>
-      <w:r>
-        <w:t>/</w:t>
+        <w:t xml:space="preserve"> simple_ui/</w:t>
       </w:r>
     </w:p>
     <w:p>
@@ -2894,6 +2413,7 @@
         <w:rPr>
           <w:rFonts w:ascii="MS Gothic" w:eastAsia="MS Gothic" w:hAnsi="MS Gothic" w:cs="MS Gothic" w:hint="eastAsia"/>
         </w:rPr>
+        <w:lastRenderedPageBreak/>
         <w:t>├</w:t>
       </w:r>
       <w:r>
@@ -2983,15 +2503,7 @@
         </w:numPr>
       </w:pPr>
       <w:r>
-        <w:t xml:space="preserve">Bias controlled through </w:t>
-      </w:r>
-      <w:proofErr w:type="gramStart"/>
-      <w:r>
-        <w:t>intercept</w:t>
-      </w:r>
-      <w:proofErr w:type="gramEnd"/>
-      <w:r>
-        <w:t xml:space="preserve"> calibration</w:t>
+        <w:t>Bias controlled through intercept calibration</w:t>
       </w:r>
     </w:p>
     <w:p>
@@ -3071,21 +2583,12 @@
       <w:r>
         <w:t xml:space="preserve">, and </w:t>
       </w:r>
-      <w:proofErr w:type="gramStart"/>
       <w:r>
         <w:rPr>
           <w:b/>
           <w:bCs/>
         </w:rPr>
-        <w:t>cached</w:t>
-      </w:r>
-      <w:proofErr w:type="gramEnd"/>
-      <w:r>
-        <w:rPr>
-          <w:b/>
-          <w:bCs/>
-        </w:rPr>
-        <w:t xml:space="preserve"> API scoring for reproducibility</w:t>
+        <w:t>cached API scoring for reproducibility</w:t>
       </w:r>
       <w:r>
         <w:t>.</w:t>
@@ -3131,13 +2634,8 @@
         </w:numPr>
       </w:pPr>
       <w:r>
-        <w:t xml:space="preserve">Raw API </w:t>
-      </w:r>
-      <w:proofErr w:type="spellStart"/>
-      <w:r>
-        <w:t>subscores</w:t>
-      </w:r>
-      <w:proofErr w:type="spellEnd"/>
+        <w:t>Raw API subscores</w:t>
+      </w:r>
     </w:p>
     <w:p>
       <w:pPr>
@@ -3152,6 +2650,7 @@
     </w:p>
     <w:p>
       <w:r>
+        <w:lastRenderedPageBreak/>
         <w:t>The following metrics are tracked:</w:t>
       </w:r>
     </w:p>
@@ -3174,7 +2673,6 @@
         </w:numPr>
       </w:pPr>
       <w:r>
-        <w:lastRenderedPageBreak/>
         <w:t>Standard deviation</w:t>
       </w:r>
     </w:p>
@@ -3438,12 +2936,12 @@
           <w:b/>
           <w:bCs/>
         </w:rPr>
+        <w:lastRenderedPageBreak/>
         <w:t>Mean calibrated score</w:t>
       </w:r>
     </w:p>
     <w:p>
       <w:r>
-        <w:lastRenderedPageBreak/>
         <w:t>These metrics are compared to stored baseline metrics to determine whether scoring behavior has changed.</w:t>
       </w:r>
     </w:p>
@@ -3497,13 +2995,8 @@
           <w:numId w:val="25"/>
         </w:numPr>
       </w:pPr>
-      <w:proofErr w:type="spellStart"/>
-      <w:r>
-        <w:t>Subscores</w:t>
-      </w:r>
-      <w:proofErr w:type="spellEnd"/>
-      <w:r>
-        <w:t xml:space="preserve"> (C1–C6) are stored in cache files</w:t>
+      <w:r>
+        <w:t>Subscores (C1–C6) are stored in cache files</w:t>
       </w:r>
     </w:p>
     <w:p>
@@ -3511,31 +3004,21 @@
         <w:t>golden20_current</w:t>
       </w:r>
       <w:r>
-        <w:t>_</w:t>
-      </w:r>
-      <w:proofErr w:type="gramStart"/>
-      <w:r>
-        <w:t>scores</w:t>
+        <w:t>_scores</w:t>
       </w:r>
       <w:r>
         <w:t>.json</w:t>
       </w:r>
-      <w:proofErr w:type="gramEnd"/>
       <w:r>
         <w:br/>
         <w:t>golden20_legacy</w:t>
       </w:r>
       <w:r>
-        <w:t>_</w:t>
-      </w:r>
-      <w:proofErr w:type="gramStart"/>
-      <w:r>
-        <w:t>scores</w:t>
+        <w:t>_scores</w:t>
       </w:r>
       <w:r>
         <w:t>.json</w:t>
       </w:r>
-      <w:proofErr w:type="gramEnd"/>
     </w:p>
     <w:p>
       <w:r>
@@ -3620,41 +3103,17 @@
       </w:r>
     </w:p>
     <w:p>
-      <w:proofErr w:type="spellStart"/>
-      <w:r>
-        <w:t>golden_C_current_</w:t>
-      </w:r>
-      <w:proofErr w:type="gramStart"/>
-      <w:r>
-        <w:t>metrics.json</w:t>
-      </w:r>
-      <w:proofErr w:type="spellEnd"/>
-      <w:proofErr w:type="gramEnd"/>
+      <w:r>
+        <w:t>golden_C_current_metrics.json</w:t>
+      </w:r>
       <w:r>
         <w:br/>
-      </w:r>
-      <w:proofErr w:type="spellStart"/>
-      <w:r>
-        <w:t>golden_C_legacy_</w:t>
-      </w:r>
-      <w:proofErr w:type="gramStart"/>
-      <w:r>
-        <w:t>metrics.json</w:t>
-      </w:r>
-      <w:proofErr w:type="spellEnd"/>
-      <w:proofErr w:type="gramEnd"/>
-    </w:p>
-    <w:p>
-      <w:r>
-        <w:t xml:space="preserve">These files represent the expected scoring behavior of the system. Future validation runs </w:t>
-      </w:r>
-      <w:proofErr w:type="gramStart"/>
-      <w:r>
-        <w:t>compare</w:t>
-      </w:r>
-      <w:proofErr w:type="gramEnd"/>
-      <w:r>
-        <w:t xml:space="preserve"> against these baselines to detect deviations.</w:t>
+        <w:t>golden_C_legacy_metrics.json</w:t>
+      </w:r>
+    </w:p>
+    <w:p>
+      <w:r>
+        <w:t>These files represent the expected scoring behavior of the system. Future validation runs compare against these baselines to detect deviations.</w:t>
       </w:r>
     </w:p>
     <w:p>
@@ -3686,6 +3145,7 @@
     </w:p>
     <w:p>
       <w:r>
+        <w:lastRenderedPageBreak/>
         <w:t xml:space="preserve">cd </w:t>
       </w:r>
       <w:r>
@@ -3697,7 +3157,6 @@
     </w:p>
     <w:p>
       <w:r>
-        <w:lastRenderedPageBreak/>
         <w:t>c:\MyDesign_GPTScorer</w:t>
       </w:r>
       <w:r>
@@ -3763,13 +3222,8 @@
           <w:numId w:val="27"/>
         </w:numPr>
       </w:pPr>
-      <w:proofErr w:type="gramStart"/>
-      <w:r>
-        <w:t>Report</w:t>
-      </w:r>
-      <w:proofErr w:type="gramEnd"/>
-      <w:r>
-        <w:t xml:space="preserve"> whether drift is detected</w:t>
+      <w:r>
+        <w:t>Report whether drift is detected</w:t>
       </w:r>
     </w:p>
     <w:p>
@@ -3805,74 +3259,28 @@
       </w:r>
       <w:r>
         <w:br/>
-      </w:r>
-      <w:proofErr w:type="spellStart"/>
-      <w:r>
-        <w:t>golden_C_current_</w:t>
-      </w:r>
-      <w:proofErr w:type="gramStart"/>
-      <w:r>
-        <w:t>cases.json</w:t>
-      </w:r>
-      <w:proofErr w:type="spellEnd"/>
-      <w:proofErr w:type="gramEnd"/>
+        <w:t>golden_C_current_cases.json</w:t>
+      </w:r>
       <w:r>
         <w:br/>
-      </w:r>
-      <w:proofErr w:type="spellStart"/>
-      <w:r>
-        <w:t>golden_C_legacy_</w:t>
-      </w:r>
-      <w:proofErr w:type="gramStart"/>
-      <w:r>
-        <w:t>cases.json</w:t>
-      </w:r>
-      <w:proofErr w:type="spellEnd"/>
-      <w:proofErr w:type="gramEnd"/>
+        <w:t>golden_C_legacy_cases.json</w:t>
+      </w:r>
       <w:r>
         <w:br/>
-      </w:r>
-      <w:proofErr w:type="spellStart"/>
-      <w:r>
-        <w:t>golden_C_current_</w:t>
-      </w:r>
-      <w:proofErr w:type="gramStart"/>
-      <w:r>
-        <w:t>metrics.json</w:t>
-      </w:r>
-      <w:proofErr w:type="spellEnd"/>
-      <w:proofErr w:type="gramEnd"/>
+        <w:t>golden_C_current_metrics.json</w:t>
+      </w:r>
       <w:r>
         <w:br/>
-      </w:r>
-      <w:proofErr w:type="spellStart"/>
-      <w:r>
-        <w:t>golden_C_legacy_</w:t>
-      </w:r>
-      <w:proofErr w:type="gramStart"/>
-      <w:r>
-        <w:t>metrics.json</w:t>
-      </w:r>
-      <w:proofErr w:type="spellEnd"/>
-      <w:proofErr w:type="gramEnd"/>
+        <w:t>golden_C_legacy_metrics.json</w:t>
+      </w:r>
       <w:r>
         <w:br/>
-        <w:t>golden20_api_scores_</w:t>
-      </w:r>
-      <w:proofErr w:type="gramStart"/>
-      <w:r>
-        <w:t>current.json</w:t>
-      </w:r>
-      <w:proofErr w:type="gramEnd"/>
+        <w:t>golden20_api_scores_current.json</w:t>
+      </w:r>
       <w:r>
         <w:br/>
-        <w:t>golden20_api_scores_</w:t>
-      </w:r>
-      <w:proofErr w:type="gramStart"/>
-      <w:r>
-        <w:t>legacy.json</w:t>
-      </w:r>
-      <w:proofErr w:type="gramEnd"/>
+        <w:t>golden20_api_scores_legacy.json</w:t>
+      </w:r>
     </w:p>
     <w:p>
       <w:r>
@@ -3968,7 +3376,6 @@
     <w:p/>
     <w:p>
       <w:r>
-        <w:lastRenderedPageBreak/>
         <w:pict w14:anchorId="6BA7B863">
           <v:rect id="_x0000_i1043" style="width:0;height:1.5pt" o:hralign="center" o:hrstd="t" o:hr="t" fillcolor="#a0a0a0" stroked="f"/>
         </w:pict>
@@ -4067,10 +3474,16 @@
         <w:t xml:space="preserve">Align Element </w:t>
       </w:r>
       <w:r>
-        <w:t>I</w:t>
-      </w:r>
-      <w:r>
-        <w:t xml:space="preserve"> - L</w:t>
+        <w:t>J, K</w:t>
+      </w:r>
+      <w:r>
+        <w:t xml:space="preserve"> </w:t>
+      </w:r>
+      <w:r>
+        <w:t>and</w:t>
+      </w:r>
+      <w:r>
+        <w:t xml:space="preserve"> L</w:t>
       </w:r>
       <w:r>
         <w:t xml:space="preserve"> with this architecture</w:t>
@@ -4103,13 +3516,8 @@
         </w:numPr>
       </w:pPr>
       <w:r>
-        <w:t xml:space="preserve">Support integration with </w:t>
-      </w:r>
-      <w:proofErr w:type="spellStart"/>
-      <w:r>
-        <w:t>MyDesign</w:t>
-      </w:r>
-      <w:proofErr w:type="spellEnd"/>
+        <w:t>Support integration with MyDesign</w:t>
+      </w:r>
     </w:p>
     <w:p>
       <w:pPr>
@@ -4120,15 +3528,7 @@
         </w:numPr>
       </w:pPr>
       <w:r>
-        <w:t xml:space="preserve">Retest all Legacy documents in their original form (rather than screenshots of the pdf documents) </w:t>
-      </w:r>
-      <w:proofErr w:type="gramStart"/>
-      <w:r>
-        <w:t>in an attempt to</w:t>
-      </w:r>
-      <w:proofErr w:type="gramEnd"/>
-      <w:r>
-        <w:t xml:space="preserve"> eliminate the processing difference for Legacy and Current models.</w:t>
+        <w:t>Retest all Legacy documents in their original form (rather than screenshots of the pdf documents) in an attempt to eliminate the processing difference for Legacy and Current models.</w:t>
       </w:r>
       <w:r>
         <w:pict w14:anchorId="35FA4AB3">

</xml_diff>

<commit_message>
Add Element J scoring and baselines
</commit_message>
<xml_diff>
--- a/Readme.docx
+++ b/Readme.docx
@@ -55,18 +55,18 @@
         <w:t>, H</w:t>
       </w:r>
       <w:r>
+        <w:t xml:space="preserve">, I </w:t>
+      </w:r>
+      <w:r>
+        <w:t xml:space="preserve">and </w:t>
+      </w:r>
+      <w:r>
+        <w:t>J</w:t>
+      </w:r>
+      <w:r>
         <w:t xml:space="preserve"> </w:t>
       </w:r>
       <w:r>
-        <w:t xml:space="preserve">and </w:t>
-      </w:r>
-      <w:r>
-        <w:t>I</w:t>
-      </w:r>
-      <w:r>
-        <w:t xml:space="preserve"> </w:t>
-      </w:r>
-      <w:r>
         <w:t>have</w:t>
       </w:r>
       <w:r>
@@ -103,16 +103,7 @@
         <w:t>, H</w:t>
       </w:r>
       <w:r>
-        <w:t xml:space="preserve"> </w:t>
-      </w:r>
-      <w:r>
-        <w:t xml:space="preserve">and </w:t>
-      </w:r>
-      <w:r>
-        <w:t>I</w:t>
-      </w:r>
-      <w:r>
-        <w:t xml:space="preserve"> </w:t>
+        <w:t xml:space="preserve">, I and J </w:t>
       </w:r>
       <w:r>
         <w:t>as well</w:t>
@@ -1960,10 +1951,15 @@
     </w:p>
     <w:p>
       <w:r>
+        <w:t xml:space="preserve"> │   └── element_I/ -  analogous to C</w:t>
+      </w:r>
+    </w:p>
+    <w:p>
+      <w:r>
         <w:t xml:space="preserve"> │   └── element_</w:t>
       </w:r>
       <w:r>
-        <w:t>I</w:t>
+        <w:t>J</w:t>
       </w:r>
       <w:r>
         <w:t>/ -  analogous to C</w:t>
@@ -2169,251 +2165,256 @@
     </w:p>
     <w:p>
       <w:r>
+        <w:lastRenderedPageBreak/>
         <w:t xml:space="preserve"> │   └── element_H/ -  analogous to C</w:t>
       </w:r>
     </w:p>
     <w:p>
       <w:r>
+        <w:t xml:space="preserve"> │   └── element_I/ -  analogous to C</w:t>
+      </w:r>
+    </w:p>
+    <w:p>
+      <w:r>
+        <w:t xml:space="preserve"> │   └── element_J/ -  analogous to C</w:t>
+      </w:r>
+    </w:p>
+    <w:p>
+      <w:r>
+        <w:t>│   └── element_C/</w:t>
+      </w:r>
+    </w:p>
+    <w:p>
+      <w:r>
+        <w:t xml:space="preserve">│       </w:t>
+      </w:r>
+      <w:r>
+        <w:rPr>
+          <w:rFonts w:ascii="MS Gothic" w:eastAsia="MS Gothic" w:hAnsi="MS Gothic" w:cs="MS Gothic" w:hint="eastAsia"/>
+        </w:rPr>
+        <w:t>├</w:t>
+      </w:r>
+      <w:r>
+        <w:rPr>
+          <w:rFonts w:ascii="Aptos" w:hAnsi="Aptos" w:cs="Aptos"/>
+        </w:rPr>
+        <w:t>──</w:t>
+      </w:r>
+      <w:r>
+        <w:t xml:space="preserve"> score_with_API_C.py</w:t>
+      </w:r>
+    </w:p>
+    <w:p>
+      <w:r>
+        <w:t xml:space="preserve">│       </w:t>
+      </w:r>
+      <w:r>
+        <w:rPr>
+          <w:rFonts w:ascii="MS Gothic" w:eastAsia="MS Gothic" w:hAnsi="MS Gothic" w:cs="MS Gothic" w:hint="eastAsia"/>
+        </w:rPr>
+        <w:t>├</w:t>
+      </w:r>
+      <w:r>
+        <w:rPr>
+          <w:rFonts w:ascii="Aptos" w:hAnsi="Aptos" w:cs="Aptos"/>
+        </w:rPr>
+        <w:t>──</w:t>
+      </w:r>
+      <w:r>
+        <w:t xml:space="preserve"> scorer_app_C.py</w:t>
+      </w:r>
+    </w:p>
+    <w:p>
+      <w:r>
+        <w:t>│       │</w:t>
+      </w:r>
+    </w:p>
+    <w:p>
+      <w:r>
+        <w:t xml:space="preserve">│       </w:t>
+      </w:r>
+      <w:r>
+        <w:rPr>
+          <w:rFonts w:ascii="MS Gothic" w:eastAsia="MS Gothic" w:hAnsi="MS Gothic" w:cs="MS Gothic" w:hint="eastAsia"/>
+        </w:rPr>
+        <w:t>├</w:t>
+      </w:r>
+      <w:r>
+        <w:rPr>
+          <w:rFonts w:ascii="Aptos" w:hAnsi="Aptos" w:cs="Aptos"/>
+        </w:rPr>
+        <w:t>──</w:t>
+      </w:r>
+      <w:r>
+        <w:t xml:space="preserve"> Current_GPT.csv</w:t>
+      </w:r>
+    </w:p>
+    <w:p>
+      <w:r>
+        <w:t xml:space="preserve">│       </w:t>
+      </w:r>
+      <w:r>
+        <w:rPr>
+          <w:rFonts w:ascii="MS Gothic" w:eastAsia="MS Gothic" w:hAnsi="MS Gothic" w:cs="MS Gothic" w:hint="eastAsia"/>
+        </w:rPr>
+        <w:t>├</w:t>
+      </w:r>
+      <w:r>
+        <w:rPr>
+          <w:rFonts w:ascii="Aptos" w:hAnsi="Aptos" w:cs="Aptos"/>
+        </w:rPr>
+        <w:t>──</w:t>
+      </w:r>
+      <w:r>
+        <w:t xml:space="preserve"> Legacy_GPT.csv</w:t>
+      </w:r>
+    </w:p>
+    <w:p>
+      <w:r>
+        <w:t>│       │</w:t>
+      </w:r>
+    </w:p>
+    <w:p>
+      <w:r>
+        <w:t xml:space="preserve">│       </w:t>
+      </w:r>
+      <w:r>
+        <w:rPr>
+          <w:rFonts w:ascii="MS Gothic" w:eastAsia="MS Gothic" w:hAnsi="MS Gothic" w:cs="MS Gothic" w:hint="eastAsia"/>
+        </w:rPr>
+        <w:t>├</w:t>
+      </w:r>
+      <w:r>
+        <w:rPr>
+          <w:rFonts w:ascii="Aptos" w:hAnsi="Aptos" w:cs="Aptos"/>
+        </w:rPr>
+        <w:t>──</w:t>
+      </w:r>
+      <w:r>
+        <w:t xml:space="preserve"> current_api_scoring_documents/</w:t>
+      </w:r>
+    </w:p>
+    <w:p>
+      <w:r>
+        <w:t>│       │   └── (documents scored using current model)</w:t>
+      </w:r>
+    </w:p>
+    <w:p>
+      <w:r>
+        <w:t>│       │</w:t>
+      </w:r>
+    </w:p>
+    <w:p>
+      <w:r>
+        <w:t>│       └── legacy_api_scoring_documents/</w:t>
+      </w:r>
+    </w:p>
+    <w:p>
+      <w:r>
+        <w:t>│           └── (documents scored using legacy model)</w:t>
+      </w:r>
+    </w:p>
+    <w:p>
+      <w:r>
+        <w:t>│</w:t>
+      </w:r>
+    </w:p>
+    <w:p>
+      <w:r>
+        <w:rPr>
+          <w:rFonts w:ascii="MS Gothic" w:eastAsia="MS Gothic" w:hAnsi="MS Gothic" w:cs="MS Gothic" w:hint="eastAsia"/>
+        </w:rPr>
+        <w:t>├</w:t>
+      </w:r>
+      <w:r>
+        <w:rPr>
+          <w:rFonts w:ascii="Aptos" w:hAnsi="Aptos" w:cs="Aptos"/>
+        </w:rPr>
+        <w:t>──</w:t>
+      </w:r>
+      <w:r>
+        <w:t xml:space="preserve"> scripts/</w:t>
+      </w:r>
+    </w:p>
+    <w:p>
+      <w:r>
+        <w:t>│   └── shared/</w:t>
+      </w:r>
+    </w:p>
+    <w:p>
+      <w:r>
+        <w:t>│       └── utils.py</w:t>
+      </w:r>
+    </w:p>
+    <w:p>
+      <w:r>
+        <w:t>│       └── validate_golden20.py</w:t>
+      </w:r>
+    </w:p>
+    <w:p/>
+    <w:p>
+      <w:r>
+        <w:t>│</w:t>
+      </w:r>
+    </w:p>
+    <w:p>
+      <w:r>
+        <w:rPr>
+          <w:rFonts w:ascii="MS Gothic" w:eastAsia="MS Gothic" w:hAnsi="MS Gothic" w:cs="MS Gothic" w:hint="eastAsia"/>
+        </w:rPr>
+        <w:t>├</w:t>
+      </w:r>
+      <w:r>
+        <w:rPr>
+          <w:rFonts w:ascii="Aptos" w:hAnsi="Aptos" w:cs="Aptos"/>
+        </w:rPr>
+        <w:t>──</w:t>
+      </w:r>
+      <w:r>
+        <w:t xml:space="preserve"> simple_ui/</w:t>
+      </w:r>
+    </w:p>
+    <w:p>
+      <w:r>
+        <w:t xml:space="preserve">│   </w:t>
+      </w:r>
+      <w:r>
+        <w:rPr>
+          <w:rFonts w:ascii="MS Gothic" w:eastAsia="MS Gothic" w:hAnsi="MS Gothic" w:cs="MS Gothic" w:hint="eastAsia"/>
+        </w:rPr>
+        <w:t>├</w:t>
+      </w:r>
+      <w:r>
+        <w:rPr>
+          <w:rFonts w:ascii="Aptos" w:hAnsi="Aptos" w:cs="Aptos"/>
+        </w:rPr>
+        <w:t>──</w:t>
+      </w:r>
+      <w:r>
+        <w:t xml:space="preserve"> shared/</w:t>
+      </w:r>
+    </w:p>
+    <w:p>
+      <w:r>
+        <w:t>│   │   └── script.js</w:t>
+      </w:r>
+    </w:p>
+    <w:p>
+      <w:r>
+        <w:t>│       └── index.html</w:t>
+      </w:r>
+    </w:p>
+    <w:p>
+      <w:r>
         <w:lastRenderedPageBreak/>
-        <w:t xml:space="preserve"> │   └── element_I/ -  analogous to C</w:t>
-      </w:r>
-    </w:p>
-    <w:p>
-      <w:r>
-        <w:t>│   └── element_C/</w:t>
-      </w:r>
-    </w:p>
-    <w:p>
-      <w:r>
-        <w:t xml:space="preserve">│       </w:t>
-      </w:r>
+        <w:t>│</w:t>
+      </w:r>
+    </w:p>
+    <w:p>
       <w:r>
         <w:rPr>
           <w:rFonts w:ascii="MS Gothic" w:eastAsia="MS Gothic" w:hAnsi="MS Gothic" w:cs="MS Gothic" w:hint="eastAsia"/>
         </w:rPr>
-        <w:t>├</w:t>
-      </w:r>
-      <w:r>
-        <w:rPr>
-          <w:rFonts w:ascii="Aptos" w:hAnsi="Aptos" w:cs="Aptos"/>
-        </w:rPr>
-        <w:t>──</w:t>
-      </w:r>
-      <w:r>
-        <w:t xml:space="preserve"> score_with_API_C.py</w:t>
-      </w:r>
-    </w:p>
-    <w:p>
-      <w:r>
-        <w:t xml:space="preserve">│       </w:t>
-      </w:r>
-      <w:r>
-        <w:rPr>
-          <w:rFonts w:ascii="MS Gothic" w:eastAsia="MS Gothic" w:hAnsi="MS Gothic" w:cs="MS Gothic" w:hint="eastAsia"/>
-        </w:rPr>
-        <w:t>├</w:t>
-      </w:r>
-      <w:r>
-        <w:rPr>
-          <w:rFonts w:ascii="Aptos" w:hAnsi="Aptos" w:cs="Aptos"/>
-        </w:rPr>
-        <w:t>──</w:t>
-      </w:r>
-      <w:r>
-        <w:t xml:space="preserve"> scorer_app_C.py</w:t>
-      </w:r>
-    </w:p>
-    <w:p>
-      <w:r>
-        <w:t>│       │</w:t>
-      </w:r>
-    </w:p>
-    <w:p>
-      <w:r>
-        <w:t xml:space="preserve">│       </w:t>
-      </w:r>
-      <w:r>
-        <w:rPr>
-          <w:rFonts w:ascii="MS Gothic" w:eastAsia="MS Gothic" w:hAnsi="MS Gothic" w:cs="MS Gothic" w:hint="eastAsia"/>
-        </w:rPr>
-        <w:t>├</w:t>
-      </w:r>
-      <w:r>
-        <w:rPr>
-          <w:rFonts w:ascii="Aptos" w:hAnsi="Aptos" w:cs="Aptos"/>
-        </w:rPr>
-        <w:t>──</w:t>
-      </w:r>
-      <w:r>
-        <w:t xml:space="preserve"> Current_GPT.csv</w:t>
-      </w:r>
-    </w:p>
-    <w:p>
-      <w:r>
-        <w:t xml:space="preserve">│       </w:t>
-      </w:r>
-      <w:r>
-        <w:rPr>
-          <w:rFonts w:ascii="MS Gothic" w:eastAsia="MS Gothic" w:hAnsi="MS Gothic" w:cs="MS Gothic" w:hint="eastAsia"/>
-        </w:rPr>
-        <w:t>├</w:t>
-      </w:r>
-      <w:r>
-        <w:rPr>
-          <w:rFonts w:ascii="Aptos" w:hAnsi="Aptos" w:cs="Aptos"/>
-        </w:rPr>
-        <w:t>──</w:t>
-      </w:r>
-      <w:r>
-        <w:t xml:space="preserve"> Legacy_GPT.csv</w:t>
-      </w:r>
-    </w:p>
-    <w:p>
-      <w:r>
-        <w:t>│       │</w:t>
-      </w:r>
-    </w:p>
-    <w:p>
-      <w:r>
-        <w:t xml:space="preserve">│       </w:t>
-      </w:r>
-      <w:r>
-        <w:rPr>
-          <w:rFonts w:ascii="MS Gothic" w:eastAsia="MS Gothic" w:hAnsi="MS Gothic" w:cs="MS Gothic" w:hint="eastAsia"/>
-        </w:rPr>
-        <w:t>├</w:t>
-      </w:r>
-      <w:r>
-        <w:rPr>
-          <w:rFonts w:ascii="Aptos" w:hAnsi="Aptos" w:cs="Aptos"/>
-        </w:rPr>
-        <w:t>──</w:t>
-      </w:r>
-      <w:r>
-        <w:t xml:space="preserve"> current_api_scoring_documents/</w:t>
-      </w:r>
-    </w:p>
-    <w:p>
-      <w:r>
-        <w:t>│       │   └── (documents scored using current model)</w:t>
-      </w:r>
-    </w:p>
-    <w:p>
-      <w:r>
-        <w:t>│       │</w:t>
-      </w:r>
-    </w:p>
-    <w:p>
-      <w:r>
-        <w:t>│       └── legacy_api_scoring_documents/</w:t>
-      </w:r>
-    </w:p>
-    <w:p>
-      <w:r>
-        <w:t>│           └── (documents scored using legacy model)</w:t>
-      </w:r>
-    </w:p>
-    <w:p>
-      <w:r>
-        <w:t>│</w:t>
-      </w:r>
-    </w:p>
-    <w:p>
-      <w:r>
-        <w:rPr>
-          <w:rFonts w:ascii="MS Gothic" w:eastAsia="MS Gothic" w:hAnsi="MS Gothic" w:cs="MS Gothic" w:hint="eastAsia"/>
-        </w:rPr>
-        <w:t>├</w:t>
-      </w:r>
-      <w:r>
-        <w:rPr>
-          <w:rFonts w:ascii="Aptos" w:hAnsi="Aptos" w:cs="Aptos"/>
-        </w:rPr>
-        <w:t>──</w:t>
-      </w:r>
-      <w:r>
-        <w:t xml:space="preserve"> scripts/</w:t>
-      </w:r>
-    </w:p>
-    <w:p>
-      <w:r>
-        <w:t>│   └── shared/</w:t>
-      </w:r>
-    </w:p>
-    <w:p>
-      <w:r>
-        <w:t>│       └── utils.py</w:t>
-      </w:r>
-    </w:p>
-    <w:p>
-      <w:r>
-        <w:t>│       └── validate_golden20.py</w:t>
-      </w:r>
-    </w:p>
-    <w:p/>
-    <w:p>
-      <w:r>
-        <w:t>│</w:t>
-      </w:r>
-    </w:p>
-    <w:p>
-      <w:r>
-        <w:rPr>
-          <w:rFonts w:ascii="MS Gothic" w:eastAsia="MS Gothic" w:hAnsi="MS Gothic" w:cs="MS Gothic" w:hint="eastAsia"/>
-        </w:rPr>
-        <w:t>├</w:t>
-      </w:r>
-      <w:r>
-        <w:rPr>
-          <w:rFonts w:ascii="Aptos" w:hAnsi="Aptos" w:cs="Aptos"/>
-        </w:rPr>
-        <w:t>──</w:t>
-      </w:r>
-      <w:r>
-        <w:t xml:space="preserve"> simple_ui/</w:t>
-      </w:r>
-    </w:p>
-    <w:p>
-      <w:r>
-        <w:t xml:space="preserve">│   </w:t>
-      </w:r>
-      <w:r>
-        <w:rPr>
-          <w:rFonts w:ascii="MS Gothic" w:eastAsia="MS Gothic" w:hAnsi="MS Gothic" w:cs="MS Gothic" w:hint="eastAsia"/>
-        </w:rPr>
-        <w:t>├</w:t>
-      </w:r>
-      <w:r>
-        <w:rPr>
-          <w:rFonts w:ascii="Aptos" w:hAnsi="Aptos" w:cs="Aptos"/>
-        </w:rPr>
-        <w:t>──</w:t>
-      </w:r>
-      <w:r>
-        <w:t xml:space="preserve"> shared/</w:t>
-      </w:r>
-    </w:p>
-    <w:p>
-      <w:r>
-        <w:t>│   │   └── script.js</w:t>
-      </w:r>
-    </w:p>
-    <w:p>
-      <w:r>
-        <w:t>│       └── index.html</w:t>
-      </w:r>
-    </w:p>
-    <w:p>
-      <w:r>
-        <w:t>│</w:t>
-      </w:r>
-    </w:p>
-    <w:p>
-      <w:r>
-        <w:rPr>
-          <w:rFonts w:ascii="MS Gothic" w:eastAsia="MS Gothic" w:hAnsi="MS Gothic" w:cs="MS Gothic" w:hint="eastAsia"/>
-        </w:rPr>
-        <w:lastRenderedPageBreak/>
         <w:t>├</w:t>
       </w:r>
       <w:r>
@@ -2645,12 +2646,12 @@
         </w:numPr>
       </w:pPr>
       <w:r>
+        <w:lastRenderedPageBreak/>
         <w:t>Final calibrated scores</w:t>
       </w:r>
     </w:p>
     <w:p>
       <w:r>
-        <w:lastRenderedPageBreak/>
         <w:t>The following metrics are tracked:</w:t>
       </w:r>
     </w:p>
@@ -2918,6 +2919,7 @@
           <w:b/>
           <w:bCs/>
         </w:rPr>
+        <w:lastRenderedPageBreak/>
         <w:t>95% Confidence Interval</w:t>
       </w:r>
       <w:r>
@@ -2936,7 +2938,6 @@
           <w:b/>
           <w:bCs/>
         </w:rPr>
-        <w:lastRenderedPageBreak/>
         <w:t>Mean calibrated score</w:t>
       </w:r>
     </w:p>
@@ -3140,12 +3141,12 @@
     </w:p>
     <w:p>
       <w:r>
+        <w:lastRenderedPageBreak/>
         <w:t>To run the Golden benchmark validation:</w:t>
       </w:r>
     </w:p>
     <w:p>
       <w:r>
-        <w:lastRenderedPageBreak/>
         <w:t xml:space="preserve">cd </w:t>
       </w:r>
       <w:r>
@@ -3370,6 +3371,7 @@
     </w:p>
     <w:p>
       <w:r>
+        <w:lastRenderedPageBreak/>
         <w:t>This ensures that automated scoring remains stable and consistent over time.</w:t>
       </w:r>
     </w:p>
@@ -3474,7 +3476,7 @@
         <w:t xml:space="preserve">Align Element </w:t>
       </w:r>
       <w:r>
-        <w:t>J, K</w:t>
+        <w:t>K</w:t>
       </w:r>
       <w:r>
         <w:t xml:space="preserve"> </w:t>
@@ -3529,6 +3531,9 @@
       </w:pPr>
       <w:r>
         <w:t>Retest all Legacy documents in their original form (rather than screenshots of the pdf documents) in an attempt to eliminate the processing difference for Legacy and Current models.</w:t>
+      </w:r>
+      <w:r>
+        <w:t xml:space="preserve">  Elements I through L are already tested with original Legacy documents.  They still show some differences that be accounted for by scorer and student evolution, but the results are much closer to being unified for Legacy and Current documents.</w:t>
       </w:r>
       <w:r>
         <w:pict w14:anchorId="35FA4AB3">

</xml_diff>

<commit_message>
Add Element K scoring and baselines
</commit_message>
<xml_diff>
--- a/Readme.docx
+++ b/Readme.docx
@@ -9,12 +9,21 @@
           <w:bCs/>
         </w:rPr>
       </w:pPr>
+      <w:proofErr w:type="spellStart"/>
       <w:r>
         <w:rPr>
           <w:b/>
           <w:bCs/>
         </w:rPr>
-        <w:t>GPTScorer – Element  Scoring Application</w:t>
+        <w:t>GPTScorer</w:t>
+      </w:r>
+      <w:proofErr w:type="spellEnd"/>
+      <w:r>
+        <w:rPr>
+          <w:b/>
+          <w:bCs/>
+        </w:rPr>
+        <w:t xml:space="preserve"> – Element  Scoring Application</w:t>
       </w:r>
     </w:p>
     <w:p>
@@ -25,7 +34,15 @@
         <w:t>validated</w:t>
       </w:r>
       <w:r>
-        <w:t xml:space="preserve"> scoring application for MyDesign – Element C (Presentation and Justification of Solution Design Requirements).</w:t>
+        <w:t xml:space="preserve"> scoring application for </w:t>
+      </w:r>
+      <w:proofErr w:type="spellStart"/>
+      <w:r>
+        <w:t>MyDesign</w:t>
+      </w:r>
+      <w:proofErr w:type="spellEnd"/>
+      <w:r>
+        <w:t xml:space="preserve"> – Element C (Presentation and Justification of Solution Design Requirements).</w:t>
       </w:r>
       <w:r>
         <w:t xml:space="preserve">  Element</w:t>
@@ -58,10 +75,7 @@
         <w:t xml:space="preserve">, I </w:t>
       </w:r>
       <w:r>
-        <w:t xml:space="preserve">and </w:t>
-      </w:r>
-      <w:r>
-        <w:t>J</w:t>
+        <w:t>,J and K</w:t>
       </w:r>
       <w:r>
         <w:t xml:space="preserve"> </w:t>
@@ -103,7 +117,19 @@
         <w:t>, H</w:t>
       </w:r>
       <w:r>
-        <w:t xml:space="preserve">, I and J </w:t>
+        <w:t>, I</w:t>
+      </w:r>
+      <w:r>
+        <w:t>, J</w:t>
+      </w:r>
+      <w:r>
+        <w:t xml:space="preserve"> and </w:t>
+      </w:r>
+      <w:r>
+        <w:t>K</w:t>
+      </w:r>
+      <w:r>
+        <w:t xml:space="preserve"> </w:t>
       </w:r>
       <w:r>
         <w:t>as well</w:t>
@@ -239,7 +265,15 @@
       </w:r>
       <w:r>
         <w:br/>
-        <w:t>Raw Element Score (mean of subscores)</w:t>
+        <w:t xml:space="preserve">Raw Element Score (mean of </w:t>
+      </w:r>
+      <w:proofErr w:type="spellStart"/>
+      <w:r>
+        <w:t>subscores</w:t>
+      </w:r>
+      <w:proofErr w:type="spellEnd"/>
+      <w:r>
+        <w:t>)</w:t>
       </w:r>
       <w:r>
         <w:br/>
@@ -871,8 +905,13 @@
     </w:p>
     <w:p>
       <w:r>
-        <w:t>set OPENAI_API_KEY=your_key_here</w:t>
-      </w:r>
+        <w:t>set OPENAI_API_KEY=</w:t>
+      </w:r>
+      <w:proofErr w:type="spellStart"/>
+      <w:r>
+        <w:t>your_key_here</w:t>
+      </w:r>
+      <w:proofErr w:type="spellEnd"/>
     </w:p>
     <w:p>
       <w:r>
@@ -935,11 +974,35 @@
     </w:p>
     <w:p>
       <w:r>
-        <w:t>python -m elements.element_C.score_with_API_C ^</w:t>
+        <w:t xml:space="preserve">python -m </w:t>
+      </w:r>
+      <w:proofErr w:type="spellStart"/>
+      <w:r>
+        <w:t>elements.element_C.score_with_API_C</w:t>
+      </w:r>
+      <w:proofErr w:type="spellEnd"/>
+      <w:r>
+        <w:t xml:space="preserve"> ^</w:t>
       </w:r>
       <w:r>
         <w:br/>
-        <w:t xml:space="preserve">  --folder elements/element_C/current_api_scoring_documents ^</w:t>
+        <w:t xml:space="preserve">  --folder elements/</w:t>
+      </w:r>
+      <w:proofErr w:type="spellStart"/>
+      <w:r>
+        <w:t>element_C</w:t>
+      </w:r>
+      <w:proofErr w:type="spellEnd"/>
+      <w:r>
+        <w:t>/</w:t>
+      </w:r>
+      <w:proofErr w:type="spellStart"/>
+      <w:r>
+        <w:t>current_api_scoring_documents</w:t>
+      </w:r>
+      <w:proofErr w:type="spellEnd"/>
+      <w:r>
+        <w:t xml:space="preserve"> ^</w:t>
       </w:r>
       <w:r>
         <w:br/>
@@ -949,7 +1012,15 @@
         <w:t xml:space="preserve"> </w:t>
       </w:r>
       <w:r>
-        <w:t>elements/element_C/</w:t>
+        <w:t>elements/</w:t>
+      </w:r>
+      <w:proofErr w:type="spellStart"/>
+      <w:r>
+        <w:t>element_C</w:t>
+      </w:r>
+      <w:proofErr w:type="spellEnd"/>
+      <w:r>
+        <w:t>/</w:t>
       </w:r>
       <w:r>
         <w:t>scored_results</w:t>
@@ -1276,8 +1347,13 @@
         </w:numPr>
       </w:pPr>
       <w:r>
-        <w:t>C1_expert – C_expert</w:t>
-      </w:r>
+        <w:t xml:space="preserve">C1_expert – </w:t>
+      </w:r>
+      <w:proofErr w:type="spellStart"/>
+      <w:r>
+        <w:t>C_expert</w:t>
+      </w:r>
+      <w:proofErr w:type="spellEnd"/>
       <w:r>
         <w:t xml:space="preserve"> scores</w:t>
       </w:r>
@@ -1357,8 +1433,21 @@
           <w:numId w:val="18"/>
         </w:numPr>
       </w:pPr>
-      <w:r>
-        <w:t>Element_score_raw, the average of the api scores</w:t>
+      <w:proofErr w:type="spellStart"/>
+      <w:r>
+        <w:t>Element_score_raw</w:t>
+      </w:r>
+      <w:proofErr w:type="spellEnd"/>
+      <w:r>
+        <w:t xml:space="preserve">, the average of the </w:t>
+      </w:r>
+      <w:proofErr w:type="spellStart"/>
+      <w:r>
+        <w:t>api</w:t>
+      </w:r>
+      <w:proofErr w:type="spellEnd"/>
+      <w:r>
+        <w:t xml:space="preserve"> scores</w:t>
       </w:r>
     </w:p>
     <w:p>
@@ -1410,9 +1499,11 @@
           <w:numId w:val="17"/>
         </w:numPr>
       </w:pPr>
+      <w:proofErr w:type="spellStart"/>
       <w:r>
         <w:t>element_score_raw</w:t>
       </w:r>
+      <w:proofErr w:type="spellEnd"/>
       <w:r>
         <w:tab/>
       </w:r>
@@ -1425,9 +1516,11 @@
           <w:numId w:val="17"/>
         </w:numPr>
       </w:pPr>
+      <w:proofErr w:type="spellStart"/>
       <w:r>
         <w:t>element_score_calibrated</w:t>
       </w:r>
+      <w:proofErr w:type="spellEnd"/>
       <w:r>
         <w:tab/>
       </w:r>
@@ -1440,9 +1533,11 @@
           <w:numId w:val="17"/>
         </w:numPr>
       </w:pPr>
+      <w:proofErr w:type="spellStart"/>
       <w:r>
         <w:t>calibration_delta</w:t>
       </w:r>
+      <w:proofErr w:type="spellEnd"/>
     </w:p>
     <w:p>
       <w:pPr>
@@ -1779,8 +1874,13 @@
           <w:numId w:val="12"/>
         </w:numPr>
       </w:pPr>
-      <w:r>
-        <w:t>Subscore drift analysis</w:t>
+      <w:proofErr w:type="spellStart"/>
+      <w:r>
+        <w:t>Subscore</w:t>
+      </w:r>
+      <w:proofErr w:type="spellEnd"/>
+      <w:r>
+        <w:t xml:space="preserve"> drift analysis</w:t>
       </w:r>
     </w:p>
     <w:p>
@@ -1825,7 +1925,23 @@
           <w:b/>
           <w:bCs/>
         </w:rPr>
-        <w:t xml:space="preserve"> (all core, scripts and simple_ui apps are now element agnostic to facilitate cloning the architecture for other elements)</w:t>
+        <w:t xml:space="preserve"> (all core, scripts and </w:t>
+      </w:r>
+      <w:proofErr w:type="spellStart"/>
+      <w:r>
+        <w:rPr>
+          <w:b/>
+          <w:bCs/>
+        </w:rPr>
+        <w:t>simple_ui</w:t>
+      </w:r>
+      <w:proofErr w:type="spellEnd"/>
+      <w:r>
+        <w:rPr>
+          <w:b/>
+          <w:bCs/>
+        </w:rPr>
+        <w:t xml:space="preserve"> apps are now element agnostic to facilitate cloning the architecture for other elements)</w:t>
       </w:r>
     </w:p>
     <w:p>
@@ -1840,8 +1956,13 @@
       <w:r>
         <w:t xml:space="preserve"> </w:t>
       </w:r>
-      <w:r>
-        <w:t>GPTScorer/</w:t>
+      <w:proofErr w:type="spellStart"/>
+      <w:r>
+        <w:t>GPTScorer</w:t>
+      </w:r>
+      <w:proofErr w:type="spellEnd"/>
+      <w:r>
+        <w:t>/</w:t>
       </w:r>
     </w:p>
     <w:p>
@@ -1916,58 +2037,148 @@
     </w:p>
     <w:p>
       <w:r>
-        <w:t xml:space="preserve"> │     └── element_A/ -  analogous to C</w:t>
-      </w:r>
-    </w:p>
-    <w:p>
-      <w:r>
-        <w:t xml:space="preserve"> │   └── element_B/ -  analogous to C</w:t>
-      </w:r>
-    </w:p>
-    <w:p>
-      <w:r>
-        <w:t xml:space="preserve"> │   └── element_D/ - analogous to C</w:t>
-      </w:r>
-    </w:p>
-    <w:p>
-      <w:r>
-        <w:t xml:space="preserve"> │   └── element_E/ -  analogous to C</w:t>
-      </w:r>
-    </w:p>
-    <w:p>
-      <w:r>
-        <w:t xml:space="preserve"> │   └── element_F/ -  analogous to C</w:t>
-      </w:r>
-    </w:p>
-    <w:p>
-      <w:r>
-        <w:t xml:space="preserve"> │   └── element_G/ -  analogous to C</w:t>
-      </w:r>
-    </w:p>
-    <w:p>
-      <w:r>
-        <w:t xml:space="preserve"> │   └── element_H/ -  analogous to C</w:t>
-      </w:r>
-    </w:p>
-    <w:p>
-      <w:r>
-        <w:t xml:space="preserve"> │   └── element_I/ -  analogous to C</w:t>
-      </w:r>
-    </w:p>
-    <w:p>
-      <w:r>
-        <w:t xml:space="preserve"> │   └── element_</w:t>
-      </w:r>
-      <w:r>
-        <w:t>J</w:t>
-      </w:r>
+        <w:t xml:space="preserve"> │     └── </w:t>
+      </w:r>
+      <w:proofErr w:type="spellStart"/>
+      <w:r>
+        <w:t>element_A</w:t>
+      </w:r>
+      <w:proofErr w:type="spellEnd"/>
       <w:r>
         <w:t>/ -  analogous to C</w:t>
       </w:r>
     </w:p>
     <w:p>
       <w:r>
-        <w:t xml:space="preserve"> │    └── element_C/</w:t>
+        <w:t xml:space="preserve"> │   └── </w:t>
+      </w:r>
+      <w:proofErr w:type="spellStart"/>
+      <w:r>
+        <w:t>element_B</w:t>
+      </w:r>
+      <w:proofErr w:type="spellEnd"/>
+      <w:r>
+        <w:t>/ -  analogous to C</w:t>
+      </w:r>
+    </w:p>
+    <w:p>
+      <w:r>
+        <w:t xml:space="preserve"> │   └── </w:t>
+      </w:r>
+      <w:proofErr w:type="spellStart"/>
+      <w:r>
+        <w:t>element_D</w:t>
+      </w:r>
+      <w:proofErr w:type="spellEnd"/>
+      <w:r>
+        <w:t>/ - analogous to C</w:t>
+      </w:r>
+    </w:p>
+    <w:p>
+      <w:r>
+        <w:t xml:space="preserve"> │   └── </w:t>
+      </w:r>
+      <w:proofErr w:type="spellStart"/>
+      <w:r>
+        <w:t>element_E</w:t>
+      </w:r>
+      <w:proofErr w:type="spellEnd"/>
+      <w:r>
+        <w:t>/ -  analogous to C</w:t>
+      </w:r>
+    </w:p>
+    <w:p>
+      <w:r>
+        <w:t xml:space="preserve"> │   └── </w:t>
+      </w:r>
+      <w:proofErr w:type="spellStart"/>
+      <w:r>
+        <w:t>element_F</w:t>
+      </w:r>
+      <w:proofErr w:type="spellEnd"/>
+      <w:r>
+        <w:t>/ -  analogous to C</w:t>
+      </w:r>
+    </w:p>
+    <w:p>
+      <w:r>
+        <w:t xml:space="preserve"> │   └── </w:t>
+      </w:r>
+      <w:proofErr w:type="spellStart"/>
+      <w:r>
+        <w:t>element_G</w:t>
+      </w:r>
+      <w:proofErr w:type="spellEnd"/>
+      <w:r>
+        <w:t>/ -  analogous to C</w:t>
+      </w:r>
+    </w:p>
+    <w:p>
+      <w:r>
+        <w:t xml:space="preserve"> │   └── </w:t>
+      </w:r>
+      <w:proofErr w:type="spellStart"/>
+      <w:r>
+        <w:t>element_H</w:t>
+      </w:r>
+      <w:proofErr w:type="spellEnd"/>
+      <w:r>
+        <w:t>/ -  analogous to C</w:t>
+      </w:r>
+    </w:p>
+    <w:p>
+      <w:r>
+        <w:t xml:space="preserve"> │   └── </w:t>
+      </w:r>
+      <w:proofErr w:type="spellStart"/>
+      <w:r>
+        <w:t>element_I</w:t>
+      </w:r>
+      <w:proofErr w:type="spellEnd"/>
+      <w:r>
+        <w:t>/ -  analogous to C</w:t>
+      </w:r>
+    </w:p>
+    <w:p>
+      <w:r>
+        <w:t xml:space="preserve"> │   └── </w:t>
+      </w:r>
+      <w:proofErr w:type="spellStart"/>
+      <w:r>
+        <w:t>element_J</w:t>
+      </w:r>
+      <w:proofErr w:type="spellEnd"/>
+      <w:r>
+        <w:t>/ -  analogous to C</w:t>
+      </w:r>
+    </w:p>
+    <w:p>
+      <w:r>
+        <w:t xml:space="preserve"> │   └── </w:t>
+      </w:r>
+      <w:proofErr w:type="spellStart"/>
+      <w:r>
+        <w:t>element_</w:t>
+      </w:r>
+      <w:r>
+        <w:t>K</w:t>
+      </w:r>
+      <w:proofErr w:type="spellEnd"/>
+      <w:r>
+        <w:t>/ -  analogous to C</w:t>
+      </w:r>
+    </w:p>
+    <w:p>
+      <w:r>
+        <w:t xml:space="preserve"> │    └── </w:t>
+      </w:r>
+      <w:proofErr w:type="spellStart"/>
+      <w:r>
+        <w:t>element_C</w:t>
+      </w:r>
+      <w:proofErr w:type="spellEnd"/>
+      <w:r>
+        <w:t>/</w:t>
       </w:r>
     </w:p>
     <w:p>
@@ -1990,8 +2201,13 @@
         <w:t>──</w:t>
       </w:r>
       <w:r>
-        <w:t xml:space="preserve"> golden_C_current.json</w:t>
-      </w:r>
+        <w:t xml:space="preserve"> </w:t>
+      </w:r>
+      <w:proofErr w:type="spellStart"/>
+      <w:r>
+        <w:t>golden_C_current.json</w:t>
+      </w:r>
+      <w:proofErr w:type="spellEnd"/>
     </w:p>
     <w:p>
       <w:r>
@@ -2013,8 +2229,13 @@
         <w:t>──</w:t>
       </w:r>
       <w:r>
-        <w:t xml:space="preserve"> golden_C_legacy.json</w:t>
-      </w:r>
+        <w:t xml:space="preserve"> </w:t>
+      </w:r>
+      <w:proofErr w:type="spellStart"/>
+      <w:r>
+        <w:t>golden_C_legacy.json</w:t>
+      </w:r>
+      <w:proofErr w:type="spellEnd"/>
     </w:p>
     <w:p>
       <w:r>
@@ -2135,53 +2356,149 @@
     </w:p>
     <w:p>
       <w:r>
-        <w:t xml:space="preserve"> │   └── element_A/ -  analogous to C</w:t>
-      </w:r>
-    </w:p>
-    <w:p>
-      <w:r>
-        <w:t xml:space="preserve"> │   └── element_B/ -  analogous to C</w:t>
-      </w:r>
-    </w:p>
-    <w:p>
-      <w:r>
-        <w:t xml:space="preserve"> │   └── element_D/ - analogous to C</w:t>
-      </w:r>
-    </w:p>
-    <w:p>
-      <w:r>
-        <w:t xml:space="preserve"> │   └── element_E/ -  analogous to C</w:t>
-      </w:r>
-    </w:p>
-    <w:p>
-      <w:r>
-        <w:t xml:space="preserve"> │   └── element_F/ -  analogous to C</w:t>
-      </w:r>
-    </w:p>
-    <w:p>
-      <w:r>
-        <w:t xml:space="preserve"> │   └── element_G/ -  analogous to C</w:t>
+        <w:t xml:space="preserve"> │   └── </w:t>
+      </w:r>
+      <w:proofErr w:type="spellStart"/>
+      <w:r>
+        <w:t>element_A</w:t>
+      </w:r>
+      <w:proofErr w:type="spellEnd"/>
+      <w:r>
+        <w:t>/ -  analogous to C</w:t>
+      </w:r>
+    </w:p>
+    <w:p>
+      <w:r>
+        <w:t xml:space="preserve"> │   └── </w:t>
+      </w:r>
+      <w:proofErr w:type="spellStart"/>
+      <w:r>
+        <w:t>element_B</w:t>
+      </w:r>
+      <w:proofErr w:type="spellEnd"/>
+      <w:r>
+        <w:t>/ -  analogous to C</w:t>
+      </w:r>
+    </w:p>
+    <w:p>
+      <w:r>
+        <w:t xml:space="preserve"> │   └── </w:t>
+      </w:r>
+      <w:proofErr w:type="spellStart"/>
+      <w:r>
+        <w:t>element_D</w:t>
+      </w:r>
+      <w:proofErr w:type="spellEnd"/>
+      <w:r>
+        <w:t>/ - analogous to C</w:t>
+      </w:r>
+    </w:p>
+    <w:p>
+      <w:r>
+        <w:t xml:space="preserve"> │   └── </w:t>
+      </w:r>
+      <w:proofErr w:type="spellStart"/>
+      <w:r>
+        <w:t>element_E</w:t>
+      </w:r>
+      <w:proofErr w:type="spellEnd"/>
+      <w:r>
+        <w:t>/ -  analogous to C</w:t>
+      </w:r>
+    </w:p>
+    <w:p>
+      <w:r>
+        <w:t xml:space="preserve"> │   └── </w:t>
+      </w:r>
+      <w:proofErr w:type="spellStart"/>
+      <w:r>
+        <w:t>element_F</w:t>
+      </w:r>
+      <w:proofErr w:type="spellEnd"/>
+      <w:r>
+        <w:t>/ -  analogous to C</w:t>
       </w:r>
     </w:p>
     <w:p>
       <w:r>
         <w:lastRenderedPageBreak/>
-        <w:t xml:space="preserve"> │   └── element_H/ -  analogous to C</w:t>
-      </w:r>
-    </w:p>
-    <w:p>
-      <w:r>
-        <w:t xml:space="preserve"> │   └── element_I/ -  analogous to C</w:t>
-      </w:r>
-    </w:p>
-    <w:p>
-      <w:r>
-        <w:t xml:space="preserve"> │   └── element_J/ -  analogous to C</w:t>
-      </w:r>
-    </w:p>
-    <w:p>
-      <w:r>
-        <w:t>│   └── element_C/</w:t>
+        <w:t xml:space="preserve"> │   └── </w:t>
+      </w:r>
+      <w:proofErr w:type="spellStart"/>
+      <w:r>
+        <w:t>element_G</w:t>
+      </w:r>
+      <w:proofErr w:type="spellEnd"/>
+      <w:r>
+        <w:t>/ -  analogous to C</w:t>
+      </w:r>
+    </w:p>
+    <w:p>
+      <w:r>
+        <w:t xml:space="preserve"> │   └── </w:t>
+      </w:r>
+      <w:proofErr w:type="spellStart"/>
+      <w:r>
+        <w:t>element_H</w:t>
+      </w:r>
+      <w:proofErr w:type="spellEnd"/>
+      <w:r>
+        <w:t>/ -  analogous to C</w:t>
+      </w:r>
+    </w:p>
+    <w:p>
+      <w:r>
+        <w:t xml:space="preserve"> │   └── </w:t>
+      </w:r>
+      <w:proofErr w:type="spellStart"/>
+      <w:r>
+        <w:t>element_I</w:t>
+      </w:r>
+      <w:proofErr w:type="spellEnd"/>
+      <w:r>
+        <w:t>/ -  analogous to C</w:t>
+      </w:r>
+    </w:p>
+    <w:p>
+      <w:r>
+        <w:t xml:space="preserve"> │   └── </w:t>
+      </w:r>
+      <w:proofErr w:type="spellStart"/>
+      <w:r>
+        <w:t>element_J</w:t>
+      </w:r>
+      <w:proofErr w:type="spellEnd"/>
+      <w:r>
+        <w:t>/ -  analogous to C</w:t>
+      </w:r>
+    </w:p>
+    <w:p>
+      <w:r>
+        <w:t xml:space="preserve"> │   └── </w:t>
+      </w:r>
+      <w:proofErr w:type="spellStart"/>
+      <w:r>
+        <w:t>element_</w:t>
+      </w:r>
+      <w:r>
+        <w:t>K</w:t>
+      </w:r>
+      <w:proofErr w:type="spellEnd"/>
+      <w:r>
+        <w:t>/ -  analogous to C</w:t>
+      </w:r>
+    </w:p>
+    <w:p>
+      <w:r>
+        <w:t xml:space="preserve">│   └── </w:t>
+      </w:r>
+      <w:proofErr w:type="spellStart"/>
+      <w:r>
+        <w:t>element_C</w:t>
+      </w:r>
+      <w:proofErr w:type="spellEnd"/>
+      <w:r>
+        <w:t>/</w:t>
       </w:r>
     </w:p>
     <w:p>
@@ -2291,7 +2608,15 @@
         <w:t>──</w:t>
       </w:r>
       <w:r>
-        <w:t xml:space="preserve"> current_api_scoring_documents/</w:t>
+        <w:t xml:space="preserve"> </w:t>
+      </w:r>
+      <w:proofErr w:type="spellStart"/>
+      <w:r>
+        <w:t>current_api_scoring_documents</w:t>
+      </w:r>
+      <w:proofErr w:type="spellEnd"/>
+      <w:r>
+        <w:t>/</w:t>
       </w:r>
     </w:p>
     <w:p>
@@ -2306,7 +2631,15 @@
     </w:p>
     <w:p>
       <w:r>
-        <w:t>│       └── legacy_api_scoring_documents/</w:t>
+        <w:t xml:space="preserve">│       └── </w:t>
+      </w:r>
+      <w:proofErr w:type="spellStart"/>
+      <w:r>
+        <w:t>legacy_api_scoring_documents</w:t>
+      </w:r>
+      <w:proofErr w:type="spellEnd"/>
+      <w:r>
+        <w:t>/</w:t>
       </w:r>
     </w:p>
     <w:p>
@@ -2371,7 +2704,15 @@
         <w:t>──</w:t>
       </w:r>
       <w:r>
-        <w:t xml:space="preserve"> simple_ui/</w:t>
+        <w:t xml:space="preserve"> </w:t>
+      </w:r>
+      <w:proofErr w:type="spellStart"/>
+      <w:r>
+        <w:t>simple_ui</w:t>
+      </w:r>
+      <w:proofErr w:type="spellEnd"/>
+      <w:r>
+        <w:t>/</w:t>
       </w:r>
     </w:p>
     <w:p>
@@ -2396,6 +2737,7 @@
     </w:p>
     <w:p>
       <w:r>
+        <w:lastRenderedPageBreak/>
         <w:t>│   │   └── script.js</w:t>
       </w:r>
     </w:p>
@@ -2406,7 +2748,6 @@
     </w:p>
     <w:p>
       <w:r>
-        <w:lastRenderedPageBreak/>
         <w:t>│</w:t>
       </w:r>
     </w:p>
@@ -2624,6 +2965,7 @@
     </w:p>
     <w:p>
       <w:r>
+        <w:lastRenderedPageBreak/>
         <w:t>After each batch scoring run, the system computes summary statistics for both:</w:t>
       </w:r>
     </w:p>
@@ -2635,8 +2977,13 @@
         </w:numPr>
       </w:pPr>
       <w:r>
-        <w:t>Raw API subscores</w:t>
-      </w:r>
+        <w:t xml:space="preserve">Raw API </w:t>
+      </w:r>
+      <w:proofErr w:type="spellStart"/>
+      <w:r>
+        <w:t>subscores</w:t>
+      </w:r>
+      <w:proofErr w:type="spellEnd"/>
     </w:p>
     <w:p>
       <w:pPr>
@@ -2646,7 +2993,6 @@
         </w:numPr>
       </w:pPr>
       <w:r>
-        <w:lastRenderedPageBreak/>
         <w:t>Final calibrated scores</w:t>
       </w:r>
     </w:p>
@@ -2883,6 +3229,7 @@
           <w:b/>
           <w:bCs/>
         </w:rPr>
+        <w:lastRenderedPageBreak/>
         <w:t>Bias</w:t>
       </w:r>
       <w:r>
@@ -2919,7 +3266,6 @@
           <w:b/>
           <w:bCs/>
         </w:rPr>
-        <w:lastRenderedPageBreak/>
         <w:t>95% Confidence Interval</w:t>
       </w:r>
       <w:r>
@@ -2996,8 +3342,13 @@
           <w:numId w:val="25"/>
         </w:numPr>
       </w:pPr>
-      <w:r>
-        <w:t>Subscores (C1–C6) are stored in cache files</w:t>
+      <w:proofErr w:type="spellStart"/>
+      <w:r>
+        <w:t>Subscores</w:t>
+      </w:r>
+      <w:proofErr w:type="spellEnd"/>
+      <w:r>
+        <w:t xml:space="preserve"> (C1–C6) are stored in cache files</w:t>
       </w:r>
     </w:p>
     <w:p>
@@ -3104,13 +3455,19 @@
       </w:r>
     </w:p>
     <w:p>
+      <w:proofErr w:type="spellStart"/>
       <w:r>
         <w:t>golden_C_current_metrics.json</w:t>
       </w:r>
+      <w:proofErr w:type="spellEnd"/>
       <w:r>
         <w:br/>
+      </w:r>
+      <w:proofErr w:type="spellStart"/>
+      <w:r>
         <w:t>golden_C_legacy_metrics.json</w:t>
       </w:r>
+      <w:proofErr w:type="spellEnd"/>
     </w:p>
     <w:p>
       <w:r>
@@ -3119,6 +3476,7 @@
     </w:p>
     <w:p>
       <w:r>
+        <w:lastRenderedPageBreak/>
         <w:pict w14:anchorId="4299744F">
           <v:rect id="_x0000_i1040" style="width:0;height:1.5pt" o:hralign="center" o:hrstd="t" o:hr="t" fillcolor="#a0a0a0" stroked="f"/>
         </w:pict>
@@ -3141,7 +3499,6 @@
     </w:p>
     <w:p>
       <w:r>
-        <w:lastRenderedPageBreak/>
         <w:t>To run the Golden benchmark validation:</w:t>
       </w:r>
     </w:p>
@@ -3260,20 +3617,36 @@
       </w:r>
       <w:r>
         <w:br/>
+      </w:r>
+      <w:proofErr w:type="spellStart"/>
+      <w:r>
         <w:t>golden_C_current_cases.json</w:t>
       </w:r>
+      <w:proofErr w:type="spellEnd"/>
       <w:r>
         <w:br/>
+      </w:r>
+      <w:proofErr w:type="spellStart"/>
+      <w:r>
         <w:t>golden_C_legacy_cases.json</w:t>
       </w:r>
+      <w:proofErr w:type="spellEnd"/>
       <w:r>
         <w:br/>
+      </w:r>
+      <w:proofErr w:type="spellStart"/>
+      <w:r>
         <w:t>golden_C_current_metrics.json</w:t>
       </w:r>
+      <w:proofErr w:type="spellEnd"/>
       <w:r>
         <w:br/>
+      </w:r>
+      <w:proofErr w:type="spellStart"/>
+      <w:r>
         <w:t>golden_C_legacy_metrics.json</w:t>
       </w:r>
+      <w:proofErr w:type="spellEnd"/>
       <w:r>
         <w:br/>
         <w:t>golden20_api_scores_current.json</w:t>
@@ -3355,6 +3728,7 @@
         </w:numPr>
       </w:pPr>
       <w:r>
+        <w:lastRenderedPageBreak/>
         <w:t>scoring pipeline errors</w:t>
       </w:r>
     </w:p>
@@ -3371,7 +3745,6 @@
     </w:p>
     <w:p>
       <w:r>
-        <w:lastRenderedPageBreak/>
         <w:t>This ensures that automated scoring remains stable and consistent over time.</w:t>
       </w:r>
     </w:p>
@@ -3473,19 +3846,13 @@
         </w:numPr>
       </w:pPr>
       <w:r>
-        <w:t xml:space="preserve">Align Element </w:t>
-      </w:r>
-      <w:r>
-        <w:t>K</w:t>
+        <w:t>Align Element</w:t>
       </w:r>
       <w:r>
         <w:t xml:space="preserve"> </w:t>
       </w:r>
       <w:r>
-        <w:t>and</w:t>
-      </w:r>
-      <w:r>
-        <w:t xml:space="preserve"> L</w:t>
+        <w:t>L</w:t>
       </w:r>
       <w:r>
         <w:t xml:space="preserve"> with this architecture</w:t>
@@ -3518,8 +3885,13 @@
         </w:numPr>
       </w:pPr>
       <w:r>
-        <w:t>Support integration with MyDesign</w:t>
-      </w:r>
+        <w:t xml:space="preserve">Support integration with </w:t>
+      </w:r>
+      <w:proofErr w:type="spellStart"/>
+      <w:r>
+        <w:t>MyDesign</w:t>
+      </w:r>
+      <w:proofErr w:type="spellEnd"/>
     </w:p>
     <w:p>
       <w:pPr>

</xml_diff>

<commit_message>
Add Element L scoring, rule pipeline, and baselines
</commit_message>
<xml_diff>
--- a/Readme.docx
+++ b/Readme.docx
@@ -9,21 +9,12 @@
           <w:bCs/>
         </w:rPr>
       </w:pPr>
-      <w:proofErr w:type="spellStart"/>
       <w:r>
         <w:rPr>
           <w:b/>
           <w:bCs/>
         </w:rPr>
-        <w:t>GPTScorer</w:t>
-      </w:r>
-      <w:proofErr w:type="spellEnd"/>
-      <w:r>
-        <w:rPr>
-          <w:b/>
-          <w:bCs/>
-        </w:rPr>
-        <w:t xml:space="preserve"> – Element  Scoring Application</w:t>
+        <w:t>GPTScorer – Element  Scoring Application</w:t>
       </w:r>
     </w:p>
     <w:p>
@@ -34,15 +25,7 @@
         <w:t>validated</w:t>
       </w:r>
       <w:r>
-        <w:t xml:space="preserve"> scoring application for </w:t>
-      </w:r>
-      <w:proofErr w:type="spellStart"/>
-      <w:r>
-        <w:t>MyDesign</w:t>
-      </w:r>
-      <w:proofErr w:type="spellEnd"/>
-      <w:r>
-        <w:t xml:space="preserve"> – Element C (Presentation and Justification of Solution Design Requirements).</w:t>
+        <w:t xml:space="preserve"> scoring application for MyDesign – Element C (Presentation and Justification of Solution Design Requirements).</w:t>
       </w:r>
       <w:r>
         <w:t xml:space="preserve">  Element</w:t>
@@ -75,10 +58,10 @@
         <w:t xml:space="preserve">, I </w:t>
       </w:r>
       <w:r>
-        <w:t>,J and K</w:t>
-      </w:r>
-      <w:r>
-        <w:t xml:space="preserve"> </w:t>
+        <w:t>,J</w:t>
+      </w:r>
+      <w:r>
+        <w:t xml:space="preserve">, K and L </w:t>
       </w:r>
       <w:r>
         <w:t>have</w:t>
@@ -123,10 +106,13 @@
         <w:t>, J</w:t>
       </w:r>
       <w:r>
-        <w:t xml:space="preserve"> and </w:t>
-      </w:r>
-      <w:r>
-        <w:t>K</w:t>
+        <w:t xml:space="preserve">, K </w:t>
+      </w:r>
+      <w:r>
+        <w:t xml:space="preserve">and </w:t>
+      </w:r>
+      <w:r>
+        <w:t>L</w:t>
       </w:r>
       <w:r>
         <w:t xml:space="preserve"> </w:t>
@@ -265,15 +251,7 @@
       </w:r>
       <w:r>
         <w:br/>
-        <w:t xml:space="preserve">Raw Element Score (mean of </w:t>
-      </w:r>
-      <w:proofErr w:type="spellStart"/>
-      <w:r>
-        <w:t>subscores</w:t>
-      </w:r>
-      <w:proofErr w:type="spellEnd"/>
-      <w:r>
-        <w:t>)</w:t>
+        <w:t>Raw Element Score (mean of subscores)</w:t>
       </w:r>
       <w:r>
         <w:br/>
@@ -905,13 +883,8 @@
     </w:p>
     <w:p>
       <w:r>
-        <w:t>set OPENAI_API_KEY=</w:t>
-      </w:r>
-      <w:proofErr w:type="spellStart"/>
-      <w:r>
-        <w:t>your_key_here</w:t>
-      </w:r>
-      <w:proofErr w:type="spellEnd"/>
+        <w:t>set OPENAI_API_KEY=your_key_here</w:t>
+      </w:r>
     </w:p>
     <w:p>
       <w:r>
@@ -974,35 +947,11 @@
     </w:p>
     <w:p>
       <w:r>
-        <w:t xml:space="preserve">python -m </w:t>
-      </w:r>
-      <w:proofErr w:type="spellStart"/>
-      <w:r>
-        <w:t>elements.element_C.score_with_API_C</w:t>
-      </w:r>
-      <w:proofErr w:type="spellEnd"/>
-      <w:r>
-        <w:t xml:space="preserve"> ^</w:t>
+        <w:t>python -m elements.element_C.score_with_API_C ^</w:t>
       </w:r>
       <w:r>
         <w:br/>
-        <w:t xml:space="preserve">  --folder elements/</w:t>
-      </w:r>
-      <w:proofErr w:type="spellStart"/>
-      <w:r>
-        <w:t>element_C</w:t>
-      </w:r>
-      <w:proofErr w:type="spellEnd"/>
-      <w:r>
-        <w:t>/</w:t>
-      </w:r>
-      <w:proofErr w:type="spellStart"/>
-      <w:r>
-        <w:t>current_api_scoring_documents</w:t>
-      </w:r>
-      <w:proofErr w:type="spellEnd"/>
-      <w:r>
-        <w:t xml:space="preserve"> ^</w:t>
+        <w:t xml:space="preserve">  --folder elements/element_C/current_api_scoring_documents ^</w:t>
       </w:r>
       <w:r>
         <w:br/>
@@ -1012,15 +961,7 @@
         <w:t xml:space="preserve"> </w:t>
       </w:r>
       <w:r>
-        <w:t>elements/</w:t>
-      </w:r>
-      <w:proofErr w:type="spellStart"/>
-      <w:r>
-        <w:t>element_C</w:t>
-      </w:r>
-      <w:proofErr w:type="spellEnd"/>
-      <w:r>
-        <w:t>/</w:t>
+        <w:t>elements/element_C/</w:t>
       </w:r>
       <w:r>
         <w:t>scored_results</w:t>
@@ -1347,13 +1288,8 @@
         </w:numPr>
       </w:pPr>
       <w:r>
-        <w:t xml:space="preserve">C1_expert – </w:t>
-      </w:r>
-      <w:proofErr w:type="spellStart"/>
-      <w:r>
-        <w:t>C_expert</w:t>
-      </w:r>
-      <w:proofErr w:type="spellEnd"/>
+        <w:t>C1_expert – C_expert</w:t>
+      </w:r>
       <w:r>
         <w:t xml:space="preserve"> scores</w:t>
       </w:r>
@@ -1433,21 +1369,8 @@
           <w:numId w:val="18"/>
         </w:numPr>
       </w:pPr>
-      <w:proofErr w:type="spellStart"/>
-      <w:r>
-        <w:t>Element_score_raw</w:t>
-      </w:r>
-      <w:proofErr w:type="spellEnd"/>
-      <w:r>
-        <w:t xml:space="preserve">, the average of the </w:t>
-      </w:r>
-      <w:proofErr w:type="spellStart"/>
-      <w:r>
-        <w:t>api</w:t>
-      </w:r>
-      <w:proofErr w:type="spellEnd"/>
-      <w:r>
-        <w:t xml:space="preserve"> scores</w:t>
+      <w:r>
+        <w:t>Element_score_raw, the average of the api scores</w:t>
       </w:r>
     </w:p>
     <w:p>
@@ -1499,11 +1422,9 @@
           <w:numId w:val="17"/>
         </w:numPr>
       </w:pPr>
-      <w:proofErr w:type="spellStart"/>
       <w:r>
         <w:t>element_score_raw</w:t>
       </w:r>
-      <w:proofErr w:type="spellEnd"/>
       <w:r>
         <w:tab/>
       </w:r>
@@ -1516,11 +1437,9 @@
           <w:numId w:val="17"/>
         </w:numPr>
       </w:pPr>
-      <w:proofErr w:type="spellStart"/>
       <w:r>
         <w:t>element_score_calibrated</w:t>
       </w:r>
-      <w:proofErr w:type="spellEnd"/>
       <w:r>
         <w:tab/>
       </w:r>
@@ -1533,11 +1452,9 @@
           <w:numId w:val="17"/>
         </w:numPr>
       </w:pPr>
-      <w:proofErr w:type="spellStart"/>
       <w:r>
         <w:t>calibration_delta</w:t>
       </w:r>
-      <w:proofErr w:type="spellEnd"/>
     </w:p>
     <w:p>
       <w:pPr>
@@ -1874,13 +1791,8 @@
           <w:numId w:val="12"/>
         </w:numPr>
       </w:pPr>
-      <w:proofErr w:type="spellStart"/>
-      <w:r>
-        <w:t>Subscore</w:t>
-      </w:r>
-      <w:proofErr w:type="spellEnd"/>
-      <w:r>
-        <w:t xml:space="preserve"> drift analysis</w:t>
+      <w:r>
+        <w:t>Subscore drift analysis</w:t>
       </w:r>
     </w:p>
     <w:p>
@@ -1925,23 +1837,7 @@
           <w:b/>
           <w:bCs/>
         </w:rPr>
-        <w:t xml:space="preserve"> (all core, scripts and </w:t>
-      </w:r>
-      <w:proofErr w:type="spellStart"/>
-      <w:r>
-        <w:rPr>
-          <w:b/>
-          <w:bCs/>
-        </w:rPr>
-        <w:t>simple_ui</w:t>
-      </w:r>
-      <w:proofErr w:type="spellEnd"/>
-      <w:r>
-        <w:rPr>
-          <w:b/>
-          <w:bCs/>
-        </w:rPr>
-        <w:t xml:space="preserve"> apps are now element agnostic to facilitate cloning the architecture for other elements)</w:t>
+        <w:t xml:space="preserve"> (all core, scripts and simple_ui apps are now element agnostic to facilitate cloning the architecture for other elements)</w:t>
       </w:r>
     </w:p>
     <w:p>
@@ -1956,13 +1852,8 @@
       <w:r>
         <w:t xml:space="preserve"> </w:t>
       </w:r>
-      <w:proofErr w:type="spellStart"/>
-      <w:r>
-        <w:t>GPTScorer</w:t>
-      </w:r>
-      <w:proofErr w:type="spellEnd"/>
-      <w:r>
-        <w:t>/</w:t>
+      <w:r>
+        <w:t>GPTScorer/</w:t>
       </w:r>
     </w:p>
     <w:p>
@@ -2037,148 +1928,68 @@
     </w:p>
     <w:p>
       <w:r>
-        <w:t xml:space="preserve"> │     └── </w:t>
-      </w:r>
-      <w:proofErr w:type="spellStart"/>
-      <w:r>
-        <w:t>element_A</w:t>
-      </w:r>
-      <w:proofErr w:type="spellEnd"/>
+        <w:t xml:space="preserve"> │     └── element_A/ -  analogous to C</w:t>
+      </w:r>
+    </w:p>
+    <w:p>
+      <w:r>
+        <w:t xml:space="preserve"> │   └── element_B/ -  analogous to C</w:t>
+      </w:r>
+    </w:p>
+    <w:p>
+      <w:r>
+        <w:t xml:space="preserve"> │   └── element_D/ - analogous to C</w:t>
+      </w:r>
+    </w:p>
+    <w:p>
+      <w:r>
+        <w:t xml:space="preserve"> │   └── element_E/ -  analogous to C</w:t>
+      </w:r>
+    </w:p>
+    <w:p>
+      <w:r>
+        <w:t xml:space="preserve"> │   └── element_F/ -  analogous to C</w:t>
+      </w:r>
+    </w:p>
+    <w:p>
+      <w:r>
+        <w:t xml:space="preserve"> │   └── element_G/ -  analogous to C</w:t>
+      </w:r>
+    </w:p>
+    <w:p>
+      <w:r>
+        <w:t xml:space="preserve"> │   └── element_H/ -  analogous to C</w:t>
+      </w:r>
+    </w:p>
+    <w:p>
+      <w:r>
+        <w:t xml:space="preserve"> │   └── element_I/ -  analogous to C</w:t>
+      </w:r>
+    </w:p>
+    <w:p>
+      <w:r>
+        <w:t xml:space="preserve"> │   └── element_J/ -  analogous to C</w:t>
+      </w:r>
+    </w:p>
+    <w:p>
+      <w:r>
+        <w:t xml:space="preserve"> │   └── element_K/ -  analogous to C</w:t>
+      </w:r>
+    </w:p>
+    <w:p>
+      <w:r>
+        <w:t xml:space="preserve"> │   └── element_</w:t>
+      </w:r>
+      <w:r>
+        <w:t>L</w:t>
+      </w:r>
       <w:r>
         <w:t>/ -  analogous to C</w:t>
       </w:r>
     </w:p>
     <w:p>
       <w:r>
-        <w:t xml:space="preserve"> │   └── </w:t>
-      </w:r>
-      <w:proofErr w:type="spellStart"/>
-      <w:r>
-        <w:t>element_B</w:t>
-      </w:r>
-      <w:proofErr w:type="spellEnd"/>
-      <w:r>
-        <w:t>/ -  analogous to C</w:t>
-      </w:r>
-    </w:p>
-    <w:p>
-      <w:r>
-        <w:t xml:space="preserve"> │   └── </w:t>
-      </w:r>
-      <w:proofErr w:type="spellStart"/>
-      <w:r>
-        <w:t>element_D</w:t>
-      </w:r>
-      <w:proofErr w:type="spellEnd"/>
-      <w:r>
-        <w:t>/ - analogous to C</w:t>
-      </w:r>
-    </w:p>
-    <w:p>
-      <w:r>
-        <w:t xml:space="preserve"> │   └── </w:t>
-      </w:r>
-      <w:proofErr w:type="spellStart"/>
-      <w:r>
-        <w:t>element_E</w:t>
-      </w:r>
-      <w:proofErr w:type="spellEnd"/>
-      <w:r>
-        <w:t>/ -  analogous to C</w:t>
-      </w:r>
-    </w:p>
-    <w:p>
-      <w:r>
-        <w:t xml:space="preserve"> │   └── </w:t>
-      </w:r>
-      <w:proofErr w:type="spellStart"/>
-      <w:r>
-        <w:t>element_F</w:t>
-      </w:r>
-      <w:proofErr w:type="spellEnd"/>
-      <w:r>
-        <w:t>/ -  analogous to C</w:t>
-      </w:r>
-    </w:p>
-    <w:p>
-      <w:r>
-        <w:t xml:space="preserve"> │   └── </w:t>
-      </w:r>
-      <w:proofErr w:type="spellStart"/>
-      <w:r>
-        <w:t>element_G</w:t>
-      </w:r>
-      <w:proofErr w:type="spellEnd"/>
-      <w:r>
-        <w:t>/ -  analogous to C</w:t>
-      </w:r>
-    </w:p>
-    <w:p>
-      <w:r>
-        <w:t xml:space="preserve"> │   └── </w:t>
-      </w:r>
-      <w:proofErr w:type="spellStart"/>
-      <w:r>
-        <w:t>element_H</w:t>
-      </w:r>
-      <w:proofErr w:type="spellEnd"/>
-      <w:r>
-        <w:t>/ -  analogous to C</w:t>
-      </w:r>
-    </w:p>
-    <w:p>
-      <w:r>
-        <w:t xml:space="preserve"> │   └── </w:t>
-      </w:r>
-      <w:proofErr w:type="spellStart"/>
-      <w:r>
-        <w:t>element_I</w:t>
-      </w:r>
-      <w:proofErr w:type="spellEnd"/>
-      <w:r>
-        <w:t>/ -  analogous to C</w:t>
-      </w:r>
-    </w:p>
-    <w:p>
-      <w:r>
-        <w:t xml:space="preserve"> │   └── </w:t>
-      </w:r>
-      <w:proofErr w:type="spellStart"/>
-      <w:r>
-        <w:t>element_J</w:t>
-      </w:r>
-      <w:proofErr w:type="spellEnd"/>
-      <w:r>
-        <w:t>/ -  analogous to C</w:t>
-      </w:r>
-    </w:p>
-    <w:p>
-      <w:r>
-        <w:t xml:space="preserve"> │   └── </w:t>
-      </w:r>
-      <w:proofErr w:type="spellStart"/>
-      <w:r>
-        <w:t>element_</w:t>
-      </w:r>
-      <w:r>
-        <w:t>K</w:t>
-      </w:r>
-      <w:proofErr w:type="spellEnd"/>
-      <w:r>
-        <w:t>/ -  analogous to C</w:t>
-      </w:r>
-    </w:p>
-    <w:p>
-      <w:r>
-        <w:t xml:space="preserve"> │    └── </w:t>
-      </w:r>
-      <w:proofErr w:type="spellStart"/>
-      <w:r>
-        <w:t>element_C</w:t>
-      </w:r>
-      <w:proofErr w:type="spellEnd"/>
-      <w:r>
-        <w:t>/</w:t>
+        <w:t xml:space="preserve"> │    └── element_C/</w:t>
       </w:r>
     </w:p>
     <w:p>
@@ -2201,13 +2012,8 @@
         <w:t>──</w:t>
       </w:r>
       <w:r>
-        <w:t xml:space="preserve"> </w:t>
-      </w:r>
-      <w:proofErr w:type="spellStart"/>
-      <w:r>
-        <w:t>golden_C_current.json</w:t>
-      </w:r>
-      <w:proofErr w:type="spellEnd"/>
+        <w:t xml:space="preserve"> golden_C_current.json</w:t>
+      </w:r>
     </w:p>
     <w:p>
       <w:r>
@@ -2229,13 +2035,8 @@
         <w:t>──</w:t>
       </w:r>
       <w:r>
-        <w:t xml:space="preserve"> </w:t>
-      </w:r>
-      <w:proofErr w:type="spellStart"/>
-      <w:r>
-        <w:t>golden_C_legacy.json</w:t>
-      </w:r>
-      <w:proofErr w:type="spellEnd"/>
+        <w:t xml:space="preserve"> golden_C_legacy.json</w:t>
+      </w:r>
     </w:p>
     <w:p>
       <w:r>
@@ -2356,149 +2157,63 @@
     </w:p>
     <w:p>
       <w:r>
-        <w:t xml:space="preserve"> │   └── </w:t>
-      </w:r>
-      <w:proofErr w:type="spellStart"/>
-      <w:r>
-        <w:t>element_A</w:t>
-      </w:r>
-      <w:proofErr w:type="spellEnd"/>
-      <w:r>
-        <w:t>/ -  analogous to C</w:t>
-      </w:r>
-    </w:p>
-    <w:p>
-      <w:r>
-        <w:t xml:space="preserve"> │   └── </w:t>
-      </w:r>
-      <w:proofErr w:type="spellStart"/>
-      <w:r>
-        <w:t>element_B</w:t>
-      </w:r>
-      <w:proofErr w:type="spellEnd"/>
-      <w:r>
-        <w:t>/ -  analogous to C</w:t>
-      </w:r>
-    </w:p>
-    <w:p>
-      <w:r>
-        <w:t xml:space="preserve"> │   └── </w:t>
-      </w:r>
-      <w:proofErr w:type="spellStart"/>
-      <w:r>
-        <w:t>element_D</w:t>
-      </w:r>
-      <w:proofErr w:type="spellEnd"/>
-      <w:r>
-        <w:t>/ - analogous to C</w:t>
-      </w:r>
-    </w:p>
-    <w:p>
-      <w:r>
-        <w:t xml:space="preserve"> │   └── </w:t>
-      </w:r>
-      <w:proofErr w:type="spellStart"/>
-      <w:r>
-        <w:t>element_E</w:t>
-      </w:r>
-      <w:proofErr w:type="spellEnd"/>
-      <w:r>
-        <w:t>/ -  analogous to C</w:t>
-      </w:r>
-    </w:p>
-    <w:p>
-      <w:r>
-        <w:t xml:space="preserve"> │   └── </w:t>
-      </w:r>
-      <w:proofErr w:type="spellStart"/>
-      <w:r>
-        <w:t>element_F</w:t>
-      </w:r>
-      <w:proofErr w:type="spellEnd"/>
-      <w:r>
-        <w:t>/ -  analogous to C</w:t>
+        <w:t xml:space="preserve"> │   └── element_A/ -  analogous to C</w:t>
+      </w:r>
+    </w:p>
+    <w:p>
+      <w:r>
+        <w:t xml:space="preserve"> │   └── element_B/ -  analogous to C</w:t>
+      </w:r>
+    </w:p>
+    <w:p>
+      <w:r>
+        <w:t xml:space="preserve"> │   └── element_D/ - analogous to C</w:t>
+      </w:r>
+    </w:p>
+    <w:p>
+      <w:r>
+        <w:t xml:space="preserve"> │   └── element_E/ -  analogous to C</w:t>
       </w:r>
     </w:p>
     <w:p>
       <w:r>
         <w:lastRenderedPageBreak/>
-        <w:t xml:space="preserve"> │   └── </w:t>
-      </w:r>
-      <w:proofErr w:type="spellStart"/>
-      <w:r>
-        <w:t>element_G</w:t>
-      </w:r>
-      <w:proofErr w:type="spellEnd"/>
-      <w:r>
-        <w:t>/ -  analogous to C</w:t>
-      </w:r>
-    </w:p>
-    <w:p>
-      <w:r>
-        <w:t xml:space="preserve"> │   └── </w:t>
-      </w:r>
-      <w:proofErr w:type="spellStart"/>
-      <w:r>
-        <w:t>element_H</w:t>
-      </w:r>
-      <w:proofErr w:type="spellEnd"/>
-      <w:r>
-        <w:t>/ -  analogous to C</w:t>
-      </w:r>
-    </w:p>
-    <w:p>
-      <w:r>
-        <w:t xml:space="preserve"> │   └── </w:t>
-      </w:r>
-      <w:proofErr w:type="spellStart"/>
-      <w:r>
-        <w:t>element_I</w:t>
-      </w:r>
-      <w:proofErr w:type="spellEnd"/>
-      <w:r>
-        <w:t>/ -  analogous to C</w:t>
-      </w:r>
-    </w:p>
-    <w:p>
-      <w:r>
-        <w:t xml:space="preserve"> │   └── </w:t>
-      </w:r>
-      <w:proofErr w:type="spellStart"/>
-      <w:r>
-        <w:t>element_J</w:t>
-      </w:r>
-      <w:proofErr w:type="spellEnd"/>
-      <w:r>
-        <w:t>/ -  analogous to C</w:t>
-      </w:r>
-    </w:p>
-    <w:p>
-      <w:r>
-        <w:t xml:space="preserve"> │   └── </w:t>
-      </w:r>
-      <w:proofErr w:type="spellStart"/>
-      <w:r>
-        <w:t>element_</w:t>
-      </w:r>
-      <w:r>
-        <w:t>K</w:t>
-      </w:r>
-      <w:proofErr w:type="spellEnd"/>
-      <w:r>
-        <w:t>/ -  analogous to C</w:t>
-      </w:r>
-    </w:p>
-    <w:p>
-      <w:r>
-        <w:t xml:space="preserve">│   └── </w:t>
-      </w:r>
-      <w:proofErr w:type="spellStart"/>
-      <w:r>
-        <w:t>element_C</w:t>
-      </w:r>
-      <w:proofErr w:type="spellEnd"/>
-      <w:r>
-        <w:t>/</w:t>
+        <w:t xml:space="preserve"> │   └── element_F/ -  analogous to C</w:t>
+      </w:r>
+    </w:p>
+    <w:p>
+      <w:r>
+        <w:t xml:space="preserve"> │   └── element_G/ -  analogous to C</w:t>
+      </w:r>
+    </w:p>
+    <w:p>
+      <w:r>
+        <w:t xml:space="preserve"> │   └── element_H/ -  analogous to C</w:t>
+      </w:r>
+    </w:p>
+    <w:p>
+      <w:r>
+        <w:t xml:space="preserve"> │   └── element_I/ -  analogous to C</w:t>
+      </w:r>
+    </w:p>
+    <w:p>
+      <w:r>
+        <w:t xml:space="preserve"> │   └── element_J/ -  analogous to C</w:t>
+      </w:r>
+    </w:p>
+    <w:p>
+      <w:r>
+        <w:t xml:space="preserve"> │   └── element_K/ -  analogous to C</w:t>
+      </w:r>
+    </w:p>
+    <w:p>
+      <w:r>
+        <w:t xml:space="preserve"> │   └── element_L/ -  analogous to C</w:t>
+      </w:r>
+    </w:p>
+    <w:p>
+      <w:r>
+        <w:t>│   └── element_C/</w:t>
       </w:r>
     </w:p>
     <w:p>
@@ -2608,15 +2323,7 @@
         <w:t>──</w:t>
       </w:r>
       <w:r>
-        <w:t xml:space="preserve"> </w:t>
-      </w:r>
-      <w:proofErr w:type="spellStart"/>
-      <w:r>
-        <w:t>current_api_scoring_documents</w:t>
-      </w:r>
-      <w:proofErr w:type="spellEnd"/>
-      <w:r>
-        <w:t>/</w:t>
+        <w:t xml:space="preserve"> current_api_scoring_documents/</w:t>
       </w:r>
     </w:p>
     <w:p>
@@ -2631,15 +2338,7 @@
     </w:p>
     <w:p>
       <w:r>
-        <w:t xml:space="preserve">│       └── </w:t>
-      </w:r>
-      <w:proofErr w:type="spellStart"/>
-      <w:r>
-        <w:t>legacy_api_scoring_documents</w:t>
-      </w:r>
-      <w:proofErr w:type="spellEnd"/>
-      <w:r>
-        <w:t>/</w:t>
+        <w:t>│       └── legacy_api_scoring_documents/</w:t>
       </w:r>
     </w:p>
     <w:p>
@@ -2695,6 +2394,7 @@
         <w:rPr>
           <w:rFonts w:ascii="MS Gothic" w:eastAsia="MS Gothic" w:hAnsi="MS Gothic" w:cs="MS Gothic" w:hint="eastAsia"/>
         </w:rPr>
+        <w:lastRenderedPageBreak/>
         <w:t>├</w:t>
       </w:r>
       <w:r>
@@ -2704,15 +2404,7 @@
         <w:t>──</w:t>
       </w:r>
       <w:r>
-        <w:t xml:space="preserve"> </w:t>
-      </w:r>
-      <w:proofErr w:type="spellStart"/>
-      <w:r>
-        <w:t>simple_ui</w:t>
-      </w:r>
-      <w:proofErr w:type="spellEnd"/>
-      <w:r>
-        <w:t>/</w:t>
+        <w:t xml:space="preserve"> simple_ui/</w:t>
       </w:r>
     </w:p>
     <w:p>
@@ -2737,7 +2429,6 @@
     </w:p>
     <w:p>
       <w:r>
-        <w:lastRenderedPageBreak/>
         <w:t>│   │   └── script.js</w:t>
       </w:r>
     </w:p>
@@ -2955,6 +2646,7 @@
           <w:b/>
           <w:bCs/>
         </w:rPr>
+        <w:lastRenderedPageBreak/>
         <w:t>Drift Diagnostics</w:t>
       </w:r>
     </w:p>
@@ -2965,7 +2657,6 @@
     </w:p>
     <w:p>
       <w:r>
-        <w:lastRenderedPageBreak/>
         <w:t>After each batch scoring run, the system computes summary statistics for both:</w:t>
       </w:r>
     </w:p>
@@ -2977,13 +2668,8 @@
         </w:numPr>
       </w:pPr>
       <w:r>
-        <w:t xml:space="preserve">Raw API </w:t>
-      </w:r>
-      <w:proofErr w:type="spellStart"/>
-      <w:r>
-        <w:t>subscores</w:t>
-      </w:r>
-      <w:proofErr w:type="spellEnd"/>
+        <w:t>Raw API subscores</w:t>
+      </w:r>
     </w:p>
     <w:p>
       <w:pPr>
@@ -3209,6 +2895,7 @@
         </w:numPr>
       </w:pPr>
       <w:r>
+        <w:lastRenderedPageBreak/>
         <w:t>Final scores are compared to expert scores</w:t>
       </w:r>
     </w:p>
@@ -3229,7 +2916,6 @@
           <w:b/>
           <w:bCs/>
         </w:rPr>
-        <w:lastRenderedPageBreak/>
         <w:t>Bias</w:t>
       </w:r>
       <w:r>
@@ -3342,13 +3028,8 @@
           <w:numId w:val="25"/>
         </w:numPr>
       </w:pPr>
-      <w:proofErr w:type="spellStart"/>
-      <w:r>
-        <w:t>Subscores</w:t>
-      </w:r>
-      <w:proofErr w:type="spellEnd"/>
-      <w:r>
-        <w:t xml:space="preserve"> (C1–C6) are stored in cache files</w:t>
+      <w:r>
+        <w:t>Subscores (C1–C6) are stored in cache files</w:t>
       </w:r>
     </w:p>
     <w:p>
@@ -3455,28 +3136,22 @@
       </w:r>
     </w:p>
     <w:p>
-      <w:proofErr w:type="spellStart"/>
       <w:r>
         <w:t>golden_C_current_metrics.json</w:t>
       </w:r>
-      <w:proofErr w:type="spellEnd"/>
       <w:r>
         <w:br/>
-      </w:r>
-      <w:proofErr w:type="spellStart"/>
-      <w:r>
         <w:t>golden_C_legacy_metrics.json</w:t>
       </w:r>
-      <w:proofErr w:type="spellEnd"/>
-    </w:p>
-    <w:p>
-      <w:r>
+    </w:p>
+    <w:p>
+      <w:r>
+        <w:lastRenderedPageBreak/>
         <w:t>These files represent the expected scoring behavior of the system. Future validation runs compare against these baselines to detect deviations.</w:t>
       </w:r>
     </w:p>
     <w:p>
       <w:r>
-        <w:lastRenderedPageBreak/>
         <w:pict w14:anchorId="4299744F">
           <v:rect id="_x0000_i1040" style="width:0;height:1.5pt" o:hralign="center" o:hrstd="t" o:hr="t" fillcolor="#a0a0a0" stroked="f"/>
         </w:pict>
@@ -3617,36 +3292,20 @@
       </w:r>
       <w:r>
         <w:br/>
-      </w:r>
-      <w:proofErr w:type="spellStart"/>
-      <w:r>
         <w:t>golden_C_current_cases.json</w:t>
       </w:r>
-      <w:proofErr w:type="spellEnd"/>
       <w:r>
         <w:br/>
-      </w:r>
-      <w:proofErr w:type="spellStart"/>
-      <w:r>
         <w:t>golden_C_legacy_cases.json</w:t>
       </w:r>
-      <w:proofErr w:type="spellEnd"/>
       <w:r>
         <w:br/>
-      </w:r>
-      <w:proofErr w:type="spellStart"/>
-      <w:r>
         <w:t>golden_C_current_metrics.json</w:t>
       </w:r>
-      <w:proofErr w:type="spellEnd"/>
       <w:r>
         <w:br/>
-      </w:r>
-      <w:proofErr w:type="spellStart"/>
-      <w:r>
         <w:t>golden_C_legacy_metrics.json</w:t>
       </w:r>
-      <w:proofErr w:type="spellEnd"/>
       <w:r>
         <w:br/>
         <w:t>golden20_api_scores_current.json</w:t>
@@ -3706,6 +3365,7 @@
         </w:numPr>
       </w:pPr>
       <w:r>
+        <w:lastRenderedPageBreak/>
         <w:t>GPT model drift</w:t>
       </w:r>
     </w:p>
@@ -3728,7 +3388,6 @@
         </w:numPr>
       </w:pPr>
       <w:r>
-        <w:lastRenderedPageBreak/>
         <w:t>scoring pipeline errors</w:t>
       </w:r>
     </w:p>
@@ -3846,16 +3505,13 @@
         </w:numPr>
       </w:pPr>
       <w:r>
-        <w:t>Align Element</w:t>
-      </w:r>
-      <w:r>
-        <w:t xml:space="preserve"> </w:t>
-      </w:r>
-      <w:r>
-        <w:t>L</w:t>
-      </w:r>
-      <w:r>
-        <w:t xml:space="preserve"> with this architecture</w:t>
+        <w:t xml:space="preserve">Maintain quality of the scoring pipeline by running </w:t>
+      </w:r>
+      <w:r>
+        <w:t>weekly</w:t>
+      </w:r>
+      <w:r>
+        <w:t xml:space="preserve"> regression tests and drift baseline reviews</w:t>
       </w:r>
     </w:p>
     <w:p>
@@ -3867,31 +3523,8 @@
         </w:numPr>
       </w:pPr>
       <w:r>
-        <w:t xml:space="preserve">Maintain quality of the scoring pipeline by running </w:t>
-      </w:r>
-      <w:r>
-        <w:t>weekly</w:t>
-      </w:r>
-      <w:r>
-        <w:t xml:space="preserve"> regression tests and drift baseline reviews</w:t>
-      </w:r>
-    </w:p>
-    <w:p>
-      <w:pPr>
-        <w:pStyle w:val="ListParagraph"/>
-        <w:numPr>
-          <w:ilvl w:val="0"/>
-          <w:numId w:val="19"/>
-        </w:numPr>
-      </w:pPr>
-      <w:r>
-        <w:t xml:space="preserve">Support integration with </w:t>
-      </w:r>
-      <w:proofErr w:type="spellStart"/>
-      <w:r>
-        <w:t>MyDesign</w:t>
-      </w:r>
-      <w:proofErr w:type="spellEnd"/>
+        <w:t>Support integration with MyDesign</w:t>
+      </w:r>
     </w:p>
     <w:p>
       <w:pPr>
@@ -3938,7 +3571,6 @@
         <w:t>For questions regarding calibration methodology or validation metrics, contact the project lead.</w:t>
       </w:r>
     </w:p>
-    <w:p/>
     <w:sectPr>
       <w:pgSz w:w="12240" w:h="15840"/>
       <w:pgMar w:top="1440" w:right="1440" w:bottom="1440" w:left="1440" w:header="720" w:footer="720" w:gutter="0"/>

</xml_diff>

<commit_message>
Release Version 2.0: Complete MyDesign GPT Scoring System
</commit_message>
<xml_diff>
--- a/Readme.docx
+++ b/Readme.docx
@@ -14,151 +14,205 @@
           <w:b/>
           <w:bCs/>
         </w:rPr>
-        <w:t>GPTScorer – Element  Scoring Application</w:t>
-      </w:r>
-    </w:p>
-    <w:p>
-      <w:r>
-        <w:t xml:space="preserve">This repository contains the </w:t>
-      </w:r>
-      <w:r>
-        <w:t>validated</w:t>
-      </w:r>
-      <w:r>
-        <w:t xml:space="preserve"> scoring application for MyDesign – Element C (Presentation and Justification of Solution Design Requirements).</w:t>
-      </w:r>
-      <w:r>
-        <w:t xml:space="preserve">  Element</w:t>
-      </w:r>
-      <w:r>
-        <w:t>s</w:t>
-      </w:r>
-      <w:r>
-        <w:t xml:space="preserve"> A</w:t>
-      </w:r>
-      <w:r>
-        <w:t>, B, D</w:t>
-      </w:r>
-      <w:r>
-        <w:t xml:space="preserve">, </w:t>
-      </w:r>
-      <w:r>
-        <w:t>E</w:t>
-      </w:r>
-      <w:r>
-        <w:t>, F</w:t>
-      </w:r>
-      <w:r>
-        <w:t>, G</w:t>
-      </w:r>
-      <w:r>
-        <w:t>, H</w:t>
-      </w:r>
-      <w:r>
-        <w:t xml:space="preserve">, I </w:t>
-      </w:r>
-      <w:r>
-        <w:t>,J</w:t>
-      </w:r>
-      <w:r>
-        <w:t xml:space="preserve">, K and L </w:t>
-      </w:r>
-      <w:r>
-        <w:t>have</w:t>
-      </w:r>
-      <w:r>
-        <w:t xml:space="preserve"> also been added with the same architecture.  The discussion below describes Element C but is applicable to Element</w:t>
-      </w:r>
-      <w:r>
-        <w:t>s</w:t>
-      </w:r>
-      <w:r>
-        <w:t xml:space="preserve"> A</w:t>
-      </w:r>
-      <w:r>
-        <w:t>, B</w:t>
-      </w:r>
-      <w:r>
-        <w:t>,</w:t>
-      </w:r>
-      <w:r>
-        <w:t>D</w:t>
-      </w:r>
-      <w:r>
-        <w:t xml:space="preserve">, </w:t>
-      </w:r>
-      <w:r>
-        <w:t>E</w:t>
-      </w:r>
-      <w:r>
-        <w:t>, F</w:t>
-      </w:r>
-      <w:r>
-        <w:t>, G</w:t>
-      </w:r>
-      <w:r>
-        <w:t>, H</w:t>
-      </w:r>
-      <w:r>
-        <w:t>, I</w:t>
-      </w:r>
-      <w:r>
-        <w:t>, J</w:t>
-      </w:r>
-      <w:r>
-        <w:t xml:space="preserve">, K </w:t>
-      </w:r>
-      <w:r>
-        <w:t xml:space="preserve">and </w:t>
-      </w:r>
-      <w:r>
-        <w:t>L</w:t>
-      </w:r>
-      <w:r>
-        <w:t xml:space="preserve"> </w:t>
-      </w:r>
-      <w:r>
-        <w:t>as well</w:t>
-      </w:r>
-      <w:r>
-        <w:t xml:space="preserve"> for operation.  The discussion discloses  detailed parameters that are specific to Element C so they will obviously change for the other elements.</w:t>
-      </w:r>
-    </w:p>
-    <w:p>
-      <w:r>
-        <w:t>The system uses deterministic GPT-based evaluation combined with post-processing calibration to generate rubric-aligned sub-scores (C1–C6), a calibrated element score, and structured narrative feedback suitable for educator review.</w:t>
-      </w:r>
-    </w:p>
-    <w:p/>
-    <w:p>
-      <w:r>
-        <w:t>The application supports both:</w:t>
-      </w:r>
-    </w:p>
-    <w:p>
+        <w:t xml:space="preserve">GPTScorer – </w:t>
+      </w:r>
+      <w:proofErr w:type="gramStart"/>
       <w:r>
         <w:rPr>
           <w:b/>
           <w:bCs/>
         </w:rPr>
-        <w:t xml:space="preserve">Current </w:t>
-      </w:r>
-      <w:r>
-        <w:t>documents (</w:t>
-      </w:r>
-      <w:r>
-        <w:t>10/2024</w:t>
-      </w:r>
-      <w:r>
-        <w:t>–present)</w:t>
-      </w:r>
-    </w:p>
-    <w:p>
+        <w:t>Element  Scoring</w:t>
+      </w:r>
+      <w:proofErr w:type="gramEnd"/>
       <w:r>
         <w:rPr>
           <w:b/>
           <w:bCs/>
         </w:rPr>
+        <w:t xml:space="preserve"> Application</w:t>
+      </w:r>
+    </w:p>
+    <w:p>
+      <w:r>
+        <w:t xml:space="preserve">This repository contains the </w:t>
+      </w:r>
+      <w:r>
+        <w:t>validated</w:t>
+      </w:r>
+      <w:r>
+        <w:t xml:space="preserve"> scoring application for MyDesign – Element C (Presentation and Justification of Solution Design Requirements).</w:t>
+      </w:r>
+      <w:r>
+        <w:t xml:space="preserve">  Element</w:t>
+      </w:r>
+      <w:r>
+        <w:t>s</w:t>
+      </w:r>
+      <w:r>
+        <w:t xml:space="preserve"> A</w:t>
+      </w:r>
+      <w:r>
+        <w:t>, B, D</w:t>
+      </w:r>
+      <w:r>
+        <w:t xml:space="preserve">, </w:t>
+      </w:r>
+      <w:r>
+        <w:t>E</w:t>
+      </w:r>
+      <w:r>
+        <w:t>, F</w:t>
+      </w:r>
+      <w:r>
+        <w:t>, G</w:t>
+      </w:r>
+      <w:r>
+        <w:t>, H</w:t>
+      </w:r>
+      <w:r>
+        <w:t xml:space="preserve">, </w:t>
+      </w:r>
+      <w:proofErr w:type="gramStart"/>
+      <w:r>
+        <w:t xml:space="preserve">I </w:t>
+      </w:r>
+      <w:r>
+        <w:t>,J</w:t>
+      </w:r>
+      <w:proofErr w:type="gramEnd"/>
+      <w:r>
+        <w:t xml:space="preserve">, K and L </w:t>
+      </w:r>
+      <w:r>
+        <w:t>have</w:t>
+      </w:r>
+      <w:r>
+        <w:t xml:space="preserve"> also been added with the same architecture.  The discussion below describes Element C but is applicable to Element</w:t>
+      </w:r>
+      <w:r>
+        <w:t>s</w:t>
+      </w:r>
+      <w:r>
+        <w:t xml:space="preserve"> A</w:t>
+      </w:r>
+      <w:r>
+        <w:t xml:space="preserve">, </w:t>
+      </w:r>
+      <w:proofErr w:type="gramStart"/>
+      <w:r>
+        <w:t>B</w:t>
+      </w:r>
+      <w:r>
+        <w:t>,</w:t>
+      </w:r>
+      <w:r>
+        <w:t>D</w:t>
+      </w:r>
+      <w:proofErr w:type="gramEnd"/>
+      <w:r>
+        <w:t xml:space="preserve">, </w:t>
+      </w:r>
+      <w:r>
+        <w:t>E</w:t>
+      </w:r>
+      <w:r>
+        <w:t>, F</w:t>
+      </w:r>
+      <w:r>
+        <w:t>, G</w:t>
+      </w:r>
+      <w:r>
+        <w:t>, H</w:t>
+      </w:r>
+      <w:r>
+        <w:t>, I</w:t>
+      </w:r>
+      <w:r>
+        <w:t>, J</w:t>
+      </w:r>
+      <w:r>
+        <w:t xml:space="preserve">, K </w:t>
+      </w:r>
+      <w:r>
+        <w:t xml:space="preserve">and </w:t>
+      </w:r>
+      <w:r>
+        <w:t>L</w:t>
+      </w:r>
+      <w:r>
+        <w:t xml:space="preserve"> </w:t>
+      </w:r>
+      <w:r>
+        <w:t>as well</w:t>
+      </w:r>
+      <w:r>
+        <w:t xml:space="preserve"> </w:t>
+      </w:r>
+      <w:proofErr w:type="gramStart"/>
+      <w:r>
+        <w:t>for</w:t>
+      </w:r>
+      <w:proofErr w:type="gramEnd"/>
+      <w:r>
+        <w:t xml:space="preserve"> operation.  The discussion </w:t>
+      </w:r>
+      <w:proofErr w:type="gramStart"/>
+      <w:r>
+        <w:t>discloses  detailed</w:t>
+      </w:r>
+      <w:proofErr w:type="gramEnd"/>
+      <w:r>
+        <w:t xml:space="preserve"> parameters that are specific to Element C so they will obviously change for the other elements.</w:t>
+      </w:r>
+    </w:p>
+    <w:p>
+      <w:r>
+        <w:t>The system uses deterministic GPT-based evaluation combined with post-processing calibration to generate rubric-aligned sub-scores (C1–C6), a calibrated element score, and structured narrative feedback suitable for educator review.</w:t>
+      </w:r>
+    </w:p>
+    <w:p/>
+    <w:p>
+      <w:r>
+        <w:t>The application supports both:</w:t>
+      </w:r>
+    </w:p>
+    <w:p>
+      <w:r>
+        <w:rPr>
+          <w:b/>
+          <w:bCs/>
+        </w:rPr>
+        <w:t xml:space="preserve">Current </w:t>
+      </w:r>
+      <w:r>
+        <w:t>documents (</w:t>
+      </w:r>
+      <w:r>
+        <w:t>1</w:t>
+      </w:r>
+      <w:r>
+        <w:t>2</w:t>
+      </w:r>
+      <w:r>
+        <w:t>/2024</w:t>
+      </w:r>
+      <w:r>
+        <w:t>–</w:t>
+      </w:r>
+      <w:r>
+        <w:t>6/30/2025</w:t>
+      </w:r>
+      <w:r>
+        <w:t>)</w:t>
+      </w:r>
+    </w:p>
+    <w:p>
+      <w:r>
+        <w:rPr>
+          <w:b/>
+          <w:bCs/>
+        </w:rPr>
         <w:t>Legacy</w:t>
       </w:r>
       <w:r>
@@ -169,6 +223,12 @@
     <w:p>
       <w:r>
         <w:t>This release represents a validated and stabilized baseline following model drift testing and calibration alignment with expert scoring.</w:t>
+      </w:r>
+      <w:r>
+        <w:t xml:space="preserve">  It includes improvements for OCR and text extraction, prompt engineering and calibration, and bug fixes.</w:t>
+      </w:r>
+      <w:r>
+        <w:t xml:space="preserve">  It also completed testing of 100% unmodified student documents for all modes and elements.</w:t>
       </w:r>
       <w:r>
         <w:pict w14:anchorId="2BF245F3">
@@ -263,6 +323,9 @@
       </w:r>
       <w:r>
         <w:br/>
+      </w:r>
+      <w:r>
+        <w:lastRenderedPageBreak/>
         <w:t xml:space="preserve">        ↓</w:t>
       </w:r>
       <w:r>
@@ -271,9 +334,6 @@
       </w:r>
       <w:r>
         <w:br/>
-      </w:r>
-      <w:r>
-        <w:lastRenderedPageBreak/>
         <w:t xml:space="preserve">        ↓</w:t>
       </w:r>
       <w:r>
@@ -498,7 +558,31 @@
         <w:t>This b</w:t>
       </w:r>
       <w:r>
-        <w:t xml:space="preserve">lock diagram shows data flow for the overall system which is divided in two processes:  scoring and diagnostics.  Diagnostics include drift detection for scores of documents  submitted for scoring.  Regression testing using a Golden20 set of documents, chosen for their susceptibility for variations in scoring processes and philosophy.  Controller_app.py is an overall controller for system, controlling both scoring and diagnostics in one UI. </w:t>
+        <w:t xml:space="preserve">lock diagram shows data flow for the overall system which is divided </w:t>
+      </w:r>
+      <w:proofErr w:type="gramStart"/>
+      <w:r>
+        <w:t>in</w:t>
+      </w:r>
+      <w:proofErr w:type="gramEnd"/>
+      <w:r>
+        <w:t xml:space="preserve"> two processes</w:t>
+      </w:r>
+      <w:proofErr w:type="gramStart"/>
+      <w:r>
+        <w:t>:  scoring</w:t>
+      </w:r>
+      <w:proofErr w:type="gramEnd"/>
+      <w:r>
+        <w:t xml:space="preserve"> and diagnostics.  Diagnostics include drift detection for scores of </w:t>
+      </w:r>
+      <w:proofErr w:type="gramStart"/>
+      <w:r>
+        <w:t>documents  submitted</w:t>
+      </w:r>
+      <w:proofErr w:type="gramEnd"/>
+      <w:r>
+        <w:t xml:space="preserve"> for scoring.  Regression testing using a Golden20 set of documents, chosen for their susceptibility for variations in scoring processes and philosophy.  Controller_app.py is an overall controller for system, controlling both scoring and diagnostics in one UI. </w:t>
       </w:r>
     </w:p>
     <w:p>
@@ -947,7 +1031,23 @@
     </w:p>
     <w:p>
       <w:r>
-        <w:t>python -m elements.element_C.score_with_API_C ^</w:t>
+        <w:t xml:space="preserve">python -m </w:t>
+      </w:r>
+      <w:proofErr w:type="gramStart"/>
+      <w:r>
+        <w:t>elements.element</w:t>
+      </w:r>
+      <w:proofErr w:type="gramEnd"/>
+      <w:r>
+        <w:t>_</w:t>
+      </w:r>
+      <w:proofErr w:type="gramStart"/>
+      <w:r>
+        <w:t>C.score</w:t>
+      </w:r>
+      <w:proofErr w:type="gramEnd"/>
+      <w:r>
+        <w:t>_with_API_C ^</w:t>
       </w:r>
       <w:r>
         <w:br/>
@@ -1062,7 +1162,15 @@
         </w:numPr>
       </w:pPr>
       <w:r>
-        <w:t>C1-C6  Bulleted rationale</w:t>
+        <w:t>C1-C</w:t>
+      </w:r>
+      <w:proofErr w:type="gramStart"/>
+      <w:r>
+        <w:t>6  Bulleted</w:t>
+      </w:r>
+      <w:proofErr w:type="gramEnd"/>
+      <w:r>
+        <w:t xml:space="preserve"> rationale</w:t>
       </w:r>
     </w:p>
     <w:p>
@@ -1411,7 +1519,15 @@
         </w:numPr>
       </w:pPr>
       <w:r>
-        <w:t>C1_final  – C6_final calibrated scores for output</w:t>
+        <w:t>C1_</w:t>
+      </w:r>
+      <w:proofErr w:type="gramStart"/>
+      <w:r>
+        <w:t>final  –</w:t>
+      </w:r>
+      <w:proofErr w:type="gramEnd"/>
+      <w:r>
+        <w:t xml:space="preserve"> C6_final calibrated scores for output</w:t>
       </w:r>
     </w:p>
     <w:p>
@@ -1540,8 +1656,13 @@
         </w:numPr>
       </w:pPr>
       <w:r>
-        <w:t>Drift slightly over time</w:t>
-      </w:r>
+        <w:t xml:space="preserve">Drift slightly </w:t>
+      </w:r>
+      <w:proofErr w:type="gramStart"/>
+      <w:r>
+        <w:t>over time</w:t>
+      </w:r>
+      <w:proofErr w:type="gramEnd"/>
     </w:p>
     <w:p>
       <w:pPr>
@@ -1693,8 +1814,13 @@
           <w:numId w:val="11"/>
         </w:numPr>
       </w:pPr>
-      <w:r>
-        <w:t>Explains strengths and weaknesses</w:t>
+      <w:proofErr w:type="gramStart"/>
+      <w:r>
+        <w:t>Explains</w:t>
+      </w:r>
+      <w:proofErr w:type="gramEnd"/>
+      <w:r>
+        <w:t xml:space="preserve"> strengths and weaknesses</w:t>
       </w:r>
     </w:p>
     <w:p>
@@ -1715,8 +1841,13 @@
           <w:numId w:val="11"/>
         </w:numPr>
       </w:pPr>
-      <w:r>
-        <w:t>Uses educator-friendly language</w:t>
+      <w:proofErr w:type="gramStart"/>
+      <w:r>
+        <w:t>Uses</w:t>
+      </w:r>
+      <w:proofErr w:type="gramEnd"/>
+      <w:r>
+        <w:t xml:space="preserve"> educator-friendly language</w:t>
       </w:r>
     </w:p>
     <w:p>
@@ -1928,12 +2059,28 @@
     </w:p>
     <w:p>
       <w:r>
-        <w:t xml:space="preserve"> │     └── element_A/ -  analogous to C</w:t>
-      </w:r>
-    </w:p>
-    <w:p>
-      <w:r>
-        <w:t xml:space="preserve"> │   └── element_B/ -  analogous to C</w:t>
+        <w:t xml:space="preserve"> │     └── element_A/ </w:t>
+      </w:r>
+      <w:proofErr w:type="gramStart"/>
+      <w:r>
+        <w:t>-  analogous</w:t>
+      </w:r>
+      <w:proofErr w:type="gramEnd"/>
+      <w:r>
+        <w:t xml:space="preserve"> to C</w:t>
+      </w:r>
+    </w:p>
+    <w:p>
+      <w:r>
+        <w:t xml:space="preserve"> │   └── element_B/ </w:t>
+      </w:r>
+      <w:proofErr w:type="gramStart"/>
+      <w:r>
+        <w:t>-  analogous</w:t>
+      </w:r>
+      <w:proofErr w:type="gramEnd"/>
+      <w:r>
+        <w:t xml:space="preserve"> to C</w:t>
       </w:r>
     </w:p>
     <w:p>
@@ -1943,48 +2090,106 @@
     </w:p>
     <w:p>
       <w:r>
-        <w:t xml:space="preserve"> │   └── element_E/ -  analogous to C</w:t>
-      </w:r>
-    </w:p>
-    <w:p>
-      <w:r>
-        <w:t xml:space="preserve"> │   └── element_F/ -  analogous to C</w:t>
-      </w:r>
-    </w:p>
-    <w:p>
-      <w:r>
-        <w:t xml:space="preserve"> │   └── element_G/ -  analogous to C</w:t>
-      </w:r>
-    </w:p>
-    <w:p>
-      <w:r>
-        <w:t xml:space="preserve"> │   └── element_H/ -  analogous to C</w:t>
-      </w:r>
-    </w:p>
-    <w:p>
-      <w:r>
-        <w:t xml:space="preserve"> │   └── element_I/ -  analogous to C</w:t>
-      </w:r>
-    </w:p>
-    <w:p>
-      <w:r>
-        <w:t xml:space="preserve"> │   └── element_J/ -  analogous to C</w:t>
-      </w:r>
-    </w:p>
-    <w:p>
-      <w:r>
-        <w:t xml:space="preserve"> │   └── element_K/ -  analogous to C</w:t>
-      </w:r>
-    </w:p>
-    <w:p>
-      <w:r>
-        <w:t xml:space="preserve"> │   └── element_</w:t>
-      </w:r>
-      <w:r>
-        <w:t>L</w:t>
-      </w:r>
-      <w:r>
-        <w:t>/ -  analogous to C</w:t>
+        <w:t xml:space="preserve"> │   └── element_E/ </w:t>
+      </w:r>
+      <w:proofErr w:type="gramStart"/>
+      <w:r>
+        <w:t>-  analogous</w:t>
+      </w:r>
+      <w:proofErr w:type="gramEnd"/>
+      <w:r>
+        <w:t xml:space="preserve"> to C</w:t>
+      </w:r>
+    </w:p>
+    <w:p>
+      <w:r>
+        <w:t xml:space="preserve"> │   └── element_F/ </w:t>
+      </w:r>
+      <w:proofErr w:type="gramStart"/>
+      <w:r>
+        <w:t>-  analogous</w:t>
+      </w:r>
+      <w:proofErr w:type="gramEnd"/>
+      <w:r>
+        <w:t xml:space="preserve"> to C</w:t>
+      </w:r>
+    </w:p>
+    <w:p>
+      <w:r>
+        <w:t xml:space="preserve"> │   └── element_G/ </w:t>
+      </w:r>
+      <w:proofErr w:type="gramStart"/>
+      <w:r>
+        <w:t>-  analogous</w:t>
+      </w:r>
+      <w:proofErr w:type="gramEnd"/>
+      <w:r>
+        <w:t xml:space="preserve"> to C</w:t>
+      </w:r>
+    </w:p>
+    <w:p>
+      <w:r>
+        <w:t xml:space="preserve"> │   └── element_H/ </w:t>
+      </w:r>
+      <w:proofErr w:type="gramStart"/>
+      <w:r>
+        <w:t>-  analogous</w:t>
+      </w:r>
+      <w:proofErr w:type="gramEnd"/>
+      <w:r>
+        <w:t xml:space="preserve"> to C</w:t>
+      </w:r>
+    </w:p>
+    <w:p>
+      <w:r>
+        <w:t xml:space="preserve"> │   └── element_I/ </w:t>
+      </w:r>
+      <w:proofErr w:type="gramStart"/>
+      <w:r>
+        <w:t>-  analogous</w:t>
+      </w:r>
+      <w:proofErr w:type="gramEnd"/>
+      <w:r>
+        <w:t xml:space="preserve"> to C</w:t>
+      </w:r>
+    </w:p>
+    <w:p>
+      <w:r>
+        <w:t xml:space="preserve"> │   └── element_J/ </w:t>
+      </w:r>
+      <w:proofErr w:type="gramStart"/>
+      <w:r>
+        <w:t>-  analogous</w:t>
+      </w:r>
+      <w:proofErr w:type="gramEnd"/>
+      <w:r>
+        <w:t xml:space="preserve"> to C</w:t>
+      </w:r>
+    </w:p>
+    <w:p>
+      <w:r>
+        <w:t xml:space="preserve"> │   └── element_K/ </w:t>
+      </w:r>
+      <w:proofErr w:type="gramStart"/>
+      <w:r>
+        <w:t>-  analogous</w:t>
+      </w:r>
+      <w:proofErr w:type="gramEnd"/>
+      <w:r>
+        <w:t xml:space="preserve"> to C</w:t>
+      </w:r>
+    </w:p>
+    <w:p>
+      <w:r>
+        <w:t xml:space="preserve"> │   └── element_L/ </w:t>
+      </w:r>
+      <w:proofErr w:type="gramStart"/>
+      <w:r>
+        <w:t>-  analogous</w:t>
+      </w:r>
+      <w:proofErr w:type="gramEnd"/>
+      <w:r>
+        <w:t xml:space="preserve"> to C</w:t>
       </w:r>
     </w:p>
     <w:p>
@@ -2012,8 +2217,13 @@
         <w:t>──</w:t>
       </w:r>
       <w:r>
-        <w:t xml:space="preserve"> golden_C_current.json</w:t>
-      </w:r>
+        <w:t xml:space="preserve"> golden_C_</w:t>
+      </w:r>
+      <w:proofErr w:type="gramStart"/>
+      <w:r>
+        <w:t>current.json</w:t>
+      </w:r>
+      <w:proofErr w:type="gramEnd"/>
     </w:p>
     <w:p>
       <w:r>
@@ -2035,8 +2245,13 @@
         <w:t>──</w:t>
       </w:r>
       <w:r>
-        <w:t xml:space="preserve"> golden_C_legacy.json</w:t>
-      </w:r>
+        <w:t xml:space="preserve"> golden_C_</w:t>
+      </w:r>
+      <w:proofErr w:type="gramStart"/>
+      <w:r>
+        <w:t>legacy.json</w:t>
+      </w:r>
+      <w:proofErr w:type="gramEnd"/>
     </w:p>
     <w:p>
       <w:r>
@@ -2058,8 +2273,13 @@
         <w:t>──</w:t>
       </w:r>
       <w:r>
-        <w:t xml:space="preserve"> golden20_metrics_current.json</w:t>
-      </w:r>
+        <w:t xml:space="preserve"> golden20_metrics_</w:t>
+      </w:r>
+      <w:proofErr w:type="gramStart"/>
+      <w:r>
+        <w:t>current.json</w:t>
+      </w:r>
+      <w:proofErr w:type="gramEnd"/>
     </w:p>
     <w:p>
       <w:r>
@@ -2081,8 +2301,13 @@
         <w:t>──</w:t>
       </w:r>
       <w:r>
-        <w:t xml:space="preserve"> golden20_metrics_legacy.json</w:t>
-      </w:r>
+        <w:t xml:space="preserve"> golden20_metrics_</w:t>
+      </w:r>
+      <w:proofErr w:type="gramStart"/>
+      <w:r>
+        <w:t>legacy.json</w:t>
+      </w:r>
+      <w:proofErr w:type="gramEnd"/>
     </w:p>
     <w:p>
       <w:r>
@@ -2104,7 +2329,15 @@
         <w:t>──</w:t>
       </w:r>
       <w:r>
-        <w:t xml:space="preserve"> golden20_current_scores.json      </w:t>
+        <w:t xml:space="preserve"> golden20_current_</w:t>
+      </w:r>
+      <w:proofErr w:type="gramStart"/>
+      <w:r>
+        <w:t>scores.json</w:t>
+      </w:r>
+      <w:proofErr w:type="gramEnd"/>
+      <w:r>
+        <w:t xml:space="preserve">      </w:t>
       </w:r>
       <w:r>
         <w:rPr>
@@ -2130,7 +2363,15 @@
         <w:t xml:space="preserve">  </w:t>
       </w:r>
       <w:r>
-        <w:t>└── golden20_legacy_scores.json       ← cached API scores</w:t>
+        <w:t>└── golden20_legacy_</w:t>
+      </w:r>
+      <w:proofErr w:type="gramStart"/>
+      <w:r>
+        <w:t>scores.json</w:t>
+      </w:r>
+      <w:proofErr w:type="gramEnd"/>
+      <w:r>
+        <w:t xml:space="preserve">       ← cached API scores</w:t>
       </w:r>
     </w:p>
     <w:p>
@@ -2157,12 +2398,28 @@
     </w:p>
     <w:p>
       <w:r>
-        <w:t xml:space="preserve"> │   └── element_A/ -  analogous to C</w:t>
-      </w:r>
-    </w:p>
-    <w:p>
-      <w:r>
-        <w:t xml:space="preserve"> │   └── element_B/ -  analogous to C</w:t>
+        <w:t xml:space="preserve"> │   └── element_A/ </w:t>
+      </w:r>
+      <w:proofErr w:type="gramStart"/>
+      <w:r>
+        <w:t>-  analogous</w:t>
+      </w:r>
+      <w:proofErr w:type="gramEnd"/>
+      <w:r>
+        <w:t xml:space="preserve"> to C</w:t>
+      </w:r>
+    </w:p>
+    <w:p>
+      <w:r>
+        <w:t xml:space="preserve"> │   └── element_B/ </w:t>
+      </w:r>
+      <w:proofErr w:type="gramStart"/>
+      <w:r>
+        <w:t>-  analogous</w:t>
+      </w:r>
+      <w:proofErr w:type="gramEnd"/>
+      <w:r>
+        <w:t xml:space="preserve"> to C</w:t>
       </w:r>
     </w:p>
     <w:p>
@@ -2172,43 +2429,107 @@
     </w:p>
     <w:p>
       <w:r>
-        <w:t xml:space="preserve"> │   └── element_E/ -  analogous to C</w:t>
+        <w:t xml:space="preserve"> │   └── element_E/ </w:t>
+      </w:r>
+      <w:proofErr w:type="gramStart"/>
+      <w:r>
+        <w:t>-  analogous</w:t>
+      </w:r>
+      <w:proofErr w:type="gramEnd"/>
+      <w:r>
+        <w:t xml:space="preserve"> to C</w:t>
       </w:r>
     </w:p>
     <w:p>
       <w:r>
         <w:lastRenderedPageBreak/>
-        <w:t xml:space="preserve"> │   └── element_F/ -  analogous to C</w:t>
-      </w:r>
-    </w:p>
-    <w:p>
-      <w:r>
-        <w:t xml:space="preserve"> │   └── element_G/ -  analogous to C</w:t>
-      </w:r>
-    </w:p>
-    <w:p>
-      <w:r>
-        <w:t xml:space="preserve"> │   └── element_H/ -  analogous to C</w:t>
-      </w:r>
-    </w:p>
-    <w:p>
-      <w:r>
-        <w:t xml:space="preserve"> │   └── element_I/ -  analogous to C</w:t>
-      </w:r>
-    </w:p>
-    <w:p>
-      <w:r>
-        <w:t xml:space="preserve"> │   └── element_J/ -  analogous to C</w:t>
-      </w:r>
-    </w:p>
-    <w:p>
-      <w:r>
-        <w:t xml:space="preserve"> │   └── element_K/ -  analogous to C</w:t>
-      </w:r>
-    </w:p>
-    <w:p>
-      <w:r>
-        <w:t xml:space="preserve"> │   └── element_L/ -  analogous to C</w:t>
+        <w:t xml:space="preserve"> │   └── element_F/ </w:t>
+      </w:r>
+      <w:proofErr w:type="gramStart"/>
+      <w:r>
+        <w:t>-  analogous</w:t>
+      </w:r>
+      <w:proofErr w:type="gramEnd"/>
+      <w:r>
+        <w:t xml:space="preserve"> to C</w:t>
+      </w:r>
+    </w:p>
+    <w:p>
+      <w:r>
+        <w:t xml:space="preserve"> │   └── element_G/ </w:t>
+      </w:r>
+      <w:proofErr w:type="gramStart"/>
+      <w:r>
+        <w:t>-  analogous</w:t>
+      </w:r>
+      <w:proofErr w:type="gramEnd"/>
+      <w:r>
+        <w:t xml:space="preserve"> to C</w:t>
+      </w:r>
+    </w:p>
+    <w:p>
+      <w:r>
+        <w:t xml:space="preserve"> │   └── element_H/ </w:t>
+      </w:r>
+      <w:proofErr w:type="gramStart"/>
+      <w:r>
+        <w:t>-  analogous</w:t>
+      </w:r>
+      <w:proofErr w:type="gramEnd"/>
+      <w:r>
+        <w:t xml:space="preserve"> to C</w:t>
+      </w:r>
+    </w:p>
+    <w:p>
+      <w:r>
+        <w:t xml:space="preserve"> │   └── element_I/ </w:t>
+      </w:r>
+      <w:proofErr w:type="gramStart"/>
+      <w:r>
+        <w:t>-  analogous</w:t>
+      </w:r>
+      <w:proofErr w:type="gramEnd"/>
+      <w:r>
+        <w:t xml:space="preserve"> to C</w:t>
+      </w:r>
+    </w:p>
+    <w:p>
+      <w:r>
+        <w:t xml:space="preserve"> │   └── element_J/ </w:t>
+      </w:r>
+      <w:proofErr w:type="gramStart"/>
+      <w:r>
+        <w:t>-  analogous</w:t>
+      </w:r>
+      <w:proofErr w:type="gramEnd"/>
+      <w:r>
+        <w:t xml:space="preserve"> to C</w:t>
+      </w:r>
+    </w:p>
+    <w:p>
+      <w:r>
+        <w:t xml:space="preserve"> │   └── element_K/ </w:t>
+      </w:r>
+      <w:proofErr w:type="gramStart"/>
+      <w:r>
+        <w:t>-  analogous</w:t>
+      </w:r>
+      <w:proofErr w:type="gramEnd"/>
+      <w:r>
+        <w:t xml:space="preserve"> to C</w:t>
+      </w:r>
+    </w:p>
+    <w:p>
+      <w:r>
+        <w:t xml:space="preserve"> │   └── element_L/ </w:t>
+      </w:r>
+      <w:proofErr w:type="gramStart"/>
+      <w:r>
+        <w:t>-  analogous</w:t>
+      </w:r>
+      <w:proofErr w:type="gramEnd"/>
+      <w:r>
+        <w:t xml:space="preserve"> to C</w:t>
       </w:r>
     </w:p>
     <w:p>
@@ -2536,7 +2857,15 @@
         </w:numPr>
       </w:pPr>
       <w:r>
-        <w:t>Bias controlled through intercept calibration</w:t>
+        <w:t xml:space="preserve">Bias controlled through </w:t>
+      </w:r>
+      <w:proofErr w:type="gramStart"/>
+      <w:r>
+        <w:t>intercept</w:t>
+      </w:r>
+      <w:proofErr w:type="gramEnd"/>
+      <w:r>
+        <w:t xml:space="preserve"> calibration</w:t>
       </w:r>
     </w:p>
     <w:p>
@@ -2616,12 +2945,21 @@
       <w:r>
         <w:t xml:space="preserve">, and </w:t>
       </w:r>
+      <w:proofErr w:type="gramStart"/>
       <w:r>
         <w:rPr>
           <w:b/>
           <w:bCs/>
         </w:rPr>
-        <w:t>cached API scoring for reproducibility</w:t>
+        <w:t>cached</w:t>
+      </w:r>
+      <w:proofErr w:type="gramEnd"/>
+      <w:r>
+        <w:rPr>
+          <w:b/>
+          <w:bCs/>
+        </w:rPr>
+        <w:t xml:space="preserve"> API scoring for reproducibility</w:t>
       </w:r>
       <w:r>
         <w:t>.</w:t>
@@ -3037,21 +3375,31 @@
         <w:t>golden20_current</w:t>
       </w:r>
       <w:r>
-        <w:t>_scores</w:t>
+        <w:t>_</w:t>
+      </w:r>
+      <w:proofErr w:type="gramStart"/>
+      <w:r>
+        <w:t>scores</w:t>
       </w:r>
       <w:r>
         <w:t>.json</w:t>
       </w:r>
+      <w:proofErr w:type="gramEnd"/>
       <w:r>
         <w:br/>
         <w:t>golden20_legacy</w:t>
       </w:r>
       <w:r>
-        <w:t>_scores</w:t>
+        <w:t>_</w:t>
+      </w:r>
+      <w:proofErr w:type="gramStart"/>
+      <w:r>
+        <w:t>scores</w:t>
       </w:r>
       <w:r>
         <w:t>.json</w:t>
       </w:r>
+      <w:proofErr w:type="gramEnd"/>
     </w:p>
     <w:p>
       <w:r>
@@ -3137,17 +3485,35 @@
     </w:p>
     <w:p>
       <w:r>
-        <w:t>golden_C_current_metrics.json</w:t>
-      </w:r>
+        <w:t>golden_C_current_</w:t>
+      </w:r>
+      <w:proofErr w:type="gramStart"/>
+      <w:r>
+        <w:t>metrics.json</w:t>
+      </w:r>
+      <w:proofErr w:type="gramEnd"/>
       <w:r>
         <w:br/>
-        <w:t>golden_C_legacy_metrics.json</w:t>
-      </w:r>
+        <w:t>golden_C_legacy_</w:t>
+      </w:r>
+      <w:proofErr w:type="gramStart"/>
+      <w:r>
+        <w:t>metrics.json</w:t>
+      </w:r>
+      <w:proofErr w:type="gramEnd"/>
     </w:p>
     <w:p>
       <w:r>
         <w:lastRenderedPageBreak/>
-        <w:t>These files represent the expected scoring behavior of the system. Future validation runs compare against these baselines to detect deviations.</w:t>
+        <w:t xml:space="preserve">These files represent the expected scoring behavior of the system. Future validation runs </w:t>
+      </w:r>
+      <w:proofErr w:type="gramStart"/>
+      <w:r>
+        <w:t>compare</w:t>
+      </w:r>
+      <w:proofErr w:type="gramEnd"/>
+      <w:r>
+        <w:t xml:space="preserve"> against these baselines to detect deviations.</w:t>
       </w:r>
     </w:p>
     <w:p>
@@ -3255,8 +3621,13 @@
           <w:numId w:val="27"/>
         </w:numPr>
       </w:pPr>
-      <w:r>
-        <w:t>Report whether drift is detected</w:t>
+      <w:proofErr w:type="gramStart"/>
+      <w:r>
+        <w:t>Report</w:t>
+      </w:r>
+      <w:proofErr w:type="gramEnd"/>
+      <w:r>
+        <w:t xml:space="preserve"> whether drift is detected</w:t>
       </w:r>
     </w:p>
     <w:p>
@@ -3292,28 +3663,58 @@
       </w:r>
       <w:r>
         <w:br/>
-        <w:t>golden_C_current_cases.json</w:t>
-      </w:r>
+        <w:t>golden_C_current_</w:t>
+      </w:r>
+      <w:proofErr w:type="gramStart"/>
+      <w:r>
+        <w:t>cases.json</w:t>
+      </w:r>
+      <w:proofErr w:type="gramEnd"/>
       <w:r>
         <w:br/>
-        <w:t>golden_C_legacy_cases.json</w:t>
-      </w:r>
+        <w:t>golden_C_legacy_</w:t>
+      </w:r>
+      <w:proofErr w:type="gramStart"/>
+      <w:r>
+        <w:t>cases.json</w:t>
+      </w:r>
+      <w:proofErr w:type="gramEnd"/>
       <w:r>
         <w:br/>
-        <w:t>golden_C_current_metrics.json</w:t>
-      </w:r>
+        <w:t>golden_C_current_</w:t>
+      </w:r>
+      <w:proofErr w:type="gramStart"/>
+      <w:r>
+        <w:t>metrics.json</w:t>
+      </w:r>
+      <w:proofErr w:type="gramEnd"/>
       <w:r>
         <w:br/>
-        <w:t>golden_C_legacy_metrics.json</w:t>
-      </w:r>
+        <w:t>golden_C_legacy_</w:t>
+      </w:r>
+      <w:proofErr w:type="gramStart"/>
+      <w:r>
+        <w:t>metrics.json</w:t>
+      </w:r>
+      <w:proofErr w:type="gramEnd"/>
       <w:r>
         <w:br/>
-        <w:t>golden20_api_scores_current.json</w:t>
-      </w:r>
+        <w:t>golden20_api_scores_</w:t>
+      </w:r>
+      <w:proofErr w:type="gramStart"/>
+      <w:r>
+        <w:t>current.json</w:t>
+      </w:r>
+      <w:proofErr w:type="gramEnd"/>
       <w:r>
         <w:br/>
-        <w:t>golden20_api_scores_legacy.json</w:t>
-      </w:r>
+        <w:t>golden20_api_scores_</w:t>
+      </w:r>
+      <w:proofErr w:type="gramStart"/>
+      <w:r>
+        <w:t>legacy.json</w:t>
+      </w:r>
+      <w:proofErr w:type="gramEnd"/>
     </w:p>
     <w:p>
       <w:r>
@@ -3535,10 +3936,7 @@
         </w:numPr>
       </w:pPr>
       <w:r>
-        <w:t>Retest all Legacy documents in their original form (rather than screenshots of the pdf documents) in an attempt to eliminate the processing difference for Legacy and Current models.</w:t>
-      </w:r>
-      <w:r>
-        <w:t xml:space="preserve">  Elements I through L are already tested with original Legacy documents.  They still show some differences that be accounted for by scorer and student evolution, but the results are much closer to being unified for Legacy and Current documents.</w:t>
+        <w:t>Move away from prompt engineering/calibration work to research that informs further work in scoring improvements</w:t>
       </w:r>
       <w:r>
         <w:pict w14:anchorId="35FA4AB3">

</xml_diff>

<commit_message>
Release v2.1: Added post-calibration editorial reconciliation, Points for Teacher Review, unified Legacy/Current scoring prompt, improved progress tracking, Legacy Replay support, JSON-safe output handling, and revised integer reconciliation order.
</commit_message>
<xml_diff>
--- a/Readme.docx
+++ b/Readme.docx
@@ -14,23 +14,7 @@
           <w:b/>
           <w:bCs/>
         </w:rPr>
-        <w:t xml:space="preserve">GPTScorer – </w:t>
-      </w:r>
-      <w:proofErr w:type="gramStart"/>
-      <w:r>
-        <w:rPr>
-          <w:b/>
-          <w:bCs/>
-        </w:rPr>
-        <w:t>Element  Scoring</w:t>
-      </w:r>
-      <w:proofErr w:type="gramEnd"/>
-      <w:r>
-        <w:rPr>
-          <w:b/>
-          <w:bCs/>
-        </w:rPr>
-        <w:t xml:space="preserve"> Application</w:t>
+        <w:t>GPTScorer – Element  Scoring Application</w:t>
       </w:r>
     </w:p>
     <w:p>
@@ -71,48 +55,38 @@
         <w:t>, H</w:t>
       </w:r>
       <w:r>
+        <w:t xml:space="preserve">, I </w:t>
+      </w:r>
+      <w:r>
+        <w:t>,J</w:t>
+      </w:r>
+      <w:r>
+        <w:t xml:space="preserve">, K and L </w:t>
+      </w:r>
+      <w:r>
+        <w:t>have</w:t>
+      </w:r>
+      <w:r>
+        <w:t xml:space="preserve"> also been added with the same architecture.  The discussion below describes Element C but is applicable to Element</w:t>
+      </w:r>
+      <w:r>
+        <w:t>s</w:t>
+      </w:r>
+      <w:r>
+        <w:t xml:space="preserve"> A</w:t>
+      </w:r>
+      <w:r>
+        <w:t>, B</w:t>
+      </w:r>
+      <w:r>
+        <w:t>,</w:t>
+      </w:r>
+      <w:r>
+        <w:t>D</w:t>
+      </w:r>
+      <w:r>
         <w:t xml:space="preserve">, </w:t>
       </w:r>
-      <w:proofErr w:type="gramStart"/>
-      <w:r>
-        <w:t xml:space="preserve">I </w:t>
-      </w:r>
-      <w:r>
-        <w:t>,J</w:t>
-      </w:r>
-      <w:proofErr w:type="gramEnd"/>
-      <w:r>
-        <w:t xml:space="preserve">, K and L </w:t>
-      </w:r>
-      <w:r>
-        <w:t>have</w:t>
-      </w:r>
-      <w:r>
-        <w:t xml:space="preserve"> also been added with the same architecture.  The discussion below describes Element C but is applicable to Element</w:t>
-      </w:r>
-      <w:r>
-        <w:t>s</w:t>
-      </w:r>
-      <w:r>
-        <w:t xml:space="preserve"> A</w:t>
-      </w:r>
-      <w:r>
-        <w:t xml:space="preserve">, </w:t>
-      </w:r>
-      <w:proofErr w:type="gramStart"/>
-      <w:r>
-        <w:t>B</w:t>
-      </w:r>
-      <w:r>
-        <w:t>,</w:t>
-      </w:r>
-      <w:r>
-        <w:t>D</w:t>
-      </w:r>
-      <w:proofErr w:type="gramEnd"/>
-      <w:r>
-        <w:t xml:space="preserve">, </w:t>
-      </w:r>
       <w:r>
         <w:t>E</w:t>
       </w:r>
@@ -147,23 +121,7 @@
         <w:t>as well</w:t>
       </w:r>
       <w:r>
-        <w:t xml:space="preserve"> </w:t>
-      </w:r>
-      <w:proofErr w:type="gramStart"/>
-      <w:r>
-        <w:t>for</w:t>
-      </w:r>
-      <w:proofErr w:type="gramEnd"/>
-      <w:r>
-        <w:t xml:space="preserve"> operation.  The discussion </w:t>
-      </w:r>
-      <w:proofErr w:type="gramStart"/>
-      <w:r>
-        <w:t>discloses  detailed</w:t>
-      </w:r>
-      <w:proofErr w:type="gramEnd"/>
-      <w:r>
-        <w:t xml:space="preserve"> parameters that are specific to Element C so they will obviously change for the other elements.</w:t>
+        <w:t xml:space="preserve"> for operation.  The discussion discloses  detailed parameters that are specific to Element C so they will obviously change for the other elements.</w:t>
       </w:r>
     </w:p>
     <w:p>
@@ -558,31 +516,7 @@
         <w:t>This b</w:t>
       </w:r>
       <w:r>
-        <w:t xml:space="preserve">lock diagram shows data flow for the overall system which is divided </w:t>
-      </w:r>
-      <w:proofErr w:type="gramStart"/>
-      <w:r>
-        <w:t>in</w:t>
-      </w:r>
-      <w:proofErr w:type="gramEnd"/>
-      <w:r>
-        <w:t xml:space="preserve"> two processes</w:t>
-      </w:r>
-      <w:proofErr w:type="gramStart"/>
-      <w:r>
-        <w:t>:  scoring</w:t>
-      </w:r>
-      <w:proofErr w:type="gramEnd"/>
-      <w:r>
-        <w:t xml:space="preserve"> and diagnostics.  Diagnostics include drift detection for scores of </w:t>
-      </w:r>
-      <w:proofErr w:type="gramStart"/>
-      <w:r>
-        <w:t>documents  submitted</w:t>
-      </w:r>
-      <w:proofErr w:type="gramEnd"/>
-      <w:r>
-        <w:t xml:space="preserve"> for scoring.  Regression testing using a Golden20 set of documents, chosen for their susceptibility for variations in scoring processes and philosophy.  Controller_app.py is an overall controller for system, controlling both scoring and diagnostics in one UI. </w:t>
+        <w:t xml:space="preserve">lock diagram shows data flow for the overall system which is divided in two processes:  scoring and diagnostics.  Diagnostics include drift detection for scores of documents  submitted for scoring.  Regression testing using a Golden20 set of documents, chosen for their susceptibility for variations in scoring processes and philosophy.  Controller_app.py is an overall controller for system, controlling both scoring and diagnostics in one UI. </w:t>
       </w:r>
     </w:p>
     <w:p>
@@ -1031,23 +965,7 @@
     </w:p>
     <w:p>
       <w:r>
-        <w:t xml:space="preserve">python -m </w:t>
-      </w:r>
-      <w:proofErr w:type="gramStart"/>
-      <w:r>
-        <w:t>elements.element</w:t>
-      </w:r>
-      <w:proofErr w:type="gramEnd"/>
-      <w:r>
-        <w:t>_</w:t>
-      </w:r>
-      <w:proofErr w:type="gramStart"/>
-      <w:r>
-        <w:t>C.score</w:t>
-      </w:r>
-      <w:proofErr w:type="gramEnd"/>
-      <w:r>
-        <w:t>_with_API_C ^</w:t>
+        <w:t>python -m elements.element_C.score_with_API_C ^</w:t>
       </w:r>
       <w:r>
         <w:br/>
@@ -1162,15 +1080,7 @@
         </w:numPr>
       </w:pPr>
       <w:r>
-        <w:t>C1-C</w:t>
-      </w:r>
-      <w:proofErr w:type="gramStart"/>
-      <w:r>
-        <w:t>6  Bulleted</w:t>
-      </w:r>
-      <w:proofErr w:type="gramEnd"/>
-      <w:r>
-        <w:t xml:space="preserve"> rationale</w:t>
+        <w:t>C1-C6  Bulleted rationale</w:t>
       </w:r>
     </w:p>
     <w:p>
@@ -1445,7 +1355,7 @@
         <w:t>C1 – C6 bulleted rationale</w:t>
       </w:r>
       <w:r>
-        <w:t xml:space="preserve"> </w:t>
+        <w:t xml:space="preserve">, reconciled to calibrated scores, </w:t>
       </w:r>
       <w:r>
         <w:t>from score_with_api_C.py</w:t>
@@ -1460,13 +1370,10 @@
         </w:numPr>
       </w:pPr>
       <w:r>
-        <w:t>Narrative ra</w:t>
-      </w:r>
-      <w:r>
-        <w:t>t</w:t>
-      </w:r>
-      <w:r>
-        <w:t>ionale</w:t>
+        <w:t xml:space="preserve">Narrative </w:t>
+      </w:r>
+      <w:r>
+        <w:t>feedback, reoonciled to calibrated scores</w:t>
       </w:r>
     </w:p>
     <w:p>
@@ -1478,6 +1385,18 @@
         </w:numPr>
       </w:pPr>
       <w:r>
+        <w:t>Points for Teacher Review, intended to inform teachers for scoring a specific document</w:t>
+      </w:r>
+    </w:p>
+    <w:p>
+      <w:pPr>
+        <w:pStyle w:val="ListParagraph"/>
+        <w:numPr>
+          <w:ilvl w:val="0"/>
+          <w:numId w:val="18"/>
+        </w:numPr>
+      </w:pPr>
+      <w:r>
         <w:t>Element_score_raw, the average of the api scores</w:t>
       </w:r>
     </w:p>
@@ -1519,15 +1438,7 @@
         </w:numPr>
       </w:pPr>
       <w:r>
-        <w:t>C1_</w:t>
-      </w:r>
-      <w:proofErr w:type="gramStart"/>
-      <w:r>
-        <w:t>final  –</w:t>
-      </w:r>
-      <w:proofErr w:type="gramEnd"/>
-      <w:r>
-        <w:t xml:space="preserve"> C6_final calibrated scores for output</w:t>
+        <w:t>C1_final  – C6_final calibrated scores for output</w:t>
       </w:r>
     </w:p>
     <w:p>
@@ -1606,6 +1517,18 @@
       </w:pPr>
       <w:r>
         <w:t>Narrative rationale</w:t>
+      </w:r>
+    </w:p>
+    <w:p>
+      <w:pPr>
+        <w:pStyle w:val="ListParagraph"/>
+        <w:numPr>
+          <w:ilvl w:val="0"/>
+          <w:numId w:val="17"/>
+        </w:numPr>
+      </w:pPr>
+      <w:r>
+        <w:t>Points for Teacher Review</w:t>
       </w:r>
     </w:p>
     <w:p/>
@@ -1656,13 +1579,8 @@
         </w:numPr>
       </w:pPr>
       <w:r>
-        <w:t xml:space="preserve">Drift slightly </w:t>
-      </w:r>
-      <w:proofErr w:type="gramStart"/>
-      <w:r>
-        <w:t>over time</w:t>
-      </w:r>
-      <w:proofErr w:type="gramEnd"/>
+        <w:t>Drift slightly over time</w:t>
+      </w:r>
     </w:p>
     <w:p>
       <w:pPr>
@@ -1749,6 +1667,7 @@
         </w:numPr>
       </w:pPr>
       <w:r>
+        <w:lastRenderedPageBreak/>
         <w:t>Interpretability</w:t>
       </w:r>
     </w:p>
@@ -1770,7 +1689,6 @@
     </w:p>
     <w:p>
       <w:r>
-        <w:lastRenderedPageBreak/>
         <w:pict w14:anchorId="5B151077">
           <v:rect id="_x0000_i1031" style="width:0;height:1.5pt" o:hralign="center" o:hrstd="t" o:hr="t" fillcolor="#a0a0a0" stroked="f"/>
         </w:pict>
@@ -1814,13 +1732,8 @@
           <w:numId w:val="11"/>
         </w:numPr>
       </w:pPr>
-      <w:proofErr w:type="gramStart"/>
-      <w:r>
-        <w:t>Explains</w:t>
-      </w:r>
-      <w:proofErr w:type="gramEnd"/>
-      <w:r>
-        <w:t xml:space="preserve"> strengths and weaknesses</w:t>
+      <w:r>
+        <w:t>Explains strengths and weaknesses</w:t>
       </w:r>
     </w:p>
     <w:p>
@@ -1841,13 +1754,19 @@
           <w:numId w:val="11"/>
         </w:numPr>
       </w:pPr>
-      <w:proofErr w:type="gramStart"/>
-      <w:r>
-        <w:t>Uses</w:t>
-      </w:r>
-      <w:proofErr w:type="gramEnd"/>
-      <w:r>
-        <w:t xml:space="preserve"> educator-friendly language</w:t>
+      <w:r>
+        <w:t>Uses educator-friendly language</w:t>
+      </w:r>
+    </w:p>
+    <w:p>
+      <w:pPr>
+        <w:numPr>
+          <w:ilvl w:val="0"/>
+          <w:numId w:val="11"/>
+        </w:numPr>
+      </w:pPr>
+      <w:r>
+        <w:t>Reconciled to calibrated scores</w:t>
       </w:r>
     </w:p>
     <w:p>
@@ -1989,6 +1908,7 @@
     </w:p>
     <w:p>
       <w:r>
+        <w:lastRenderedPageBreak/>
         <w:t xml:space="preserve">└── </w:t>
       </w:r>
       <w:r>
@@ -2036,7 +1956,442 @@
     </w:p>
     <w:p>
       <w:r>
+        <w:t>│</w:t>
+      </w:r>
+    </w:p>
+    <w:p>
+      <w:r>
+        <w:rPr>
+          <w:rFonts w:ascii="MS Gothic" w:eastAsia="MS Gothic" w:hAnsi="MS Gothic" w:cs="MS Gothic" w:hint="eastAsia"/>
+        </w:rPr>
+        <w:t>├</w:t>
+      </w:r>
+      <w:r>
+        <w:rPr>
+          <w:rFonts w:ascii="Aptos" w:hAnsi="Aptos" w:cs="Aptos"/>
+        </w:rPr>
+        <w:t>──</w:t>
+      </w:r>
+      <w:r>
+        <w:t xml:space="preserve"> config/</w:t>
+      </w:r>
+    </w:p>
+    <w:p>
+      <w:r>
+        <w:t xml:space="preserve"> │     └── element_A/ -  analogous to C</w:t>
+      </w:r>
+    </w:p>
+    <w:p>
+      <w:r>
+        <w:t xml:space="preserve"> │   └── element_B/ -  analogous to C</w:t>
+      </w:r>
+    </w:p>
+    <w:p>
+      <w:r>
+        <w:t xml:space="preserve"> │   └── element_D/ - analogous to C</w:t>
+      </w:r>
+    </w:p>
+    <w:p>
+      <w:r>
+        <w:t xml:space="preserve"> │   └── element_E/ -  analogous to C</w:t>
+      </w:r>
+    </w:p>
+    <w:p>
+      <w:r>
+        <w:t xml:space="preserve"> │   └── element_F/ -  analogous to C</w:t>
+      </w:r>
+    </w:p>
+    <w:p>
+      <w:r>
+        <w:t xml:space="preserve"> │   └── element_G/ -  analogous to C</w:t>
+      </w:r>
+    </w:p>
+    <w:p>
+      <w:r>
+        <w:t xml:space="preserve"> │   └── element_H/ -  analogous to C</w:t>
+      </w:r>
+    </w:p>
+    <w:p>
+      <w:r>
+        <w:t xml:space="preserve"> │   └── element_I/ -  analogous to C</w:t>
+      </w:r>
+    </w:p>
+    <w:p>
+      <w:r>
+        <w:t xml:space="preserve"> │   └── element_J/ -  analogous to C</w:t>
+      </w:r>
+    </w:p>
+    <w:p>
+      <w:r>
+        <w:t xml:space="preserve"> │   └── element_K/ -  analogous to C</w:t>
+      </w:r>
+    </w:p>
+    <w:p>
+      <w:r>
+        <w:t xml:space="preserve"> │   └── element_L/ -  analogous to C</w:t>
+      </w:r>
+    </w:p>
+    <w:p>
+      <w:r>
+        <w:t xml:space="preserve"> │    └── element_C/</w:t>
+      </w:r>
+    </w:p>
+    <w:p>
+      <w:r>
+        <w:t xml:space="preserve">│   </w:t>
+      </w:r>
+      <w:r>
+        <w:t xml:space="preserve">     </w:t>
+      </w:r>
+      <w:r>
+        <w:rPr>
+          <w:rFonts w:ascii="MS Gothic" w:eastAsia="MS Gothic" w:hAnsi="MS Gothic" w:cs="MS Gothic" w:hint="eastAsia"/>
+        </w:rPr>
+        <w:t>├</w:t>
+      </w:r>
+      <w:r>
+        <w:rPr>
+          <w:rFonts w:ascii="Aptos" w:hAnsi="Aptos" w:cs="Aptos"/>
+        </w:rPr>
+        <w:t>──</w:t>
+      </w:r>
+      <w:r>
+        <w:t xml:space="preserve"> golden_C_current.json</w:t>
+      </w:r>
+    </w:p>
+    <w:p>
+      <w:r>
+        <w:t xml:space="preserve">│   </w:t>
+      </w:r>
+      <w:r>
+        <w:t xml:space="preserve">     </w:t>
+      </w:r>
+      <w:r>
+        <w:rPr>
+          <w:rFonts w:ascii="MS Gothic" w:eastAsia="MS Gothic" w:hAnsi="MS Gothic" w:cs="MS Gothic" w:hint="eastAsia"/>
+        </w:rPr>
+        <w:t>├</w:t>
+      </w:r>
+      <w:r>
+        <w:rPr>
+          <w:rFonts w:ascii="Aptos" w:hAnsi="Aptos" w:cs="Aptos"/>
+        </w:rPr>
+        <w:t>──</w:t>
+      </w:r>
+      <w:r>
+        <w:t xml:space="preserve"> golden_C_legacy.json</w:t>
+      </w:r>
+    </w:p>
+    <w:p>
+      <w:r>
+        <w:t xml:space="preserve">│   </w:t>
+      </w:r>
+      <w:r>
+        <w:t xml:space="preserve">     </w:t>
+      </w:r>
+      <w:r>
+        <w:rPr>
+          <w:rFonts w:ascii="MS Gothic" w:eastAsia="MS Gothic" w:hAnsi="MS Gothic" w:cs="MS Gothic" w:hint="eastAsia"/>
+        </w:rPr>
+        <w:t>├</w:t>
+      </w:r>
+      <w:r>
+        <w:rPr>
+          <w:rFonts w:ascii="Aptos" w:hAnsi="Aptos" w:cs="Aptos"/>
+        </w:rPr>
+        <w:t>──</w:t>
+      </w:r>
+      <w:r>
+        <w:t xml:space="preserve"> golden20_metrics_current.json</w:t>
+      </w:r>
+    </w:p>
+    <w:p>
+      <w:r>
+        <w:t xml:space="preserve">│   </w:t>
+      </w:r>
+      <w:r>
+        <w:t xml:space="preserve">     </w:t>
+      </w:r>
+      <w:r>
+        <w:rPr>
+          <w:rFonts w:ascii="MS Gothic" w:eastAsia="MS Gothic" w:hAnsi="MS Gothic" w:cs="MS Gothic" w:hint="eastAsia"/>
+        </w:rPr>
+        <w:t>├</w:t>
+      </w:r>
+      <w:r>
+        <w:rPr>
+          <w:rFonts w:ascii="Aptos" w:hAnsi="Aptos" w:cs="Aptos"/>
+        </w:rPr>
+        <w:t>──</w:t>
+      </w:r>
+      <w:r>
+        <w:t xml:space="preserve"> golden20_metrics_legacy.json</w:t>
+      </w:r>
+    </w:p>
+    <w:p>
+      <w:r>
+        <w:t xml:space="preserve">│   </w:t>
+      </w:r>
+      <w:r>
+        <w:t xml:space="preserve">     </w:t>
+      </w:r>
+      <w:r>
+        <w:rPr>
+          <w:rFonts w:ascii="MS Gothic" w:eastAsia="MS Gothic" w:hAnsi="MS Gothic" w:cs="MS Gothic" w:hint="eastAsia"/>
+        </w:rPr>
+        <w:t>├</w:t>
+      </w:r>
+      <w:r>
+        <w:rPr>
+          <w:rFonts w:ascii="Aptos" w:hAnsi="Aptos" w:cs="Aptos"/>
+        </w:rPr>
+        <w:t>──</w:t>
+      </w:r>
+      <w:r>
+        <w:t xml:space="preserve"> golden20_current_scores.json      </w:t>
+      </w:r>
+      <w:r>
+        <w:rPr>
+          <w:rFonts w:ascii="Aptos" w:hAnsi="Aptos" w:cs="Aptos"/>
+        </w:rPr>
+        <w:t>←</w:t>
+      </w:r>
+      <w:r>
+        <w:t xml:space="preserve"> cached API scores</w:t>
+      </w:r>
+    </w:p>
+    <w:p>
+      <w:r>
+        <w:t xml:space="preserve">│ </w:t>
+      </w:r>
+      <w:r>
+        <w:t xml:space="preserve">    </w:t>
+      </w:r>
+      <w:r>
+        <w:t xml:space="preserve">  </w:t>
+      </w:r>
+      <w:r>
+        <w:t xml:space="preserve">  </w:t>
+      </w:r>
+      <w:r>
+        <w:t>└── golden20_legacy_scores.json       ← cached API scores</w:t>
+      </w:r>
+    </w:p>
+    <w:p>
+      <w:r>
+        <w:t>│</w:t>
+      </w:r>
+    </w:p>
+    <w:p>
+      <w:r>
+        <w:rPr>
+          <w:rFonts w:ascii="MS Gothic" w:eastAsia="MS Gothic" w:hAnsi="MS Gothic" w:cs="MS Gothic" w:hint="eastAsia"/>
+        </w:rPr>
+        <w:t>├</w:t>
+      </w:r>
+      <w:r>
+        <w:rPr>
+          <w:rFonts w:ascii="Aptos" w:hAnsi="Aptos" w:cs="Aptos"/>
+        </w:rPr>
+        <w:t>──</w:t>
+      </w:r>
+      <w:r>
+        <w:t xml:space="preserve"> elements/</w:t>
+      </w:r>
+    </w:p>
+    <w:p>
+      <w:r>
         <w:lastRenderedPageBreak/>
+        <w:t xml:space="preserve"> │   └── element_A/ -  analogous to C</w:t>
+      </w:r>
+    </w:p>
+    <w:p>
+      <w:r>
+        <w:t xml:space="preserve"> │   └── element_B/ -  analogous to C</w:t>
+      </w:r>
+    </w:p>
+    <w:p>
+      <w:r>
+        <w:t xml:space="preserve"> │   └── element_D/ - analogous to C</w:t>
+      </w:r>
+    </w:p>
+    <w:p>
+      <w:r>
+        <w:t xml:space="preserve"> │   └── element_E/ -  analogous to C</w:t>
+      </w:r>
+    </w:p>
+    <w:p>
+      <w:r>
+        <w:t xml:space="preserve"> │   └── element_F/ -  analogous to C</w:t>
+      </w:r>
+    </w:p>
+    <w:p>
+      <w:r>
+        <w:t xml:space="preserve"> │   └── element_G/ -  analogous to C</w:t>
+      </w:r>
+    </w:p>
+    <w:p>
+      <w:r>
+        <w:t xml:space="preserve"> │   └── element_H/ -  analogous to C</w:t>
+      </w:r>
+    </w:p>
+    <w:p>
+      <w:r>
+        <w:t xml:space="preserve"> │   └── element_I/ -  analogous to C</w:t>
+      </w:r>
+    </w:p>
+    <w:p>
+      <w:r>
+        <w:t xml:space="preserve"> │   └── element_J/ -  analogous to C</w:t>
+      </w:r>
+    </w:p>
+    <w:p>
+      <w:r>
+        <w:t xml:space="preserve"> │   └── element_K/ -  analogous to C</w:t>
+      </w:r>
+    </w:p>
+    <w:p>
+      <w:r>
+        <w:t xml:space="preserve"> │   └── element_L/ -  analogous to C</w:t>
+      </w:r>
+    </w:p>
+    <w:p>
+      <w:r>
+        <w:t>│   └── element_C/</w:t>
+      </w:r>
+    </w:p>
+    <w:p>
+      <w:r>
+        <w:t xml:space="preserve">│       </w:t>
+      </w:r>
+      <w:r>
+        <w:rPr>
+          <w:rFonts w:ascii="MS Gothic" w:eastAsia="MS Gothic" w:hAnsi="MS Gothic" w:cs="MS Gothic" w:hint="eastAsia"/>
+        </w:rPr>
+        <w:t>├</w:t>
+      </w:r>
+      <w:r>
+        <w:rPr>
+          <w:rFonts w:ascii="Aptos" w:hAnsi="Aptos" w:cs="Aptos"/>
+        </w:rPr>
+        <w:t>──</w:t>
+      </w:r>
+      <w:r>
+        <w:t xml:space="preserve"> score_with_API_C.py</w:t>
+      </w:r>
+    </w:p>
+    <w:p>
+      <w:r>
+        <w:t xml:space="preserve">│       </w:t>
+      </w:r>
+      <w:r>
+        <w:rPr>
+          <w:rFonts w:ascii="MS Gothic" w:eastAsia="MS Gothic" w:hAnsi="MS Gothic" w:cs="MS Gothic" w:hint="eastAsia"/>
+        </w:rPr>
+        <w:t>├</w:t>
+      </w:r>
+      <w:r>
+        <w:rPr>
+          <w:rFonts w:ascii="Aptos" w:hAnsi="Aptos" w:cs="Aptos"/>
+        </w:rPr>
+        <w:t>──</w:t>
+      </w:r>
+      <w:r>
+        <w:t xml:space="preserve"> scorer_app_C.py</w:t>
+      </w:r>
+    </w:p>
+    <w:p>
+      <w:r>
+        <w:t>│       │</w:t>
+      </w:r>
+    </w:p>
+    <w:p>
+      <w:r>
+        <w:t xml:space="preserve">│       </w:t>
+      </w:r>
+      <w:r>
+        <w:rPr>
+          <w:rFonts w:ascii="MS Gothic" w:eastAsia="MS Gothic" w:hAnsi="MS Gothic" w:cs="MS Gothic" w:hint="eastAsia"/>
+        </w:rPr>
+        <w:t>├</w:t>
+      </w:r>
+      <w:r>
+        <w:rPr>
+          <w:rFonts w:ascii="Aptos" w:hAnsi="Aptos" w:cs="Aptos"/>
+        </w:rPr>
+        <w:t>──</w:t>
+      </w:r>
+      <w:r>
+        <w:t xml:space="preserve"> Current_GPT.csv</w:t>
+      </w:r>
+    </w:p>
+    <w:p>
+      <w:r>
+        <w:t xml:space="preserve">│       </w:t>
+      </w:r>
+      <w:r>
+        <w:rPr>
+          <w:rFonts w:ascii="MS Gothic" w:eastAsia="MS Gothic" w:hAnsi="MS Gothic" w:cs="MS Gothic" w:hint="eastAsia"/>
+        </w:rPr>
+        <w:t>├</w:t>
+      </w:r>
+      <w:r>
+        <w:rPr>
+          <w:rFonts w:ascii="Aptos" w:hAnsi="Aptos" w:cs="Aptos"/>
+        </w:rPr>
+        <w:t>──</w:t>
+      </w:r>
+      <w:r>
+        <w:t xml:space="preserve"> Legacy_GPT.csv</w:t>
+      </w:r>
+    </w:p>
+    <w:p>
+      <w:r>
+        <w:t>│       │</w:t>
+      </w:r>
+    </w:p>
+    <w:p>
+      <w:r>
+        <w:t xml:space="preserve">│       </w:t>
+      </w:r>
+      <w:r>
+        <w:rPr>
+          <w:rFonts w:ascii="MS Gothic" w:eastAsia="MS Gothic" w:hAnsi="MS Gothic" w:cs="MS Gothic" w:hint="eastAsia"/>
+        </w:rPr>
+        <w:t>├</w:t>
+      </w:r>
+      <w:r>
+        <w:rPr>
+          <w:rFonts w:ascii="Aptos" w:hAnsi="Aptos" w:cs="Aptos"/>
+        </w:rPr>
+        <w:t>──</w:t>
+      </w:r>
+      <w:r>
+        <w:t xml:space="preserve"> current_api_scoring_documents/</w:t>
+      </w:r>
+    </w:p>
+    <w:p>
+      <w:r>
+        <w:t>│       │   └── (documents scored using current model)</w:t>
+      </w:r>
+    </w:p>
+    <w:p>
+      <w:r>
+        <w:t>│       │</w:t>
+      </w:r>
+    </w:p>
+    <w:p>
+      <w:r>
+        <w:t>│       └── legacy_api_scoring_documents/</w:t>
+      </w:r>
+    </w:p>
+    <w:p>
+      <w:r>
+        <w:t>│           └── (documents scored using legacy model)</w:t>
+      </w:r>
+    </w:p>
+    <w:p>
+      <w:r>
         <w:t>│</w:t>
       </w:r>
     </w:p>
@@ -2054,668 +2409,36 @@
         <w:t>──</w:t>
       </w:r>
       <w:r>
-        <w:t xml:space="preserve"> config/</w:t>
-      </w:r>
-    </w:p>
-    <w:p>
-      <w:r>
-        <w:t xml:space="preserve"> │     └── element_A/ </w:t>
-      </w:r>
-      <w:proofErr w:type="gramStart"/>
-      <w:r>
-        <w:t>-  analogous</w:t>
-      </w:r>
-      <w:proofErr w:type="gramEnd"/>
-      <w:r>
-        <w:t xml:space="preserve"> to C</w:t>
-      </w:r>
-    </w:p>
-    <w:p>
-      <w:r>
-        <w:t xml:space="preserve"> │   └── element_B/ </w:t>
-      </w:r>
-      <w:proofErr w:type="gramStart"/>
-      <w:r>
-        <w:t>-  analogous</w:t>
-      </w:r>
-      <w:proofErr w:type="gramEnd"/>
-      <w:r>
-        <w:t xml:space="preserve"> to C</w:t>
-      </w:r>
-    </w:p>
-    <w:p>
-      <w:r>
-        <w:t xml:space="preserve"> │   └── element_D/ - analogous to C</w:t>
-      </w:r>
-    </w:p>
-    <w:p>
-      <w:r>
-        <w:t xml:space="preserve"> │   └── element_E/ </w:t>
-      </w:r>
-      <w:proofErr w:type="gramStart"/>
-      <w:r>
-        <w:t>-  analogous</w:t>
-      </w:r>
-      <w:proofErr w:type="gramEnd"/>
-      <w:r>
-        <w:t xml:space="preserve"> to C</w:t>
-      </w:r>
-    </w:p>
-    <w:p>
-      <w:r>
-        <w:t xml:space="preserve"> │   └── element_F/ </w:t>
-      </w:r>
-      <w:proofErr w:type="gramStart"/>
-      <w:r>
-        <w:t>-  analogous</w:t>
-      </w:r>
-      <w:proofErr w:type="gramEnd"/>
-      <w:r>
-        <w:t xml:space="preserve"> to C</w:t>
-      </w:r>
-    </w:p>
-    <w:p>
-      <w:r>
-        <w:t xml:space="preserve"> │   └── element_G/ </w:t>
-      </w:r>
-      <w:proofErr w:type="gramStart"/>
-      <w:r>
-        <w:t>-  analogous</w:t>
-      </w:r>
-      <w:proofErr w:type="gramEnd"/>
-      <w:r>
-        <w:t xml:space="preserve"> to C</w:t>
-      </w:r>
-    </w:p>
-    <w:p>
-      <w:r>
-        <w:t xml:space="preserve"> │   └── element_H/ </w:t>
-      </w:r>
-      <w:proofErr w:type="gramStart"/>
-      <w:r>
-        <w:t>-  analogous</w:t>
-      </w:r>
-      <w:proofErr w:type="gramEnd"/>
-      <w:r>
-        <w:t xml:space="preserve"> to C</w:t>
-      </w:r>
-    </w:p>
-    <w:p>
-      <w:r>
-        <w:t xml:space="preserve"> │   └── element_I/ </w:t>
-      </w:r>
-      <w:proofErr w:type="gramStart"/>
-      <w:r>
-        <w:t>-  analogous</w:t>
-      </w:r>
-      <w:proofErr w:type="gramEnd"/>
-      <w:r>
-        <w:t xml:space="preserve"> to C</w:t>
-      </w:r>
-    </w:p>
-    <w:p>
-      <w:r>
-        <w:t xml:space="preserve"> │   └── element_J/ </w:t>
-      </w:r>
-      <w:proofErr w:type="gramStart"/>
-      <w:r>
-        <w:t>-  analogous</w:t>
-      </w:r>
-      <w:proofErr w:type="gramEnd"/>
-      <w:r>
-        <w:t xml:space="preserve"> to C</w:t>
-      </w:r>
-    </w:p>
-    <w:p>
-      <w:r>
-        <w:t xml:space="preserve"> │   └── element_K/ </w:t>
-      </w:r>
-      <w:proofErr w:type="gramStart"/>
-      <w:r>
-        <w:t>-  analogous</w:t>
-      </w:r>
-      <w:proofErr w:type="gramEnd"/>
-      <w:r>
-        <w:t xml:space="preserve"> to C</w:t>
-      </w:r>
-    </w:p>
-    <w:p>
-      <w:r>
-        <w:t xml:space="preserve"> │   └── element_L/ </w:t>
-      </w:r>
-      <w:proofErr w:type="gramStart"/>
-      <w:r>
-        <w:t>-  analogous</w:t>
-      </w:r>
-      <w:proofErr w:type="gramEnd"/>
-      <w:r>
-        <w:t xml:space="preserve"> to C</w:t>
-      </w:r>
-    </w:p>
-    <w:p>
-      <w:r>
-        <w:t xml:space="preserve"> │    └── element_C/</w:t>
-      </w:r>
-    </w:p>
-    <w:p>
-      <w:r>
-        <w:t xml:space="preserve">│   </w:t>
-      </w:r>
-      <w:r>
-        <w:t xml:space="preserve">     </w:t>
-      </w:r>
+        <w:t xml:space="preserve"> scripts/</w:t>
+      </w:r>
+    </w:p>
+    <w:p>
+      <w:r>
+        <w:t>│   └── shared/</w:t>
+      </w:r>
+    </w:p>
+    <w:p>
+      <w:r>
+        <w:lastRenderedPageBreak/>
+        <w:t>│       └── utils.py</w:t>
+      </w:r>
+    </w:p>
+    <w:p>
+      <w:r>
+        <w:t>│       └── validate_golden20.py</w:t>
+      </w:r>
+    </w:p>
+    <w:p/>
+    <w:p>
+      <w:r>
+        <w:t>│</w:t>
+      </w:r>
+    </w:p>
+    <w:p>
       <w:r>
         <w:rPr>
           <w:rFonts w:ascii="MS Gothic" w:eastAsia="MS Gothic" w:hAnsi="MS Gothic" w:cs="MS Gothic" w:hint="eastAsia"/>
         </w:rPr>
-        <w:t>├</w:t>
-      </w:r>
-      <w:r>
-        <w:rPr>
-          <w:rFonts w:ascii="Aptos" w:hAnsi="Aptos" w:cs="Aptos"/>
-        </w:rPr>
-        <w:t>──</w:t>
-      </w:r>
-      <w:r>
-        <w:t xml:space="preserve"> golden_C_</w:t>
-      </w:r>
-      <w:proofErr w:type="gramStart"/>
-      <w:r>
-        <w:t>current.json</w:t>
-      </w:r>
-      <w:proofErr w:type="gramEnd"/>
-    </w:p>
-    <w:p>
-      <w:r>
-        <w:t xml:space="preserve">│   </w:t>
-      </w:r>
-      <w:r>
-        <w:t xml:space="preserve">     </w:t>
-      </w:r>
-      <w:r>
-        <w:rPr>
-          <w:rFonts w:ascii="MS Gothic" w:eastAsia="MS Gothic" w:hAnsi="MS Gothic" w:cs="MS Gothic" w:hint="eastAsia"/>
-        </w:rPr>
-        <w:t>├</w:t>
-      </w:r>
-      <w:r>
-        <w:rPr>
-          <w:rFonts w:ascii="Aptos" w:hAnsi="Aptos" w:cs="Aptos"/>
-        </w:rPr>
-        <w:t>──</w:t>
-      </w:r>
-      <w:r>
-        <w:t xml:space="preserve"> golden_C_</w:t>
-      </w:r>
-      <w:proofErr w:type="gramStart"/>
-      <w:r>
-        <w:t>legacy.json</w:t>
-      </w:r>
-      <w:proofErr w:type="gramEnd"/>
-    </w:p>
-    <w:p>
-      <w:r>
-        <w:t xml:space="preserve">│   </w:t>
-      </w:r>
-      <w:r>
-        <w:t xml:space="preserve">     </w:t>
-      </w:r>
-      <w:r>
-        <w:rPr>
-          <w:rFonts w:ascii="MS Gothic" w:eastAsia="MS Gothic" w:hAnsi="MS Gothic" w:cs="MS Gothic" w:hint="eastAsia"/>
-        </w:rPr>
-        <w:t>├</w:t>
-      </w:r>
-      <w:r>
-        <w:rPr>
-          <w:rFonts w:ascii="Aptos" w:hAnsi="Aptos" w:cs="Aptos"/>
-        </w:rPr>
-        <w:t>──</w:t>
-      </w:r>
-      <w:r>
-        <w:t xml:space="preserve"> golden20_metrics_</w:t>
-      </w:r>
-      <w:proofErr w:type="gramStart"/>
-      <w:r>
-        <w:t>current.json</w:t>
-      </w:r>
-      <w:proofErr w:type="gramEnd"/>
-    </w:p>
-    <w:p>
-      <w:r>
-        <w:t xml:space="preserve">│   </w:t>
-      </w:r>
-      <w:r>
-        <w:t xml:space="preserve">     </w:t>
-      </w:r>
-      <w:r>
-        <w:rPr>
-          <w:rFonts w:ascii="MS Gothic" w:eastAsia="MS Gothic" w:hAnsi="MS Gothic" w:cs="MS Gothic" w:hint="eastAsia"/>
-        </w:rPr>
-        <w:t>├</w:t>
-      </w:r>
-      <w:r>
-        <w:rPr>
-          <w:rFonts w:ascii="Aptos" w:hAnsi="Aptos" w:cs="Aptos"/>
-        </w:rPr>
-        <w:t>──</w:t>
-      </w:r>
-      <w:r>
-        <w:t xml:space="preserve"> golden20_metrics_</w:t>
-      </w:r>
-      <w:proofErr w:type="gramStart"/>
-      <w:r>
-        <w:t>legacy.json</w:t>
-      </w:r>
-      <w:proofErr w:type="gramEnd"/>
-    </w:p>
-    <w:p>
-      <w:r>
-        <w:t xml:space="preserve">│   </w:t>
-      </w:r>
-      <w:r>
-        <w:t xml:space="preserve">     </w:t>
-      </w:r>
-      <w:r>
-        <w:rPr>
-          <w:rFonts w:ascii="MS Gothic" w:eastAsia="MS Gothic" w:hAnsi="MS Gothic" w:cs="MS Gothic" w:hint="eastAsia"/>
-        </w:rPr>
-        <w:t>├</w:t>
-      </w:r>
-      <w:r>
-        <w:rPr>
-          <w:rFonts w:ascii="Aptos" w:hAnsi="Aptos" w:cs="Aptos"/>
-        </w:rPr>
-        <w:t>──</w:t>
-      </w:r>
-      <w:r>
-        <w:t xml:space="preserve"> golden20_current_</w:t>
-      </w:r>
-      <w:proofErr w:type="gramStart"/>
-      <w:r>
-        <w:t>scores.json</w:t>
-      </w:r>
-      <w:proofErr w:type="gramEnd"/>
-      <w:r>
-        <w:t xml:space="preserve">      </w:t>
-      </w:r>
-      <w:r>
-        <w:rPr>
-          <w:rFonts w:ascii="Aptos" w:hAnsi="Aptos" w:cs="Aptos"/>
-        </w:rPr>
-        <w:t>←</w:t>
-      </w:r>
-      <w:r>
-        <w:t xml:space="preserve"> cached API scores</w:t>
-      </w:r>
-    </w:p>
-    <w:p>
-      <w:r>
-        <w:t xml:space="preserve">│ </w:t>
-      </w:r>
-      <w:r>
-        <w:t xml:space="preserve">    </w:t>
-      </w:r>
-      <w:r>
-        <w:t xml:space="preserve">  </w:t>
-      </w:r>
-      <w:r>
-        <w:t xml:space="preserve">  </w:t>
-      </w:r>
-      <w:r>
-        <w:t>└── golden20_legacy_</w:t>
-      </w:r>
-      <w:proofErr w:type="gramStart"/>
-      <w:r>
-        <w:t>scores.json</w:t>
-      </w:r>
-      <w:proofErr w:type="gramEnd"/>
-      <w:r>
-        <w:t xml:space="preserve">       ← cached API scores</w:t>
-      </w:r>
-    </w:p>
-    <w:p>
-      <w:r>
-        <w:t>│</w:t>
-      </w:r>
-    </w:p>
-    <w:p>
-      <w:r>
-        <w:rPr>
-          <w:rFonts w:ascii="MS Gothic" w:eastAsia="MS Gothic" w:hAnsi="MS Gothic" w:cs="MS Gothic" w:hint="eastAsia"/>
-        </w:rPr>
-        <w:t>├</w:t>
-      </w:r>
-      <w:r>
-        <w:rPr>
-          <w:rFonts w:ascii="Aptos" w:hAnsi="Aptos" w:cs="Aptos"/>
-        </w:rPr>
-        <w:t>──</w:t>
-      </w:r>
-      <w:r>
-        <w:t xml:space="preserve"> elements/</w:t>
-      </w:r>
-    </w:p>
-    <w:p>
-      <w:r>
-        <w:t xml:space="preserve"> │   └── element_A/ </w:t>
-      </w:r>
-      <w:proofErr w:type="gramStart"/>
-      <w:r>
-        <w:t>-  analogous</w:t>
-      </w:r>
-      <w:proofErr w:type="gramEnd"/>
-      <w:r>
-        <w:t xml:space="preserve"> to C</w:t>
-      </w:r>
-    </w:p>
-    <w:p>
-      <w:r>
-        <w:t xml:space="preserve"> │   └── element_B/ </w:t>
-      </w:r>
-      <w:proofErr w:type="gramStart"/>
-      <w:r>
-        <w:t>-  analogous</w:t>
-      </w:r>
-      <w:proofErr w:type="gramEnd"/>
-      <w:r>
-        <w:t xml:space="preserve"> to C</w:t>
-      </w:r>
-    </w:p>
-    <w:p>
-      <w:r>
-        <w:t xml:space="preserve"> │   └── element_D/ - analogous to C</w:t>
-      </w:r>
-    </w:p>
-    <w:p>
-      <w:r>
-        <w:t xml:space="preserve"> │   └── element_E/ </w:t>
-      </w:r>
-      <w:proofErr w:type="gramStart"/>
-      <w:r>
-        <w:t>-  analogous</w:t>
-      </w:r>
-      <w:proofErr w:type="gramEnd"/>
-      <w:r>
-        <w:t xml:space="preserve"> to C</w:t>
-      </w:r>
-    </w:p>
-    <w:p>
-      <w:r>
-        <w:lastRenderedPageBreak/>
-        <w:t xml:space="preserve"> │   └── element_F/ </w:t>
-      </w:r>
-      <w:proofErr w:type="gramStart"/>
-      <w:r>
-        <w:t>-  analogous</w:t>
-      </w:r>
-      <w:proofErr w:type="gramEnd"/>
-      <w:r>
-        <w:t xml:space="preserve"> to C</w:t>
-      </w:r>
-    </w:p>
-    <w:p>
-      <w:r>
-        <w:t xml:space="preserve"> │   └── element_G/ </w:t>
-      </w:r>
-      <w:proofErr w:type="gramStart"/>
-      <w:r>
-        <w:t>-  analogous</w:t>
-      </w:r>
-      <w:proofErr w:type="gramEnd"/>
-      <w:r>
-        <w:t xml:space="preserve"> to C</w:t>
-      </w:r>
-    </w:p>
-    <w:p>
-      <w:r>
-        <w:t xml:space="preserve"> │   └── element_H/ </w:t>
-      </w:r>
-      <w:proofErr w:type="gramStart"/>
-      <w:r>
-        <w:t>-  analogous</w:t>
-      </w:r>
-      <w:proofErr w:type="gramEnd"/>
-      <w:r>
-        <w:t xml:space="preserve"> to C</w:t>
-      </w:r>
-    </w:p>
-    <w:p>
-      <w:r>
-        <w:t xml:space="preserve"> │   └── element_I/ </w:t>
-      </w:r>
-      <w:proofErr w:type="gramStart"/>
-      <w:r>
-        <w:t>-  analogous</w:t>
-      </w:r>
-      <w:proofErr w:type="gramEnd"/>
-      <w:r>
-        <w:t xml:space="preserve"> to C</w:t>
-      </w:r>
-    </w:p>
-    <w:p>
-      <w:r>
-        <w:t xml:space="preserve"> │   └── element_J/ </w:t>
-      </w:r>
-      <w:proofErr w:type="gramStart"/>
-      <w:r>
-        <w:t>-  analogous</w:t>
-      </w:r>
-      <w:proofErr w:type="gramEnd"/>
-      <w:r>
-        <w:t xml:space="preserve"> to C</w:t>
-      </w:r>
-    </w:p>
-    <w:p>
-      <w:r>
-        <w:t xml:space="preserve"> │   └── element_K/ </w:t>
-      </w:r>
-      <w:proofErr w:type="gramStart"/>
-      <w:r>
-        <w:t>-  analogous</w:t>
-      </w:r>
-      <w:proofErr w:type="gramEnd"/>
-      <w:r>
-        <w:t xml:space="preserve"> to C</w:t>
-      </w:r>
-    </w:p>
-    <w:p>
-      <w:r>
-        <w:t xml:space="preserve"> │   └── element_L/ </w:t>
-      </w:r>
-      <w:proofErr w:type="gramStart"/>
-      <w:r>
-        <w:t>-  analogous</w:t>
-      </w:r>
-      <w:proofErr w:type="gramEnd"/>
-      <w:r>
-        <w:t xml:space="preserve"> to C</w:t>
-      </w:r>
-    </w:p>
-    <w:p>
-      <w:r>
-        <w:t>│   └── element_C/</w:t>
-      </w:r>
-    </w:p>
-    <w:p>
-      <w:r>
-        <w:t xml:space="preserve">│       </w:t>
-      </w:r>
-      <w:r>
-        <w:rPr>
-          <w:rFonts w:ascii="MS Gothic" w:eastAsia="MS Gothic" w:hAnsi="MS Gothic" w:cs="MS Gothic" w:hint="eastAsia"/>
-        </w:rPr>
-        <w:t>├</w:t>
-      </w:r>
-      <w:r>
-        <w:rPr>
-          <w:rFonts w:ascii="Aptos" w:hAnsi="Aptos" w:cs="Aptos"/>
-        </w:rPr>
-        <w:t>──</w:t>
-      </w:r>
-      <w:r>
-        <w:t xml:space="preserve"> score_with_API_C.py</w:t>
-      </w:r>
-    </w:p>
-    <w:p>
-      <w:r>
-        <w:t xml:space="preserve">│       </w:t>
-      </w:r>
-      <w:r>
-        <w:rPr>
-          <w:rFonts w:ascii="MS Gothic" w:eastAsia="MS Gothic" w:hAnsi="MS Gothic" w:cs="MS Gothic" w:hint="eastAsia"/>
-        </w:rPr>
-        <w:t>├</w:t>
-      </w:r>
-      <w:r>
-        <w:rPr>
-          <w:rFonts w:ascii="Aptos" w:hAnsi="Aptos" w:cs="Aptos"/>
-        </w:rPr>
-        <w:t>──</w:t>
-      </w:r>
-      <w:r>
-        <w:t xml:space="preserve"> scorer_app_C.py</w:t>
-      </w:r>
-    </w:p>
-    <w:p>
-      <w:r>
-        <w:t>│       │</w:t>
-      </w:r>
-    </w:p>
-    <w:p>
-      <w:r>
-        <w:t xml:space="preserve">│       </w:t>
-      </w:r>
-      <w:r>
-        <w:rPr>
-          <w:rFonts w:ascii="MS Gothic" w:eastAsia="MS Gothic" w:hAnsi="MS Gothic" w:cs="MS Gothic" w:hint="eastAsia"/>
-        </w:rPr>
-        <w:t>├</w:t>
-      </w:r>
-      <w:r>
-        <w:rPr>
-          <w:rFonts w:ascii="Aptos" w:hAnsi="Aptos" w:cs="Aptos"/>
-        </w:rPr>
-        <w:t>──</w:t>
-      </w:r>
-      <w:r>
-        <w:t xml:space="preserve"> Current_GPT.csv</w:t>
-      </w:r>
-    </w:p>
-    <w:p>
-      <w:r>
-        <w:t xml:space="preserve">│       </w:t>
-      </w:r>
-      <w:r>
-        <w:rPr>
-          <w:rFonts w:ascii="MS Gothic" w:eastAsia="MS Gothic" w:hAnsi="MS Gothic" w:cs="MS Gothic" w:hint="eastAsia"/>
-        </w:rPr>
-        <w:t>├</w:t>
-      </w:r>
-      <w:r>
-        <w:rPr>
-          <w:rFonts w:ascii="Aptos" w:hAnsi="Aptos" w:cs="Aptos"/>
-        </w:rPr>
-        <w:t>──</w:t>
-      </w:r>
-      <w:r>
-        <w:t xml:space="preserve"> Legacy_GPT.csv</w:t>
-      </w:r>
-    </w:p>
-    <w:p>
-      <w:r>
-        <w:t>│       │</w:t>
-      </w:r>
-    </w:p>
-    <w:p>
-      <w:r>
-        <w:t xml:space="preserve">│       </w:t>
-      </w:r>
-      <w:r>
-        <w:rPr>
-          <w:rFonts w:ascii="MS Gothic" w:eastAsia="MS Gothic" w:hAnsi="MS Gothic" w:cs="MS Gothic" w:hint="eastAsia"/>
-        </w:rPr>
-        <w:t>├</w:t>
-      </w:r>
-      <w:r>
-        <w:rPr>
-          <w:rFonts w:ascii="Aptos" w:hAnsi="Aptos" w:cs="Aptos"/>
-        </w:rPr>
-        <w:t>──</w:t>
-      </w:r>
-      <w:r>
-        <w:t xml:space="preserve"> current_api_scoring_documents/</w:t>
-      </w:r>
-    </w:p>
-    <w:p>
-      <w:r>
-        <w:t>│       │   └── (documents scored using current model)</w:t>
-      </w:r>
-    </w:p>
-    <w:p>
-      <w:r>
-        <w:t>│       │</w:t>
-      </w:r>
-    </w:p>
-    <w:p>
-      <w:r>
-        <w:t>│       └── legacy_api_scoring_documents/</w:t>
-      </w:r>
-    </w:p>
-    <w:p>
-      <w:r>
-        <w:t>│           └── (documents scored using legacy model)</w:t>
-      </w:r>
-    </w:p>
-    <w:p>
-      <w:r>
-        <w:t>│</w:t>
-      </w:r>
-    </w:p>
-    <w:p>
-      <w:r>
-        <w:rPr>
-          <w:rFonts w:ascii="MS Gothic" w:eastAsia="MS Gothic" w:hAnsi="MS Gothic" w:cs="MS Gothic" w:hint="eastAsia"/>
-        </w:rPr>
-        <w:t>├</w:t>
-      </w:r>
-      <w:r>
-        <w:rPr>
-          <w:rFonts w:ascii="Aptos" w:hAnsi="Aptos" w:cs="Aptos"/>
-        </w:rPr>
-        <w:t>──</w:t>
-      </w:r>
-      <w:r>
-        <w:t xml:space="preserve"> scripts/</w:t>
-      </w:r>
-    </w:p>
-    <w:p>
-      <w:r>
-        <w:t>│   └── shared/</w:t>
-      </w:r>
-    </w:p>
-    <w:p>
-      <w:r>
-        <w:t>│       └── utils.py</w:t>
-      </w:r>
-    </w:p>
-    <w:p>
-      <w:r>
-        <w:t>│       └── validate_golden20.py</w:t>
-      </w:r>
-    </w:p>
-    <w:p/>
-    <w:p>
-      <w:r>
-        <w:t>│</w:t>
-      </w:r>
-    </w:p>
-    <w:p>
-      <w:r>
-        <w:rPr>
-          <w:rFonts w:ascii="MS Gothic" w:eastAsia="MS Gothic" w:hAnsi="MS Gothic" w:cs="MS Gothic" w:hint="eastAsia"/>
-        </w:rPr>
-        <w:lastRenderedPageBreak/>
         <w:t>├</w:t>
       </w:r>
       <w:r>
@@ -2857,15 +2580,7 @@
         </w:numPr>
       </w:pPr>
       <w:r>
-        <w:t xml:space="preserve">Bias controlled through </w:t>
-      </w:r>
-      <w:proofErr w:type="gramStart"/>
-      <w:r>
-        <w:t>intercept</w:t>
-      </w:r>
-      <w:proofErr w:type="gramEnd"/>
-      <w:r>
-        <w:t xml:space="preserve"> calibration</w:t>
+        <w:t>Bias controlled through intercept calibration</w:t>
       </w:r>
     </w:p>
     <w:p>
@@ -2908,6 +2623,7 @@
     </w:p>
     <w:p>
       <w:r>
+        <w:lastRenderedPageBreak/>
         <w:t xml:space="preserve">This update adds a </w:t>
       </w:r>
       <w:r>
@@ -2945,21 +2661,12 @@
       <w:r>
         <w:t xml:space="preserve">, and </w:t>
       </w:r>
-      <w:proofErr w:type="gramStart"/>
       <w:r>
         <w:rPr>
           <w:b/>
           <w:bCs/>
         </w:rPr>
-        <w:t>cached</w:t>
-      </w:r>
-      <w:proofErr w:type="gramEnd"/>
-      <w:r>
-        <w:rPr>
-          <w:b/>
-          <w:bCs/>
-        </w:rPr>
-        <w:t xml:space="preserve"> API scoring for reproducibility</w:t>
+        <w:t>cached API scoring for reproducibility</w:t>
       </w:r>
       <w:r>
         <w:t>.</w:t>
@@ -2984,7 +2691,6 @@
           <w:b/>
           <w:bCs/>
         </w:rPr>
-        <w:lastRenderedPageBreak/>
         <w:t>Drift Diagnostics</w:t>
       </w:r>
     </w:p>
@@ -3233,7 +2939,6 @@
         </w:numPr>
       </w:pPr>
       <w:r>
-        <w:lastRenderedPageBreak/>
         <w:t>Final scores are compared to expert scores</w:t>
       </w:r>
     </w:p>
@@ -3375,31 +3080,21 @@
         <w:t>golden20_current</w:t>
       </w:r>
       <w:r>
-        <w:t>_</w:t>
-      </w:r>
-      <w:proofErr w:type="gramStart"/>
-      <w:r>
-        <w:t>scores</w:t>
+        <w:t>_scores</w:t>
       </w:r>
       <w:r>
         <w:t>.json</w:t>
       </w:r>
-      <w:proofErr w:type="gramEnd"/>
       <w:r>
         <w:br/>
         <w:t>golden20_legacy</w:t>
       </w:r>
       <w:r>
-        <w:t>_</w:t>
-      </w:r>
-      <w:proofErr w:type="gramStart"/>
-      <w:r>
-        <w:t>scores</w:t>
+        <w:t>_scores</w:t>
       </w:r>
       <w:r>
         <w:t>.json</w:t>
       </w:r>
-      <w:proofErr w:type="gramEnd"/>
     </w:p>
     <w:p>
       <w:r>
@@ -3453,6 +3148,7 @@
     </w:p>
     <w:p>
       <w:r>
+        <w:lastRenderedPageBreak/>
         <w:t>This makes the validation process deterministic and reproducible for reviewers.</w:t>
       </w:r>
     </w:p>
@@ -3485,35 +3181,16 @@
     </w:p>
     <w:p>
       <w:r>
-        <w:t>golden_C_current_</w:t>
-      </w:r>
-      <w:proofErr w:type="gramStart"/>
-      <w:r>
-        <w:t>metrics.json</w:t>
-      </w:r>
-      <w:proofErr w:type="gramEnd"/>
+        <w:t>golden_C_current_metrics.json</w:t>
+      </w:r>
       <w:r>
         <w:br/>
-        <w:t>golden_C_legacy_</w:t>
-      </w:r>
-      <w:proofErr w:type="gramStart"/>
-      <w:r>
-        <w:t>metrics.json</w:t>
-      </w:r>
-      <w:proofErr w:type="gramEnd"/>
-    </w:p>
-    <w:p>
-      <w:r>
-        <w:lastRenderedPageBreak/>
-        <w:t xml:space="preserve">These files represent the expected scoring behavior of the system. Future validation runs </w:t>
-      </w:r>
-      <w:proofErr w:type="gramStart"/>
-      <w:r>
-        <w:t>compare</w:t>
-      </w:r>
-      <w:proofErr w:type="gramEnd"/>
-      <w:r>
-        <w:t xml:space="preserve"> against these baselines to detect deviations.</w:t>
+        <w:t>golden_C_legacy_metrics.json</w:t>
+      </w:r>
+    </w:p>
+    <w:p>
+      <w:r>
+        <w:t>These files represent the expected scoring behavior of the system. Future validation runs compare against these baselines to detect deviations.</w:t>
       </w:r>
     </w:p>
     <w:p>
@@ -3621,13 +3298,8 @@
           <w:numId w:val="27"/>
         </w:numPr>
       </w:pPr>
-      <w:proofErr w:type="gramStart"/>
-      <w:r>
-        <w:t>Report</w:t>
-      </w:r>
-      <w:proofErr w:type="gramEnd"/>
-      <w:r>
-        <w:t xml:space="preserve"> whether drift is detected</w:t>
+      <w:r>
+        <w:t>Report whether drift is detected</w:t>
       </w:r>
     </w:p>
     <w:p>
@@ -3663,58 +3335,31 @@
       </w:r>
       <w:r>
         <w:br/>
-        <w:t>golden_C_current_</w:t>
-      </w:r>
-      <w:proofErr w:type="gramStart"/>
-      <w:r>
-        <w:t>cases.json</w:t>
-      </w:r>
-      <w:proofErr w:type="gramEnd"/>
+        <w:t>golden_C_current_cases.json</w:t>
+      </w:r>
       <w:r>
         <w:br/>
-        <w:t>golden_C_legacy_</w:t>
-      </w:r>
-      <w:proofErr w:type="gramStart"/>
-      <w:r>
-        <w:t>cases.json</w:t>
-      </w:r>
-      <w:proofErr w:type="gramEnd"/>
+        <w:t>golden_C_legacy_cases.json</w:t>
+      </w:r>
       <w:r>
         <w:br/>
-        <w:t>golden_C_current_</w:t>
-      </w:r>
-      <w:proofErr w:type="gramStart"/>
-      <w:r>
-        <w:t>metrics.json</w:t>
-      </w:r>
-      <w:proofErr w:type="gramEnd"/>
+        <w:t>golden_C_current_metrics.json</w:t>
+      </w:r>
       <w:r>
         <w:br/>
-        <w:t>golden_C_legacy_</w:t>
-      </w:r>
-      <w:proofErr w:type="gramStart"/>
-      <w:r>
-        <w:t>metrics.json</w:t>
-      </w:r>
-      <w:proofErr w:type="gramEnd"/>
+        <w:t>golden_C_legacy_metrics.json</w:t>
+      </w:r>
       <w:r>
         <w:br/>
-        <w:t>golden20_api_scores_</w:t>
-      </w:r>
-      <w:proofErr w:type="gramStart"/>
-      <w:r>
-        <w:t>current.json</w:t>
-      </w:r>
-      <w:proofErr w:type="gramEnd"/>
+      </w:r>
+      <w:r>
+        <w:lastRenderedPageBreak/>
+        <w:t>golden20_api_scores_current.json</w:t>
+      </w:r>
       <w:r>
         <w:br/>
-        <w:t>golden20_api_scores_</w:t>
-      </w:r>
-      <w:proofErr w:type="gramStart"/>
-      <w:r>
-        <w:t>legacy.json</w:t>
-      </w:r>
-      <w:proofErr w:type="gramEnd"/>
+        <w:t>golden20_api_scores_legacy.json</w:t>
+      </w:r>
     </w:p>
     <w:p>
       <w:r>
@@ -3766,7 +3411,6 @@
         </w:numPr>
       </w:pPr>
       <w:r>
-        <w:lastRenderedPageBreak/>
         <w:t>GPT model drift</w:t>
       </w:r>
     </w:p>
@@ -3961,6 +3605,7 @@
     </w:p>
     <w:p>
       <w:r>
+        <w:lastRenderedPageBreak/>
         <w:t>This repository is intended for instructional review and internal evaluation.</w:t>
       </w:r>
     </w:p>

</xml_diff>

<commit_message>
Finalize Element A and B v2.2 scoring, reconciliation, JSON safeguards, and baselines
</commit_message>
<xml_diff>
--- a/Readme.docx
+++ b/Readme.docx
@@ -1,6 +1,6 @@
 
 <file path=word/document.xml><?xml version="1.0" encoding="utf-8"?>
-<w:document xmlns:wpc="http://schemas.microsoft.com/office/word/2010/wordprocessingCanvas" xmlns:cx="http://schemas.microsoft.com/office/drawing/2014/chartex" xmlns:cx1="http://schemas.microsoft.com/office/drawing/2015/9/8/chartex" xmlns:cx2="http://schemas.microsoft.com/office/drawing/2015/10/21/chartex" xmlns:cx3="http://schemas.microsoft.com/office/drawing/2016/5/9/chartex" xmlns:cx4="http://schemas.microsoft.com/office/drawing/2016/5/10/chartex" xmlns:cx5="http://schemas.microsoft.com/office/drawing/2016/5/11/chartex" xmlns:cx6="http://schemas.microsoft.com/office/drawing/2016/5/12/chartex" xmlns:cx7="http://schemas.microsoft.com/office/drawing/2016/5/13/chartex" xmlns:cx8="http://schemas.microsoft.com/office/drawing/2016/5/14/chartex" xmlns:mc="http://schemas.openxmlformats.org/markup-compatibility/2006" xmlns:aink="http://schemas.microsoft.com/office/drawing/2016/ink" xmlns:am3d="http://schemas.microsoft.com/office/drawing/2017/model3d" xmlns:o="urn:schemas-microsoft-com:office:office" xmlns:oel="http://schemas.microsoft.com/office/2019/extlst" xmlns:r="http://schemas.openxmlformats.org/officeDocument/2006/relationships" xmlns:m="http://schemas.openxmlformats.org/officeDocument/2006/math" xmlns:v="urn:schemas-microsoft-com:vml" xmlns:wp14="http://schemas.microsoft.com/office/word/2010/wordprocessingDrawing" xmlns:wp="http://schemas.openxmlformats.org/drawingml/2006/wordprocessingDrawing" xmlns:w10="urn:schemas-microsoft-com:office:word" xmlns:w="http://schemas.openxmlformats.org/wordprocessingml/2006/main" xmlns:w14="http://schemas.microsoft.com/office/word/2010/wordml" xmlns:w15="http://schemas.microsoft.com/office/word/2012/wordml" xmlns:w16cex="http://schemas.microsoft.com/office/word/2018/wordml/cex" xmlns:w16cid="http://schemas.microsoft.com/office/word/2016/wordml/cid" xmlns:w16="http://schemas.microsoft.com/office/word/2018/wordml" xmlns:w16du="http://schemas.microsoft.com/office/word/2023/wordml/word16du" xmlns:w16sdtdh="http://schemas.microsoft.com/office/word/2020/wordml/sdtdatahash" xmlns:w16sdtfl="http://schemas.microsoft.com/office/word/2024/wordml/sdtformatlock" xmlns:w16se="http://schemas.microsoft.com/office/word/2015/wordml/symex" xmlns:wpg="http://schemas.microsoft.com/office/word/2010/wordprocessingGroup" xmlns:wpi="http://schemas.microsoft.com/office/word/2010/wordprocessingInk" xmlns:wne="http://schemas.microsoft.com/office/word/2006/wordml" xmlns:wps="http://schemas.microsoft.com/office/word/2010/wordprocessingShape" mc:Ignorable="w14 w15 w16se w16cid w16 w16cex w16sdtdh w16sdtfl w16du wp14">
+<w:document xmlns:wpc="http://schemas.microsoft.com/office/word/2010/wordprocessingCanvas" xmlns:cx="http://schemas.microsoft.com/office/drawing/2014/chartex" xmlns:cx1="http://schemas.microsoft.com/office/drawing/2015/9/8/chartex" xmlns:cx2="http://schemas.microsoft.com/office/drawing/2015/10/21/chartex" xmlns:cx3="http://schemas.microsoft.com/office/drawing/2016/5/9/chartex" xmlns:cx4="http://schemas.microsoft.com/office/drawing/2016/5/10/chartex" xmlns:cx5="http://schemas.microsoft.com/office/drawing/2016/5/11/chartex" xmlns:cx6="http://schemas.microsoft.com/office/drawing/2016/5/12/chartex" xmlns:cx7="http://schemas.microsoft.com/office/drawing/2016/5/13/chartex" xmlns:cx8="http://schemas.microsoft.com/office/drawing/2016/5/14/chartex" xmlns:mc="http://schemas.openxmlformats.org/markup-compatibility/2006" xmlns:aink="http://schemas.microsoft.com/office/drawing/2016/ink" xmlns:am3d="http://schemas.microsoft.com/office/drawing/2017/model3d" xmlns:o="urn:schemas-microsoft-com:office:office" xmlns:oel="http://schemas.microsoft.com/office/2019/extlst" xmlns:r="http://schemas.openxmlformats.org/officeDocument/2006/relationships" xmlns:m="http://schemas.openxmlformats.org/officeDocument/2006/math" xmlns:v="urn:schemas-microsoft-com:vml" xmlns:wp14="http://schemas.microsoft.com/office/word/2010/wordprocessingDrawing" xmlns:wp="http://schemas.openxmlformats.org/drawingml/2006/wordprocessingDrawing" xmlns:w10="urn:schemas-microsoft-com:office:word" xmlns:w="http://schemas.openxmlformats.org/wordprocessingml/2006/main" xmlns:w14="http://schemas.microsoft.com/office/word/2010/wordml" xmlns:w15="http://schemas.microsoft.com/office/word/2012/wordml" xmlns:w16cei="http://schemas.microsoft.com/office/word/2026/wordml/cei" xmlns:w16cex="http://schemas.microsoft.com/office/word/2018/wordml/cex" xmlns:w16cid="http://schemas.microsoft.com/office/word/2016/wordml/cid" xmlns:w16="http://schemas.microsoft.com/office/word/2018/wordml" xmlns:w16du="http://schemas.microsoft.com/office/word/2023/wordml/word16du" xmlns:w16sdtdh="http://schemas.microsoft.com/office/word/2020/wordml/sdtdatahash" xmlns:w16sdtfl="http://schemas.microsoft.com/office/word/2024/wordml/sdtformatlock" xmlns:w16se="http://schemas.microsoft.com/office/word/2015/wordml/symex" xmlns:wpg="http://schemas.microsoft.com/office/word/2010/wordprocessingGroup" xmlns:wpi="http://schemas.microsoft.com/office/word/2010/wordprocessingInk" xmlns:wne="http://schemas.microsoft.com/office/word/2006/wordml" xmlns:wps="http://schemas.microsoft.com/office/word/2010/wordprocessingShape" mc:Ignorable="w14 w15 w16se w16cid w16 w16cex w16sdtdh w16sdtfl w16du wp14">
   <w:body>
     <w:p>
       <w:pPr>
@@ -9,12 +9,21 @@
           <w:bCs/>
         </w:rPr>
       </w:pPr>
+      <w:proofErr w:type="spellStart"/>
       <w:r>
         <w:rPr>
           <w:b/>
           <w:bCs/>
         </w:rPr>
-        <w:t>GPTScorer – Element  Scoring Application</w:t>
+        <w:t>GPTScorer</w:t>
+      </w:r>
+      <w:proofErr w:type="spellEnd"/>
+      <w:r>
+        <w:rPr>
+          <w:b/>
+          <w:bCs/>
+        </w:rPr>
+        <w:t xml:space="preserve"> – Element  Scoring Application</w:t>
       </w:r>
     </w:p>
     <w:p>
@@ -25,7 +34,15 @@
         <w:t>validated</w:t>
       </w:r>
       <w:r>
-        <w:t xml:space="preserve"> scoring application for MyDesign – Element C (Presentation and Justification of Solution Design Requirements).</w:t>
+        <w:t xml:space="preserve"> scoring application for </w:t>
+      </w:r>
+      <w:proofErr w:type="spellStart"/>
+      <w:r>
+        <w:t>MyDesign</w:t>
+      </w:r>
+      <w:proofErr w:type="spellEnd"/>
+      <w:r>
+        <w:t xml:space="preserve"> – Element C (Presentation and Justification of Solution Design Requirements).</w:t>
       </w:r>
       <w:r>
         <w:t xml:space="preserve">  Element</w:t>
@@ -269,7 +286,15 @@
       </w:r>
       <w:r>
         <w:br/>
-        <w:t>Raw Element Score (mean of subscores)</w:t>
+        <w:t xml:space="preserve">Raw Element Score (mean of </w:t>
+      </w:r>
+      <w:proofErr w:type="spellStart"/>
+      <w:r>
+        <w:t>subscores</w:t>
+      </w:r>
+      <w:proofErr w:type="spellEnd"/>
+      <w:r>
+        <w:t>)</w:t>
       </w:r>
       <w:r>
         <w:br/>
@@ -901,8 +926,13 @@
     </w:p>
     <w:p>
       <w:r>
-        <w:t>set OPENAI_API_KEY=your_key_here</w:t>
-      </w:r>
+        <w:t>set OPENAI_API_KEY=</w:t>
+      </w:r>
+      <w:proofErr w:type="spellStart"/>
+      <w:r>
+        <w:t>your_key_here</w:t>
+      </w:r>
+      <w:proofErr w:type="spellEnd"/>
     </w:p>
     <w:p>
       <w:r>
@@ -965,11 +995,35 @@
     </w:p>
     <w:p>
       <w:r>
-        <w:t>python -m elements.element_C.score_with_API_C ^</w:t>
+        <w:t xml:space="preserve">python -m </w:t>
+      </w:r>
+      <w:proofErr w:type="spellStart"/>
+      <w:r>
+        <w:t>elements.element_C.score_with_API_C</w:t>
+      </w:r>
+      <w:proofErr w:type="spellEnd"/>
+      <w:r>
+        <w:t xml:space="preserve"> ^</w:t>
       </w:r>
       <w:r>
         <w:br/>
-        <w:t xml:space="preserve">  --folder elements/element_C/current_api_scoring_documents ^</w:t>
+        <w:t xml:space="preserve">  --folder elements/</w:t>
+      </w:r>
+      <w:proofErr w:type="spellStart"/>
+      <w:r>
+        <w:t>element_C</w:t>
+      </w:r>
+      <w:proofErr w:type="spellEnd"/>
+      <w:r>
+        <w:t>/</w:t>
+      </w:r>
+      <w:proofErr w:type="spellStart"/>
+      <w:r>
+        <w:t>current_api_scoring_documents</w:t>
+      </w:r>
+      <w:proofErr w:type="spellEnd"/>
+      <w:r>
+        <w:t xml:space="preserve"> ^</w:t>
       </w:r>
       <w:r>
         <w:br/>
@@ -979,7 +1033,15 @@
         <w:t xml:space="preserve"> </w:t>
       </w:r>
       <w:r>
-        <w:t>elements/element_C/</w:t>
+        <w:t>elements/</w:t>
+      </w:r>
+      <w:proofErr w:type="spellStart"/>
+      <w:r>
+        <w:t>element_C</w:t>
+      </w:r>
+      <w:proofErr w:type="spellEnd"/>
+      <w:r>
+        <w:t>/</w:t>
       </w:r>
       <w:r>
         <w:t>scored_results</w:t>
@@ -1306,8 +1368,13 @@
         </w:numPr>
       </w:pPr>
       <w:r>
-        <w:t>C1_expert – C_expert</w:t>
-      </w:r>
+        <w:t xml:space="preserve">C1_expert – </w:t>
+      </w:r>
+      <w:proofErr w:type="spellStart"/>
+      <w:r>
+        <w:t>C_expert</w:t>
+      </w:r>
+      <w:proofErr w:type="spellEnd"/>
       <w:r>
         <w:t xml:space="preserve"> scores</w:t>
       </w:r>
@@ -1373,7 +1440,21 @@
         <w:t xml:space="preserve">Narrative </w:t>
       </w:r>
       <w:r>
-        <w:t>feedback, reoonciled to calibrated scores</w:t>
+        <w:t xml:space="preserve">feedback, </w:t>
+      </w:r>
+      <w:proofErr w:type="spellStart"/>
+      <w:r>
+        <w:t>reoonciled</w:t>
+      </w:r>
+      <w:proofErr w:type="spellEnd"/>
+      <w:r>
+        <w:t xml:space="preserve"> to calibrated scores</w:t>
+      </w:r>
+      <w:r>
+        <w:t xml:space="preserve"> </w:t>
+      </w:r>
+      <w:r>
+        <w:t xml:space="preserve"> (A and B only)</w:t>
       </w:r>
     </w:p>
     <w:p>
@@ -1387,6 +1468,9 @@
       <w:r>
         <w:t>Points for Teacher Review, intended to inform teachers for scoring a specific document</w:t>
       </w:r>
+      <w:r>
+        <w:t xml:space="preserve"> (A and B only)</w:t>
+      </w:r>
     </w:p>
     <w:p>
       <w:pPr>
@@ -1396,8 +1480,21 @@
           <w:numId w:val="18"/>
         </w:numPr>
       </w:pPr>
-      <w:r>
-        <w:t>Element_score_raw, the average of the api scores</w:t>
+      <w:proofErr w:type="spellStart"/>
+      <w:r>
+        <w:t>Element_score_raw</w:t>
+      </w:r>
+      <w:proofErr w:type="spellEnd"/>
+      <w:r>
+        <w:t xml:space="preserve">, the average of the </w:t>
+      </w:r>
+      <w:proofErr w:type="spellStart"/>
+      <w:r>
+        <w:t>api</w:t>
+      </w:r>
+      <w:proofErr w:type="spellEnd"/>
+      <w:r>
+        <w:t xml:space="preserve"> scores</w:t>
       </w:r>
     </w:p>
     <w:p>
@@ -1449,9 +1546,11 @@
           <w:numId w:val="17"/>
         </w:numPr>
       </w:pPr>
+      <w:proofErr w:type="spellStart"/>
       <w:r>
         <w:t>element_score_raw</w:t>
       </w:r>
+      <w:proofErr w:type="spellEnd"/>
       <w:r>
         <w:tab/>
       </w:r>
@@ -1464,9 +1563,11 @@
           <w:numId w:val="17"/>
         </w:numPr>
       </w:pPr>
+      <w:proofErr w:type="spellStart"/>
       <w:r>
         <w:t>element_score_calibrated</w:t>
       </w:r>
+      <w:proofErr w:type="spellEnd"/>
       <w:r>
         <w:tab/>
       </w:r>
@@ -1479,9 +1580,11 @@
           <w:numId w:val="17"/>
         </w:numPr>
       </w:pPr>
+      <w:proofErr w:type="spellStart"/>
       <w:r>
         <w:t>calibration_delta</w:t>
       </w:r>
+      <w:proofErr w:type="spellEnd"/>
     </w:p>
     <w:p>
       <w:pPr>
@@ -1516,8 +1619,14 @@
         </w:numPr>
       </w:pPr>
       <w:r>
+        <w:t xml:space="preserve">Calibrated </w:t>
+      </w:r>
+      <w:r>
         <w:t>Narrative rationale</w:t>
       </w:r>
+      <w:r>
+        <w:t xml:space="preserve"> (A and B only)</w:t>
+      </w:r>
     </w:p>
     <w:p>
       <w:pPr>
@@ -1529,6 +1638,9 @@
       </w:pPr>
       <w:r>
         <w:t>Points for Teacher Review</w:t>
+      </w:r>
+      <w:r>
+        <w:t xml:space="preserve"> (A and B only)</w:t>
       </w:r>
     </w:p>
     <w:p/>
@@ -1768,6 +1880,9 @@
       <w:r>
         <w:t>Reconciled to calibrated scores</w:t>
       </w:r>
+      <w:r>
+        <w:t xml:space="preserve"> (A and B only)</w:t>
+      </w:r>
     </w:p>
     <w:p>
       <w:r>
@@ -1841,8 +1956,13 @@
           <w:numId w:val="12"/>
         </w:numPr>
       </w:pPr>
-      <w:r>
-        <w:t>Subscore drift analysis</w:t>
+      <w:proofErr w:type="spellStart"/>
+      <w:r>
+        <w:t>Subscore</w:t>
+      </w:r>
+      <w:proofErr w:type="spellEnd"/>
+      <w:r>
+        <w:t xml:space="preserve"> drift analysis</w:t>
       </w:r>
     </w:p>
     <w:p>
@@ -1887,7 +2007,23 @@
           <w:b/>
           <w:bCs/>
         </w:rPr>
-        <w:t xml:space="preserve"> (all core, scripts and simple_ui apps are now element agnostic to facilitate cloning the architecture for other elements)</w:t>
+        <w:t xml:space="preserve"> (all core, scripts and </w:t>
+      </w:r>
+      <w:proofErr w:type="spellStart"/>
+      <w:r>
+        <w:rPr>
+          <w:b/>
+          <w:bCs/>
+        </w:rPr>
+        <w:t>simple_ui</w:t>
+      </w:r>
+      <w:proofErr w:type="spellEnd"/>
+      <w:r>
+        <w:rPr>
+          <w:b/>
+          <w:bCs/>
+        </w:rPr>
+        <w:t xml:space="preserve"> apps are now element agnostic to facilitate cloning the architecture for other elements)</w:t>
       </w:r>
     </w:p>
     <w:p>
@@ -1902,8 +2038,13 @@
       <w:r>
         <w:t xml:space="preserve"> </w:t>
       </w:r>
-      <w:r>
-        <w:t>GPTScorer/</w:t>
+      <w:proofErr w:type="spellStart"/>
+      <w:r>
+        <w:t>GPTScorer</w:t>
+      </w:r>
+      <w:proofErr w:type="spellEnd"/>
+      <w:r>
+        <w:t>/</w:t>
       </w:r>
     </w:p>
     <w:p>
@@ -1978,62 +2119,158 @@
     </w:p>
     <w:p>
       <w:r>
-        <w:t xml:space="preserve"> │     └── element_A/ -  analogous to C</w:t>
-      </w:r>
-    </w:p>
-    <w:p>
-      <w:r>
-        <w:t xml:space="preserve"> │   └── element_B/ -  analogous to C</w:t>
-      </w:r>
-    </w:p>
-    <w:p>
-      <w:r>
-        <w:t xml:space="preserve"> │   └── element_D/ - analogous to C</w:t>
-      </w:r>
-    </w:p>
-    <w:p>
-      <w:r>
-        <w:t xml:space="preserve"> │   └── element_E/ -  analogous to C</w:t>
-      </w:r>
-    </w:p>
-    <w:p>
-      <w:r>
-        <w:t xml:space="preserve"> │   └── element_F/ -  analogous to C</w:t>
-      </w:r>
-    </w:p>
-    <w:p>
-      <w:r>
-        <w:t xml:space="preserve"> │   └── element_G/ -  analogous to C</w:t>
-      </w:r>
-    </w:p>
-    <w:p>
-      <w:r>
-        <w:t xml:space="preserve"> │   └── element_H/ -  analogous to C</w:t>
-      </w:r>
-    </w:p>
-    <w:p>
-      <w:r>
-        <w:t xml:space="preserve"> │   └── element_I/ -  analogous to C</w:t>
-      </w:r>
-    </w:p>
-    <w:p>
-      <w:r>
-        <w:t xml:space="preserve"> │   └── element_J/ -  analogous to C</w:t>
-      </w:r>
-    </w:p>
-    <w:p>
-      <w:r>
-        <w:t xml:space="preserve"> │   └── element_K/ -  analogous to C</w:t>
-      </w:r>
-    </w:p>
-    <w:p>
-      <w:r>
-        <w:t xml:space="preserve"> │   └── element_L/ -  analogous to C</w:t>
-      </w:r>
-    </w:p>
-    <w:p>
-      <w:r>
-        <w:t xml:space="preserve"> │    └── element_C/</w:t>
+        <w:t xml:space="preserve"> │     └── </w:t>
+      </w:r>
+      <w:proofErr w:type="spellStart"/>
+      <w:r>
+        <w:t>element_A</w:t>
+      </w:r>
+      <w:proofErr w:type="spellEnd"/>
+      <w:r>
+        <w:t>/ -  analogous to C</w:t>
+      </w:r>
+    </w:p>
+    <w:p>
+      <w:r>
+        <w:t xml:space="preserve"> │   └── </w:t>
+      </w:r>
+      <w:proofErr w:type="spellStart"/>
+      <w:r>
+        <w:t>element_B</w:t>
+      </w:r>
+      <w:proofErr w:type="spellEnd"/>
+      <w:r>
+        <w:t>/ -  analogous to C</w:t>
+      </w:r>
+    </w:p>
+    <w:p>
+      <w:r>
+        <w:t xml:space="preserve"> │   └── </w:t>
+      </w:r>
+      <w:proofErr w:type="spellStart"/>
+      <w:r>
+        <w:t>element_D</w:t>
+      </w:r>
+      <w:proofErr w:type="spellEnd"/>
+      <w:r>
+        <w:t>/ - analogous to C</w:t>
+      </w:r>
+    </w:p>
+    <w:p>
+      <w:r>
+        <w:t xml:space="preserve"> │   └── </w:t>
+      </w:r>
+      <w:proofErr w:type="spellStart"/>
+      <w:r>
+        <w:t>element_E</w:t>
+      </w:r>
+      <w:proofErr w:type="spellEnd"/>
+      <w:r>
+        <w:t>/ -  analogous to C</w:t>
+      </w:r>
+    </w:p>
+    <w:p>
+      <w:r>
+        <w:t xml:space="preserve"> │   └── </w:t>
+      </w:r>
+      <w:proofErr w:type="spellStart"/>
+      <w:r>
+        <w:t>element_F</w:t>
+      </w:r>
+      <w:proofErr w:type="spellEnd"/>
+      <w:r>
+        <w:t>/ -  analogous to C</w:t>
+      </w:r>
+    </w:p>
+    <w:p>
+      <w:r>
+        <w:t xml:space="preserve"> │   └── </w:t>
+      </w:r>
+      <w:proofErr w:type="spellStart"/>
+      <w:r>
+        <w:t>element_G</w:t>
+      </w:r>
+      <w:proofErr w:type="spellEnd"/>
+      <w:r>
+        <w:t>/ -  analogous to C</w:t>
+      </w:r>
+    </w:p>
+    <w:p>
+      <w:r>
+        <w:t xml:space="preserve"> │   └── </w:t>
+      </w:r>
+      <w:proofErr w:type="spellStart"/>
+      <w:r>
+        <w:t>element_H</w:t>
+      </w:r>
+      <w:proofErr w:type="spellEnd"/>
+      <w:r>
+        <w:t>/ -  analogous to C</w:t>
+      </w:r>
+    </w:p>
+    <w:p>
+      <w:r>
+        <w:t xml:space="preserve"> │   └── </w:t>
+      </w:r>
+      <w:proofErr w:type="spellStart"/>
+      <w:r>
+        <w:t>element_I</w:t>
+      </w:r>
+      <w:proofErr w:type="spellEnd"/>
+      <w:r>
+        <w:t>/ -  analogous to C</w:t>
+      </w:r>
+    </w:p>
+    <w:p>
+      <w:r>
+        <w:t xml:space="preserve"> │   └── </w:t>
+      </w:r>
+      <w:proofErr w:type="spellStart"/>
+      <w:r>
+        <w:t>element_J</w:t>
+      </w:r>
+      <w:proofErr w:type="spellEnd"/>
+      <w:r>
+        <w:t>/ -  analogous to C</w:t>
+      </w:r>
+    </w:p>
+    <w:p>
+      <w:r>
+        <w:t xml:space="preserve"> │   └── </w:t>
+      </w:r>
+      <w:proofErr w:type="spellStart"/>
+      <w:r>
+        <w:t>element_K</w:t>
+      </w:r>
+      <w:proofErr w:type="spellEnd"/>
+      <w:r>
+        <w:t>/ -  analogous to C</w:t>
+      </w:r>
+    </w:p>
+    <w:p>
+      <w:r>
+        <w:t xml:space="preserve"> │   └── </w:t>
+      </w:r>
+      <w:proofErr w:type="spellStart"/>
+      <w:r>
+        <w:t>element_L</w:t>
+      </w:r>
+      <w:proofErr w:type="spellEnd"/>
+      <w:r>
+        <w:t>/ -  analogous to C</w:t>
+      </w:r>
+    </w:p>
+    <w:p>
+      <w:r>
+        <w:t xml:space="preserve"> │    └── </w:t>
+      </w:r>
+      <w:proofErr w:type="spellStart"/>
+      <w:r>
+        <w:t>element_C</w:t>
+      </w:r>
+      <w:proofErr w:type="spellEnd"/>
+      <w:r>
+        <w:t>/</w:t>
       </w:r>
     </w:p>
     <w:p>
@@ -2056,8 +2293,13 @@
         <w:t>──</w:t>
       </w:r>
       <w:r>
-        <w:t xml:space="preserve"> golden_C_current.json</w:t>
-      </w:r>
+        <w:t xml:space="preserve"> </w:t>
+      </w:r>
+      <w:proofErr w:type="spellStart"/>
+      <w:r>
+        <w:t>golden_C_current.json</w:t>
+      </w:r>
+      <w:proofErr w:type="spellEnd"/>
     </w:p>
     <w:p>
       <w:r>
@@ -2079,8 +2321,13 @@
         <w:t>──</w:t>
       </w:r>
       <w:r>
-        <w:t xml:space="preserve"> golden_C_legacy.json</w:t>
-      </w:r>
+        <w:t xml:space="preserve"> </w:t>
+      </w:r>
+      <w:proofErr w:type="spellStart"/>
+      <w:r>
+        <w:t>golden_C_legacy.json</w:t>
+      </w:r>
+      <w:proofErr w:type="spellEnd"/>
     </w:p>
     <w:p>
       <w:r>
@@ -2202,62 +2449,158 @@
     <w:p>
       <w:r>
         <w:lastRenderedPageBreak/>
-        <w:t xml:space="preserve"> │   └── element_A/ -  analogous to C</w:t>
-      </w:r>
-    </w:p>
-    <w:p>
-      <w:r>
-        <w:t xml:space="preserve"> │   └── element_B/ -  analogous to C</w:t>
-      </w:r>
-    </w:p>
-    <w:p>
-      <w:r>
-        <w:t xml:space="preserve"> │   └── element_D/ - analogous to C</w:t>
-      </w:r>
-    </w:p>
-    <w:p>
-      <w:r>
-        <w:t xml:space="preserve"> │   └── element_E/ -  analogous to C</w:t>
-      </w:r>
-    </w:p>
-    <w:p>
-      <w:r>
-        <w:t xml:space="preserve"> │   └── element_F/ -  analogous to C</w:t>
-      </w:r>
-    </w:p>
-    <w:p>
-      <w:r>
-        <w:t xml:space="preserve"> │   └── element_G/ -  analogous to C</w:t>
-      </w:r>
-    </w:p>
-    <w:p>
-      <w:r>
-        <w:t xml:space="preserve"> │   └── element_H/ -  analogous to C</w:t>
-      </w:r>
-    </w:p>
-    <w:p>
-      <w:r>
-        <w:t xml:space="preserve"> │   └── element_I/ -  analogous to C</w:t>
-      </w:r>
-    </w:p>
-    <w:p>
-      <w:r>
-        <w:t xml:space="preserve"> │   └── element_J/ -  analogous to C</w:t>
-      </w:r>
-    </w:p>
-    <w:p>
-      <w:r>
-        <w:t xml:space="preserve"> │   └── element_K/ -  analogous to C</w:t>
-      </w:r>
-    </w:p>
-    <w:p>
-      <w:r>
-        <w:t xml:space="preserve"> │   └── element_L/ -  analogous to C</w:t>
-      </w:r>
-    </w:p>
-    <w:p>
-      <w:r>
-        <w:t>│   └── element_C/</w:t>
+        <w:t xml:space="preserve"> │   └── </w:t>
+      </w:r>
+      <w:proofErr w:type="spellStart"/>
+      <w:r>
+        <w:t>element_A</w:t>
+      </w:r>
+      <w:proofErr w:type="spellEnd"/>
+      <w:r>
+        <w:t>/ -  analogous to C</w:t>
+      </w:r>
+    </w:p>
+    <w:p>
+      <w:r>
+        <w:t xml:space="preserve"> │   └── </w:t>
+      </w:r>
+      <w:proofErr w:type="spellStart"/>
+      <w:r>
+        <w:t>element_B</w:t>
+      </w:r>
+      <w:proofErr w:type="spellEnd"/>
+      <w:r>
+        <w:t>/ -  analogous to C</w:t>
+      </w:r>
+    </w:p>
+    <w:p>
+      <w:r>
+        <w:t xml:space="preserve"> │   └── </w:t>
+      </w:r>
+      <w:proofErr w:type="spellStart"/>
+      <w:r>
+        <w:t>element_D</w:t>
+      </w:r>
+      <w:proofErr w:type="spellEnd"/>
+      <w:r>
+        <w:t>/ - analogous to C</w:t>
+      </w:r>
+    </w:p>
+    <w:p>
+      <w:r>
+        <w:t xml:space="preserve"> │   └── </w:t>
+      </w:r>
+      <w:proofErr w:type="spellStart"/>
+      <w:r>
+        <w:t>element_E</w:t>
+      </w:r>
+      <w:proofErr w:type="spellEnd"/>
+      <w:r>
+        <w:t>/ -  analogous to C</w:t>
+      </w:r>
+    </w:p>
+    <w:p>
+      <w:r>
+        <w:t xml:space="preserve"> │   └── </w:t>
+      </w:r>
+      <w:proofErr w:type="spellStart"/>
+      <w:r>
+        <w:t>element_F</w:t>
+      </w:r>
+      <w:proofErr w:type="spellEnd"/>
+      <w:r>
+        <w:t>/ -  analogous to C</w:t>
+      </w:r>
+    </w:p>
+    <w:p>
+      <w:r>
+        <w:t xml:space="preserve"> │   └── </w:t>
+      </w:r>
+      <w:proofErr w:type="spellStart"/>
+      <w:r>
+        <w:t>element_G</w:t>
+      </w:r>
+      <w:proofErr w:type="spellEnd"/>
+      <w:r>
+        <w:t>/ -  analogous to C</w:t>
+      </w:r>
+    </w:p>
+    <w:p>
+      <w:r>
+        <w:t xml:space="preserve"> │   └── </w:t>
+      </w:r>
+      <w:proofErr w:type="spellStart"/>
+      <w:r>
+        <w:t>element_H</w:t>
+      </w:r>
+      <w:proofErr w:type="spellEnd"/>
+      <w:r>
+        <w:t>/ -  analogous to C</w:t>
+      </w:r>
+    </w:p>
+    <w:p>
+      <w:r>
+        <w:t xml:space="preserve"> │   └── </w:t>
+      </w:r>
+      <w:proofErr w:type="spellStart"/>
+      <w:r>
+        <w:t>element_I</w:t>
+      </w:r>
+      <w:proofErr w:type="spellEnd"/>
+      <w:r>
+        <w:t>/ -  analogous to C</w:t>
+      </w:r>
+    </w:p>
+    <w:p>
+      <w:r>
+        <w:t xml:space="preserve"> │   └── </w:t>
+      </w:r>
+      <w:proofErr w:type="spellStart"/>
+      <w:r>
+        <w:t>element_J</w:t>
+      </w:r>
+      <w:proofErr w:type="spellEnd"/>
+      <w:r>
+        <w:t>/ -  analogous to C</w:t>
+      </w:r>
+    </w:p>
+    <w:p>
+      <w:r>
+        <w:t xml:space="preserve"> │   └── </w:t>
+      </w:r>
+      <w:proofErr w:type="spellStart"/>
+      <w:r>
+        <w:t>element_K</w:t>
+      </w:r>
+      <w:proofErr w:type="spellEnd"/>
+      <w:r>
+        <w:t>/ -  analogous to C</w:t>
+      </w:r>
+    </w:p>
+    <w:p>
+      <w:r>
+        <w:t xml:space="preserve"> │   └── </w:t>
+      </w:r>
+      <w:proofErr w:type="spellStart"/>
+      <w:r>
+        <w:t>element_L</w:t>
+      </w:r>
+      <w:proofErr w:type="spellEnd"/>
+      <w:r>
+        <w:t>/ -  analogous to C</w:t>
+      </w:r>
+    </w:p>
+    <w:p>
+      <w:r>
+        <w:t xml:space="preserve">│   └── </w:t>
+      </w:r>
+      <w:proofErr w:type="spellStart"/>
+      <w:r>
+        <w:t>element_C</w:t>
+      </w:r>
+      <w:proofErr w:type="spellEnd"/>
+      <w:r>
+        <w:t>/</w:t>
       </w:r>
     </w:p>
     <w:p>
@@ -2367,7 +2710,15 @@
         <w:t>──</w:t>
       </w:r>
       <w:r>
-        <w:t xml:space="preserve"> current_api_scoring_documents/</w:t>
+        <w:t xml:space="preserve"> </w:t>
+      </w:r>
+      <w:proofErr w:type="spellStart"/>
+      <w:r>
+        <w:t>current_api_scoring_documents</w:t>
+      </w:r>
+      <w:proofErr w:type="spellEnd"/>
+      <w:r>
+        <w:t>/</w:t>
       </w:r>
     </w:p>
     <w:p>
@@ -2382,7 +2733,15 @@
     </w:p>
     <w:p>
       <w:r>
-        <w:t>│       └── legacy_api_scoring_documents/</w:t>
+        <w:t xml:space="preserve">│       └── </w:t>
+      </w:r>
+      <w:proofErr w:type="spellStart"/>
+      <w:r>
+        <w:t>legacy_api_scoring_documents</w:t>
+      </w:r>
+      <w:proofErr w:type="spellEnd"/>
+      <w:r>
+        <w:t>/</w:t>
       </w:r>
     </w:p>
     <w:p>
@@ -2448,7 +2807,15 @@
         <w:t>──</w:t>
       </w:r>
       <w:r>
-        <w:t xml:space="preserve"> simple_ui/</w:t>
+        <w:t xml:space="preserve"> </w:t>
+      </w:r>
+      <w:proofErr w:type="spellStart"/>
+      <w:r>
+        <w:t>simple_ui</w:t>
+      </w:r>
+      <w:proofErr w:type="spellEnd"/>
+      <w:r>
+        <w:t>/</w:t>
       </w:r>
     </w:p>
     <w:p>
@@ -2712,8 +3079,13 @@
         </w:numPr>
       </w:pPr>
       <w:r>
-        <w:t>Raw API subscores</w:t>
-      </w:r>
+        <w:t xml:space="preserve">Raw API </w:t>
+      </w:r>
+      <w:proofErr w:type="spellStart"/>
+      <w:r>
+        <w:t>subscores</w:t>
+      </w:r>
+      <w:proofErr w:type="spellEnd"/>
     </w:p>
     <w:p>
       <w:pPr>
@@ -3071,8 +3443,13 @@
           <w:numId w:val="25"/>
         </w:numPr>
       </w:pPr>
-      <w:r>
-        <w:t>Subscores (C1–C6) are stored in cache files</w:t>
+      <w:proofErr w:type="spellStart"/>
+      <w:r>
+        <w:t>Subscores</w:t>
+      </w:r>
+      <w:proofErr w:type="spellEnd"/>
+      <w:r>
+        <w:t xml:space="preserve"> (C1–C6) are stored in cache files</w:t>
       </w:r>
     </w:p>
     <w:p>
@@ -3180,13 +3557,19 @@
       </w:r>
     </w:p>
     <w:p>
+      <w:proofErr w:type="spellStart"/>
       <w:r>
         <w:t>golden_C_current_metrics.json</w:t>
       </w:r>
+      <w:proofErr w:type="spellEnd"/>
       <w:r>
         <w:br/>
+      </w:r>
+      <w:proofErr w:type="spellStart"/>
+      <w:r>
         <w:t>golden_C_legacy_metrics.json</w:t>
       </w:r>
+      <w:proofErr w:type="spellEnd"/>
     </w:p>
     <w:p>
       <w:r>
@@ -3335,20 +3718,36 @@
       </w:r>
       <w:r>
         <w:br/>
+      </w:r>
+      <w:proofErr w:type="spellStart"/>
+      <w:r>
         <w:t>golden_C_current_cases.json</w:t>
       </w:r>
+      <w:proofErr w:type="spellEnd"/>
       <w:r>
         <w:br/>
+      </w:r>
+      <w:proofErr w:type="spellStart"/>
+      <w:r>
         <w:t>golden_C_legacy_cases.json</w:t>
       </w:r>
+      <w:proofErr w:type="spellEnd"/>
       <w:r>
         <w:br/>
+      </w:r>
+      <w:proofErr w:type="spellStart"/>
+      <w:r>
         <w:t>golden_C_current_metrics.json</w:t>
       </w:r>
+      <w:proofErr w:type="spellEnd"/>
       <w:r>
         <w:br/>
+      </w:r>
+      <w:proofErr w:type="spellStart"/>
+      <w:r>
         <w:t>golden_C_legacy_metrics.json</w:t>
       </w:r>
+      <w:proofErr w:type="spellEnd"/>
       <w:r>
         <w:br/>
       </w:r>
@@ -3568,8 +3967,13 @@
         </w:numPr>
       </w:pPr>
       <w:r>
-        <w:t>Support integration with MyDesign</w:t>
-      </w:r>
+        <w:t xml:space="preserve">Support integration with </w:t>
+      </w:r>
+      <w:proofErr w:type="spellStart"/>
+      <w:r>
+        <w:t>MyDesign</w:t>
+      </w:r>
+      <w:proofErr w:type="spellEnd"/>
     </w:p>
     <w:p>
       <w:pPr>
@@ -3625,7 +4029,7 @@
 </file>
 
 <file path=word/numbering.xml><?xml version="1.0" encoding="utf-8"?>
-<w:numbering xmlns:wpc="http://schemas.microsoft.com/office/word/2010/wordprocessingCanvas" xmlns:cx="http://schemas.microsoft.com/office/drawing/2014/chartex" xmlns:cx1="http://schemas.microsoft.com/office/drawing/2015/9/8/chartex" xmlns:cx2="http://schemas.microsoft.com/office/drawing/2015/10/21/chartex" xmlns:cx3="http://schemas.microsoft.com/office/drawing/2016/5/9/chartex" xmlns:cx4="http://schemas.microsoft.com/office/drawing/2016/5/10/chartex" xmlns:cx5="http://schemas.microsoft.com/office/drawing/2016/5/11/chartex" xmlns:cx6="http://schemas.microsoft.com/office/drawing/2016/5/12/chartex" xmlns:cx7="http://schemas.microsoft.com/office/drawing/2016/5/13/chartex" xmlns:cx8="http://schemas.microsoft.com/office/drawing/2016/5/14/chartex" xmlns:mc="http://schemas.openxmlformats.org/markup-compatibility/2006" xmlns:aink="http://schemas.microsoft.com/office/drawing/2016/ink" xmlns:am3d="http://schemas.microsoft.com/office/drawing/2017/model3d" xmlns:o="urn:schemas-microsoft-com:office:office" xmlns:oel="http://schemas.microsoft.com/office/2019/extlst" xmlns:r="http://schemas.openxmlformats.org/officeDocument/2006/relationships" xmlns:m="http://schemas.openxmlformats.org/officeDocument/2006/math" xmlns:v="urn:schemas-microsoft-com:vml" xmlns:wp14="http://schemas.microsoft.com/office/word/2010/wordprocessingDrawing" xmlns:wp="http://schemas.openxmlformats.org/drawingml/2006/wordprocessingDrawing" xmlns:w10="urn:schemas-microsoft-com:office:word" xmlns:w="http://schemas.openxmlformats.org/wordprocessingml/2006/main" xmlns:w14="http://schemas.microsoft.com/office/word/2010/wordml" xmlns:w15="http://schemas.microsoft.com/office/word/2012/wordml" xmlns:w16cex="http://schemas.microsoft.com/office/word/2018/wordml/cex" xmlns:w16cid="http://schemas.microsoft.com/office/word/2016/wordml/cid" xmlns:w16="http://schemas.microsoft.com/office/word/2018/wordml" xmlns:w16du="http://schemas.microsoft.com/office/word/2023/wordml/word16du" xmlns:w16sdtdh="http://schemas.microsoft.com/office/word/2020/wordml/sdtdatahash" xmlns:w16sdtfl="http://schemas.microsoft.com/office/word/2024/wordml/sdtformatlock" xmlns:w16se="http://schemas.microsoft.com/office/word/2015/wordml/symex" xmlns:wpg="http://schemas.microsoft.com/office/word/2010/wordprocessingGroup" xmlns:wpi="http://schemas.microsoft.com/office/word/2010/wordprocessingInk" xmlns:wne="http://schemas.microsoft.com/office/word/2006/wordml" xmlns:wps="http://schemas.microsoft.com/office/word/2010/wordprocessingShape" mc:Ignorable="w14 w15 w16se w16cid w16 w16cex w16sdtdh w16sdtfl w16du wp14">
+<w:numbering xmlns:wpc="http://schemas.microsoft.com/office/word/2010/wordprocessingCanvas" xmlns:cx="http://schemas.microsoft.com/office/drawing/2014/chartex" xmlns:cx1="http://schemas.microsoft.com/office/drawing/2015/9/8/chartex" xmlns:cx2="http://schemas.microsoft.com/office/drawing/2015/10/21/chartex" xmlns:cx3="http://schemas.microsoft.com/office/drawing/2016/5/9/chartex" xmlns:cx4="http://schemas.microsoft.com/office/drawing/2016/5/10/chartex" xmlns:cx5="http://schemas.microsoft.com/office/drawing/2016/5/11/chartex" xmlns:cx6="http://schemas.microsoft.com/office/drawing/2016/5/12/chartex" xmlns:cx7="http://schemas.microsoft.com/office/drawing/2016/5/13/chartex" xmlns:cx8="http://schemas.microsoft.com/office/drawing/2016/5/14/chartex" xmlns:mc="http://schemas.openxmlformats.org/markup-compatibility/2006" xmlns:aink="http://schemas.microsoft.com/office/drawing/2016/ink" xmlns:am3d="http://schemas.microsoft.com/office/drawing/2017/model3d" xmlns:o="urn:schemas-microsoft-com:office:office" xmlns:oel="http://schemas.microsoft.com/office/2019/extlst" xmlns:r="http://schemas.openxmlformats.org/officeDocument/2006/relationships" xmlns:m="http://schemas.openxmlformats.org/officeDocument/2006/math" xmlns:v="urn:schemas-microsoft-com:vml" xmlns:wp14="http://schemas.microsoft.com/office/word/2010/wordprocessingDrawing" xmlns:wp="http://schemas.openxmlformats.org/drawingml/2006/wordprocessingDrawing" xmlns:w10="urn:schemas-microsoft-com:office:word" xmlns:w="http://schemas.openxmlformats.org/wordprocessingml/2006/main" xmlns:w14="http://schemas.microsoft.com/office/word/2010/wordml" xmlns:w15="http://schemas.microsoft.com/office/word/2012/wordml" xmlns:w16cei="http://schemas.microsoft.com/office/word/2026/wordml/cei" xmlns:w16cex="http://schemas.microsoft.com/office/word/2018/wordml/cex" xmlns:w16cid="http://schemas.microsoft.com/office/word/2016/wordml/cid" xmlns:w16="http://schemas.microsoft.com/office/word/2018/wordml" xmlns:w16du="http://schemas.microsoft.com/office/word/2023/wordml/word16du" xmlns:w16sdtdh="http://schemas.microsoft.com/office/word/2020/wordml/sdtdatahash" xmlns:w16sdtfl="http://schemas.microsoft.com/office/word/2024/wordml/sdtformatlock" xmlns:w16se="http://schemas.microsoft.com/office/word/2015/wordml/symex" xmlns:wpg="http://schemas.microsoft.com/office/word/2010/wordprocessingGroup" xmlns:wpi="http://schemas.microsoft.com/office/word/2010/wordprocessingInk" xmlns:wne="http://schemas.microsoft.com/office/word/2006/wordml" xmlns:wps="http://schemas.microsoft.com/office/word/2010/wordprocessingShape" mc:Ignorable="w14 w15 w16se w16cid w16 w16cex w16sdtdh w16sdtfl w16du wp14">
   <w:abstractNum w:abstractNumId="0" w15:restartNumberingAfterBreak="0">
     <w:nsid w:val="027B4D16"/>
     <w:multiLevelType w:val="multilevel"/>
@@ -8380,7 +8784,6 @@
   <w:style w:type="character" w:default="1" w:styleId="DefaultParagraphFont">
     <w:name w:val="Default Paragraph Font"/>
     <w:uiPriority w:val="1"/>
-    <w:semiHidden/>
     <w:unhideWhenUsed/>
   </w:style>
   <w:style w:type="table" w:default="1" w:styleId="TableNormal">

</xml_diff>

<commit_message>
Standardize calibration pipeline interface and restore replay compatibility for all elements
</commit_message>
<xml_diff>
--- a/Readme.docx
+++ b/Readme.docx
@@ -23,7 +23,23 @@
           <w:b/>
           <w:bCs/>
         </w:rPr>
-        <w:t xml:space="preserve"> – Element  Scoring Application</w:t>
+        <w:t xml:space="preserve"> – </w:t>
+      </w:r>
+      <w:proofErr w:type="gramStart"/>
+      <w:r>
+        <w:rPr>
+          <w:b/>
+          <w:bCs/>
+        </w:rPr>
+        <w:t>Element  Scoring</w:t>
+      </w:r>
+      <w:proofErr w:type="gramEnd"/>
+      <w:r>
+        <w:rPr>
+          <w:b/>
+          <w:bCs/>
+        </w:rPr>
+        <w:t xml:space="preserve"> Application</w:t>
       </w:r>
     </w:p>
     <w:p>
@@ -72,11 +88,16 @@
         <w:t>, H</w:t>
       </w:r>
       <w:r>
-        <w:t xml:space="preserve">, I </w:t>
+        <w:t xml:space="preserve">, </w:t>
+      </w:r>
+      <w:proofErr w:type="gramStart"/>
+      <w:r>
+        <w:t xml:space="preserve">I </w:t>
       </w:r>
       <w:r>
         <w:t>,J</w:t>
       </w:r>
+      <w:proofErr w:type="gramEnd"/>
       <w:r>
         <w:t xml:space="preserve">, K and L </w:t>
       </w:r>
@@ -93,7 +114,11 @@
         <w:t xml:space="preserve"> A</w:t>
       </w:r>
       <w:r>
-        <w:t>, B</w:t>
+        <w:t xml:space="preserve">, </w:t>
+      </w:r>
+      <w:proofErr w:type="gramStart"/>
+      <w:r>
+        <w:t>B</w:t>
       </w:r>
       <w:r>
         <w:t>,</w:t>
@@ -101,6 +126,7 @@
       <w:r>
         <w:t>D</w:t>
       </w:r>
+      <w:proofErr w:type="gramEnd"/>
       <w:r>
         <w:t xml:space="preserve">, </w:t>
       </w:r>
@@ -138,7 +164,23 @@
         <w:t>as well</w:t>
       </w:r>
       <w:r>
-        <w:t xml:space="preserve"> for operation.  The discussion discloses  detailed parameters that are specific to Element C so they will obviously change for the other elements.</w:t>
+        <w:t xml:space="preserve"> </w:t>
+      </w:r>
+      <w:proofErr w:type="gramStart"/>
+      <w:r>
+        <w:t>for</w:t>
+      </w:r>
+      <w:proofErr w:type="gramEnd"/>
+      <w:r>
+        <w:t xml:space="preserve"> operation.  The discussion </w:t>
+      </w:r>
+      <w:proofErr w:type="gramStart"/>
+      <w:r>
+        <w:t>discloses  detailed</w:t>
+      </w:r>
+      <w:proofErr w:type="gramEnd"/>
+      <w:r>
+        <w:t xml:space="preserve"> parameters that are specific to Element C so they will obviously change for the other elements.</w:t>
       </w:r>
     </w:p>
     <w:p>
@@ -541,7 +583,31 @@
         <w:t>This b</w:t>
       </w:r>
       <w:r>
-        <w:t xml:space="preserve">lock diagram shows data flow for the overall system which is divided in two processes:  scoring and diagnostics.  Diagnostics include drift detection for scores of documents  submitted for scoring.  Regression testing using a Golden20 set of documents, chosen for their susceptibility for variations in scoring processes and philosophy.  Controller_app.py is an overall controller for system, controlling both scoring and diagnostics in one UI. </w:t>
+        <w:t xml:space="preserve">lock diagram shows data flow for the overall system which is divided </w:t>
+      </w:r>
+      <w:proofErr w:type="gramStart"/>
+      <w:r>
+        <w:t>in</w:t>
+      </w:r>
+      <w:proofErr w:type="gramEnd"/>
+      <w:r>
+        <w:t xml:space="preserve"> two processes</w:t>
+      </w:r>
+      <w:proofErr w:type="gramStart"/>
+      <w:r>
+        <w:t>:  scoring</w:t>
+      </w:r>
+      <w:proofErr w:type="gramEnd"/>
+      <w:r>
+        <w:t xml:space="preserve"> and diagnostics.  Diagnostics include drift detection for scores of </w:t>
+      </w:r>
+      <w:proofErr w:type="gramStart"/>
+      <w:r>
+        <w:t>documents  submitted</w:t>
+      </w:r>
+      <w:proofErr w:type="gramEnd"/>
+      <w:r>
+        <w:t xml:space="preserve"> for scoring.  Regression testing using a Golden20 set of documents, chosen for their susceptibility for variations in scoring processes and philosophy.  Controller_app.py is an overall controller for system, controlling both scoring and diagnostics in one UI. </w:t>
       </w:r>
     </w:p>
     <w:p>
@@ -998,8 +1064,21 @@
         <w:t xml:space="preserve">python -m </w:t>
       </w:r>
       <w:proofErr w:type="spellStart"/>
-      <w:r>
-        <w:t>elements.element_C.score_with_API_C</w:t>
+      <w:proofErr w:type="gramStart"/>
+      <w:r>
+        <w:t>elements.element</w:t>
+      </w:r>
+      <w:proofErr w:type="gramEnd"/>
+      <w:r>
+        <w:t>_</w:t>
+      </w:r>
+      <w:proofErr w:type="gramStart"/>
+      <w:r>
+        <w:t>C.score</w:t>
+      </w:r>
+      <w:proofErr w:type="gramEnd"/>
+      <w:r>
+        <w:t>_with_API_C</w:t>
       </w:r>
       <w:proofErr w:type="spellEnd"/>
       <w:r>
@@ -1142,7 +1221,15 @@
         </w:numPr>
       </w:pPr>
       <w:r>
-        <w:t>C1-C6  Bulleted rationale</w:t>
+        <w:t>C1-C</w:t>
+      </w:r>
+      <w:proofErr w:type="gramStart"/>
+      <w:r>
+        <w:t>6  Bulleted</w:t>
+      </w:r>
+      <w:proofErr w:type="gramEnd"/>
+      <w:r>
+        <w:t xml:space="preserve"> rationale</w:t>
       </w:r>
     </w:p>
     <w:p>
@@ -1448,10 +1535,30 @@
       </w:r>
       <w:proofErr w:type="spellEnd"/>
       <w:r>
-        <w:t xml:space="preserve"> to calibrated scores</w:t>
-      </w:r>
-      <w:r>
-        <w:t xml:space="preserve"> </w:t>
+        <w:t xml:space="preserve"> to calibrated </w:t>
+      </w:r>
+      <w:proofErr w:type="gramStart"/>
+      <w:r>
+        <w:t>scores</w:t>
+      </w:r>
+      <w:r>
+        <w:t xml:space="preserve">  (</w:t>
+      </w:r>
+      <w:proofErr w:type="gramEnd"/>
+      <w:r>
+        <w:t>A and B only)</w:t>
+      </w:r>
+    </w:p>
+    <w:p>
+      <w:pPr>
+        <w:pStyle w:val="ListParagraph"/>
+        <w:numPr>
+          <w:ilvl w:val="0"/>
+          <w:numId w:val="18"/>
+        </w:numPr>
+      </w:pPr>
+      <w:r>
+        <w:t>Points for Teacher Review, intended to inform teachers for scoring a specific document</w:t>
       </w:r>
       <w:r>
         <w:t xml:space="preserve"> (A and B only)</w:t>
@@ -1465,11 +1572,26 @@
           <w:numId w:val="18"/>
         </w:numPr>
       </w:pPr>
-      <w:r>
-        <w:t>Points for Teacher Review, intended to inform teachers for scoring a specific document</w:t>
-      </w:r>
-      <w:r>
-        <w:t xml:space="preserve"> (A and B only)</w:t>
+      <w:proofErr w:type="spellStart"/>
+      <w:r>
+        <w:t>Element_score_raw</w:t>
+      </w:r>
+      <w:proofErr w:type="spellEnd"/>
+      <w:r>
+        <w:t xml:space="preserve">, the average of the </w:t>
+      </w:r>
+      <w:proofErr w:type="spellStart"/>
+      <w:r>
+        <w:t>api</w:t>
+      </w:r>
+      <w:proofErr w:type="spellEnd"/>
+      <w:r>
+        <w:t xml:space="preserve"> scores</w:t>
+      </w:r>
+    </w:p>
+    <w:p>
+      <w:r>
+        <w:t>Whether uploading a csv file or document files, the UI output is sub-element scores and narrative rationale.  A downloadable csv contains the following outputs:</w:t>
       </w:r>
     </w:p>
     <w:p>
@@ -1477,29 +1599,11 @@
         <w:pStyle w:val="ListParagraph"/>
         <w:numPr>
           <w:ilvl w:val="0"/>
-          <w:numId w:val="18"/>
-        </w:numPr>
-      </w:pPr>
-      <w:proofErr w:type="spellStart"/>
-      <w:r>
-        <w:t>Element_score_raw</w:t>
-      </w:r>
-      <w:proofErr w:type="spellEnd"/>
-      <w:r>
-        <w:t xml:space="preserve">, the average of the </w:t>
-      </w:r>
-      <w:proofErr w:type="spellStart"/>
-      <w:r>
-        <w:t>api</w:t>
-      </w:r>
-      <w:proofErr w:type="spellEnd"/>
-      <w:r>
-        <w:t xml:space="preserve"> scores</w:t>
-      </w:r>
-    </w:p>
-    <w:p>
-      <w:r>
-        <w:t>Whether uploading a csv file or document files, the UI output is sub-element scores and narrative rationale.  A downloadable csv contains the following outputs:</w:t>
+          <w:numId w:val="17"/>
+        </w:numPr>
+      </w:pPr>
+      <w:r>
+        <w:t>Filename</w:t>
       </w:r>
     </w:p>
     <w:p>
@@ -1511,7 +1615,7 @@
         </w:numPr>
       </w:pPr>
       <w:r>
-        <w:t>Filename</w:t>
+        <w:t>C1 – C6 outputs from score_with_API_C.py (aka C1_api-C6_api)</w:t>
       </w:r>
     </w:p>
     <w:p>
@@ -1523,19 +1627,15 @@
         </w:numPr>
       </w:pPr>
       <w:r>
-        <w:t>C1 – C6 outputs from score_with_API_C.py (aka C1_api-C6_api)</w:t>
-      </w:r>
-    </w:p>
-    <w:p>
-      <w:pPr>
-        <w:pStyle w:val="ListParagraph"/>
-        <w:numPr>
-          <w:ilvl w:val="0"/>
-          <w:numId w:val="17"/>
-        </w:numPr>
-      </w:pPr>
-      <w:r>
-        <w:t>C1_final  – C6_final calibrated scores for output</w:t>
+        <w:t>C1_</w:t>
+      </w:r>
+      <w:proofErr w:type="gramStart"/>
+      <w:r>
+        <w:t>final  –</w:t>
+      </w:r>
+      <w:proofErr w:type="gramEnd"/>
+      <w:r>
+        <w:t xml:space="preserve"> C6_final calibrated scores for output</w:t>
       </w:r>
     </w:p>
     <w:p>
@@ -1691,8 +1791,13 @@
         </w:numPr>
       </w:pPr>
       <w:r>
-        <w:t>Drift slightly over time</w:t>
-      </w:r>
+        <w:t xml:space="preserve">Drift slightly </w:t>
+      </w:r>
+      <w:proofErr w:type="gramStart"/>
+      <w:r>
+        <w:t>over time</w:t>
+      </w:r>
+      <w:proofErr w:type="gramEnd"/>
     </w:p>
     <w:p>
       <w:pPr>
@@ -1844,8 +1949,13 @@
           <w:numId w:val="11"/>
         </w:numPr>
       </w:pPr>
-      <w:r>
-        <w:t>Explains strengths and weaknesses</w:t>
+      <w:proofErr w:type="gramStart"/>
+      <w:r>
+        <w:t>Explains</w:t>
+      </w:r>
+      <w:proofErr w:type="gramEnd"/>
+      <w:r>
+        <w:t xml:space="preserve"> strengths and weaknesses</w:t>
       </w:r>
     </w:p>
     <w:p>
@@ -1866,8 +1976,13 @@
           <w:numId w:val="11"/>
         </w:numPr>
       </w:pPr>
-      <w:r>
-        <w:t>Uses educator-friendly language</w:t>
+      <w:proofErr w:type="gramStart"/>
+      <w:r>
+        <w:t>Uses</w:t>
+      </w:r>
+      <w:proofErr w:type="gramEnd"/>
+      <w:r>
+        <w:t xml:space="preserve"> educator-friendly language</w:t>
       </w:r>
     </w:p>
     <w:p>
@@ -2127,7 +2242,15 @@
       </w:r>
       <w:proofErr w:type="spellEnd"/>
       <w:r>
-        <w:t>/ -  analogous to C</w:t>
+        <w:t xml:space="preserve">/ </w:t>
+      </w:r>
+      <w:proofErr w:type="gramStart"/>
+      <w:r>
+        <w:t>-  analogous</w:t>
+      </w:r>
+      <w:proofErr w:type="gramEnd"/>
+      <w:r>
+        <w:t xml:space="preserve"> to C</w:t>
       </w:r>
     </w:p>
     <w:p>
@@ -2140,7 +2263,15 @@
       </w:r>
       <w:proofErr w:type="spellEnd"/>
       <w:r>
-        <w:t>/ -  analogous to C</w:t>
+        <w:t xml:space="preserve">/ </w:t>
+      </w:r>
+      <w:proofErr w:type="gramStart"/>
+      <w:r>
+        <w:t>-  analogous</w:t>
+      </w:r>
+      <w:proofErr w:type="gramEnd"/>
+      <w:r>
+        <w:t xml:space="preserve"> to C</w:t>
       </w:r>
     </w:p>
     <w:p>
@@ -2166,7 +2297,15 @@
       </w:r>
       <w:proofErr w:type="spellEnd"/>
       <w:r>
-        <w:t>/ -  analogous to C</w:t>
+        <w:t xml:space="preserve">/ </w:t>
+      </w:r>
+      <w:proofErr w:type="gramStart"/>
+      <w:r>
+        <w:t>-  analogous</w:t>
+      </w:r>
+      <w:proofErr w:type="gramEnd"/>
+      <w:r>
+        <w:t xml:space="preserve"> to C</w:t>
       </w:r>
     </w:p>
     <w:p>
@@ -2179,7 +2318,15 @@
       </w:r>
       <w:proofErr w:type="spellEnd"/>
       <w:r>
-        <w:t>/ -  analogous to C</w:t>
+        <w:t xml:space="preserve">/ </w:t>
+      </w:r>
+      <w:proofErr w:type="gramStart"/>
+      <w:r>
+        <w:t>-  analogous</w:t>
+      </w:r>
+      <w:proofErr w:type="gramEnd"/>
+      <w:r>
+        <w:t xml:space="preserve"> to C</w:t>
       </w:r>
     </w:p>
     <w:p>
@@ -2192,7 +2339,15 @@
       </w:r>
       <w:proofErr w:type="spellEnd"/>
       <w:r>
-        <w:t>/ -  analogous to C</w:t>
+        <w:t xml:space="preserve">/ </w:t>
+      </w:r>
+      <w:proofErr w:type="gramStart"/>
+      <w:r>
+        <w:t>-  analogous</w:t>
+      </w:r>
+      <w:proofErr w:type="gramEnd"/>
+      <w:r>
+        <w:t xml:space="preserve"> to C</w:t>
       </w:r>
     </w:p>
     <w:p>
@@ -2205,7 +2360,15 @@
       </w:r>
       <w:proofErr w:type="spellEnd"/>
       <w:r>
-        <w:t>/ -  analogous to C</w:t>
+        <w:t xml:space="preserve">/ </w:t>
+      </w:r>
+      <w:proofErr w:type="gramStart"/>
+      <w:r>
+        <w:t>-  analogous</w:t>
+      </w:r>
+      <w:proofErr w:type="gramEnd"/>
+      <w:r>
+        <w:t xml:space="preserve"> to C</w:t>
       </w:r>
     </w:p>
     <w:p>
@@ -2218,7 +2381,15 @@
       </w:r>
       <w:proofErr w:type="spellEnd"/>
       <w:r>
-        <w:t>/ -  analogous to C</w:t>
+        <w:t xml:space="preserve">/ </w:t>
+      </w:r>
+      <w:proofErr w:type="gramStart"/>
+      <w:r>
+        <w:t>-  analogous</w:t>
+      </w:r>
+      <w:proofErr w:type="gramEnd"/>
+      <w:r>
+        <w:t xml:space="preserve"> to C</w:t>
       </w:r>
     </w:p>
     <w:p>
@@ -2231,7 +2402,15 @@
       </w:r>
       <w:proofErr w:type="spellEnd"/>
       <w:r>
-        <w:t>/ -  analogous to C</w:t>
+        <w:t xml:space="preserve">/ </w:t>
+      </w:r>
+      <w:proofErr w:type="gramStart"/>
+      <w:r>
+        <w:t>-  analogous</w:t>
+      </w:r>
+      <w:proofErr w:type="gramEnd"/>
+      <w:r>
+        <w:t xml:space="preserve"> to C</w:t>
       </w:r>
     </w:p>
     <w:p>
@@ -2244,7 +2423,15 @@
       </w:r>
       <w:proofErr w:type="spellEnd"/>
       <w:r>
-        <w:t>/ -  analogous to C</w:t>
+        <w:t xml:space="preserve">/ </w:t>
+      </w:r>
+      <w:proofErr w:type="gramStart"/>
+      <w:r>
+        <w:t>-  analogous</w:t>
+      </w:r>
+      <w:proofErr w:type="gramEnd"/>
+      <w:r>
+        <w:t xml:space="preserve"> to C</w:t>
       </w:r>
     </w:p>
     <w:p>
@@ -2257,7 +2444,15 @@
       </w:r>
       <w:proofErr w:type="spellEnd"/>
       <w:r>
-        <w:t>/ -  analogous to C</w:t>
+        <w:t xml:space="preserve">/ </w:t>
+      </w:r>
+      <w:proofErr w:type="gramStart"/>
+      <w:r>
+        <w:t>-  analogous</w:t>
+      </w:r>
+      <w:proofErr w:type="gramEnd"/>
+      <w:r>
+        <w:t xml:space="preserve"> to C</w:t>
       </w:r>
     </w:p>
     <w:p>
@@ -2297,9 +2492,14 @@
       </w:r>
       <w:proofErr w:type="spellStart"/>
       <w:r>
-        <w:t>golden_C_current.json</w:t>
+        <w:t>golden_C_</w:t>
+      </w:r>
+      <w:proofErr w:type="gramStart"/>
+      <w:r>
+        <w:t>current.json</w:t>
       </w:r>
       <w:proofErr w:type="spellEnd"/>
+      <w:proofErr w:type="gramEnd"/>
     </w:p>
     <w:p>
       <w:r>
@@ -2325,9 +2525,14 @@
       </w:r>
       <w:proofErr w:type="spellStart"/>
       <w:r>
-        <w:t>golden_C_legacy.json</w:t>
+        <w:t>golden_C_</w:t>
+      </w:r>
+      <w:proofErr w:type="gramStart"/>
+      <w:r>
+        <w:t>legacy.json</w:t>
       </w:r>
       <w:proofErr w:type="spellEnd"/>
+      <w:proofErr w:type="gramEnd"/>
     </w:p>
     <w:p>
       <w:r>
@@ -2349,8 +2554,13 @@
         <w:t>──</w:t>
       </w:r>
       <w:r>
-        <w:t xml:space="preserve"> golden20_metrics_current.json</w:t>
-      </w:r>
+        <w:t xml:space="preserve"> golden20_metrics_</w:t>
+      </w:r>
+      <w:proofErr w:type="gramStart"/>
+      <w:r>
+        <w:t>current.json</w:t>
+      </w:r>
+      <w:proofErr w:type="gramEnd"/>
     </w:p>
     <w:p>
       <w:r>
@@ -2372,8 +2582,13 @@
         <w:t>──</w:t>
       </w:r>
       <w:r>
-        <w:t xml:space="preserve"> golden20_metrics_legacy.json</w:t>
-      </w:r>
+        <w:t xml:space="preserve"> golden20_metrics_</w:t>
+      </w:r>
+      <w:proofErr w:type="gramStart"/>
+      <w:r>
+        <w:t>legacy.json</w:t>
+      </w:r>
+      <w:proofErr w:type="gramEnd"/>
     </w:p>
     <w:p>
       <w:r>
@@ -2395,7 +2610,15 @@
         <w:t>──</w:t>
       </w:r>
       <w:r>
-        <w:t xml:space="preserve"> golden20_current_scores.json      </w:t>
+        <w:t xml:space="preserve"> golden20_current_</w:t>
+      </w:r>
+      <w:proofErr w:type="gramStart"/>
+      <w:r>
+        <w:t>scores.json</w:t>
+      </w:r>
+      <w:proofErr w:type="gramEnd"/>
+      <w:r>
+        <w:t xml:space="preserve">      </w:t>
       </w:r>
       <w:r>
         <w:rPr>
@@ -2421,7 +2644,15 @@
         <w:t xml:space="preserve">  </w:t>
       </w:r>
       <w:r>
-        <w:t>└── golden20_legacy_scores.json       ← cached API scores</w:t>
+        <w:t>└── golden20_legacy_</w:t>
+      </w:r>
+      <w:proofErr w:type="gramStart"/>
+      <w:r>
+        <w:t>scores.json</w:t>
+      </w:r>
+      <w:proofErr w:type="gramEnd"/>
+      <w:r>
+        <w:t xml:space="preserve">       ← cached API scores</w:t>
       </w:r>
     </w:p>
     <w:p>
@@ -2457,7 +2688,15 @@
       </w:r>
       <w:proofErr w:type="spellEnd"/>
       <w:r>
-        <w:t>/ -  analogous to C</w:t>
+        <w:t xml:space="preserve">/ </w:t>
+      </w:r>
+      <w:proofErr w:type="gramStart"/>
+      <w:r>
+        <w:t>-  analogous</w:t>
+      </w:r>
+      <w:proofErr w:type="gramEnd"/>
+      <w:r>
+        <w:t xml:space="preserve"> to C</w:t>
       </w:r>
     </w:p>
     <w:p>
@@ -2470,7 +2709,15 @@
       </w:r>
       <w:proofErr w:type="spellEnd"/>
       <w:r>
-        <w:t>/ -  analogous to C</w:t>
+        <w:t xml:space="preserve">/ </w:t>
+      </w:r>
+      <w:proofErr w:type="gramStart"/>
+      <w:r>
+        <w:t>-  analogous</w:t>
+      </w:r>
+      <w:proofErr w:type="gramEnd"/>
+      <w:r>
+        <w:t xml:space="preserve"> to C</w:t>
       </w:r>
     </w:p>
     <w:p>
@@ -2496,7 +2743,15 @@
       </w:r>
       <w:proofErr w:type="spellEnd"/>
       <w:r>
-        <w:t>/ -  analogous to C</w:t>
+        <w:t xml:space="preserve">/ </w:t>
+      </w:r>
+      <w:proofErr w:type="gramStart"/>
+      <w:r>
+        <w:t>-  analogous</w:t>
+      </w:r>
+      <w:proofErr w:type="gramEnd"/>
+      <w:r>
+        <w:t xml:space="preserve"> to C</w:t>
       </w:r>
     </w:p>
     <w:p>
@@ -2509,7 +2764,15 @@
       </w:r>
       <w:proofErr w:type="spellEnd"/>
       <w:r>
-        <w:t>/ -  analogous to C</w:t>
+        <w:t xml:space="preserve">/ </w:t>
+      </w:r>
+      <w:proofErr w:type="gramStart"/>
+      <w:r>
+        <w:t>-  analogous</w:t>
+      </w:r>
+      <w:proofErr w:type="gramEnd"/>
+      <w:r>
+        <w:t xml:space="preserve"> to C</w:t>
       </w:r>
     </w:p>
     <w:p>
@@ -2522,7 +2785,15 @@
       </w:r>
       <w:proofErr w:type="spellEnd"/>
       <w:r>
-        <w:t>/ -  analogous to C</w:t>
+        <w:t xml:space="preserve">/ </w:t>
+      </w:r>
+      <w:proofErr w:type="gramStart"/>
+      <w:r>
+        <w:t>-  analogous</w:t>
+      </w:r>
+      <w:proofErr w:type="gramEnd"/>
+      <w:r>
+        <w:t xml:space="preserve"> to C</w:t>
       </w:r>
     </w:p>
     <w:p>
@@ -2535,7 +2806,15 @@
       </w:r>
       <w:proofErr w:type="spellEnd"/>
       <w:r>
-        <w:t>/ -  analogous to C</w:t>
+        <w:t xml:space="preserve">/ </w:t>
+      </w:r>
+      <w:proofErr w:type="gramStart"/>
+      <w:r>
+        <w:t>-  analogous</w:t>
+      </w:r>
+      <w:proofErr w:type="gramEnd"/>
+      <w:r>
+        <w:t xml:space="preserve"> to C</w:t>
       </w:r>
     </w:p>
     <w:p>
@@ -2548,7 +2827,15 @@
       </w:r>
       <w:proofErr w:type="spellEnd"/>
       <w:r>
-        <w:t>/ -  analogous to C</w:t>
+        <w:t xml:space="preserve">/ </w:t>
+      </w:r>
+      <w:proofErr w:type="gramStart"/>
+      <w:r>
+        <w:t>-  analogous</w:t>
+      </w:r>
+      <w:proofErr w:type="gramEnd"/>
+      <w:r>
+        <w:t xml:space="preserve"> to C</w:t>
       </w:r>
     </w:p>
     <w:p>
@@ -2561,7 +2848,15 @@
       </w:r>
       <w:proofErr w:type="spellEnd"/>
       <w:r>
-        <w:t>/ -  analogous to C</w:t>
+        <w:t xml:space="preserve">/ </w:t>
+      </w:r>
+      <w:proofErr w:type="gramStart"/>
+      <w:r>
+        <w:t>-  analogous</w:t>
+      </w:r>
+      <w:proofErr w:type="gramEnd"/>
+      <w:r>
+        <w:t xml:space="preserve"> to C</w:t>
       </w:r>
     </w:p>
     <w:p>
@@ -2574,7 +2869,15 @@
       </w:r>
       <w:proofErr w:type="spellEnd"/>
       <w:r>
-        <w:t>/ -  analogous to C</w:t>
+        <w:t xml:space="preserve">/ </w:t>
+      </w:r>
+      <w:proofErr w:type="gramStart"/>
+      <w:r>
+        <w:t>-  analogous</w:t>
+      </w:r>
+      <w:proofErr w:type="gramEnd"/>
+      <w:r>
+        <w:t xml:space="preserve"> to C</w:t>
       </w:r>
     </w:p>
     <w:p>
@@ -2587,7 +2890,15 @@
       </w:r>
       <w:proofErr w:type="spellEnd"/>
       <w:r>
-        <w:t>/ -  analogous to C</w:t>
+        <w:t xml:space="preserve">/ </w:t>
+      </w:r>
+      <w:proofErr w:type="gramStart"/>
+      <w:r>
+        <w:t>-  analogous</w:t>
+      </w:r>
+      <w:proofErr w:type="gramEnd"/>
+      <w:r>
+        <w:t xml:space="preserve"> to C</w:t>
       </w:r>
     </w:p>
     <w:p>
@@ -2947,7 +3258,15 @@
         </w:numPr>
       </w:pPr>
       <w:r>
-        <w:t>Bias controlled through intercept calibration</w:t>
+        <w:t xml:space="preserve">Bias controlled through </w:t>
+      </w:r>
+      <w:proofErr w:type="gramStart"/>
+      <w:r>
+        <w:t>intercept</w:t>
+      </w:r>
+      <w:proofErr w:type="gramEnd"/>
+      <w:r>
+        <w:t xml:space="preserve"> calibration</w:t>
       </w:r>
     </w:p>
     <w:p>
@@ -3028,12 +3347,21 @@
       <w:r>
         <w:t xml:space="preserve">, and </w:t>
       </w:r>
+      <w:proofErr w:type="gramStart"/>
       <w:r>
         <w:rPr>
           <w:b/>
           <w:bCs/>
         </w:rPr>
-        <w:t>cached API scoring for reproducibility</w:t>
+        <w:t>cached</w:t>
+      </w:r>
+      <w:proofErr w:type="gramEnd"/>
+      <w:r>
+        <w:rPr>
+          <w:b/>
+          <w:bCs/>
+        </w:rPr>
+        <w:t xml:space="preserve"> API scoring for reproducibility</w:t>
       </w:r>
       <w:r>
         <w:t>.</w:t>
@@ -3457,21 +3785,31 @@
         <w:t>golden20_current</w:t>
       </w:r>
       <w:r>
-        <w:t>_scores</w:t>
+        <w:t>_</w:t>
+      </w:r>
+      <w:proofErr w:type="gramStart"/>
+      <w:r>
+        <w:t>scores</w:t>
       </w:r>
       <w:r>
         <w:t>.json</w:t>
       </w:r>
+      <w:proofErr w:type="gramEnd"/>
       <w:r>
         <w:br/>
         <w:t>golden20_legacy</w:t>
       </w:r>
       <w:r>
-        <w:t>_scores</w:t>
+        <w:t>_</w:t>
+      </w:r>
+      <w:proofErr w:type="gramStart"/>
+      <w:r>
+        <w:t>scores</w:t>
       </w:r>
       <w:r>
         <w:t>.json</w:t>
       </w:r>
+      <w:proofErr w:type="gramEnd"/>
     </w:p>
     <w:p>
       <w:r>
@@ -3559,21 +3897,39 @@
     <w:p>
       <w:proofErr w:type="spellStart"/>
       <w:r>
-        <w:t>golden_C_current_metrics.json</w:t>
+        <w:t>golden_C_current_</w:t>
+      </w:r>
+      <w:proofErr w:type="gramStart"/>
+      <w:r>
+        <w:t>metrics.json</w:t>
       </w:r>
       <w:proofErr w:type="spellEnd"/>
+      <w:proofErr w:type="gramEnd"/>
       <w:r>
         <w:br/>
       </w:r>
       <w:proofErr w:type="spellStart"/>
       <w:r>
-        <w:t>golden_C_legacy_metrics.json</w:t>
+        <w:t>golden_C_legacy_</w:t>
+      </w:r>
+      <w:proofErr w:type="gramStart"/>
+      <w:r>
+        <w:t>metrics.json</w:t>
       </w:r>
       <w:proofErr w:type="spellEnd"/>
-    </w:p>
-    <w:p>
-      <w:r>
-        <w:t>These files represent the expected scoring behavior of the system. Future validation runs compare against these baselines to detect deviations.</w:t>
+      <w:proofErr w:type="gramEnd"/>
+    </w:p>
+    <w:p>
+      <w:r>
+        <w:t xml:space="preserve">These files represent the expected scoring behavior of the system. Future validation runs </w:t>
+      </w:r>
+      <w:proofErr w:type="gramStart"/>
+      <w:r>
+        <w:t>compare</w:t>
+      </w:r>
+      <w:proofErr w:type="gramEnd"/>
+      <w:r>
+        <w:t xml:space="preserve"> against these baselines to detect deviations.</w:t>
       </w:r>
     </w:p>
     <w:p>
@@ -3681,8 +4037,13 @@
           <w:numId w:val="27"/>
         </w:numPr>
       </w:pPr>
-      <w:r>
-        <w:t>Report whether drift is detected</w:t>
+      <w:proofErr w:type="gramStart"/>
+      <w:r>
+        <w:t>Report</w:t>
+      </w:r>
+      <w:proofErr w:type="gramEnd"/>
+      <w:r>
+        <w:t xml:space="preserve"> whether drift is detected</w:t>
       </w:r>
     </w:p>
     <w:p>
@@ -3721,44 +4082,74 @@
       </w:r>
       <w:proofErr w:type="spellStart"/>
       <w:r>
-        <w:t>golden_C_current_cases.json</w:t>
+        <w:t>golden_C_current_</w:t>
+      </w:r>
+      <w:proofErr w:type="gramStart"/>
+      <w:r>
+        <w:t>cases.json</w:t>
       </w:r>
       <w:proofErr w:type="spellEnd"/>
+      <w:proofErr w:type="gramEnd"/>
       <w:r>
         <w:br/>
       </w:r>
       <w:proofErr w:type="spellStart"/>
       <w:r>
-        <w:t>golden_C_legacy_cases.json</w:t>
+        <w:t>golden_C_legacy_</w:t>
+      </w:r>
+      <w:proofErr w:type="gramStart"/>
+      <w:r>
+        <w:t>cases.json</w:t>
       </w:r>
       <w:proofErr w:type="spellEnd"/>
+      <w:proofErr w:type="gramEnd"/>
       <w:r>
         <w:br/>
       </w:r>
       <w:proofErr w:type="spellStart"/>
       <w:r>
-        <w:t>golden_C_current_metrics.json</w:t>
+        <w:t>golden_C_current_</w:t>
+      </w:r>
+      <w:proofErr w:type="gramStart"/>
+      <w:r>
+        <w:t>metrics.json</w:t>
       </w:r>
       <w:proofErr w:type="spellEnd"/>
+      <w:proofErr w:type="gramEnd"/>
       <w:r>
         <w:br/>
       </w:r>
       <w:proofErr w:type="spellStart"/>
       <w:r>
-        <w:t>golden_C_legacy_metrics.json</w:t>
+        <w:t>golden_C_legacy_</w:t>
+      </w:r>
+      <w:proofErr w:type="gramStart"/>
+      <w:r>
+        <w:t>metrics.json</w:t>
       </w:r>
       <w:proofErr w:type="spellEnd"/>
+      <w:proofErr w:type="gramEnd"/>
       <w:r>
         <w:br/>
       </w:r>
       <w:r>
         <w:lastRenderedPageBreak/>
-        <w:t>golden20_api_scores_current.json</w:t>
-      </w:r>
+        <w:t>golden20_api_scores_</w:t>
+      </w:r>
+      <w:proofErr w:type="gramStart"/>
+      <w:r>
+        <w:t>current.json</w:t>
+      </w:r>
+      <w:proofErr w:type="gramEnd"/>
       <w:r>
         <w:br/>
-        <w:t>golden20_api_scores_legacy.json</w:t>
-      </w:r>
+        <w:t>golden20_api_scores_</w:t>
+      </w:r>
+      <w:proofErr w:type="gramStart"/>
+      <w:r>
+        <w:t>legacy.json</w:t>
+      </w:r>
+      <w:proofErr w:type="gramEnd"/>
     </w:p>
     <w:p>
       <w:r>
@@ -3974,6 +4365,17 @@
         <w:t>MyDesign</w:t>
       </w:r>
       <w:proofErr w:type="spellEnd"/>
+      <w:r>
+        <w:t xml:space="preserve"> for Cisco </w:t>
+      </w:r>
+      <w:proofErr w:type="spellStart"/>
+      <w:r>
+        <w:t>MyDesign</w:t>
+      </w:r>
+      <w:proofErr w:type="spellEnd"/>
+      <w:r>
+        <w:t xml:space="preserve"> AI Assistance Pilot Program</w:t>
+      </w:r>
     </w:p>
     <w:p>
       <w:pPr>
@@ -8784,6 +9186,7 @@
   <w:style w:type="character" w:default="1" w:styleId="DefaultParagraphFont">
     <w:name w:val="Default Paragraph Font"/>
     <w:uiPriority w:val="1"/>
+    <w:semiHidden/>
     <w:unhideWhenUsed/>
   </w:style>
   <w:style w:type="table" w:default="1" w:styleId="TableNormal">

</xml_diff>